<commit_message>
Fix reference hanging indents and align table captions to BAELS style
- Applied consistent 0.5\" hanging indent (left 457200, first -457200) to all References entries
- Merged orphan DOI into Myrick et al. (2015) entry
- Centered and bolded Table A1 / Table B1 captions; centered title lines (matching thesis-memory draft style)
</commit_message>
<xml_diff>
--- a/thesis/Thesis_Instagram_MH_v11.docx
+++ b/thesis/Thesis_Instagram_MH_v11.docx
@@ -3156,7 +3156,7 @@
     <w:p>
       <w:pPr>
         <w:spacing w:after="0" w:before="0" w:line="480" w:lineRule="auto"/>
-        <w:ind w:firstLine="720"/>
+        <w:ind w:left="720" w:hanging="720"/>
         <w:jc w:val="both"/>
         <w:rPr/>
       </w:pPr>
@@ -3171,8 +3171,8 @@
     </w:p>
     <w:p>
       <w:pPr>
-        <w:spacing w:line="480" w:lineRule="auto"/>
-        <w:ind w:left="720" w:firstLine="0"/>
+        <w:spacing w:line="480" w:lineRule="auto" w:after="0" w:before="0"/>
+        <w:ind w:left="720" w:hanging="720"/>
         <w:jc w:val="both"/>
         <w:rPr/>
       </w:pPr>
@@ -3209,7 +3209,8 @@
     </w:p>
     <w:p>
       <w:pPr>
-        <w:spacing w:line="480" w:lineRule="auto"/>
+        <w:spacing w:line="480" w:lineRule="auto" w:after="0" w:before="0"/>
+        <w:ind w:left="720" w:hanging="720"/>
         <w:rPr/>
       </w:pPr>
       <w:r>
@@ -3223,7 +3224,7 @@
     </w:p>
     <w:p>
       <w:pPr>
-        <w:spacing w:line="480" w:lineRule="auto"/>
+        <w:spacing w:line="480" w:lineRule="auto" w:after="0" w:before="0"/>
         <w:ind w:left="720" w:hanging="720"/>
         <w:jc w:val="both"/>
         <w:rPr/>
@@ -3245,7 +3246,8 @@
     </w:p>
     <w:p>
       <w:pPr>
-        <w:spacing w:line="480" w:lineRule="auto"/>
+        <w:spacing w:line="480" w:lineRule="auto" w:after="0" w:before="0"/>
+        <w:ind w:left="720" w:hanging="720"/>
         <w:rPr/>
       </w:pPr>
       <w:r>
@@ -3259,7 +3261,7 @@
     </w:p>
     <w:p>
       <w:pPr>
-        <w:spacing w:line="480" w:lineRule="auto"/>
+        <w:spacing w:line="480" w:lineRule="auto" w:after="0" w:before="0"/>
         <w:ind w:left="720" w:hanging="720"/>
         <w:jc w:val="both"/>
         <w:rPr/>
@@ -3297,7 +3299,8 @@
     </w:p>
     <w:p>
       <w:pPr>
-        <w:spacing w:line="480" w:lineRule="auto"/>
+        <w:spacing w:line="480" w:lineRule="auto" w:after="0" w:before="0"/>
+        <w:ind w:left="720" w:hanging="720"/>
         <w:rPr/>
       </w:pPr>
       <w:r>
@@ -3311,7 +3314,7 @@
     </w:p>
     <w:p>
       <w:pPr>
-        <w:spacing w:line="480" w:lineRule="auto"/>
+        <w:spacing w:line="480" w:lineRule="auto" w:after="0" w:before="0"/>
         <w:ind w:left="720" w:hanging="720"/>
         <w:jc w:val="both"/>
         <w:rPr/>
@@ -3349,7 +3352,8 @@
     </w:p>
     <w:p>
       <w:pPr>
-        <w:spacing w:line="480" w:lineRule="auto"/>
+        <w:spacing w:line="480" w:lineRule="auto" w:after="0" w:before="0"/>
+        <w:ind w:left="720" w:hanging="720"/>
         <w:rPr/>
       </w:pPr>
       <w:r>
@@ -3363,7 +3367,7 @@
     </w:p>
     <w:p>
       <w:pPr>
-        <w:spacing w:line="480" w:lineRule="auto"/>
+        <w:spacing w:line="480" w:lineRule="auto" w:after="0" w:before="0"/>
         <w:ind w:left="720" w:hanging="720"/>
         <w:jc w:val="both"/>
         <w:rPr/>
@@ -3401,7 +3405,8 @@
     </w:p>
     <w:p>
       <w:pPr>
-        <w:spacing w:line="480" w:lineRule="auto"/>
+        <w:spacing w:line="480" w:lineRule="auto" w:after="0" w:before="0"/>
+        <w:ind w:left="720" w:hanging="720"/>
         <w:rPr/>
       </w:pPr>
       <w:r>
@@ -3415,7 +3420,7 @@
     </w:p>
     <w:p>
       <w:pPr>
-        <w:spacing w:line="480" w:lineRule="auto"/>
+        <w:spacing w:line="480" w:lineRule="auto" w:after="0" w:before="0"/>
         <w:ind w:left="720" w:hanging="720"/>
         <w:jc w:val="both"/>
         <w:rPr/>
@@ -3431,7 +3436,7 @@
     </w:p>
     <w:p>
       <w:pPr>
-        <w:spacing w:line="480" w:lineRule="auto"/>
+        <w:spacing w:line="480" w:lineRule="auto" w:after="0" w:before="0"/>
         <w:ind w:left="720" w:hanging="720"/>
         <w:jc w:val="both"/>
         <w:rPr/>
@@ -3453,7 +3458,8 @@
     </w:p>
     <w:p>
       <w:pPr>
-        <w:spacing w:line="480" w:lineRule="auto"/>
+        <w:spacing w:line="480" w:lineRule="auto" w:after="0" w:before="0"/>
+        <w:ind w:left="720" w:hanging="720"/>
         <w:rPr/>
       </w:pPr>
       <w:r>
@@ -3467,7 +3473,7 @@
     </w:p>
     <w:p>
       <w:pPr>
-        <w:spacing w:line="480" w:lineRule="auto"/>
+        <w:spacing w:line="480" w:lineRule="auto" w:after="0" w:before="0"/>
         <w:ind w:left="720" w:hanging="720"/>
         <w:jc w:val="both"/>
         <w:rPr/>
@@ -3505,7 +3511,8 @@
     </w:p>
     <w:p>
       <w:pPr>
-        <w:spacing w:line="480" w:lineRule="auto"/>
+        <w:spacing w:line="480" w:lineRule="auto" w:after="0" w:before="0"/>
+        <w:ind w:left="720" w:hanging="720"/>
         <w:rPr/>
       </w:pPr>
       <w:r>
@@ -3519,7 +3526,7 @@
     </w:p>
     <w:p>
       <w:pPr>
-        <w:spacing w:line="480" w:lineRule="auto"/>
+        <w:spacing w:line="480" w:lineRule="auto" w:after="0" w:before="0"/>
         <w:ind w:left="720" w:hanging="720"/>
         <w:jc w:val="both"/>
         <w:rPr/>
@@ -3557,7 +3564,8 @@
     </w:p>
     <w:p>
       <w:pPr>
-        <w:spacing w:line="480" w:lineRule="auto"/>
+        <w:spacing w:line="480" w:lineRule="auto" w:after="0" w:before="0"/>
+        <w:ind w:left="720" w:hanging="720"/>
         <w:rPr/>
       </w:pPr>
       <w:r>
@@ -3571,7 +3579,7 @@
     </w:p>
     <w:p>
       <w:pPr>
-        <w:spacing w:line="480" w:lineRule="auto"/>
+        <w:spacing w:line="480" w:lineRule="auto" w:after="0" w:before="0"/>
         <w:ind w:left="720" w:hanging="720"/>
         <w:jc w:val="both"/>
         <w:rPr/>
@@ -3609,7 +3617,7 @@
     </w:p>
     <w:p>
       <w:pPr>
-        <w:spacing w:line="480" w:lineRule="auto"/>
+        <w:spacing w:line="480" w:lineRule="auto" w:after="0" w:before="0"/>
         <w:ind w:left="720" w:hanging="720"/>
         <w:jc w:val="both"/>
         <w:rPr/>
@@ -3621,36 +3629,6 @@
           <w:rtl w:val="0"/>
         </w:rPr>
         <w:t>Wu, J., &amp; Hong, T. (2022). The picture of #mentalhealth on Instagram: Congruent vs. incongruent emotions in predicting the sentiment of comments. Frontiers in Communication, 7, Article 824119. https://doi.org/10.3389/fcomm.2022.824119</w:t>
-      </w:r>
-    </w:p>
-    <w:p>
-      <w:pPr>
-        <w:spacing w:line="480" w:lineRule="auto"/>
-        <w:ind w:left="720" w:hanging="720"/>
-        <w:jc w:val="both"/>
-        <w:rPr/>
-      </w:pPr>
-      <w:r>
-        <w:rPr>
-          <w:rFonts w:ascii="Times New Roman" w:hAnsi="Times New Roman"/>
-          <w:sz w:val="22"/>
-          <w:rtl w:val="0"/>
-        </w:rPr>
-      </w:r>
-      <w:hyperlink r:id="rId7">
-        <w:r>
-          <w:rPr>
-            <w:color w:val="1155cc"/>
-            <w:u w:val="single"/>
-            <w:rtl w:val="0"/>
-          </w:rPr>
-          <w:t xml:space="preserve">https://doi.org/10.1080/10410236.2014.981664</w:t>
-        </w:r>
-      </w:hyperlink>
-      <w:r>
-        <w:rPr>
-          <w:rtl w:val="0"/>
-        </w:rPr>
       </w:r>
     </w:p>
     <w:p>
@@ -3820,11 +3798,13 @@
     <w:p>
       <w:pPr>
         <w:spacing w:line="480" w:lineRule="auto"/>
-        <w:rPr/>
-      </w:pPr>
-      <w:r>
-        <w:rPr>
-          <w:i w:val="1"/>
+        <w:jc w:val="center"/>
+        <w:rPr/>
+      </w:pPr>
+      <w:r>
+        <w:rPr>
+          <w:b/>
+          <w:i w:val="0"/>
           <w:iCs w:val="1"/>
           <w:sz w:val="22"/>
           <w:szCs w:val="22"/>
@@ -3834,6 +3814,9 @@
       </w:r>
       <w:r>
         <w:rPr>
+          <w:b/>
+          <w:i w:val="0"/>
+          <w:sz w:val="22"/>
           <w:rtl w:val="0"/>
         </w:rPr>
       </w:r>
@@ -3841,12 +3824,14 @@
     <w:p>
       <w:pPr>
         <w:spacing w:after="120" w:before="0" w:line="480" w:lineRule="auto"/>
-        <w:rPr/>
-      </w:pPr>
-      <w:r>
-        <w:rPr>
-          <w:b w:val="1"/>
+        <w:jc w:val="center"/>
+        <w:rPr/>
+      </w:pPr>
+      <w:r>
+        <w:rPr>
+          <w:b w:val="0"/>
           <w:bCs w:val="1"/>
+          <w:i w:val="0"/>
           <w:sz w:val="22"/>
           <w:szCs w:val="22"/>
           <w:rtl w:val="0"/>
@@ -3855,6 +3840,9 @@
       </w:r>
       <w:r>
         <w:rPr>
+          <w:b w:val="0"/>
+          <w:i w:val="0"/>
+          <w:sz w:val="22"/>
           <w:rtl w:val="0"/>
         </w:rPr>
       </w:r>
@@ -4306,11 +4294,13 @@
     <w:p>
       <w:pPr>
         <w:spacing w:line="480" w:lineRule="auto"/>
-        <w:rPr/>
-      </w:pPr>
-      <w:r>
-        <w:rPr>
-          <w:i w:val="1"/>
+        <w:jc w:val="center"/>
+        <w:rPr/>
+      </w:pPr>
+      <w:r>
+        <w:rPr>
+          <w:b/>
+          <w:i w:val="0"/>
           <w:iCs w:val="1"/>
           <w:sz w:val="22"/>
           <w:szCs w:val="22"/>
@@ -4320,6 +4310,9 @@
       </w:r>
       <w:r>
         <w:rPr>
+          <w:b/>
+          <w:i w:val="0"/>
+          <w:sz w:val="22"/>
           <w:rtl w:val="0"/>
         </w:rPr>
       </w:r>
@@ -4327,12 +4320,14 @@
     <w:p>
       <w:pPr>
         <w:spacing w:after="120" w:before="0" w:line="480" w:lineRule="auto"/>
-        <w:rPr/>
-      </w:pPr>
-      <w:r>
-        <w:rPr>
-          <w:b w:val="1"/>
+        <w:jc w:val="center"/>
+        <w:rPr/>
+      </w:pPr>
+      <w:r>
+        <w:rPr>
+          <w:b w:val="0"/>
           <w:bCs w:val="1"/>
+          <w:i w:val="0"/>
           <w:sz w:val="22"/>
           <w:szCs w:val="22"/>
           <w:rtl w:val="0"/>
@@ -4341,6 +4336,9 @@
       </w:r>
       <w:r>
         <w:rPr>
+          <w:b w:val="0"/>
+          <w:i w:val="0"/>
+          <w:sz w:val="22"/>
           <w:rtl w:val="0"/>
         </w:rPr>
       </w:r>

</xml_diff>

<commit_message>
Match table cell borders to BAELS style from thesis-memory
Open-sided APA-style borders on all three tables:
- Header row: thick top (sz 18) + thin bottom (sz 4)
- Last row: thick bottom (sz 18)
- No vertical borders; no full grid
</commit_message>
<xml_diff>
--- a/thesis/Thesis_Instagram_MH_v11.docx
+++ b/thesis/Thesis_Instagram_MH_v11.docx
@@ -1479,14 +1479,6 @@
         <w:tblStyle w:val="Table1"/>
         <w:tblW w:w="8307.0" w:type="dxa"/>
         <w:jc w:val="center"/>
-        <w:tblBorders>
-          <w:top w:color="000000" w:space="0" w:sz="4" w:val="single"/>
-          <w:left w:color="000000" w:space="0" w:sz="4" w:val="single"/>
-          <w:bottom w:color="000000" w:space="0" w:sz="4" w:val="single"/>
-          <w:right w:color="000000" w:space="0" w:sz="4" w:val="single"/>
-          <w:insideH w:color="000000" w:space="0" w:sz="4" w:val="single"/>
-          <w:insideV w:color="000000" w:space="0" w:sz="4" w:val="single"/>
-        </w:tblBorders>
         <w:tblLayout w:type="fixed"/>
         <w:tblLook w:val="0400"/>
       </w:tblPr>
@@ -1508,7 +1500,14 @@
           <w:tblHeader w:val="0"/>
         </w:trPr>
         <w:tc>
-          <w:tcPr/>
+          <w:tcPr>
+            <w:tcBorders>
+              <w:top w:val="single" w:sz="18" w:color="000000" w:space="0"/>
+              <w:bottom w:val="single" w:sz="4" w:color="000000" w:space="0"/>
+              <w:left w:val="nil" w:sz="0" w:color="000000" w:space="0"/>
+              <w:right w:val="nil" w:sz="0" w:color="000000" w:space="0"/>
+            </w:tcBorders>
+          </w:tcPr>
           <w:p>
             <w:pPr>
               <w:spacing w:after="40" w:before="40" w:line="480" w:lineRule="auto"/>
@@ -1526,7 +1525,14 @@
           </w:p>
         </w:tc>
         <w:tc>
-          <w:tcPr/>
+          <w:tcPr>
+            <w:tcBorders>
+              <w:top w:val="single" w:sz="18" w:color="000000" w:space="0"/>
+              <w:bottom w:val="single" w:sz="4" w:color="000000" w:space="0"/>
+              <w:left w:val="nil" w:sz="0" w:color="000000" w:space="0"/>
+              <w:right w:val="nil" w:sz="0" w:color="000000" w:space="0"/>
+            </w:tcBorders>
+          </w:tcPr>
           <w:p>
             <w:pPr>
               <w:spacing w:after="40" w:before="40" w:line="480" w:lineRule="auto"/>
@@ -1554,7 +1560,14 @@
           </w:p>
         </w:tc>
         <w:tc>
-          <w:tcPr/>
+          <w:tcPr>
+            <w:tcBorders>
+              <w:top w:val="single" w:sz="18" w:color="000000" w:space="0"/>
+              <w:bottom w:val="single" w:sz="4" w:color="000000" w:space="0"/>
+              <w:left w:val="nil" w:sz="0" w:color="000000" w:space="0"/>
+              <w:right w:val="nil" w:sz="0" w:color="000000" w:space="0"/>
+            </w:tcBorders>
+          </w:tcPr>
           <w:p>
             <w:pPr>
               <w:spacing w:after="40" w:before="40" w:line="480" w:lineRule="auto"/>
@@ -1807,7 +1820,14 @@
           <w:tblHeader w:val="0"/>
         </w:trPr>
         <w:tc>
-          <w:tcPr/>
+          <w:tcPr>
+            <w:tcBorders>
+              <w:top w:val="nil" w:sz="0" w:color="000000" w:space="0"/>
+              <w:bottom w:val="single" w:sz="18" w:color="000000" w:space="0"/>
+              <w:left w:val="nil" w:sz="0" w:color="000000" w:space="0"/>
+              <w:right w:val="nil" w:sz="0" w:color="000000" w:space="0"/>
+            </w:tcBorders>
+          </w:tcPr>
           <w:p>
             <w:pPr>
               <w:spacing w:after="40" w:before="40" w:line="480" w:lineRule="auto"/>
@@ -1834,7 +1854,14 @@
           </w:p>
         </w:tc>
         <w:tc>
-          <w:tcPr/>
+          <w:tcPr>
+            <w:tcBorders>
+              <w:top w:val="nil" w:sz="0" w:color="000000" w:space="0"/>
+              <w:bottom w:val="single" w:sz="18" w:color="000000" w:space="0"/>
+              <w:left w:val="nil" w:sz="0" w:color="000000" w:space="0"/>
+              <w:right w:val="nil" w:sz="0" w:color="000000" w:space="0"/>
+            </w:tcBorders>
+          </w:tcPr>
           <w:p>
             <w:pPr>
               <w:spacing w:after="40" w:before="40" w:line="480" w:lineRule="auto"/>
@@ -1854,7 +1881,14 @@
           </w:p>
         </w:tc>
         <w:tc>
-          <w:tcPr/>
+          <w:tcPr>
+            <w:tcBorders>
+              <w:top w:val="nil" w:sz="0" w:color="000000" w:space="0"/>
+              <w:bottom w:val="single" w:sz="18" w:color="000000" w:space="0"/>
+              <w:left w:val="nil" w:sz="0" w:color="000000" w:space="0"/>
+              <w:right w:val="nil" w:sz="0" w:color="000000" w:space="0"/>
+            </w:tcBorders>
+          </w:tcPr>
           <w:p>
             <w:pPr>
               <w:spacing w:after="40" w:before="40" w:line="480" w:lineRule="auto"/>
@@ -3852,14 +3886,6 @@
         <w:tblStyle w:val="Table2"/>
         <w:tblW w:w="8306.0" w:type="dxa"/>
         <w:jc w:val="left"/>
-        <w:tblBorders>
-          <w:top w:color="000000" w:space="0" w:sz="4" w:val="single"/>
-          <w:left w:color="000000" w:space="0" w:sz="4" w:val="single"/>
-          <w:bottom w:color="000000" w:space="0" w:sz="4" w:val="single"/>
-          <w:right w:color="000000" w:space="0" w:sz="4" w:val="single"/>
-          <w:insideH w:color="000000" w:space="0" w:sz="4" w:val="single"/>
-          <w:insideV w:color="000000" w:space="0" w:sz="4" w:val="single"/>
-        </w:tblBorders>
         <w:tblLayout w:type="fixed"/>
         <w:tblLook w:val="0000"/>
       </w:tblPr>
@@ -3882,12 +3908,6 @@
         </w:trPr>
         <w:tc>
           <w:tcPr>
-            <w:tcBorders>
-              <w:top w:color="000000" w:space="0" w:sz="0" w:val="nil"/>
-              <w:left w:color="000000" w:space="0" w:sz="0" w:val="nil"/>
-              <w:bottom w:color="000000" w:space="0" w:sz="0" w:val="nil"/>
-              <w:right w:color="000000" w:space="0" w:sz="0" w:val="nil"/>
-            </w:tcBorders>
             <w:shd w:fill="1b3a6b" w:val="clear"/>
             <w:tcMar>
               <w:top w:w="80.0" w:type="dxa"/>
@@ -3895,6 +3915,12 @@
               <w:bottom w:w="80.0" w:type="dxa"/>
               <w:right w:w="80.0" w:type="dxa"/>
             </w:tcMar>
+            <w:tcBorders>
+              <w:top w:val="single" w:sz="18" w:color="000000" w:space="0"/>
+              <w:bottom w:val="single" w:sz="4" w:color="000000" w:space="0"/>
+              <w:left w:val="nil" w:sz="0" w:color="000000" w:space="0"/>
+              <w:right w:val="nil" w:sz="0" w:color="000000" w:space="0"/>
+            </w:tcBorders>
           </w:tcPr>
           <w:p>
             <w:pPr>
@@ -3925,12 +3951,6 @@
         </w:tc>
         <w:tc>
           <w:tcPr>
-            <w:tcBorders>
-              <w:top w:color="000000" w:space="0" w:sz="0" w:val="nil"/>
-              <w:left w:color="000000" w:space="0" w:sz="0" w:val="nil"/>
-              <w:bottom w:color="000000" w:space="0" w:sz="0" w:val="nil"/>
-              <w:right w:color="000000" w:space="0" w:sz="0" w:val="nil"/>
-            </w:tcBorders>
             <w:shd w:fill="1b3a6b" w:val="clear"/>
             <w:tcMar>
               <w:top w:w="80.0" w:type="dxa"/>
@@ -3938,6 +3958,12 @@
               <w:bottom w:w="80.0" w:type="dxa"/>
               <w:right w:w="80.0" w:type="dxa"/>
             </w:tcMar>
+            <w:tcBorders>
+              <w:top w:val="single" w:sz="18" w:color="000000" w:space="0"/>
+              <w:bottom w:val="single" w:sz="4" w:color="000000" w:space="0"/>
+              <w:left w:val="nil" w:sz="0" w:color="000000" w:space="0"/>
+              <w:right w:val="nil" w:sz="0" w:color="000000" w:space="0"/>
+            </w:tcBorders>
           </w:tcPr>
           <w:p>
             <w:pPr>
@@ -3968,12 +3994,6 @@
         </w:tc>
         <w:tc>
           <w:tcPr>
-            <w:tcBorders>
-              <w:top w:color="000000" w:space="0" w:sz="0" w:val="nil"/>
-              <w:left w:color="000000" w:space="0" w:sz="0" w:val="nil"/>
-              <w:bottom w:color="000000" w:space="0" w:sz="0" w:val="nil"/>
-              <w:right w:color="000000" w:space="0" w:sz="0" w:val="nil"/>
-            </w:tcBorders>
             <w:shd w:fill="1b3a6b" w:val="clear"/>
             <w:tcMar>
               <w:top w:w="80.0" w:type="dxa"/>
@@ -3981,6 +4001,12 @@
               <w:bottom w:w="80.0" w:type="dxa"/>
               <w:right w:w="80.0" w:type="dxa"/>
             </w:tcMar>
+            <w:tcBorders>
+              <w:top w:val="single" w:sz="18" w:color="000000" w:space="0"/>
+              <w:bottom w:val="single" w:sz="4" w:color="000000" w:space="0"/>
+              <w:left w:val="nil" w:sz="0" w:color="000000" w:space="0"/>
+              <w:right w:val="nil" w:sz="0" w:color="000000" w:space="0"/>
+            </w:tcBorders>
           </w:tcPr>
           <w:p>
             <w:pPr>
@@ -4017,12 +4043,6 @@
         </w:trPr>
         <w:tc>
           <w:tcPr>
-            <w:tcBorders>
-              <w:top w:color="000000" w:space="0" w:sz="0" w:val="nil"/>
-              <w:left w:color="000000" w:space="0" w:sz="0" w:val="nil"/>
-              <w:bottom w:color="000000" w:space="0" w:sz="0" w:val="nil"/>
-              <w:right w:color="000000" w:space="0" w:sz="0" w:val="nil"/>
-            </w:tcBorders>
             <w:shd w:fill="ffffff" w:val="clear"/>
             <w:tcMar>
               <w:top w:w="80.0" w:type="dxa"/>
@@ -4052,12 +4072,6 @@
         </w:tc>
         <w:tc>
           <w:tcPr>
-            <w:tcBorders>
-              <w:top w:color="000000" w:space="0" w:sz="0" w:val="nil"/>
-              <w:left w:color="000000" w:space="0" w:sz="0" w:val="nil"/>
-              <w:bottom w:color="000000" w:space="0" w:sz="0" w:val="nil"/>
-              <w:right w:color="000000" w:space="0" w:sz="0" w:val="nil"/>
-            </w:tcBorders>
             <w:shd w:fill="ffffff" w:val="clear"/>
             <w:tcMar>
               <w:top w:w="80.0" w:type="dxa"/>
@@ -4086,12 +4100,6 @@
         </w:tc>
         <w:tc>
           <w:tcPr>
-            <w:tcBorders>
-              <w:top w:color="000000" w:space="0" w:sz="0" w:val="nil"/>
-              <w:left w:color="000000" w:space="0" w:sz="0" w:val="nil"/>
-              <w:bottom w:color="000000" w:space="0" w:sz="0" w:val="nil"/>
-              <w:right w:color="000000" w:space="0" w:sz="0" w:val="nil"/>
-            </w:tcBorders>
             <w:shd w:fill="ffffff" w:val="clear"/>
             <w:tcMar>
               <w:top w:w="80.0" w:type="dxa"/>
@@ -4126,12 +4134,6 @@
         </w:trPr>
         <w:tc>
           <w:tcPr>
-            <w:tcBorders>
-              <w:top w:color="000000" w:space="0" w:sz="0" w:val="nil"/>
-              <w:left w:color="000000" w:space="0" w:sz="0" w:val="nil"/>
-              <w:bottom w:color="000000" w:space="0" w:sz="0" w:val="nil"/>
-              <w:right w:color="000000" w:space="0" w:sz="0" w:val="nil"/>
-            </w:tcBorders>
             <w:shd w:fill="ebf5fb" w:val="clear"/>
             <w:tcMar>
               <w:top w:w="80.0" w:type="dxa"/>
@@ -4139,6 +4141,12 @@
               <w:bottom w:w="80.0" w:type="dxa"/>
               <w:right w:w="80.0" w:type="dxa"/>
             </w:tcMar>
+            <w:tcBorders>
+              <w:top w:val="nil" w:sz="0" w:color="000000" w:space="0"/>
+              <w:bottom w:val="single" w:sz="18" w:color="000000" w:space="0"/>
+              <w:left w:val="nil" w:sz="0" w:color="000000" w:space="0"/>
+              <w:right w:val="nil" w:sz="0" w:color="000000" w:space="0"/>
+            </w:tcBorders>
           </w:tcPr>
           <w:p>
             <w:pPr>
@@ -4161,12 +4169,6 @@
         </w:tc>
         <w:tc>
           <w:tcPr>
-            <w:tcBorders>
-              <w:top w:color="000000" w:space="0" w:sz="0" w:val="nil"/>
-              <w:left w:color="000000" w:space="0" w:sz="0" w:val="nil"/>
-              <w:bottom w:color="000000" w:space="0" w:sz="0" w:val="nil"/>
-              <w:right w:color="000000" w:space="0" w:sz="0" w:val="nil"/>
-            </w:tcBorders>
             <w:shd w:fill="ebf5fb" w:val="clear"/>
             <w:tcMar>
               <w:top w:w="80.0" w:type="dxa"/>
@@ -4174,6 +4176,12 @@
               <w:bottom w:w="80.0" w:type="dxa"/>
               <w:right w:w="80.0" w:type="dxa"/>
             </w:tcMar>
+            <w:tcBorders>
+              <w:top w:val="nil" w:sz="0" w:color="000000" w:space="0"/>
+              <w:bottom w:val="single" w:sz="18" w:color="000000" w:space="0"/>
+              <w:left w:val="nil" w:sz="0" w:color="000000" w:space="0"/>
+              <w:right w:val="nil" w:sz="0" w:color="000000" w:space="0"/>
+            </w:tcBorders>
           </w:tcPr>
           <w:p>
             <w:pPr>
@@ -4195,12 +4203,6 @@
         </w:tc>
         <w:tc>
           <w:tcPr>
-            <w:tcBorders>
-              <w:top w:color="000000" w:space="0" w:sz="0" w:val="nil"/>
-              <w:left w:color="000000" w:space="0" w:sz="0" w:val="nil"/>
-              <w:bottom w:color="000000" w:space="0" w:sz="0" w:val="nil"/>
-              <w:right w:color="000000" w:space="0" w:sz="0" w:val="nil"/>
-            </w:tcBorders>
             <w:shd w:fill="ebf5fb" w:val="clear"/>
             <w:tcMar>
               <w:top w:w="80.0" w:type="dxa"/>
@@ -4208,6 +4210,12 @@
               <w:bottom w:w="80.0" w:type="dxa"/>
               <w:right w:w="80.0" w:type="dxa"/>
             </w:tcMar>
+            <w:tcBorders>
+              <w:top w:val="nil" w:sz="0" w:color="000000" w:space="0"/>
+              <w:bottom w:val="single" w:sz="18" w:color="000000" w:space="0"/>
+              <w:left w:val="nil" w:sz="0" w:color="000000" w:space="0"/>
+              <w:right w:val="nil" w:sz="0" w:color="000000" w:space="0"/>
+            </w:tcBorders>
           </w:tcPr>
           <w:p>
             <w:pPr>
@@ -4348,14 +4356,6 @@
         <w:tblStyle w:val="Table3"/>
         <w:tblW w:w="8310.0" w:type="dxa"/>
         <w:jc w:val="left"/>
-        <w:tblBorders>
-          <w:top w:color="000000" w:space="0" w:sz="4" w:val="single"/>
-          <w:left w:color="000000" w:space="0" w:sz="4" w:val="single"/>
-          <w:bottom w:color="000000" w:space="0" w:sz="4" w:val="single"/>
-          <w:right w:color="000000" w:space="0" w:sz="4" w:val="single"/>
-          <w:insideH w:color="000000" w:space="0" w:sz="4" w:val="single"/>
-          <w:insideV w:color="000000" w:space="0" w:sz="4" w:val="single"/>
-        </w:tblBorders>
         <w:tblLayout w:type="fixed"/>
         <w:tblLook w:val="0000"/>
       </w:tblPr>
@@ -4378,12 +4378,6 @@
         </w:trPr>
         <w:tc>
           <w:tcPr>
-            <w:tcBorders>
-              <w:top w:color="000000" w:space="0" w:sz="0" w:val="nil"/>
-              <w:left w:color="000000" w:space="0" w:sz="0" w:val="nil"/>
-              <w:bottom w:color="000000" w:space="0" w:sz="0" w:val="nil"/>
-              <w:right w:color="000000" w:space="0" w:sz="0" w:val="nil"/>
-            </w:tcBorders>
             <w:shd w:fill="1b3a6b" w:val="clear"/>
             <w:tcMar>
               <w:top w:w="80.0" w:type="dxa"/>
@@ -4391,6 +4385,12 @@
               <w:bottom w:w="80.0" w:type="dxa"/>
               <w:right w:w="80.0" w:type="dxa"/>
             </w:tcMar>
+            <w:tcBorders>
+              <w:top w:val="single" w:sz="18" w:color="000000" w:space="0"/>
+              <w:bottom w:val="single" w:sz="4" w:color="000000" w:space="0"/>
+              <w:left w:val="nil" w:sz="0" w:color="000000" w:space="0"/>
+              <w:right w:val="nil" w:sz="0" w:color="000000" w:space="0"/>
+            </w:tcBorders>
           </w:tcPr>
           <w:p>
             <w:pPr>
@@ -4421,12 +4421,6 @@
         </w:tc>
         <w:tc>
           <w:tcPr>
-            <w:tcBorders>
-              <w:top w:color="000000" w:space="0" w:sz="0" w:val="nil"/>
-              <w:left w:color="000000" w:space="0" w:sz="0" w:val="nil"/>
-              <w:bottom w:color="000000" w:space="0" w:sz="0" w:val="nil"/>
-              <w:right w:color="000000" w:space="0" w:sz="0" w:val="nil"/>
-            </w:tcBorders>
             <w:shd w:fill="1b3a6b" w:val="clear"/>
             <w:tcMar>
               <w:top w:w="80.0" w:type="dxa"/>
@@ -4434,6 +4428,12 @@
               <w:bottom w:w="80.0" w:type="dxa"/>
               <w:right w:w="80.0" w:type="dxa"/>
             </w:tcMar>
+            <w:tcBorders>
+              <w:top w:val="single" w:sz="18" w:color="000000" w:space="0"/>
+              <w:bottom w:val="single" w:sz="4" w:color="000000" w:space="0"/>
+              <w:left w:val="nil" w:sz="0" w:color="000000" w:space="0"/>
+              <w:right w:val="nil" w:sz="0" w:color="000000" w:space="0"/>
+            </w:tcBorders>
           </w:tcPr>
           <w:p>
             <w:pPr>
@@ -4464,12 +4464,6 @@
         </w:tc>
         <w:tc>
           <w:tcPr>
-            <w:tcBorders>
-              <w:top w:color="000000" w:space="0" w:sz="0" w:val="nil"/>
-              <w:left w:color="000000" w:space="0" w:sz="0" w:val="nil"/>
-              <w:bottom w:color="000000" w:space="0" w:sz="0" w:val="nil"/>
-              <w:right w:color="000000" w:space="0" w:sz="0" w:val="nil"/>
-            </w:tcBorders>
             <w:shd w:fill="1b3a6b" w:val="clear"/>
             <w:tcMar>
               <w:top w:w="80.0" w:type="dxa"/>
@@ -4477,6 +4471,12 @@
               <w:bottom w:w="80.0" w:type="dxa"/>
               <w:right w:w="80.0" w:type="dxa"/>
             </w:tcMar>
+            <w:tcBorders>
+              <w:top w:val="single" w:sz="18" w:color="000000" w:space="0"/>
+              <w:bottom w:val="single" w:sz="4" w:color="000000" w:space="0"/>
+              <w:left w:val="nil" w:sz="0" w:color="000000" w:space="0"/>
+              <w:right w:val="nil" w:sz="0" w:color="000000" w:space="0"/>
+            </w:tcBorders>
           </w:tcPr>
           <w:p>
             <w:pPr>
@@ -4513,12 +4513,6 @@
         </w:trPr>
         <w:tc>
           <w:tcPr>
-            <w:tcBorders>
-              <w:top w:color="000000" w:space="0" w:sz="0" w:val="nil"/>
-              <w:left w:color="000000" w:space="0" w:sz="0" w:val="nil"/>
-              <w:bottom w:color="000000" w:space="0" w:sz="0" w:val="nil"/>
-              <w:right w:color="000000" w:space="0" w:sz="0" w:val="nil"/>
-            </w:tcBorders>
             <w:shd w:fill="ffffff" w:val="clear"/>
             <w:tcMar>
               <w:top w:w="80.0" w:type="dxa"/>
@@ -4548,12 +4542,6 @@
         </w:tc>
         <w:tc>
           <w:tcPr>
-            <w:tcBorders>
-              <w:top w:color="000000" w:space="0" w:sz="0" w:val="nil"/>
-              <w:left w:color="000000" w:space="0" w:sz="0" w:val="nil"/>
-              <w:bottom w:color="000000" w:space="0" w:sz="0" w:val="nil"/>
-              <w:right w:color="000000" w:space="0" w:sz="0" w:val="nil"/>
-            </w:tcBorders>
             <w:shd w:fill="ffffff" w:val="clear"/>
             <w:tcMar>
               <w:top w:w="80.0" w:type="dxa"/>
@@ -4583,12 +4571,6 @@
         </w:tc>
         <w:tc>
           <w:tcPr>
-            <w:tcBorders>
-              <w:top w:color="000000" w:space="0" w:sz="0" w:val="nil"/>
-              <w:left w:color="000000" w:space="0" w:sz="0" w:val="nil"/>
-              <w:bottom w:color="000000" w:space="0" w:sz="0" w:val="nil"/>
-              <w:right w:color="000000" w:space="0" w:sz="0" w:val="nil"/>
-            </w:tcBorders>
             <w:shd w:fill="ffffff" w:val="clear"/>
             <w:tcMar>
               <w:top w:w="80.0" w:type="dxa"/>
@@ -4624,12 +4606,6 @@
         </w:trPr>
         <w:tc>
           <w:tcPr>
-            <w:tcBorders>
-              <w:top w:color="000000" w:space="0" w:sz="0" w:val="nil"/>
-              <w:left w:color="000000" w:space="0" w:sz="0" w:val="nil"/>
-              <w:bottom w:color="000000" w:space="0" w:sz="0" w:val="nil"/>
-              <w:right w:color="000000" w:space="0" w:sz="0" w:val="nil"/>
-            </w:tcBorders>
             <w:shd w:fill="ebf5fb" w:val="clear"/>
             <w:tcMar>
               <w:top w:w="80.0" w:type="dxa"/>
@@ -4637,6 +4613,12 @@
               <w:bottom w:w="80.0" w:type="dxa"/>
               <w:right w:w="80.0" w:type="dxa"/>
             </w:tcMar>
+            <w:tcBorders>
+              <w:top w:val="nil" w:sz="0" w:color="000000" w:space="0"/>
+              <w:bottom w:val="single" w:sz="18" w:color="000000" w:space="0"/>
+              <w:left w:val="nil" w:sz="0" w:color="000000" w:space="0"/>
+              <w:right w:val="nil" w:sz="0" w:color="000000" w:space="0"/>
+            </w:tcBorders>
           </w:tcPr>
           <w:p>
             <w:pPr>
@@ -4659,12 +4641,6 @@
         </w:tc>
         <w:tc>
           <w:tcPr>
-            <w:tcBorders>
-              <w:top w:color="000000" w:space="0" w:sz="0" w:val="nil"/>
-              <w:left w:color="000000" w:space="0" w:sz="0" w:val="nil"/>
-              <w:bottom w:color="000000" w:space="0" w:sz="0" w:val="nil"/>
-              <w:right w:color="000000" w:space="0" w:sz="0" w:val="nil"/>
-            </w:tcBorders>
             <w:shd w:fill="ebf5fb" w:val="clear"/>
             <w:tcMar>
               <w:top w:w="80.0" w:type="dxa"/>
@@ -4672,6 +4648,12 @@
               <w:bottom w:w="80.0" w:type="dxa"/>
               <w:right w:w="80.0" w:type="dxa"/>
             </w:tcMar>
+            <w:tcBorders>
+              <w:top w:val="nil" w:sz="0" w:color="000000" w:space="0"/>
+              <w:bottom w:val="single" w:sz="18" w:color="000000" w:space="0"/>
+              <w:left w:val="nil" w:sz="0" w:color="000000" w:space="0"/>
+              <w:right w:val="nil" w:sz="0" w:color="000000" w:space="0"/>
+            </w:tcBorders>
           </w:tcPr>
           <w:p>
             <w:pPr>
@@ -4693,12 +4675,6 @@
         </w:tc>
         <w:tc>
           <w:tcPr>
-            <w:tcBorders>
-              <w:top w:color="000000" w:space="0" w:sz="0" w:val="nil"/>
-              <w:left w:color="000000" w:space="0" w:sz="0" w:val="nil"/>
-              <w:bottom w:color="000000" w:space="0" w:sz="0" w:val="nil"/>
-              <w:right w:color="000000" w:space="0" w:sz="0" w:val="nil"/>
-            </w:tcBorders>
             <w:shd w:fill="ebf5fb" w:val="clear"/>
             <w:tcMar>
               <w:top w:w="80.0" w:type="dxa"/>
@@ -4706,6 +4682,12 @@
               <w:bottom w:w="80.0" w:type="dxa"/>
               <w:right w:w="80.0" w:type="dxa"/>
             </w:tcMar>
+            <w:tcBorders>
+              <w:top w:val="nil" w:sz="0" w:color="000000" w:space="0"/>
+              <w:bottom w:val="single" w:sz="18" w:color="000000" w:space="0"/>
+              <w:left w:val="nil" w:sz="0" w:color="000000" w:space="0"/>
+              <w:right w:val="nil" w:sz="0" w:color="000000" w:space="0"/>
+            </w:tcBorders>
           </w:tcPr>
           <w:p>
             <w:pPr>

</xml_diff>

<commit_message>
Set consistent Georgia font across thesis draft
</commit_message>
<xml_diff>
--- a/thesis/Thesis_Instagram_MH_v11.docx
+++ b/thesis/Thesis_Instagram_MH_v11.docx
@@ -13,6 +13,7 @@
       </w:pPr>
       <w:r>
         <w:rPr>
+          <w:rFonts w:ascii="Georgia" w:hAnsi="Georgia" w:eastAsia="Georgia" w:cs="Georgia"/>
           <w:rtl w:val="0"/>
         </w:rPr>
       </w:r>
@@ -28,6 +29,7 @@
       </w:pPr>
       <w:r>
         <w:rPr>
+          <w:rFonts w:ascii="Georgia" w:hAnsi="Georgia" w:eastAsia="Georgia" w:cs="Georgia"/>
           <w:rtl w:val="0"/>
         </w:rPr>
       </w:r>
@@ -43,6 +45,7 @@
       </w:pPr>
       <w:r>
         <w:rPr>
+          <w:rFonts w:ascii="Georgia" w:hAnsi="Georgia" w:eastAsia="Georgia" w:cs="Georgia"/>
           <w:rtl w:val="0"/>
         </w:rPr>
       </w:r>
@@ -58,6 +61,7 @@
       </w:pPr>
       <w:r>
         <w:rPr>
+          <w:rFonts w:ascii="Georgia" w:hAnsi="Georgia" w:eastAsia="Georgia" w:cs="Georgia"/>
           <w:b w:val="1"/>
           <w:bCs w:val="1"/>
           <w:sz w:val="28"/>
@@ -68,6 +72,7 @@
       </w:r>
       <w:r>
         <w:rPr>
+          <w:rFonts w:ascii="Georgia" w:hAnsi="Georgia" w:eastAsia="Georgia" w:cs="Georgia"/>
           <w:rtl w:val="0"/>
         </w:rPr>
       </w:r>
@@ -80,6 +85,7 @@
       </w:pPr>
       <w:r>
         <w:rPr>
+          <w:rFonts w:ascii="Georgia" w:hAnsi="Georgia" w:eastAsia="Georgia" w:cs="Georgia"/>
           <w:rtl w:val="0"/>
         </w:rPr>
       </w:r>
@@ -95,6 +101,7 @@
       </w:pPr>
       <w:r>
         <w:rPr>
+          <w:rFonts w:ascii="Georgia" w:hAnsi="Georgia" w:eastAsia="Georgia" w:cs="Georgia"/>
           <w:sz w:val="24"/>
           <w:szCs w:val="24"/>
           <w:rtl w:val="0"/>
@@ -113,6 +120,7 @@
       </w:pPr>
       <w:r>
         <w:rPr>
+          <w:rFonts w:ascii="Georgia" w:hAnsi="Georgia" w:eastAsia="Georgia" w:cs="Georgia"/>
           <w:sz w:val="24"/>
           <w:szCs w:val="24"/>
           <w:rtl w:val="0"/>
@@ -131,6 +139,7 @@
       </w:pPr>
       <w:r>
         <w:rPr>
+          <w:rFonts w:ascii="Georgia" w:hAnsi="Georgia" w:eastAsia="Georgia" w:cs="Georgia"/>
           <w:sz w:val="24"/>
           <w:szCs w:val="24"/>
           <w:rtl w:val="0"/>
@@ -149,6 +158,7 @@
       </w:pPr>
       <w:r>
         <w:rPr>
+          <w:rFonts w:ascii="Georgia" w:hAnsi="Georgia" w:eastAsia="Georgia" w:cs="Georgia"/>
           <w:sz w:val="24"/>
           <w:szCs w:val="24"/>
           <w:rtl w:val="0"/>
@@ -167,6 +177,7 @@
       </w:pPr>
       <w:r>
         <w:rPr>
+          <w:rFonts w:ascii="Georgia" w:hAnsi="Georgia" w:eastAsia="Georgia" w:cs="Georgia"/>
           <w:sz w:val="24"/>
           <w:szCs w:val="24"/>
           <w:rtl w:val="0"/>
@@ -185,6 +196,7 @@
       </w:pPr>
       <w:r>
         <w:rPr>
+          <w:rFonts w:ascii="Georgia" w:hAnsi="Georgia" w:eastAsia="Georgia" w:cs="Georgia"/>
           <w:sz w:val="24"/>
           <w:szCs w:val="24"/>
           <w:rtl w:val="0"/>
@@ -203,6 +215,7 @@
       </w:pPr>
       <w:r>
         <w:rPr>
+          <w:rFonts w:ascii="Georgia" w:hAnsi="Georgia" w:eastAsia="Georgia" w:cs="Georgia"/>
           <w:rtl w:val="0"/>
         </w:rPr>
       </w:r>
@@ -218,6 +231,7 @@
       </w:pPr>
       <w:r>
         <w:rPr>
+          <w:rFonts w:ascii="Georgia" w:hAnsi="Georgia" w:eastAsia="Georgia" w:cs="Georgia"/>
           <w:sz w:val="24"/>
           <w:szCs w:val="24"/>
           <w:rtl w:val="0"/>
@@ -236,6 +250,7 @@
       </w:pPr>
       <w:r>
         <w:rPr>
+          <w:rFonts w:ascii="Georgia" w:hAnsi="Georgia" w:eastAsia="Georgia" w:cs="Georgia"/>
           <w:sz w:val="24"/>
           <w:szCs w:val="24"/>
           <w:rtl w:val="0"/>
@@ -256,6 +271,7 @@
       </w:pPr>
       <w:r>
         <w:rPr>
+          <w:rFonts w:ascii="Georgia" w:hAnsi="Georgia" w:eastAsia="Georgia" w:cs="Georgia"/>
           <w:b w:val="1"/>
           <w:bCs w:val="1"/>
           <w:sz w:val="24"/>
@@ -278,6 +294,7 @@
       </w:pPr>
       <w:r>
         <w:rPr>
+          <w:rFonts w:ascii="Georgia" w:hAnsi="Georgia" w:eastAsia="Georgia" w:cs="Georgia"/>
           <w:rtl w:val="0"/>
         </w:rPr>
       </w:r>
@@ -295,6 +312,7 @@
       </w:pPr>
       <w:r>
         <w:rPr>
+          <w:rFonts w:ascii="Georgia" w:hAnsi="Georgia" w:eastAsia="Georgia" w:cs="Georgia"/>
           <w:rtl w:val="0"/>
         </w:rPr>
       </w:r>
@@ -310,6 +328,7 @@
       </w:pPr>
       <w:r>
         <w:rPr>
+          <w:rFonts w:ascii="Georgia" w:hAnsi="Georgia" w:eastAsia="Georgia" w:cs="Georgia"/>
           <w:sz w:val="24"/>
           <w:szCs w:val="24"/>
           <w:rtl w:val="0"/>
@@ -328,6 +347,7 @@
       </w:pPr>
       <w:r>
         <w:rPr>
+          <w:rFonts w:ascii="Georgia" w:hAnsi="Georgia" w:eastAsia="Georgia" w:cs="Georgia"/>
           <w:rtl w:val="0"/>
         </w:rPr>
       </w:r>
@@ -343,6 +363,7 @@
       </w:pPr>
       <w:r>
         <w:rPr>
+          <w:rFonts w:ascii="Georgia" w:hAnsi="Georgia" w:eastAsia="Georgia" w:cs="Georgia"/>
           <w:rtl w:val="0"/>
         </w:rPr>
       </w:r>
@@ -358,6 +379,7 @@
       </w:pPr>
       <w:r>
         <w:rPr>
+          <w:rFonts w:ascii="Georgia" w:hAnsi="Georgia" w:eastAsia="Georgia" w:cs="Georgia"/>
           <w:b w:val="1"/>
           <w:bCs w:val="1"/>
           <w:sz w:val="24"/>
@@ -368,6 +390,7 @@
       </w:r>
       <w:r>
         <w:rPr>
+          <w:rFonts w:ascii="Georgia" w:hAnsi="Georgia" w:eastAsia="Georgia" w:cs="Georgia"/>
           <w:rtl w:val="0"/>
         </w:rPr>
       </w:r>
@@ -389,6 +412,7 @@
       </w:pPr>
       <w:r>
         <w:rPr>
+          <w:rFonts w:ascii="Georgia" w:hAnsi="Georgia" w:eastAsia="Georgia" w:cs="Georgia"/>
           <w:sz w:val="24"/>
           <w:szCs w:val="24"/>
           <w:rtl w:val="0"/>
@@ -404,6 +428,7 @@
       </w:pPr>
       <w:r>
         <w:rPr>
+          <w:rFonts w:ascii="Georgia" w:hAnsi="Georgia" w:eastAsia="Georgia" w:cs="Georgia"/>
           <w:b w:val="1"/>
           <w:bCs w:val="1"/>
           <w:sz w:val="28"/>
@@ -414,6 +439,7 @@
       </w:r>
       <w:r>
         <w:rPr>
+          <w:rFonts w:ascii="Georgia" w:hAnsi="Georgia" w:eastAsia="Georgia" w:cs="Georgia"/>
           <w:rtl w:val="0"/>
         </w:rPr>
       </w:r>
@@ -432,6 +458,7 @@
       </w:pPr>
       <w:r>
         <w:rPr>
+          <w:rFonts w:ascii="Georgia" w:hAnsi="Georgia" w:eastAsia="Georgia" w:cs="Georgia"/>
           <w:rtl w:val="0"/>
         </w:rPr>
       </w:r>
@@ -445,6 +472,7 @@
       </w:pPr>
       <w:r>
         <w:rPr>
+          <w:rFonts w:ascii="Georgia" w:hAnsi="Georgia" w:eastAsia="Georgia" w:cs="Georgia"/>
           <w:b w:val="1"/>
           <w:bCs w:val="1"/>
           <w:sz w:val="24"/>
@@ -455,6 +483,7 @@
       </w:r>
       <w:r>
         <w:rPr>
+          <w:rFonts w:ascii="Georgia" w:hAnsi="Georgia" w:eastAsia="Georgia" w:cs="Georgia"/>
           <w:rtl w:val="0"/>
         </w:rPr>
       </w:r>
@@ -468,6 +497,7 @@
       </w:pPr>
       <w:r>
         <w:rPr>
+          <w:rFonts w:ascii="Georgia" w:hAnsi="Georgia" w:eastAsia="Georgia" w:cs="Georgia"/>
           <w:sz w:val="22"/>
           <w:szCs w:val="22"/>
           <w:rtl w:val="0"/>
@@ -476,6 +506,7 @@
       </w:r>
       <w:r>
         <w:rPr>
+          <w:rFonts w:ascii="Georgia" w:hAnsi="Georgia" w:eastAsia="Georgia" w:cs="Georgia"/>
           <w:rtl w:val="0"/>
         </w:rPr>
       </w:r>
@@ -489,6 +520,7 @@
       </w:pPr>
       <w:r>
         <w:rPr>
+          <w:rFonts w:ascii="Georgia" w:hAnsi="Georgia" w:eastAsia="Georgia" w:cs="Georgia"/>
           <w:sz w:val="22"/>
           <w:szCs w:val="22"/>
           <w:rtl w:val="0"/>
@@ -497,6 +529,7 @@
       </w:r>
       <w:r>
         <w:rPr>
+          <w:rFonts w:ascii="Georgia" w:hAnsi="Georgia" w:eastAsia="Georgia" w:cs="Georgia"/>
           <w:rtl w:val="0"/>
         </w:rPr>
       </w:r>
@@ -510,6 +543,7 @@
       </w:pPr>
       <w:r>
         <w:rPr>
+          <w:rFonts w:ascii="Georgia" w:hAnsi="Georgia" w:eastAsia="Georgia" w:cs="Georgia"/>
           <w:i w:val="1"/>
           <w:iCs w:val="1"/>
           <w:sz w:val="24"/>
@@ -520,6 +554,7 @@
       </w:r>
       <w:r>
         <w:rPr>
+          <w:rFonts w:ascii="Georgia" w:hAnsi="Georgia" w:eastAsia="Georgia" w:cs="Georgia"/>
           <w:rtl w:val="0"/>
         </w:rPr>
       </w:r>
@@ -533,6 +568,7 @@
       </w:pPr>
       <w:r>
         <w:rPr>
+          <w:rFonts w:ascii="Georgia" w:hAnsi="Georgia" w:eastAsia="Georgia" w:cs="Georgia"/>
           <w:sz w:val="22"/>
           <w:szCs w:val="22"/>
           <w:rtl w:val="0"/>
@@ -541,6 +577,7 @@
       </w:r>
       <w:r>
         <w:rPr>
+          <w:rFonts w:ascii="Georgia" w:hAnsi="Georgia" w:eastAsia="Georgia" w:cs="Georgia"/>
           <w:rtl w:val="0"/>
         </w:rPr>
       </w:r>
@@ -554,6 +591,7 @@
       </w:pPr>
       <w:r>
         <w:rPr>
+          <w:rFonts w:ascii="Georgia" w:hAnsi="Georgia" w:eastAsia="Georgia" w:cs="Georgia"/>
           <w:sz w:val="22"/>
           <w:szCs w:val="22"/>
           <w:rtl w:val="0"/>
@@ -562,6 +600,7 @@
       </w:r>
       <w:r>
         <w:rPr>
+          <w:rFonts w:ascii="Georgia" w:hAnsi="Georgia" w:eastAsia="Georgia" w:cs="Georgia"/>
           <w:rtl w:val="0"/>
         </w:rPr>
       </w:r>
@@ -575,6 +614,7 @@
       </w:pPr>
       <w:r>
         <w:rPr>
+          <w:rFonts w:ascii="Georgia" w:hAnsi="Georgia" w:eastAsia="Georgia" w:cs="Georgia"/>
           <w:sz w:val="22"/>
           <w:szCs w:val="22"/>
           <w:rtl w:val="0"/>
@@ -583,6 +623,7 @@
       </w:r>
       <w:r>
         <w:rPr>
+          <w:rFonts w:ascii="Georgia" w:hAnsi="Georgia" w:eastAsia="Georgia" w:cs="Georgia"/>
           <w:rtl w:val="0"/>
         </w:rPr>
       </w:r>
@@ -596,6 +637,7 @@
       </w:pPr>
       <w:r>
         <w:rPr>
+          <w:rFonts w:ascii="Georgia" w:hAnsi="Georgia" w:eastAsia="Georgia" w:cs="Georgia"/>
           <w:sz w:val="22"/>
           <w:szCs w:val="22"/>
           <w:rtl w:val="0"/>
@@ -604,6 +646,7 @@
       </w:r>
       <w:r>
         <w:rPr>
+          <w:rFonts w:ascii="Georgia" w:hAnsi="Georgia" w:eastAsia="Georgia" w:cs="Georgia"/>
           <w:rtl w:val="0"/>
         </w:rPr>
       </w:r>
@@ -617,6 +660,7 @@
       </w:pPr>
       <w:r>
         <w:rPr>
+          <w:rFonts w:ascii="Georgia" w:hAnsi="Georgia" w:eastAsia="Georgia" w:cs="Georgia"/>
           <w:sz w:val="22"/>
           <w:szCs w:val="22"/>
           <w:rtl w:val="0"/>
@@ -625,6 +669,7 @@
       </w:r>
       <w:r>
         <w:rPr>
+          <w:rFonts w:ascii="Georgia" w:hAnsi="Georgia" w:eastAsia="Georgia" w:cs="Georgia"/>
           <w:rtl w:val="0"/>
         </w:rPr>
       </w:r>
@@ -638,6 +683,7 @@
       </w:pPr>
       <w:r>
         <w:rPr>
+          <w:rFonts w:ascii="Georgia" w:hAnsi="Georgia" w:eastAsia="Georgia" w:cs="Georgia"/>
           <w:sz w:val="22"/>
           <w:szCs w:val="22"/>
           <w:rtl w:val="0"/>
@@ -646,6 +692,7 @@
       </w:r>
       <w:r>
         <w:rPr>
+          <w:rFonts w:ascii="Georgia" w:hAnsi="Georgia" w:eastAsia="Georgia" w:cs="Georgia"/>
           <w:rtl w:val="0"/>
         </w:rPr>
       </w:r>
@@ -659,6 +706,7 @@
       </w:pPr>
       <w:r>
         <w:rPr>
+          <w:rFonts w:ascii="Georgia" w:hAnsi="Georgia" w:eastAsia="Georgia" w:cs="Georgia"/>
           <w:sz w:val="22"/>
           <w:szCs w:val="22"/>
           <w:rtl w:val="0"/>
@@ -667,6 +715,7 @@
       </w:r>
       <w:r>
         <w:rPr>
+          <w:rFonts w:ascii="Georgia" w:hAnsi="Georgia" w:eastAsia="Georgia" w:cs="Georgia"/>
           <w:rtl w:val="0"/>
         </w:rPr>
       </w:r>
@@ -680,6 +729,7 @@
       </w:pPr>
       <w:r>
         <w:rPr>
+          <w:rFonts w:ascii="Georgia" w:hAnsi="Georgia" w:eastAsia="Georgia" w:cs="Georgia"/>
           <w:sz w:val="22"/>
           <w:szCs w:val="22"/>
           <w:rtl w:val="0"/>
@@ -688,6 +738,7 @@
       </w:r>
       <w:r>
         <w:rPr>
+          <w:rFonts w:ascii="Georgia" w:hAnsi="Georgia" w:eastAsia="Georgia" w:cs="Georgia"/>
           <w:rtl w:val="0"/>
         </w:rPr>
       </w:r>
@@ -701,6 +752,7 @@
       </w:pPr>
       <w:r>
         <w:rPr>
+          <w:rFonts w:ascii="Georgia" w:hAnsi="Georgia" w:eastAsia="Georgia" w:cs="Georgia"/>
           <w:sz w:val="22"/>
           <w:szCs w:val="22"/>
           <w:rtl w:val="0"/>
@@ -709,6 +761,7 @@
       </w:r>
       <w:r>
         <w:rPr>
+          <w:rFonts w:ascii="Georgia" w:hAnsi="Georgia" w:eastAsia="Georgia" w:cs="Georgia"/>
           <w:rtl w:val="0"/>
         </w:rPr>
       </w:r>
@@ -722,6 +775,7 @@
       </w:pPr>
       <w:r>
         <w:rPr>
+          <w:rFonts w:ascii="Georgia" w:hAnsi="Georgia" w:eastAsia="Georgia" w:cs="Georgia"/>
           <w:i w:val="1"/>
           <w:iCs w:val="1"/>
           <w:sz w:val="24"/>
@@ -732,6 +786,7 @@
       </w:r>
       <w:r>
         <w:rPr>
+          <w:rFonts w:ascii="Georgia" w:hAnsi="Georgia" w:eastAsia="Georgia" w:cs="Georgia"/>
           <w:rtl w:val="0"/>
         </w:rPr>
       </w:r>
@@ -745,6 +800,7 @@
       </w:pPr>
       <w:r>
         <w:rPr>
+          <w:rFonts w:ascii="Georgia" w:hAnsi="Georgia" w:eastAsia="Georgia" w:cs="Georgia"/>
           <w:sz w:val="22"/>
           <w:szCs w:val="22"/>
           <w:rtl w:val="0"/>
@@ -753,6 +809,7 @@
       </w:r>
       <w:r>
         <w:rPr>
+          <w:rFonts w:ascii="Georgia" w:hAnsi="Georgia" w:eastAsia="Georgia" w:cs="Georgia"/>
           <w:rtl w:val="0"/>
         </w:rPr>
       </w:r>
@@ -766,6 +823,7 @@
       </w:pPr>
       <w:r>
         <w:rPr>
+          <w:rFonts w:ascii="Georgia" w:hAnsi="Georgia" w:eastAsia="Georgia" w:cs="Georgia"/>
           <w:sz w:val="22"/>
           <w:szCs w:val="22"/>
           <w:rtl w:val="0"/>
@@ -774,6 +832,7 @@
       </w:r>
       <w:r>
         <w:rPr>
+          <w:rFonts w:ascii="Georgia" w:hAnsi="Georgia" w:eastAsia="Georgia" w:cs="Georgia"/>
           <w:rtl w:val="0"/>
         </w:rPr>
       </w:r>
@@ -787,6 +846,7 @@
       </w:pPr>
       <w:r>
         <w:rPr>
+          <w:rFonts w:ascii="Georgia" w:hAnsi="Georgia" w:eastAsia="Georgia" w:cs="Georgia"/>
           <w:sz w:val="22"/>
           <w:szCs w:val="22"/>
           <w:rtl w:val="0"/>
@@ -795,6 +855,7 @@
       </w:r>
       <w:r>
         <w:rPr>
+          <w:rFonts w:ascii="Georgia" w:hAnsi="Georgia" w:eastAsia="Georgia" w:cs="Georgia"/>
           <w:rtl w:val="0"/>
         </w:rPr>
       </w:r>
@@ -808,6 +869,7 @@
       </w:pPr>
       <w:r>
         <w:rPr>
+          <w:rFonts w:ascii="Georgia" w:hAnsi="Georgia" w:eastAsia="Georgia" w:cs="Georgia"/>
           <w:sz w:val="22"/>
           <w:szCs w:val="22"/>
           <w:rtl w:val="0"/>
@@ -816,6 +878,7 @@
       </w:r>
       <w:r>
         <w:rPr>
+          <w:rFonts w:ascii="Georgia" w:hAnsi="Georgia" w:eastAsia="Georgia" w:cs="Georgia"/>
           <w:rtl w:val="0"/>
         </w:rPr>
       </w:r>
@@ -829,6 +892,7 @@
       </w:pPr>
       <w:r>
         <w:rPr>
+          <w:rFonts w:ascii="Georgia" w:hAnsi="Georgia" w:eastAsia="Georgia" w:cs="Georgia"/>
           <w:sz w:val="22"/>
           <w:szCs w:val="22"/>
           <w:rtl w:val="0"/>
@@ -837,6 +901,7 @@
       </w:r>
       <w:r>
         <w:rPr>
+          <w:rFonts w:ascii="Georgia" w:hAnsi="Georgia" w:eastAsia="Georgia" w:cs="Georgia"/>
           <w:rtl w:val="0"/>
         </w:rPr>
       </w:r>
@@ -853,6 +918,7 @@
       </w:pPr>
       <w:r>
         <w:rPr>
+          <w:rFonts w:ascii="Georgia" w:hAnsi="Georgia" w:eastAsia="Georgia" w:cs="Georgia"/>
           <w:sz w:val="22"/>
           <w:szCs w:val="22"/>
           <w:rtl w:val="0"/>
@@ -869,6 +935,7 @@
       </w:pPr>
       <w:r>
         <w:rPr>
+          <w:rFonts w:ascii="Georgia" w:hAnsi="Georgia" w:eastAsia="Georgia" w:cs="Georgia"/>
           <w:rtl w:val="0"/>
         </w:rPr>
       </w:r>
@@ -886,6 +953,7 @@
       </w:pPr>
       <w:r>
         <w:rPr>
+          <w:rFonts w:ascii="Georgia" w:hAnsi="Georgia" w:eastAsia="Georgia" w:cs="Georgia"/>
           <w:i w:val="1"/>
           <w:iCs w:val="1"/>
           <w:sz w:val="24"/>
@@ -904,6 +972,7 @@
       </w:pPr>
       <w:r>
         <w:rPr>
+          <w:rFonts w:ascii="Georgia" w:hAnsi="Georgia" w:eastAsia="Georgia" w:cs="Georgia"/>
           <w:rtl w:val="0"/>
         </w:rPr>
       </w:r>
@@ -917,6 +986,7 @@
       </w:pPr>
       <w:r>
         <w:rPr>
+          <w:rFonts w:ascii="Georgia" w:hAnsi="Georgia" w:eastAsia="Georgia" w:cs="Georgia"/>
           <w:sz w:val="22"/>
           <w:szCs w:val="22"/>
           <w:rtl w:val="0"/>
@@ -925,6 +995,7 @@
       </w:r>
       <w:r>
         <w:rPr>
+          <w:rFonts w:ascii="Georgia" w:hAnsi="Georgia" w:eastAsia="Georgia" w:cs="Georgia"/>
           <w:rtl w:val="0"/>
         </w:rPr>
       </w:r>
@@ -938,6 +1009,7 @@
       </w:pPr>
       <w:r>
         <w:rPr>
+          <w:rFonts w:ascii="Georgia" w:hAnsi="Georgia" w:eastAsia="Georgia" w:cs="Georgia"/>
           <w:sz w:val="22"/>
           <w:szCs w:val="22"/>
           <w:rtl w:val="0"/>
@@ -946,6 +1018,7 @@
       </w:r>
       <w:r>
         <w:rPr>
+          <w:rFonts w:ascii="Georgia" w:hAnsi="Georgia" w:eastAsia="Georgia" w:cs="Georgia"/>
           <w:rtl w:val="0"/>
         </w:rPr>
       </w:r>
@@ -959,6 +1032,7 @@
       </w:pPr>
       <w:r>
         <w:rPr>
+          <w:rFonts w:ascii="Georgia" w:hAnsi="Georgia" w:eastAsia="Georgia" w:cs="Georgia"/>
           <w:sz w:val="22"/>
           <w:szCs w:val="22"/>
           <w:rtl w:val="0"/>
@@ -967,6 +1041,7 @@
       </w:r>
       <w:r>
         <w:rPr>
+          <w:rFonts w:ascii="Georgia" w:hAnsi="Georgia" w:eastAsia="Georgia" w:cs="Georgia"/>
           <w:rtl w:val="0"/>
         </w:rPr>
       </w:r>
@@ -980,6 +1055,7 @@
       </w:pPr>
       <w:r>
         <w:rPr>
+          <w:rFonts w:ascii="Georgia" w:hAnsi="Georgia" w:eastAsia="Georgia" w:cs="Georgia"/>
           <w:sz w:val="22"/>
           <w:szCs w:val="22"/>
           <w:rtl w:val="0"/>
@@ -988,6 +1064,7 @@
       </w:r>
       <w:r>
         <w:rPr>
+          <w:rFonts w:ascii="Georgia" w:hAnsi="Georgia" w:eastAsia="Georgia" w:cs="Georgia"/>
           <w:rtl w:val="0"/>
         </w:rPr>
       </w:r>
@@ -1001,6 +1078,7 @@
       </w:pPr>
       <w:r>
         <w:rPr>
+          <w:rFonts w:ascii="Georgia" w:hAnsi="Georgia" w:eastAsia="Georgia" w:cs="Georgia"/>
           <w:sz w:val="22"/>
           <w:szCs w:val="22"/>
           <w:rtl w:val="0"/>
@@ -1009,6 +1087,7 @@
       </w:r>
       <w:r>
         <w:rPr>
+          <w:rFonts w:ascii="Georgia" w:hAnsi="Georgia" w:eastAsia="Georgia" w:cs="Georgia"/>
           <w:rtl w:val="0"/>
         </w:rPr>
       </w:r>
@@ -1022,6 +1101,7 @@
       </w:pPr>
       <w:r>
         <w:rPr>
+          <w:rFonts w:ascii="Georgia" w:hAnsi="Georgia" w:eastAsia="Georgia" w:cs="Georgia"/>
           <w:i w:val="1"/>
           <w:iCs w:val="1"/>
           <w:sz w:val="24"/>
@@ -1032,6 +1112,7 @@
       </w:r>
       <w:r>
         <w:rPr>
+          <w:rFonts w:ascii="Georgia" w:hAnsi="Georgia" w:eastAsia="Georgia" w:cs="Georgia"/>
           <w:rtl w:val="0"/>
         </w:rPr>
       </w:r>
@@ -1045,6 +1126,7 @@
       </w:pPr>
       <w:r>
         <w:rPr>
+          <w:rFonts w:ascii="Georgia" w:hAnsi="Georgia" w:eastAsia="Georgia" w:cs="Georgia"/>
           <w:i w:val="0"/>
           <w:iCs w:val="0"/>
           <w:sz w:val="22"/>
@@ -1055,6 +1137,7 @@
       </w:r>
       <w:r>
         <w:rPr>
+          <w:rFonts w:ascii="Georgia" w:hAnsi="Georgia" w:eastAsia="Georgia" w:cs="Georgia"/>
           <w:rtl w:val="0"/>
         </w:rPr>
       </w:r>
@@ -1068,6 +1151,7 @@
       </w:pPr>
       <w:r>
         <w:rPr>
+          <w:rFonts w:ascii="Georgia" w:hAnsi="Georgia" w:eastAsia="Georgia" w:cs="Georgia"/>
           <w:i w:val="0"/>
           <w:iCs w:val="0"/>
           <w:sz w:val="22"/>
@@ -1078,6 +1162,7 @@
       </w:r>
       <w:r>
         <w:rPr>
+          <w:rFonts w:ascii="Georgia" w:hAnsi="Georgia" w:eastAsia="Georgia" w:cs="Georgia"/>
           <w:rtl w:val="0"/>
         </w:rPr>
       </w:r>
@@ -1091,6 +1176,7 @@
       </w:pPr>
       <w:r>
         <w:rPr>
+          <w:rFonts w:ascii="Georgia" w:hAnsi="Georgia" w:eastAsia="Georgia" w:cs="Georgia"/>
           <w:i w:val="0"/>
           <w:iCs w:val="0"/>
           <w:sz w:val="22"/>
@@ -1101,6 +1187,7 @@
       </w:r>
       <w:r>
         <w:rPr>
+          <w:rFonts w:ascii="Georgia" w:hAnsi="Georgia" w:eastAsia="Georgia" w:cs="Georgia"/>
           <w:rtl w:val="0"/>
         </w:rPr>
       </w:r>
@@ -1114,6 +1201,7 @@
       </w:pPr>
       <w:r>
         <w:rPr>
+          <w:rFonts w:ascii="Georgia" w:hAnsi="Georgia" w:eastAsia="Georgia" w:cs="Georgia"/>
           <w:i w:val="0"/>
           <w:iCs w:val="0"/>
           <w:sz w:val="22"/>
@@ -1124,6 +1212,7 @@
       </w:r>
       <w:r>
         <w:rPr>
+          <w:rFonts w:ascii="Georgia" w:hAnsi="Georgia" w:eastAsia="Georgia" w:cs="Georgia"/>
           <w:rtl w:val="0"/>
         </w:rPr>
       </w:r>
@@ -1137,6 +1226,7 @@
       </w:pPr>
       <w:r>
         <w:rPr>
+          <w:rFonts w:ascii="Georgia" w:hAnsi="Georgia" w:eastAsia="Georgia" w:cs="Georgia"/>
           <w:i w:val="0"/>
           <w:iCs w:val="0"/>
           <w:sz w:val="22"/>
@@ -1147,6 +1237,7 @@
       </w:r>
       <w:r>
         <w:rPr>
+          <w:rFonts w:ascii="Georgia" w:hAnsi="Georgia" w:eastAsia="Georgia" w:cs="Georgia"/>
           <w:rtl w:val="0"/>
         </w:rPr>
       </w:r>
@@ -1160,6 +1251,7 @@
       </w:pPr>
       <w:r>
         <w:rPr>
+          <w:rFonts w:ascii="Georgia" w:hAnsi="Georgia" w:eastAsia="Georgia" w:cs="Georgia"/>
           <w:i w:val="1"/>
           <w:iCs w:val="1"/>
           <w:sz w:val="24"/>
@@ -1170,6 +1262,7 @@
       </w:r>
       <w:r>
         <w:rPr>
+          <w:rFonts w:ascii="Georgia" w:hAnsi="Georgia" w:eastAsia="Georgia" w:cs="Georgia"/>
           <w:rtl w:val="0"/>
         </w:rPr>
       </w:r>
@@ -1183,6 +1276,7 @@
       </w:pPr>
       <w:r>
         <w:rPr>
+          <w:rFonts w:ascii="Georgia" w:hAnsi="Georgia" w:eastAsia="Georgia" w:cs="Georgia"/>
           <w:sz w:val="22"/>
           <w:szCs w:val="22"/>
           <w:rtl w:val="0"/>
@@ -1191,6 +1285,7 @@
       </w:r>
       <w:r>
         <w:rPr>
+          <w:rFonts w:ascii="Georgia" w:hAnsi="Georgia" w:eastAsia="Georgia" w:cs="Georgia"/>
           <w:rtl w:val="0"/>
         </w:rPr>
       </w:r>
@@ -1204,6 +1299,7 @@
       </w:pPr>
       <w:r>
         <w:rPr>
+          <w:rFonts w:ascii="Georgia" w:hAnsi="Georgia" w:eastAsia="Georgia" w:cs="Georgia"/>
           <w:sz w:val="22"/>
           <w:szCs w:val="22"/>
           <w:rtl w:val="0"/>
@@ -1212,6 +1308,7 @@
       </w:r>
       <w:r>
         <w:rPr>
+          <w:rFonts w:ascii="Georgia" w:hAnsi="Georgia" w:eastAsia="Georgia" w:cs="Georgia"/>
           <w:rtl w:val="0"/>
         </w:rPr>
       </w:r>
@@ -1225,6 +1322,7 @@
       </w:pPr>
       <w:r>
         <w:rPr>
+          <w:rFonts w:ascii="Georgia" w:hAnsi="Georgia" w:eastAsia="Georgia" w:cs="Georgia"/>
           <w:sz w:val="22"/>
           <w:szCs w:val="22"/>
           <w:rtl w:val="0"/>
@@ -1233,6 +1331,7 @@
       </w:r>
       <w:r>
         <w:rPr>
+          <w:rFonts w:ascii="Georgia" w:hAnsi="Georgia" w:eastAsia="Georgia" w:cs="Georgia"/>
           <w:rtl w:val="0"/>
         </w:rPr>
       </w:r>
@@ -1246,6 +1345,7 @@
       </w:pPr>
       <w:r>
         <w:rPr>
+          <w:rFonts w:ascii="Georgia" w:hAnsi="Georgia" w:eastAsia="Georgia" w:cs="Georgia"/>
           <w:sz w:val="22"/>
           <w:szCs w:val="22"/>
           <w:rtl w:val="0"/>
@@ -1254,6 +1354,7 @@
       </w:r>
       <w:r>
         <w:rPr>
+          <w:rFonts w:ascii="Georgia" w:hAnsi="Georgia" w:eastAsia="Georgia" w:cs="Georgia"/>
           <w:rtl w:val="0"/>
         </w:rPr>
       </w:r>
@@ -1267,6 +1368,7 @@
       </w:pPr>
       <w:r>
         <w:rPr>
+          <w:rFonts w:ascii="Georgia" w:hAnsi="Georgia" w:eastAsia="Georgia" w:cs="Georgia"/>
           <w:b w:val="1"/>
           <w:bCs w:val="1"/>
           <w:sz w:val="24"/>
@@ -1277,6 +1379,7 @@
       </w:r>
       <w:r>
         <w:rPr>
+          <w:rFonts w:ascii="Georgia" w:hAnsi="Georgia" w:eastAsia="Georgia" w:cs="Georgia"/>
           <w:rtl w:val="0"/>
         </w:rPr>
       </w:r>
@@ -1295,24 +1398,27 @@
       </w:pPr>
       <w:r>
         <w:rPr>
+          <w:rFonts w:ascii="Georgia" w:hAnsi="Georgia" w:eastAsia="Georgia" w:cs="Georgia"/>
           <w:rtl w:val="0"/>
         </w:rPr>
         <w:t xml:space="preserve">This study examines how mental health advocacy pages on Instagram employ lexical and grammatical strategies to construct hope and empowerment in captions, and how public comments respond to those strategies. Specifically, it aims to answer the following questions:</w:t>
       </w:r>
       <w:r>
         <w:rPr>
-          <w:rtl w:val="0"/>
-        </w:rPr>
-      </w:r>
-    </w:p>
-    <w:p>
-      <w:pPr>
-        <w:spacing w:line="480" w:lineRule="auto"/>
-        <w:jc w:val="both"/>
-        <w:rPr/>
-      </w:pPr>
-      <w:r>
-        <w:rPr>
+          <w:rFonts w:ascii="Georgia" w:hAnsi="Georgia" w:eastAsia="Georgia" w:cs="Georgia"/>
+          <w:rtl w:val="0"/>
+        </w:rPr>
+      </w:r>
+    </w:p>
+    <w:p>
+      <w:pPr>
+        <w:spacing w:line="480" w:lineRule="auto"/>
+        <w:jc w:val="both"/>
+        <w:rPr/>
+      </w:pPr>
+      <w:r>
+        <w:rPr>
+          <w:rFonts w:ascii="Georgia" w:hAnsi="Georgia" w:eastAsia="Georgia" w:cs="Georgia"/>
           <w:sz w:val="22"/>
           <w:szCs w:val="22"/>
           <w:rtl w:val="0"/>
@@ -1321,18 +1427,20 @@
       </w:r>
       <w:r>
         <w:rPr>
-          <w:rtl w:val="0"/>
-        </w:rPr>
-      </w:r>
-    </w:p>
-    <w:p>
-      <w:pPr>
-        <w:spacing w:line="480" w:lineRule="auto"/>
-        <w:jc w:val="both"/>
-        <w:rPr/>
-      </w:pPr>
-      <w:r>
-        <w:rPr>
+          <w:rFonts w:ascii="Georgia" w:hAnsi="Georgia" w:eastAsia="Georgia" w:cs="Georgia"/>
+          <w:rtl w:val="0"/>
+        </w:rPr>
+      </w:r>
+    </w:p>
+    <w:p>
+      <w:pPr>
+        <w:spacing w:line="480" w:lineRule="auto"/>
+        <w:jc w:val="both"/>
+        <w:rPr/>
+      </w:pPr>
+      <w:r>
+        <w:rPr>
+          <w:rFonts w:ascii="Georgia" w:hAnsi="Georgia" w:eastAsia="Georgia" w:cs="Georgia"/>
           <w:sz w:val="22"/>
           <w:szCs w:val="22"/>
           <w:rtl w:val="0"/>
@@ -1341,18 +1449,20 @@
       </w:r>
       <w:r>
         <w:rPr>
-          <w:rtl w:val="0"/>
-        </w:rPr>
-      </w:r>
-    </w:p>
-    <w:p>
-      <w:pPr>
-        <w:spacing w:line="480" w:lineRule="auto"/>
-        <w:jc w:val="both"/>
-        <w:rPr/>
-      </w:pPr>
-      <w:r>
-        <w:rPr>
+          <w:rFonts w:ascii="Georgia" w:hAnsi="Georgia" w:eastAsia="Georgia" w:cs="Georgia"/>
+          <w:rtl w:val="0"/>
+        </w:rPr>
+      </w:r>
+    </w:p>
+    <w:p>
+      <w:pPr>
+        <w:spacing w:line="480" w:lineRule="auto"/>
+        <w:jc w:val="both"/>
+        <w:rPr/>
+      </w:pPr>
+      <w:r>
+        <w:rPr>
+          <w:rFonts w:ascii="Georgia" w:hAnsi="Georgia" w:eastAsia="Georgia" w:cs="Georgia"/>
           <w:sz w:val="22"/>
           <w:szCs w:val="22"/>
           <w:rtl w:val="0"/>
@@ -1361,6 +1471,7 @@
       </w:r>
       <w:r>
         <w:rPr>
+          <w:rFonts w:ascii="Georgia" w:hAnsi="Georgia" w:eastAsia="Georgia" w:cs="Georgia"/>
           <w:rtl w:val="0"/>
         </w:rPr>
       </w:r>
@@ -1374,6 +1485,7 @@
       </w:pPr>
       <w:r>
         <w:rPr>
+          <w:rFonts w:ascii="Georgia" w:hAnsi="Georgia" w:eastAsia="Georgia" w:cs="Georgia"/>
           <w:b w:val="1"/>
           <w:bCs w:val="1"/>
           <w:sz w:val="24"/>
@@ -1384,6 +1496,7 @@
       </w:r>
       <w:r>
         <w:rPr>
+          <w:rFonts w:ascii="Georgia" w:hAnsi="Georgia" w:eastAsia="Georgia" w:cs="Georgia"/>
           <w:rtl w:val="0"/>
         </w:rPr>
       </w:r>
@@ -1397,6 +1510,7 @@
       </w:pPr>
       <w:r>
         <w:rPr>
+          <w:rFonts w:ascii="Georgia" w:hAnsi="Georgia" w:eastAsia="Georgia" w:cs="Georgia"/>
           <w:sz w:val="22"/>
           <w:szCs w:val="22"/>
           <w:rtl w:val="0"/>
@@ -1405,6 +1519,7 @@
       </w:r>
       <w:r>
         <w:rPr>
+          <w:rFonts w:ascii="Georgia" w:hAnsi="Georgia" w:eastAsia="Georgia" w:cs="Georgia"/>
           <w:rtl w:val="0"/>
         </w:rPr>
       </w:r>
@@ -1420,6 +1535,7 @@
       <w:bookmarkEnd w:id="0"/>
       <w:r>
         <w:rPr>
+          <w:rFonts w:ascii="Georgia" w:hAnsi="Georgia" w:eastAsia="Georgia" w:cs="Georgia"/>
           <w:sz w:val="22"/>
           <w:szCs w:val="22"/>
           <w:rtl w:val="0"/>
@@ -1428,6 +1544,7 @@
       </w:r>
       <w:r>
         <w:rPr>
+          <w:rFonts w:ascii="Georgia" w:hAnsi="Georgia" w:eastAsia="Georgia" w:cs="Georgia"/>
           <w:rtl w:val="0"/>
         </w:rPr>
       </w:r>
@@ -1440,6 +1557,7 @@
       </w:pPr>
       <w:r>
         <w:rPr>
+          <w:rFonts w:ascii="Georgia" w:hAnsi="Georgia" w:eastAsia="Georgia" w:cs="Georgia"/>
           <w:b w:val="1"/>
           <w:bCs w:val="1"/>
           <w:sz w:val="22"/>
@@ -1450,6 +1568,7 @@
       </w:r>
       <w:r>
         <w:rPr>
+          <w:rFonts w:ascii="Georgia" w:hAnsi="Georgia" w:eastAsia="Georgia" w:cs="Georgia"/>
           <w:rtl w:val="0"/>
         </w:rPr>
       </w:r>
@@ -1462,6 +1581,7 @@
       </w:pPr>
       <w:r>
         <w:rPr>
+          <w:rFonts w:ascii="Georgia" w:hAnsi="Georgia" w:eastAsia="Georgia" w:cs="Georgia"/>
           <w:sz w:val="22"/>
           <w:szCs w:val="22"/>
           <w:rtl w:val="0"/>
@@ -1470,6 +1590,7 @@
       </w:r>
       <w:r>
         <w:rPr>
+          <w:rFonts w:ascii="Georgia" w:hAnsi="Georgia" w:eastAsia="Georgia" w:cs="Georgia"/>
           <w:rtl w:val="0"/>
         </w:rPr>
       </w:r>
@@ -1519,6 +1640,7 @@
             </w:pPr>
             <w:r>
               <w:rPr>
+                <w:rFonts w:ascii="Georgia" w:hAnsi="Georgia" w:eastAsia="Georgia" w:cs="Georgia"/>
                 <w:rtl w:val="0"/>
               </w:rPr>
             </w:r>
@@ -1544,6 +1666,7 @@
             </w:pPr>
             <w:r>
               <w:rPr>
+                <w:rFonts w:ascii="Georgia" w:hAnsi="Georgia" w:eastAsia="Georgia" w:cs="Georgia"/>
                 <w:b w:val="1"/>
                 <w:bCs w:val="1"/>
                 <w:sz w:val="18"/>
@@ -1554,6 +1677,7 @@
             </w:r>
             <w:r>
               <w:rPr>
+                <w:rFonts w:ascii="Georgia" w:hAnsi="Georgia" w:eastAsia="Georgia" w:cs="Georgia"/>
                 <w:rtl w:val="0"/>
               </w:rPr>
             </w:r>
@@ -1579,6 +1703,7 @@
             </w:pPr>
             <w:r>
               <w:rPr>
+                <w:rFonts w:ascii="Georgia" w:hAnsi="Georgia" w:eastAsia="Georgia" w:cs="Georgia"/>
                 <w:b w:val="1"/>
                 <w:bCs w:val="1"/>
                 <w:sz w:val="18"/>
@@ -1589,6 +1714,7 @@
             </w:r>
             <w:r>
               <w:rPr>
+                <w:rFonts w:ascii="Georgia" w:hAnsi="Georgia" w:eastAsia="Georgia" w:cs="Georgia"/>
                 <w:rtl w:val="0"/>
               </w:rPr>
             </w:r>
@@ -1612,6 +1738,7 @@
             </w:pPr>
             <w:r>
               <w:rPr>
+                <w:rFonts w:ascii="Georgia" w:hAnsi="Georgia" w:eastAsia="Georgia" w:cs="Georgia"/>
                 <w:b w:val="1"/>
                 <w:bCs w:val="1"/>
                 <w:sz w:val="18"/>
@@ -1622,6 +1749,7 @@
             </w:r>
             <w:r>
               <w:rPr>
+                <w:rFonts w:ascii="Georgia" w:hAnsi="Georgia" w:eastAsia="Georgia" w:cs="Georgia"/>
                 <w:rtl w:val="0"/>
               </w:rPr>
             </w:r>
@@ -1639,6 +1767,7 @@
             </w:pPr>
             <w:r>
               <w:rPr>
+                <w:rFonts w:ascii="Georgia" w:hAnsi="Georgia" w:eastAsia="Georgia" w:cs="Georgia"/>
                 <w:sz w:val="18"/>
                 <w:szCs w:val="18"/>
                 <w:rtl w:val="0"/>
@@ -1659,6 +1788,7 @@
             </w:pPr>
             <w:r>
               <w:rPr>
+                <w:rFonts w:ascii="Georgia" w:hAnsi="Georgia" w:eastAsia="Georgia" w:cs="Georgia"/>
                 <w:sz w:val="18"/>
                 <w:szCs w:val="18"/>
                 <w:rtl w:val="0"/>
@@ -1685,6 +1815,7 @@
             </w:pPr>
             <w:r>
               <w:rPr>
+                <w:rFonts w:ascii="Georgia" w:hAnsi="Georgia" w:eastAsia="Georgia" w:cs="Georgia"/>
                 <w:b w:val="1"/>
                 <w:bCs w:val="1"/>
                 <w:sz w:val="18"/>
@@ -1695,6 +1826,7 @@
             </w:r>
             <w:r>
               <w:rPr>
+                <w:rFonts w:ascii="Georgia" w:hAnsi="Georgia" w:eastAsia="Georgia" w:cs="Georgia"/>
                 <w:rtl w:val="0"/>
               </w:rPr>
             </w:r>
@@ -1712,6 +1844,7 @@
             </w:pPr>
             <w:r>
               <w:rPr>
+                <w:rFonts w:ascii="Georgia" w:hAnsi="Georgia" w:eastAsia="Georgia" w:cs="Georgia"/>
                 <w:sz w:val="18"/>
                 <w:szCs w:val="18"/>
                 <w:rtl w:val="0"/>
@@ -1732,6 +1865,7 @@
             </w:pPr>
             <w:r>
               <w:rPr>
+                <w:rFonts w:ascii="Georgia" w:hAnsi="Georgia" w:eastAsia="Georgia" w:cs="Georgia"/>
                 <w:sz w:val="18"/>
                 <w:szCs w:val="18"/>
                 <w:rtl w:val="0"/>
@@ -1758,6 +1892,7 @@
             </w:pPr>
             <w:r>
               <w:rPr>
+                <w:rFonts w:ascii="Georgia" w:hAnsi="Georgia" w:eastAsia="Georgia" w:cs="Georgia"/>
                 <w:b w:val="1"/>
                 <w:bCs w:val="1"/>
                 <w:sz w:val="18"/>
@@ -1768,6 +1903,7 @@
             </w:r>
             <w:r>
               <w:rPr>
+                <w:rFonts w:ascii="Georgia" w:hAnsi="Georgia" w:eastAsia="Georgia" w:cs="Georgia"/>
                 <w:rtl w:val="0"/>
               </w:rPr>
             </w:r>
@@ -1785,6 +1921,7 @@
             </w:pPr>
             <w:r>
               <w:rPr>
+                <w:rFonts w:ascii="Georgia" w:hAnsi="Georgia" w:eastAsia="Georgia" w:cs="Georgia"/>
                 <w:sz w:val="18"/>
                 <w:szCs w:val="18"/>
                 <w:rtl w:val="0"/>
@@ -1805,6 +1942,7 @@
             </w:pPr>
             <w:r>
               <w:rPr>
+                <w:rFonts w:ascii="Georgia" w:hAnsi="Georgia" w:eastAsia="Georgia" w:cs="Georgia"/>
                 <w:sz w:val="18"/>
                 <w:szCs w:val="18"/>
                 <w:rtl w:val="0"/>
@@ -1838,6 +1976,7 @@
             </w:pPr>
             <w:r>
               <w:rPr>
+                <w:rFonts w:ascii="Georgia" w:hAnsi="Georgia" w:eastAsia="Georgia" w:cs="Georgia"/>
                 <w:b w:val="1"/>
                 <w:bCs w:val="1"/>
                 <w:sz w:val="18"/>
@@ -1848,6 +1987,7 @@
             </w:r>
             <w:r>
               <w:rPr>
+                <w:rFonts w:ascii="Georgia" w:hAnsi="Georgia" w:eastAsia="Georgia" w:cs="Georgia"/>
                 <w:rtl w:val="0"/>
               </w:rPr>
             </w:r>
@@ -1872,6 +2012,7 @@
             </w:pPr>
             <w:r>
               <w:rPr>
+                <w:rFonts w:ascii="Georgia" w:hAnsi="Georgia" w:eastAsia="Georgia" w:cs="Georgia"/>
                 <w:sz w:val="18"/>
                 <w:szCs w:val="18"/>
                 <w:rtl w:val="0"/>
@@ -1899,6 +2040,7 @@
             </w:pPr>
             <w:r>
               <w:rPr>
+                <w:rFonts w:ascii="Georgia" w:hAnsi="Georgia" w:eastAsia="Georgia" w:cs="Georgia"/>
                 <w:sz w:val="18"/>
                 <w:szCs w:val="18"/>
                 <w:rtl w:val="0"/>
@@ -1918,6 +2060,7 @@
       </w:pPr>
       <w:r>
         <w:rPr>
+          <w:rFonts w:ascii="Georgia" w:hAnsi="Georgia" w:eastAsia="Georgia" w:cs="Georgia"/>
           <w:rtl w:val="0"/>
         </w:rPr>
       </w:r>
@@ -1931,6 +2074,7 @@
       </w:pPr>
       <w:r>
         <w:rPr>
+          <w:rFonts w:ascii="Georgia" w:hAnsi="Georgia" w:eastAsia="Georgia" w:cs="Georgia"/>
           <w:sz w:val="22"/>
           <w:szCs w:val="22"/>
           <w:rtl w:val="0"/>
@@ -1939,6 +2083,7 @@
       </w:r>
       <w:r>
         <w:rPr>
+          <w:rFonts w:ascii="Georgia" w:hAnsi="Georgia" w:eastAsia="Georgia" w:cs="Georgia"/>
           <w:rtl w:val="0"/>
         </w:rPr>
       </w:r>
@@ -1952,6 +2097,7 @@
       </w:pPr>
       <w:r>
         <w:rPr>
+          <w:rFonts w:ascii="Georgia" w:hAnsi="Georgia" w:eastAsia="Georgia" w:cs="Georgia"/>
           <w:sz w:val="22"/>
           <w:szCs w:val="22"/>
           <w:rtl w:val="0"/>
@@ -1960,6 +2106,7 @@
       </w:r>
       <w:r>
         <w:rPr>
+          <w:rFonts w:ascii="Georgia" w:hAnsi="Georgia" w:eastAsia="Georgia" w:cs="Georgia"/>
           <w:rtl w:val="0"/>
         </w:rPr>
       </w:r>
@@ -1973,6 +2120,7 @@
       </w:pPr>
       <w:r>
         <w:rPr>
+          <w:rFonts w:ascii="Georgia" w:hAnsi="Georgia" w:eastAsia="Georgia" w:cs="Georgia"/>
           <w:sz w:val="22"/>
           <w:szCs w:val="22"/>
           <w:rtl w:val="0"/>
@@ -1981,6 +2129,7 @@
       </w:r>
       <w:r>
         <w:rPr>
+          <w:rFonts w:ascii="Georgia" w:hAnsi="Georgia" w:eastAsia="Georgia" w:cs="Georgia"/>
           <w:rtl w:val="0"/>
         </w:rPr>
       </w:r>
@@ -1994,6 +2143,7 @@
       </w:pPr>
       <w:r>
         <w:rPr>
+          <w:rFonts w:ascii="Georgia" w:hAnsi="Georgia" w:eastAsia="Georgia" w:cs="Georgia"/>
           <w:b w:val="1"/>
           <w:bCs w:val="1"/>
           <w:sz w:val="24"/>
@@ -2004,6 +2154,7 @@
       </w:r>
       <w:r>
         <w:rPr>
+          <w:rFonts w:ascii="Georgia" w:hAnsi="Georgia" w:eastAsia="Georgia" w:cs="Georgia"/>
           <w:rtl w:val="0"/>
         </w:rPr>
       </w:r>
@@ -2017,6 +2168,7 @@
       </w:pPr>
       <w:r>
         <w:rPr>
+          <w:rFonts w:ascii="Georgia" w:hAnsi="Georgia" w:eastAsia="Georgia" w:cs="Georgia"/>
           <w:sz w:val="22"/>
           <w:szCs w:val="22"/>
           <w:rtl w:val="0"/>
@@ -2025,6 +2177,7 @@
       </w:r>
       <w:r>
         <w:rPr>
+          <w:rFonts w:ascii="Georgia" w:hAnsi="Georgia" w:eastAsia="Georgia" w:cs="Georgia"/>
           <w:rtl w:val="0"/>
         </w:rPr>
       </w:r>
@@ -2038,6 +2191,7 @@
       </w:pPr>
       <w:r>
         <w:rPr>
+          <w:rFonts w:ascii="Georgia" w:hAnsi="Georgia" w:eastAsia="Georgia" w:cs="Georgia"/>
           <w:b w:val="1"/>
           <w:bCs w:val="1"/>
           <w:sz w:val="22"/>
@@ -2048,6 +2202,7 @@
       </w:r>
       <w:r>
         <w:rPr>
+          <w:rFonts w:ascii="Georgia" w:hAnsi="Georgia" w:eastAsia="Georgia" w:cs="Georgia"/>
           <w:sz w:val="22"/>
           <w:szCs w:val="22"/>
           <w:rtl w:val="0"/>
@@ -2056,6 +2211,7 @@
       </w:r>
       <w:r>
         <w:rPr>
+          <w:rFonts w:ascii="Georgia" w:hAnsi="Georgia" w:eastAsia="Georgia" w:cs="Georgia"/>
           <w:rtl w:val="0"/>
         </w:rPr>
       </w:r>
@@ -2069,6 +2225,7 @@
       </w:pPr>
       <w:r>
         <w:rPr>
+          <w:rFonts w:ascii="Georgia" w:hAnsi="Georgia" w:eastAsia="Georgia" w:cs="Georgia"/>
           <w:b w:val="1"/>
           <w:bCs w:val="1"/>
           <w:sz w:val="22"/>
@@ -2079,6 +2236,7 @@
       </w:r>
       <w:r>
         <w:rPr>
+          <w:rFonts w:ascii="Georgia" w:hAnsi="Georgia" w:eastAsia="Georgia" w:cs="Georgia"/>
           <w:sz w:val="22"/>
           <w:szCs w:val="22"/>
           <w:rtl w:val="0"/>
@@ -2087,6 +2245,7 @@
       </w:r>
       <w:r>
         <w:rPr>
+          <w:rFonts w:ascii="Georgia" w:hAnsi="Georgia" w:eastAsia="Georgia" w:cs="Georgia"/>
           <w:rtl w:val="0"/>
         </w:rPr>
       </w:r>
@@ -2100,6 +2259,7 @@
       </w:pPr>
       <w:r>
         <w:rPr>
+          <w:rFonts w:ascii="Georgia" w:hAnsi="Georgia" w:eastAsia="Georgia" w:cs="Georgia"/>
           <w:b w:val="1"/>
           <w:bCs w:val="1"/>
           <w:sz w:val="22"/>
@@ -2110,6 +2270,7 @@
       </w:r>
       <w:r>
         <w:rPr>
+          <w:rFonts w:ascii="Georgia" w:hAnsi="Georgia" w:eastAsia="Georgia" w:cs="Georgia"/>
           <w:sz w:val="22"/>
           <w:szCs w:val="22"/>
           <w:rtl w:val="0"/>
@@ -2118,6 +2279,7 @@
       </w:r>
       <w:r>
         <w:rPr>
+          <w:rFonts w:ascii="Georgia" w:hAnsi="Georgia" w:eastAsia="Georgia" w:cs="Georgia"/>
           <w:rtl w:val="0"/>
         </w:rPr>
       </w:r>
@@ -2131,6 +2293,7 @@
       </w:pPr>
       <w:r>
         <w:rPr>
+          <w:rFonts w:ascii="Georgia" w:hAnsi="Georgia" w:eastAsia="Georgia" w:cs="Georgia"/>
           <w:b w:val="1"/>
           <w:bCs w:val="1"/>
           <w:sz w:val="22"/>
@@ -2141,6 +2304,7 @@
       </w:r>
       <w:r>
         <w:rPr>
+          <w:rFonts w:ascii="Georgia" w:hAnsi="Georgia" w:eastAsia="Georgia" w:cs="Georgia"/>
           <w:sz w:val="22"/>
           <w:szCs w:val="22"/>
           <w:rtl w:val="0"/>
@@ -2149,6 +2313,7 @@
       </w:r>
       <w:r>
         <w:rPr>
+          <w:rFonts w:ascii="Georgia" w:hAnsi="Georgia" w:eastAsia="Georgia" w:cs="Georgia"/>
           <w:rtl w:val="0"/>
         </w:rPr>
       </w:r>
@@ -2162,6 +2327,7 @@
       </w:pPr>
       <w:r>
         <w:rPr>
+          <w:rFonts w:ascii="Georgia" w:hAnsi="Georgia" w:eastAsia="Georgia" w:cs="Georgia"/>
           <w:sz w:val="22"/>
           <w:szCs w:val="22"/>
           <w:rtl w:val="0"/>
@@ -2170,6 +2336,7 @@
       </w:r>
       <w:r>
         <w:rPr>
+          <w:rFonts w:ascii="Georgia" w:hAnsi="Georgia" w:eastAsia="Georgia" w:cs="Georgia"/>
           <w:rtl w:val="0"/>
         </w:rPr>
       </w:r>
@@ -2183,6 +2350,7 @@
       </w:pPr>
       <w:r>
         <w:rPr>
+          <w:rFonts w:ascii="Georgia" w:hAnsi="Georgia" w:eastAsia="Georgia" w:cs="Georgia"/>
           <w:b w:val="1"/>
           <w:bCs w:val="1"/>
           <w:sz w:val="24"/>
@@ -2193,6 +2361,7 @@
       </w:r>
       <w:r>
         <w:rPr>
+          <w:rFonts w:ascii="Georgia" w:hAnsi="Georgia" w:eastAsia="Georgia" w:cs="Georgia"/>
           <w:rtl w:val="0"/>
         </w:rPr>
       </w:r>
@@ -2206,6 +2375,7 @@
       </w:pPr>
       <w:r>
         <w:rPr>
+          <w:rFonts w:ascii="Georgia" w:hAnsi="Georgia" w:eastAsia="Georgia" w:cs="Georgia"/>
           <w:i w:val="1"/>
           <w:iCs w:val="1"/>
           <w:sz w:val="24"/>
@@ -2216,6 +2386,7 @@
       </w:r>
       <w:r>
         <w:rPr>
+          <w:rFonts w:ascii="Georgia" w:hAnsi="Georgia" w:eastAsia="Georgia" w:cs="Georgia"/>
           <w:rtl w:val="0"/>
         </w:rPr>
       </w:r>
@@ -2229,6 +2400,7 @@
       </w:pPr>
       <w:r>
         <w:rPr>
+          <w:rFonts w:ascii="Georgia" w:hAnsi="Georgia" w:eastAsia="Georgia" w:cs="Georgia"/>
           <w:sz w:val="22"/>
           <w:szCs w:val="22"/>
           <w:rtl w:val="0"/>
@@ -2237,17 +2409,19 @@
       </w:r>
       <w:r>
         <w:rPr>
-          <w:rtl w:val="0"/>
-        </w:rPr>
-      </w:r>
-    </w:p>
-    <w:p>
-      <w:pPr>
-        <w:spacing w:line="480" w:lineRule="auto"/>
-        <w:rPr/>
-      </w:pPr>
-      <w:r>
-        <w:rPr>
+          <w:rFonts w:ascii="Georgia" w:hAnsi="Georgia" w:eastAsia="Georgia" w:cs="Georgia"/>
+          <w:rtl w:val="0"/>
+        </w:rPr>
+      </w:r>
+    </w:p>
+    <w:p>
+      <w:pPr>
+        <w:spacing w:line="480" w:lineRule="auto"/>
+        <w:rPr/>
+      </w:pPr>
+      <w:r>
+        <w:rPr>
+          <w:rFonts w:ascii="Georgia" w:hAnsi="Georgia" w:eastAsia="Georgia" w:cs="Georgia"/>
           <w:rtl w:val="0"/>
         </w:rPr>
       </w:r>
@@ -2261,6 +2435,7 @@
       </w:pPr>
       <w:r>
         <w:rPr>
+          <w:rFonts w:ascii="Georgia" w:hAnsi="Georgia" w:eastAsia="Georgia" w:cs="Georgia"/>
           <w:i w:val="1"/>
           <w:iCs w:val="1"/>
           <w:sz w:val="24"/>
@@ -2271,6 +2446,7 @@
       </w:r>
       <w:r>
         <w:rPr>
+          <w:rFonts w:ascii="Georgia" w:hAnsi="Georgia" w:eastAsia="Georgia" w:cs="Georgia"/>
           <w:rtl w:val="0"/>
         </w:rPr>
       </w:r>
@@ -2284,6 +2460,7 @@
       </w:pPr>
       <w:r>
         <w:rPr>
+          <w:rFonts w:ascii="Georgia" w:hAnsi="Georgia" w:eastAsia="Georgia" w:cs="Georgia"/>
           <w:sz w:val="22"/>
           <w:szCs w:val="22"/>
           <w:rtl w:val="0"/>
@@ -2292,6 +2469,7 @@
       </w:r>
       <w:r>
         <w:rPr>
+          <w:rFonts w:ascii="Georgia" w:hAnsi="Georgia" w:eastAsia="Georgia" w:cs="Georgia"/>
           <w:rtl w:val="0"/>
         </w:rPr>
       </w:r>
@@ -2305,6 +2483,7 @@
       </w:pPr>
       <w:r>
         <w:rPr>
+          <w:rFonts w:ascii="Georgia" w:hAnsi="Georgia" w:eastAsia="Georgia" w:cs="Georgia"/>
           <w:sz w:val="22"/>
           <w:szCs w:val="22"/>
           <w:rtl w:val="0"/>
@@ -2313,6 +2492,7 @@
       </w:r>
       <w:r>
         <w:rPr>
+          <w:rFonts w:ascii="Georgia" w:hAnsi="Georgia" w:eastAsia="Georgia" w:cs="Georgia"/>
           <w:rtl w:val="0"/>
         </w:rPr>
       </w:r>
@@ -2326,6 +2506,7 @@
       </w:pPr>
       <w:r>
         <w:rPr>
+          <w:rFonts w:ascii="Georgia" w:hAnsi="Georgia" w:eastAsia="Georgia" w:cs="Georgia"/>
           <w:i w:val="1"/>
           <w:iCs w:val="1"/>
           <w:sz w:val="24"/>
@@ -2336,6 +2517,7 @@
       </w:r>
       <w:r>
         <w:rPr>
+          <w:rFonts w:ascii="Georgia" w:hAnsi="Georgia" w:eastAsia="Georgia" w:cs="Georgia"/>
           <w:rtl w:val="0"/>
         </w:rPr>
       </w:r>
@@ -2349,6 +2531,7 @@
       </w:pPr>
       <w:r>
         <w:rPr>
+          <w:rFonts w:ascii="Georgia" w:hAnsi="Georgia" w:eastAsia="Georgia" w:cs="Georgia"/>
           <w:sz w:val="22"/>
           <w:szCs w:val="22"/>
           <w:rtl w:val="0"/>
@@ -2357,6 +2540,7 @@
       </w:r>
       <w:r>
         <w:rPr>
+          <w:rFonts w:ascii="Georgia" w:hAnsi="Georgia" w:eastAsia="Georgia" w:cs="Georgia"/>
           <w:rtl w:val="0"/>
         </w:rPr>
       </w:r>
@@ -2370,6 +2554,7 @@
       </w:pPr>
       <w:r>
         <w:rPr>
+          <w:rFonts w:ascii="Georgia" w:hAnsi="Georgia" w:eastAsia="Georgia" w:cs="Georgia"/>
           <w:b w:val="1"/>
           <w:bCs w:val="1"/>
           <w:sz w:val="24"/>
@@ -2380,6 +2565,7 @@
       </w:r>
       <w:r>
         <w:rPr>
+          <w:rFonts w:ascii="Georgia" w:hAnsi="Georgia" w:eastAsia="Georgia" w:cs="Georgia"/>
           <w:rtl w:val="0"/>
         </w:rPr>
       </w:r>
@@ -2393,6 +2579,7 @@
       </w:pPr>
       <w:r>
         <w:rPr>
+          <w:rFonts w:ascii="Georgia" w:hAnsi="Georgia" w:eastAsia="Georgia" w:cs="Georgia"/>
           <w:sz w:val="22"/>
           <w:szCs w:val="22"/>
           <w:rtl w:val="0"/>
@@ -2401,17 +2588,19 @@
       </w:r>
       <w:r>
         <w:rPr>
-          <w:rtl w:val="0"/>
-        </w:rPr>
-      </w:r>
-    </w:p>
-    <w:p>
-      <w:pPr>
-        <w:spacing w:line="480" w:lineRule="auto"/>
-        <w:rPr/>
-      </w:pPr>
-      <w:r>
-        <w:rPr>
+          <w:rFonts w:ascii="Georgia" w:hAnsi="Georgia" w:eastAsia="Georgia" w:cs="Georgia"/>
+          <w:rtl w:val="0"/>
+        </w:rPr>
+      </w:r>
+    </w:p>
+    <w:p>
+      <w:pPr>
+        <w:spacing w:line="480" w:lineRule="auto"/>
+        <w:rPr/>
+      </w:pPr>
+      <w:r>
+        <w:rPr>
+          <w:rFonts w:ascii="Georgia" w:hAnsi="Georgia" w:eastAsia="Georgia" w:cs="Georgia"/>
           <w:rtl w:val="0"/>
         </w:rPr>
       </w:r>
@@ -2425,7 +2614,7 @@
       </w:pPr>
       <w:r>
         <w:rPr>
-          <w:rFonts w:ascii="Times New Roman" w:hAnsi="Times New Roman"/>
+          <w:rFonts w:ascii="Georgia" w:hAnsi="Georgia" w:eastAsia="Georgia" w:cs="Georgia"/>
           <w:b w:val="1"/>
           <w:bCs w:val="1"/>
           <w:sz w:val="22"/>
@@ -2436,24 +2625,27 @@
       </w:r>
       <w:r>
         <w:rPr>
-          <w:sz w:val="22"/>
-          <w:szCs w:val="22"/>
-          <w:rtl w:val="0"/>
-        </w:rPr>
-      </w:r>
-      <w:r>
-        <w:rPr>
-          <w:rtl w:val="0"/>
-        </w:rPr>
-      </w:r>
-    </w:p>
-    <w:p>
-      <w:pPr>
-        <w:spacing w:line="480" w:lineRule="auto"/>
-        <w:rPr/>
-      </w:pPr>
-      <w:r>
-        <w:rPr>
+          <w:rFonts w:ascii="Georgia" w:hAnsi="Georgia" w:eastAsia="Georgia" w:cs="Georgia"/>
+          <w:sz w:val="22"/>
+          <w:szCs w:val="22"/>
+          <w:rtl w:val="0"/>
+        </w:rPr>
+      </w:r>
+      <w:r>
+        <w:rPr>
+          <w:rFonts w:ascii="Georgia" w:hAnsi="Georgia" w:eastAsia="Georgia" w:cs="Georgia"/>
+          <w:rtl w:val="0"/>
+        </w:rPr>
+      </w:r>
+    </w:p>
+    <w:p>
+      <w:pPr>
+        <w:spacing w:line="480" w:lineRule="auto"/>
+        <w:rPr/>
+      </w:pPr>
+      <w:r>
+        <w:rPr>
+          <w:rFonts w:ascii="Georgia" w:hAnsi="Georgia" w:eastAsia="Georgia" w:cs="Georgia"/>
           <w:rtl w:val="0"/>
         </w:rPr>
       </w:r>
@@ -2467,7 +2659,7 @@
       </w:pPr>
       <w:r>
         <w:rPr>
-          <w:rFonts w:ascii="Times New Roman" w:hAnsi="Times New Roman"/>
+          <w:rFonts w:ascii="Georgia" w:hAnsi="Georgia" w:eastAsia="Georgia" w:cs="Georgia"/>
           <w:b w:val="1"/>
           <w:bCs w:val="1"/>
           <w:sz w:val="22"/>
@@ -2478,24 +2670,27 @@
       </w:r>
       <w:r>
         <w:rPr>
-          <w:sz w:val="22"/>
-          <w:szCs w:val="22"/>
-          <w:rtl w:val="0"/>
-        </w:rPr>
-      </w:r>
-      <w:r>
-        <w:rPr>
-          <w:rtl w:val="0"/>
-        </w:rPr>
-      </w:r>
-    </w:p>
-    <w:p>
-      <w:pPr>
-        <w:spacing w:line="480" w:lineRule="auto"/>
-        <w:rPr/>
-      </w:pPr>
-      <w:r>
-        <w:rPr>
+          <w:rFonts w:ascii="Georgia" w:hAnsi="Georgia" w:eastAsia="Georgia" w:cs="Georgia"/>
+          <w:sz w:val="22"/>
+          <w:szCs w:val="22"/>
+          <w:rtl w:val="0"/>
+        </w:rPr>
+      </w:r>
+      <w:r>
+        <w:rPr>
+          <w:rFonts w:ascii="Georgia" w:hAnsi="Georgia" w:eastAsia="Georgia" w:cs="Georgia"/>
+          <w:rtl w:val="0"/>
+        </w:rPr>
+      </w:r>
+    </w:p>
+    <w:p>
+      <w:pPr>
+        <w:spacing w:line="480" w:lineRule="auto"/>
+        <w:rPr/>
+      </w:pPr>
+      <w:r>
+        <w:rPr>
+          <w:rFonts w:ascii="Georgia" w:hAnsi="Georgia" w:eastAsia="Georgia" w:cs="Georgia"/>
           <w:rtl w:val="0"/>
         </w:rPr>
       </w:r>
@@ -2509,7 +2704,7 @@
       </w:pPr>
       <w:r>
         <w:rPr>
-          <w:rFonts w:ascii="Times New Roman" w:hAnsi="Times New Roman"/>
+          <w:rFonts w:ascii="Georgia" w:hAnsi="Georgia" w:eastAsia="Georgia" w:cs="Georgia"/>
           <w:b w:val="1"/>
           <w:bCs w:val="1"/>
           <w:sz w:val="22"/>
@@ -2520,24 +2715,27 @@
       </w:r>
       <w:r>
         <w:rPr>
-          <w:sz w:val="22"/>
-          <w:szCs w:val="22"/>
-          <w:rtl w:val="0"/>
-        </w:rPr>
-      </w:r>
-      <w:r>
-        <w:rPr>
-          <w:rtl w:val="0"/>
-        </w:rPr>
-      </w:r>
-    </w:p>
-    <w:p>
-      <w:pPr>
-        <w:spacing w:line="480" w:lineRule="auto"/>
-        <w:rPr/>
-      </w:pPr>
-      <w:r>
-        <w:rPr>
+          <w:rFonts w:ascii="Georgia" w:hAnsi="Georgia" w:eastAsia="Georgia" w:cs="Georgia"/>
+          <w:sz w:val="22"/>
+          <w:szCs w:val="22"/>
+          <w:rtl w:val="0"/>
+        </w:rPr>
+      </w:r>
+      <w:r>
+        <w:rPr>
+          <w:rFonts w:ascii="Georgia" w:hAnsi="Georgia" w:eastAsia="Georgia" w:cs="Georgia"/>
+          <w:rtl w:val="0"/>
+        </w:rPr>
+      </w:r>
+    </w:p>
+    <w:p>
+      <w:pPr>
+        <w:spacing w:line="480" w:lineRule="auto"/>
+        <w:rPr/>
+      </w:pPr>
+      <w:r>
+        <w:rPr>
+          <w:rFonts w:ascii="Georgia" w:hAnsi="Georgia" w:eastAsia="Georgia" w:cs="Georgia"/>
           <w:rtl w:val="0"/>
         </w:rPr>
       </w:r>
@@ -2551,7 +2749,7 @@
       </w:pPr>
       <w:r>
         <w:rPr>
-          <w:rFonts w:ascii="Times New Roman" w:hAnsi="Times New Roman"/>
+          <w:rFonts w:ascii="Georgia" w:hAnsi="Georgia" w:eastAsia="Georgia" w:cs="Georgia"/>
           <w:b w:val="1"/>
           <w:bCs w:val="1"/>
           <w:sz w:val="22"/>
@@ -2562,24 +2760,27 @@
       </w:r>
       <w:r>
         <w:rPr>
-          <w:sz w:val="22"/>
-          <w:szCs w:val="22"/>
-          <w:rtl w:val="0"/>
-        </w:rPr>
-      </w:r>
-      <w:r>
-        <w:rPr>
-          <w:rtl w:val="0"/>
-        </w:rPr>
-      </w:r>
-    </w:p>
-    <w:p>
-      <w:pPr>
-        <w:spacing w:line="480" w:lineRule="auto"/>
-        <w:rPr/>
-      </w:pPr>
-      <w:r>
-        <w:rPr>
+          <w:rFonts w:ascii="Georgia" w:hAnsi="Georgia" w:eastAsia="Georgia" w:cs="Georgia"/>
+          <w:sz w:val="22"/>
+          <w:szCs w:val="22"/>
+          <w:rtl w:val="0"/>
+        </w:rPr>
+      </w:r>
+      <w:r>
+        <w:rPr>
+          <w:rFonts w:ascii="Georgia" w:hAnsi="Georgia" w:eastAsia="Georgia" w:cs="Georgia"/>
+          <w:rtl w:val="0"/>
+        </w:rPr>
+      </w:r>
+    </w:p>
+    <w:p>
+      <w:pPr>
+        <w:spacing w:line="480" w:lineRule="auto"/>
+        <w:rPr/>
+      </w:pPr>
+      <w:r>
+        <w:rPr>
+          <w:rFonts w:ascii="Georgia" w:hAnsi="Georgia" w:eastAsia="Georgia" w:cs="Georgia"/>
           <w:rtl w:val="0"/>
         </w:rPr>
       </w:r>
@@ -2593,7 +2794,7 @@
       </w:pPr>
       <w:r>
         <w:rPr>
-          <w:rFonts w:ascii="Times New Roman" w:hAnsi="Times New Roman"/>
+          <w:rFonts w:ascii="Georgia" w:hAnsi="Georgia" w:eastAsia="Georgia" w:cs="Georgia"/>
           <w:b w:val="1"/>
           <w:bCs w:val="1"/>
           <w:sz w:val="22"/>
@@ -2604,24 +2805,27 @@
       </w:r>
       <w:r>
         <w:rPr>
-          <w:sz w:val="22"/>
-          <w:szCs w:val="22"/>
-          <w:rtl w:val="0"/>
-        </w:rPr>
-      </w:r>
-      <w:r>
-        <w:rPr>
-          <w:rtl w:val="0"/>
-        </w:rPr>
-      </w:r>
-    </w:p>
-    <w:p>
-      <w:pPr>
-        <w:spacing w:line="480" w:lineRule="auto"/>
-        <w:rPr/>
-      </w:pPr>
-      <w:r>
-        <w:rPr>
+          <w:rFonts w:ascii="Georgia" w:hAnsi="Georgia" w:eastAsia="Georgia" w:cs="Georgia"/>
+          <w:sz w:val="22"/>
+          <w:szCs w:val="22"/>
+          <w:rtl w:val="0"/>
+        </w:rPr>
+      </w:r>
+      <w:r>
+        <w:rPr>
+          <w:rFonts w:ascii="Georgia" w:hAnsi="Georgia" w:eastAsia="Georgia" w:cs="Georgia"/>
+          <w:rtl w:val="0"/>
+        </w:rPr>
+      </w:r>
+    </w:p>
+    <w:p>
+      <w:pPr>
+        <w:spacing w:line="480" w:lineRule="auto"/>
+        <w:rPr/>
+      </w:pPr>
+      <w:r>
+        <w:rPr>
+          <w:rFonts w:ascii="Georgia" w:hAnsi="Georgia" w:eastAsia="Georgia" w:cs="Georgia"/>
           <w:rtl w:val="0"/>
         </w:rPr>
       </w:r>
@@ -2635,7 +2839,7 @@
       </w:pPr>
       <w:r>
         <w:rPr>
-          <w:rFonts w:ascii="Times New Roman" w:hAnsi="Times New Roman"/>
+          <w:rFonts w:ascii="Georgia" w:hAnsi="Georgia" w:eastAsia="Georgia" w:cs="Georgia"/>
           <w:b w:val="1"/>
           <w:bCs w:val="1"/>
           <w:sz w:val="22"/>
@@ -2646,24 +2850,27 @@
       </w:r>
       <w:r>
         <w:rPr>
-          <w:sz w:val="22"/>
-          <w:szCs w:val="22"/>
-          <w:rtl w:val="0"/>
-        </w:rPr>
-      </w:r>
-      <w:r>
-        <w:rPr>
-          <w:rtl w:val="0"/>
-        </w:rPr>
-      </w:r>
-    </w:p>
-    <w:p>
-      <w:pPr>
-        <w:spacing w:line="480" w:lineRule="auto"/>
-        <w:rPr/>
-      </w:pPr>
-      <w:r>
-        <w:rPr>
+          <w:rFonts w:ascii="Georgia" w:hAnsi="Georgia" w:eastAsia="Georgia" w:cs="Georgia"/>
+          <w:sz w:val="22"/>
+          <w:szCs w:val="22"/>
+          <w:rtl w:val="0"/>
+        </w:rPr>
+      </w:r>
+      <w:r>
+        <w:rPr>
+          <w:rFonts w:ascii="Georgia" w:hAnsi="Georgia" w:eastAsia="Georgia" w:cs="Georgia"/>
+          <w:rtl w:val="0"/>
+        </w:rPr>
+      </w:r>
+    </w:p>
+    <w:p>
+      <w:pPr>
+        <w:spacing w:line="480" w:lineRule="auto"/>
+        <w:rPr/>
+      </w:pPr>
+      <w:r>
+        <w:rPr>
+          <w:rFonts w:ascii="Georgia" w:hAnsi="Georgia" w:eastAsia="Georgia" w:cs="Georgia"/>
           <w:rtl w:val="0"/>
         </w:rPr>
       </w:r>
@@ -2677,7 +2884,7 @@
       </w:pPr>
       <w:r>
         <w:rPr>
-          <w:rFonts w:ascii="Times New Roman" w:hAnsi="Times New Roman"/>
+          <w:rFonts w:ascii="Georgia" w:hAnsi="Georgia" w:eastAsia="Georgia" w:cs="Georgia"/>
           <w:b w:val="1"/>
           <w:bCs w:val="1"/>
           <w:sz w:val="22"/>
@@ -2688,38 +2895,45 @@
       </w:r>
       <w:r>
         <w:rPr>
-          <w:sz w:val="22"/>
-          <w:szCs w:val="22"/>
-          <w:rtl w:val="0"/>
-        </w:rPr>
-      </w:r>
-      <w:r>
-        <w:rPr>
-          <w:rtl w:val="0"/>
-        </w:rPr>
-      </w:r>
-    </w:p>
-    <w:p>
-      <w:pPr>
-        <w:spacing w:line="480" w:lineRule="auto"/>
-        <w:rPr/>
-      </w:pPr>
-      <w:r>
-        <w:rPr>
-          <w:rtl w:val="0"/>
-        </w:rPr>
-      </w:r>
-    </w:p>
-    <w:p>
-      <w:pPr>
-        <w:spacing w:line="480" w:lineRule="auto"/>
-        <w:rPr/>
-      </w:pPr>
-      <w:r>
+          <w:rFonts w:ascii="Georgia" w:hAnsi="Georgia" w:eastAsia="Georgia" w:cs="Georgia"/>
+          <w:sz w:val="22"/>
+          <w:szCs w:val="22"/>
+          <w:rtl w:val="0"/>
+        </w:rPr>
+      </w:r>
+      <w:r>
+        <w:rPr>
+          <w:rFonts w:ascii="Georgia" w:hAnsi="Georgia" w:eastAsia="Georgia" w:cs="Georgia"/>
+          <w:rtl w:val="0"/>
+        </w:rPr>
+      </w:r>
+    </w:p>
+    <w:p>
+      <w:pPr>
+        <w:spacing w:line="480" w:lineRule="auto"/>
+        <w:rPr/>
+      </w:pPr>
+      <w:r>
+        <w:rPr>
+          <w:rFonts w:ascii="Georgia" w:hAnsi="Georgia" w:eastAsia="Georgia" w:cs="Georgia"/>
+          <w:rtl w:val="0"/>
+        </w:rPr>
+      </w:r>
+    </w:p>
+    <w:p>
+      <w:pPr>
+        <w:spacing w:line="480" w:lineRule="auto"/>
+        <w:rPr/>
+      </w:pPr>
+      <w:r>
+        <w:rPr>
+          <w:rFonts w:ascii="Georgia" w:hAnsi="Georgia" w:eastAsia="Georgia" w:cs="Georgia"/>
+        </w:rPr>
         <w:br w:type="page"/>
       </w:r>
       <w:r>
         <w:rPr>
+          <w:rFonts w:ascii="Georgia" w:hAnsi="Georgia" w:eastAsia="Georgia" w:cs="Georgia"/>
           <w:rtl w:val="0"/>
         </w:rPr>
       </w:r>
@@ -2731,6 +2945,7 @@
       </w:pPr>
       <w:r>
         <w:rPr>
+          <w:rFonts w:ascii="Georgia" w:hAnsi="Georgia" w:eastAsia="Georgia" w:cs="Georgia"/>
           <w:rtl w:val="0"/>
         </w:rPr>
       </w:r>
@@ -2743,6 +2958,7 @@
       </w:pPr>
       <w:r>
         <w:rPr>
+          <w:rFonts w:ascii="Georgia" w:hAnsi="Georgia" w:eastAsia="Georgia" w:cs="Georgia"/>
           <w:b w:val="1"/>
           <w:bCs w:val="1"/>
           <w:sz w:val="28"/>
@@ -2753,6 +2969,7 @@
       </w:r>
       <w:r>
         <w:rPr>
+          <w:rFonts w:ascii="Georgia" w:hAnsi="Georgia" w:eastAsia="Georgia" w:cs="Georgia"/>
           <w:rtl w:val="0"/>
         </w:rPr>
       </w:r>
@@ -2766,6 +2983,7 @@
       </w:pPr>
       <w:r>
         <w:rPr>
+          <w:rFonts w:ascii="Georgia" w:hAnsi="Georgia" w:eastAsia="Georgia" w:cs="Georgia"/>
           <w:sz w:val="22"/>
           <w:szCs w:val="22"/>
           <w:rtl w:val="0"/>
@@ -2774,6 +2992,7 @@
       </w:r>
       <w:r>
         <w:rPr>
+          <w:rFonts w:ascii="Georgia" w:hAnsi="Georgia" w:eastAsia="Georgia" w:cs="Georgia"/>
           <w:rtl w:val="0"/>
         </w:rPr>
       </w:r>
@@ -2787,6 +3006,7 @@
       </w:pPr>
       <w:r>
         <w:rPr>
+          <w:rFonts w:ascii="Georgia" w:hAnsi="Georgia" w:eastAsia="Georgia" w:cs="Georgia"/>
           <w:b w:val="1"/>
           <w:bCs w:val="1"/>
           <w:sz w:val="24"/>
@@ -2797,6 +3017,7 @@
       </w:r>
       <w:r>
         <w:rPr>
+          <w:rFonts w:ascii="Georgia" w:hAnsi="Georgia" w:eastAsia="Georgia" w:cs="Georgia"/>
           <w:rtl w:val="0"/>
         </w:rPr>
       </w:r>
@@ -2810,6 +3031,7 @@
       </w:pPr>
       <w:r>
         <w:rPr>
+          <w:rFonts w:ascii="Georgia" w:hAnsi="Georgia" w:eastAsia="Georgia" w:cs="Georgia"/>
           <w:sz w:val="22"/>
           <w:szCs w:val="22"/>
           <w:rtl w:val="0"/>
@@ -2818,6 +3040,7 @@
       </w:r>
       <w:r>
         <w:rPr>
+          <w:rFonts w:ascii="Georgia" w:hAnsi="Georgia" w:eastAsia="Georgia" w:cs="Georgia"/>
           <w:rtl w:val="0"/>
         </w:rPr>
       </w:r>
@@ -2831,6 +3054,7 @@
       </w:pPr>
       <w:r>
         <w:rPr>
+          <w:rFonts w:ascii="Georgia" w:hAnsi="Georgia" w:eastAsia="Georgia" w:cs="Georgia"/>
           <w:b w:val="1"/>
           <w:bCs w:val="1"/>
           <w:sz w:val="24"/>
@@ -2841,6 +3065,7 @@
       </w:r>
       <w:r>
         <w:rPr>
+          <w:rFonts w:ascii="Georgia" w:hAnsi="Georgia" w:eastAsia="Georgia" w:cs="Georgia"/>
           <w:rtl w:val="0"/>
         </w:rPr>
       </w:r>
@@ -2854,6 +3079,7 @@
       </w:pPr>
       <w:r>
         <w:rPr>
+          <w:rFonts w:ascii="Georgia" w:hAnsi="Georgia" w:eastAsia="Georgia" w:cs="Georgia"/>
           <w:sz w:val="22"/>
           <w:szCs w:val="22"/>
           <w:rtl w:val="0"/>
@@ -2862,6 +3088,7 @@
       </w:r>
       <w:r>
         <w:rPr>
+          <w:rFonts w:ascii="Georgia" w:hAnsi="Georgia" w:eastAsia="Georgia" w:cs="Georgia"/>
           <w:rtl w:val="0"/>
         </w:rPr>
       </w:r>
@@ -2875,6 +3102,7 @@
       </w:pPr>
       <w:r>
         <w:rPr>
+          <w:rFonts w:ascii="Georgia" w:hAnsi="Georgia" w:eastAsia="Georgia" w:cs="Georgia"/>
           <w:b w:val="1"/>
           <w:bCs w:val="1"/>
           <w:sz w:val="24"/>
@@ -2885,6 +3113,7 @@
       </w:r>
       <w:r>
         <w:rPr>
+          <w:rFonts w:ascii="Georgia" w:hAnsi="Georgia" w:eastAsia="Georgia" w:cs="Georgia"/>
           <w:rtl w:val="0"/>
         </w:rPr>
       </w:r>
@@ -2898,7 +3127,7 @@
       </w:pPr>
       <w:r>
         <w:rPr>
-          <w:rFonts w:ascii="Times New Roman" w:hAnsi="Times New Roman"/>
+          <w:rFonts w:ascii="Georgia" w:hAnsi="Georgia" w:eastAsia="Georgia" w:cs="Georgia"/>
           <w:sz w:val="22"/>
           <w:szCs w:val="22"/>
           <w:rtl w:val="0"/>
@@ -2907,17 +3136,19 @@
       </w:r>
       <w:r>
         <w:rPr>
-          <w:rtl w:val="0"/>
-        </w:rPr>
-      </w:r>
-    </w:p>
-    <w:p>
-      <w:pPr>
-        <w:spacing w:line="480" w:lineRule="auto"/>
-        <w:rPr/>
-      </w:pPr>
-      <w:r>
-        <w:rPr>
+          <w:rFonts w:ascii="Georgia" w:hAnsi="Georgia" w:eastAsia="Georgia" w:cs="Georgia"/>
+          <w:rtl w:val="0"/>
+        </w:rPr>
+      </w:r>
+    </w:p>
+    <w:p>
+      <w:pPr>
+        <w:spacing w:line="480" w:lineRule="auto"/>
+        <w:rPr/>
+      </w:pPr>
+      <w:r>
+        <w:rPr>
+          <w:rFonts w:ascii="Georgia" w:hAnsi="Georgia" w:eastAsia="Georgia" w:cs="Georgia"/>
           <w:rtl w:val="0"/>
         </w:rPr>
       </w:r>
@@ -2931,6 +3162,7 @@
       </w:pPr>
       <w:r>
         <w:rPr>
+          <w:rFonts w:ascii="Georgia" w:hAnsi="Georgia" w:eastAsia="Georgia" w:cs="Georgia"/>
           <w:b w:val="1"/>
           <w:bCs w:val="1"/>
           <w:sz w:val="22"/>
@@ -2941,6 +3173,7 @@
       </w:r>
       <w:r>
         <w:rPr>
+          <w:rFonts w:ascii="Georgia" w:hAnsi="Georgia" w:eastAsia="Georgia" w:cs="Georgia"/>
           <w:sz w:val="22"/>
           <w:szCs w:val="22"/>
           <w:rtl w:val="0"/>
@@ -2949,6 +3182,7 @@
       </w:r>
       <w:r>
         <w:rPr>
+          <w:rFonts w:ascii="Georgia" w:hAnsi="Georgia" w:eastAsia="Georgia" w:cs="Georgia"/>
           <w:rtl w:val="0"/>
         </w:rPr>
       </w:r>
@@ -2962,7 +3196,7 @@
       </w:pPr>
       <w:r>
         <w:rPr>
-          <w:rFonts w:ascii="Times New Roman" w:hAnsi="Times New Roman"/>
+          <w:rFonts w:ascii="Georgia" w:hAnsi="Georgia" w:eastAsia="Georgia" w:cs="Georgia"/>
           <w:b w:val="1"/>
           <w:bCs w:val="1"/>
           <w:sz w:val="22"/>
@@ -2973,13 +3207,15 @@
       </w:r>
       <w:r>
         <w:rPr>
-          <w:sz w:val="22"/>
-          <w:szCs w:val="22"/>
-          <w:rtl w:val="0"/>
-        </w:rPr>
-      </w:r>
-      <w:r>
-        <w:rPr>
+          <w:rFonts w:ascii="Georgia" w:hAnsi="Georgia" w:eastAsia="Georgia" w:cs="Georgia"/>
+          <w:sz w:val="22"/>
+          <w:szCs w:val="22"/>
+          <w:rtl w:val="0"/>
+        </w:rPr>
+      </w:r>
+      <w:r>
+        <w:rPr>
+          <w:rFonts w:ascii="Georgia" w:hAnsi="Georgia" w:eastAsia="Georgia" w:cs="Georgia"/>
           <w:rtl w:val="0"/>
         </w:rPr>
       </w:r>
@@ -2993,6 +3229,7 @@
       </w:pPr>
       <w:r>
         <w:rPr>
+          <w:rFonts w:ascii="Georgia" w:hAnsi="Georgia" w:eastAsia="Georgia" w:cs="Georgia"/>
           <w:sz w:val="22"/>
           <w:szCs w:val="22"/>
           <w:rtl w:val="0"/>
@@ -3001,6 +3238,7 @@
       </w:r>
       <w:r>
         <w:rPr>
+          <w:rFonts w:ascii="Georgia" w:hAnsi="Georgia" w:eastAsia="Georgia" w:cs="Georgia"/>
           <w:b w:val="1"/>
           <w:bCs w:val="1"/>
           <w:sz w:val="22"/>
@@ -3011,6 +3249,7 @@
       </w:r>
       <w:r>
         <w:rPr>
+          <w:rFonts w:ascii="Georgia" w:hAnsi="Georgia" w:eastAsia="Georgia" w:cs="Georgia"/>
           <w:sz w:val="22"/>
           <w:szCs w:val="22"/>
           <w:rtl w:val="0"/>
@@ -3019,6 +3258,7 @@
       </w:r>
       <w:r>
         <w:rPr>
+          <w:rFonts w:ascii="Georgia" w:hAnsi="Georgia" w:eastAsia="Georgia" w:cs="Georgia"/>
           <w:rtl w:val="0"/>
         </w:rPr>
       </w:r>
@@ -3032,6 +3272,7 @@
       </w:pPr>
       <w:r>
         <w:rPr>
+          <w:rFonts w:ascii="Georgia" w:hAnsi="Georgia" w:eastAsia="Georgia" w:cs="Georgia"/>
           <w:b w:val="1"/>
           <w:bCs w:val="1"/>
           <w:sz w:val="22"/>
@@ -3042,6 +3283,7 @@
       </w:r>
       <w:r>
         <w:rPr>
+          <w:rFonts w:ascii="Georgia" w:hAnsi="Georgia" w:eastAsia="Georgia" w:cs="Georgia"/>
           <w:sz w:val="22"/>
           <w:szCs w:val="22"/>
           <w:rtl w:val="0"/>
@@ -3050,17 +3292,19 @@
       </w:r>
       <w:r>
         <w:rPr>
-          <w:rtl w:val="0"/>
-        </w:rPr>
-      </w:r>
-    </w:p>
-    <w:p>
-      <w:pPr>
-        <w:spacing w:line="480" w:lineRule="auto"/>
-        <w:rPr/>
-      </w:pPr>
-      <w:r>
-        <w:rPr>
+          <w:rFonts w:ascii="Georgia" w:hAnsi="Georgia" w:eastAsia="Georgia" w:cs="Georgia"/>
+          <w:rtl w:val="0"/>
+        </w:rPr>
+      </w:r>
+    </w:p>
+    <w:p>
+      <w:pPr>
+        <w:spacing w:line="480" w:lineRule="auto"/>
+        <w:rPr/>
+      </w:pPr>
+      <w:r>
+        <w:rPr>
+          <w:rFonts w:ascii="Georgia" w:hAnsi="Georgia" w:eastAsia="Georgia" w:cs="Georgia"/>
           <w:rtl w:val="0"/>
         </w:rPr>
       </w:r>
@@ -3074,6 +3318,7 @@
       </w:pPr>
       <w:r>
         <w:rPr>
+          <w:rFonts w:ascii="Georgia" w:hAnsi="Georgia" w:eastAsia="Georgia" w:cs="Georgia"/>
           <w:b w:val="1"/>
           <w:bCs w:val="1"/>
           <w:sz w:val="22"/>
@@ -3084,6 +3329,7 @@
       </w:r>
       <w:r>
         <w:rPr>
+          <w:rFonts w:ascii="Georgia" w:hAnsi="Georgia" w:eastAsia="Georgia" w:cs="Georgia"/>
           <w:sz w:val="22"/>
           <w:szCs w:val="22"/>
           <w:rtl w:val="0"/>
@@ -3092,6 +3338,7 @@
       </w:r>
       <w:r>
         <w:rPr>
+          <w:rFonts w:ascii="Georgia" w:hAnsi="Georgia" w:eastAsia="Georgia" w:cs="Georgia"/>
           <w:rtl w:val="0"/>
         </w:rPr>
       </w:r>
@@ -3105,6 +3352,7 @@
       </w:pPr>
       <w:r>
         <w:rPr>
+          <w:rFonts w:ascii="Georgia" w:hAnsi="Georgia" w:eastAsia="Georgia" w:cs="Georgia"/>
           <w:b w:val="1"/>
           <w:bCs w:val="1"/>
           <w:sz w:val="24"/>
@@ -3115,6 +3363,7 @@
       </w:r>
       <w:r>
         <w:rPr>
+          <w:rFonts w:ascii="Georgia" w:hAnsi="Georgia" w:eastAsia="Georgia" w:cs="Georgia"/>
           <w:rtl w:val="0"/>
         </w:rPr>
       </w:r>
@@ -3128,6 +3377,7 @@
       </w:pPr>
       <w:r>
         <w:rPr>
+          <w:rFonts w:ascii="Georgia" w:hAnsi="Georgia" w:eastAsia="Georgia" w:cs="Georgia"/>
           <w:sz w:val="22"/>
           <w:szCs w:val="22"/>
           <w:rtl w:val="0"/>
@@ -3136,20 +3386,25 @@
       </w:r>
       <w:r>
         <w:rPr>
-          <w:rtl w:val="0"/>
-        </w:rPr>
-      </w:r>
-    </w:p>
-    <w:p>
-      <w:pPr>
-        <w:spacing w:line="480" w:lineRule="auto"/>
-        <w:rPr/>
-      </w:pPr>
-      <w:r>
+          <w:rFonts w:ascii="Georgia" w:hAnsi="Georgia" w:eastAsia="Georgia" w:cs="Georgia"/>
+          <w:rtl w:val="0"/>
+        </w:rPr>
+      </w:r>
+    </w:p>
+    <w:p>
+      <w:pPr>
+        <w:spacing w:line="480" w:lineRule="auto"/>
+        <w:rPr/>
+      </w:pPr>
+      <w:r>
+        <w:rPr>
+          <w:rFonts w:ascii="Georgia" w:hAnsi="Georgia" w:eastAsia="Georgia" w:cs="Georgia"/>
+        </w:rPr>
         <w:br w:type="page"/>
       </w:r>
       <w:r>
         <w:rPr>
+          <w:rFonts w:ascii="Georgia" w:hAnsi="Georgia" w:eastAsia="Georgia" w:cs="Georgia"/>
           <w:rtl w:val="0"/>
         </w:rPr>
       </w:r>
@@ -3161,6 +3416,7 @@
       </w:pPr>
       <w:r>
         <w:rPr>
+          <w:rFonts w:ascii="Georgia" w:hAnsi="Georgia" w:eastAsia="Georgia" w:cs="Georgia"/>
           <w:rtl w:val="0"/>
         </w:rPr>
       </w:r>
@@ -3173,6 +3429,7 @@
       </w:pPr>
       <w:r>
         <w:rPr>
+          <w:rFonts w:ascii="Georgia" w:hAnsi="Georgia" w:eastAsia="Georgia" w:cs="Georgia"/>
           <w:b w:val="1"/>
           <w:bCs w:val="1"/>
           <w:sz w:val="28"/>
@@ -3183,6 +3440,7 @@
       </w:r>
       <w:r>
         <w:rPr>
+          <w:rFonts w:ascii="Georgia" w:hAnsi="Georgia" w:eastAsia="Georgia" w:cs="Georgia"/>
           <w:rtl w:val="0"/>
         </w:rPr>
       </w:r>
@@ -3196,7 +3454,7 @@
       </w:pPr>
       <w:r>
         <w:rPr>
-          <w:rFonts w:ascii="Times New Roman" w:hAnsi="Times New Roman"/>
+          <w:rFonts w:ascii="Georgia" w:hAnsi="Georgia" w:eastAsia="Georgia" w:cs="Georgia"/>
           <w:sz w:val="22"/>
           <w:rtl w:val="0"/>
         </w:rPr>
@@ -3212,7 +3470,7 @@
       </w:pPr>
       <w:r>
         <w:rPr>
-          <w:rFonts w:ascii="Times New Roman" w:hAnsi="Times New Roman"/>
+          <w:rFonts w:ascii="Georgia" w:hAnsi="Georgia" w:eastAsia="Georgia" w:cs="Georgia"/>
           <w:sz w:val="22"/>
           <w:szCs w:val="22"/>
           <w:rtl w:val="0"/>
@@ -3221,6 +3479,7 @@
       </w:r>
       <w:r>
         <w:rPr>
+          <w:rFonts w:ascii="Georgia" w:hAnsi="Georgia" w:eastAsia="Georgia" w:cs="Georgia"/>
           <w:i w:val="1"/>
           <w:iCs w:val="1"/>
           <w:sz w:val="22"/>
@@ -3230,13 +3489,15 @@
       </w:r>
       <w:r>
         <w:rPr>
-          <w:sz w:val="22"/>
-          <w:szCs w:val="22"/>
-          <w:rtl w:val="0"/>
-        </w:rPr>
-      </w:r>
-      <w:r>
-        <w:rPr>
+          <w:rFonts w:ascii="Georgia" w:hAnsi="Georgia" w:eastAsia="Georgia" w:cs="Georgia"/>
+          <w:sz w:val="22"/>
+          <w:szCs w:val="22"/>
+          <w:rtl w:val="0"/>
+        </w:rPr>
+      </w:r>
+      <w:r>
+        <w:rPr>
+          <w:rFonts w:ascii="Georgia" w:hAnsi="Georgia" w:eastAsia="Georgia" w:cs="Georgia"/>
           <w:rtl w:val="0"/>
         </w:rPr>
       </w:r>
@@ -3249,7 +3510,7 @@
       </w:pPr>
       <w:r>
         <w:rPr>
-          <w:rFonts w:ascii="Times New Roman" w:hAnsi="Times New Roman"/>
+          <w:rFonts w:ascii="Georgia" w:hAnsi="Georgia" w:eastAsia="Georgia" w:cs="Georgia"/>
           <w:sz w:val="22"/>
           <w:rtl w:val="0"/>
         </w:rPr>
@@ -3265,7 +3526,7 @@
       </w:pPr>
       <w:r>
         <w:rPr>
-          <w:rFonts w:ascii="Times New Roman" w:hAnsi="Times New Roman"/>
+          <w:rFonts w:ascii="Georgia" w:hAnsi="Georgia" w:eastAsia="Georgia" w:cs="Georgia"/>
           <w:sz w:val="22"/>
           <w:szCs w:val="22"/>
           <w:rtl w:val="0"/>
@@ -3274,6 +3535,7 @@
       </w:r>
       <w:r>
         <w:rPr>
+          <w:rFonts w:ascii="Georgia" w:hAnsi="Georgia" w:eastAsia="Georgia" w:cs="Georgia"/>
           <w:rtl w:val="0"/>
         </w:rPr>
       </w:r>
@@ -3286,7 +3548,7 @@
       </w:pPr>
       <w:r>
         <w:rPr>
-          <w:rFonts w:ascii="Times New Roman" w:hAnsi="Times New Roman"/>
+          <w:rFonts w:ascii="Georgia" w:hAnsi="Georgia" w:eastAsia="Georgia" w:cs="Georgia"/>
           <w:sz w:val="22"/>
           <w:rtl w:val="0"/>
         </w:rPr>
@@ -3302,7 +3564,7 @@
       </w:pPr>
       <w:r>
         <w:rPr>
-          <w:rFonts w:ascii="Times New Roman" w:hAnsi="Times New Roman"/>
+          <w:rFonts w:ascii="Georgia" w:hAnsi="Georgia" w:eastAsia="Georgia" w:cs="Georgia"/>
           <w:sz w:val="22"/>
           <w:szCs w:val="22"/>
           <w:rtl w:val="0"/>
@@ -3311,6 +3573,7 @@
       </w:r>
       <w:r>
         <w:rPr>
+          <w:rFonts w:ascii="Georgia" w:hAnsi="Georgia" w:eastAsia="Georgia" w:cs="Georgia"/>
           <w:i w:val="1"/>
           <w:iCs w:val="1"/>
           <w:sz w:val="22"/>
@@ -3320,13 +3583,15 @@
       </w:r>
       <w:r>
         <w:rPr>
-          <w:sz w:val="22"/>
-          <w:szCs w:val="22"/>
-          <w:rtl w:val="0"/>
-        </w:rPr>
-      </w:r>
-      <w:r>
-        <w:rPr>
+          <w:rFonts w:ascii="Georgia" w:hAnsi="Georgia" w:eastAsia="Georgia" w:cs="Georgia"/>
+          <w:sz w:val="22"/>
+          <w:szCs w:val="22"/>
+          <w:rtl w:val="0"/>
+        </w:rPr>
+      </w:r>
+      <w:r>
+        <w:rPr>
+          <w:rFonts w:ascii="Georgia" w:hAnsi="Georgia" w:eastAsia="Georgia" w:cs="Georgia"/>
           <w:rtl w:val="0"/>
         </w:rPr>
       </w:r>
@@ -3339,7 +3604,7 @@
       </w:pPr>
       <w:r>
         <w:rPr>
-          <w:rFonts w:ascii="Times New Roman" w:hAnsi="Times New Roman"/>
+          <w:rFonts w:ascii="Georgia" w:hAnsi="Georgia" w:eastAsia="Georgia" w:cs="Georgia"/>
           <w:sz w:val="22"/>
           <w:rtl w:val="0"/>
         </w:rPr>
@@ -3355,7 +3620,7 @@
       </w:pPr>
       <w:r>
         <w:rPr>
-          <w:rFonts w:ascii="Times New Roman" w:hAnsi="Times New Roman"/>
+          <w:rFonts w:ascii="Georgia" w:hAnsi="Georgia" w:eastAsia="Georgia" w:cs="Georgia"/>
           <w:sz w:val="22"/>
           <w:szCs w:val="22"/>
           <w:rtl w:val="0"/>
@@ -3364,6 +3629,7 @@
       </w:r>
       <w:r>
         <w:rPr>
+          <w:rFonts w:ascii="Georgia" w:hAnsi="Georgia" w:eastAsia="Georgia" w:cs="Georgia"/>
           <w:i w:val="1"/>
           <w:iCs w:val="1"/>
           <w:sz w:val="22"/>
@@ -3373,13 +3639,15 @@
       </w:r>
       <w:r>
         <w:rPr>
-          <w:sz w:val="22"/>
-          <w:szCs w:val="22"/>
-          <w:rtl w:val="0"/>
-        </w:rPr>
-      </w:r>
-      <w:r>
-        <w:rPr>
+          <w:rFonts w:ascii="Georgia" w:hAnsi="Georgia" w:eastAsia="Georgia" w:cs="Georgia"/>
+          <w:sz w:val="22"/>
+          <w:szCs w:val="22"/>
+          <w:rtl w:val="0"/>
+        </w:rPr>
+      </w:r>
+      <w:r>
+        <w:rPr>
+          <w:rFonts w:ascii="Georgia" w:hAnsi="Georgia" w:eastAsia="Georgia" w:cs="Georgia"/>
           <w:rtl w:val="0"/>
         </w:rPr>
       </w:r>
@@ -3392,7 +3660,7 @@
       </w:pPr>
       <w:r>
         <w:rPr>
-          <w:rFonts w:ascii="Times New Roman" w:hAnsi="Times New Roman"/>
+          <w:rFonts w:ascii="Georgia" w:hAnsi="Georgia" w:eastAsia="Georgia" w:cs="Georgia"/>
           <w:sz w:val="22"/>
           <w:rtl w:val="0"/>
         </w:rPr>
@@ -3408,7 +3676,7 @@
       </w:pPr>
       <w:r>
         <w:rPr>
-          <w:rFonts w:ascii="Times New Roman" w:hAnsi="Times New Roman"/>
+          <w:rFonts w:ascii="Georgia" w:hAnsi="Georgia" w:eastAsia="Georgia" w:cs="Georgia"/>
           <w:sz w:val="22"/>
           <w:szCs w:val="22"/>
           <w:rtl w:val="0"/>
@@ -3417,6 +3685,7 @@
       </w:r>
       <w:r>
         <w:rPr>
+          <w:rFonts w:ascii="Georgia" w:hAnsi="Georgia" w:eastAsia="Georgia" w:cs="Georgia"/>
           <w:i w:val="1"/>
           <w:iCs w:val="1"/>
           <w:sz w:val="22"/>
@@ -3426,13 +3695,15 @@
       </w:r>
       <w:r>
         <w:rPr>
-          <w:sz w:val="22"/>
-          <w:szCs w:val="22"/>
-          <w:rtl w:val="0"/>
-        </w:rPr>
-      </w:r>
-      <w:r>
-        <w:rPr>
+          <w:rFonts w:ascii="Georgia" w:hAnsi="Georgia" w:eastAsia="Georgia" w:cs="Georgia"/>
+          <w:sz w:val="22"/>
+          <w:szCs w:val="22"/>
+          <w:rtl w:val="0"/>
+        </w:rPr>
+      </w:r>
+      <w:r>
+        <w:rPr>
+          <w:rFonts w:ascii="Georgia" w:hAnsi="Georgia" w:eastAsia="Georgia" w:cs="Georgia"/>
           <w:rtl w:val="0"/>
         </w:rPr>
       </w:r>
@@ -3445,7 +3716,7 @@
       </w:pPr>
       <w:r>
         <w:rPr>
-          <w:rFonts w:ascii="Times New Roman" w:hAnsi="Times New Roman"/>
+          <w:rFonts w:ascii="Georgia" w:hAnsi="Georgia" w:eastAsia="Georgia" w:cs="Georgia"/>
           <w:sz w:val="22"/>
           <w:rtl w:val="0"/>
         </w:rPr>
@@ -3461,7 +3732,7 @@
       </w:pPr>
       <w:r>
         <w:rPr>
-          <w:rFonts w:ascii="Times New Roman" w:hAnsi="Times New Roman"/>
+          <w:rFonts w:ascii="Georgia" w:hAnsi="Georgia" w:eastAsia="Georgia" w:cs="Georgia"/>
           <w:sz w:val="22"/>
           <w:rtl w:val="0"/>
         </w:rPr>
@@ -3477,7 +3748,7 @@
       </w:pPr>
       <w:r>
         <w:rPr>
-          <w:rFonts w:ascii="Times New Roman" w:hAnsi="Times New Roman"/>
+          <w:rFonts w:ascii="Georgia" w:hAnsi="Georgia" w:eastAsia="Georgia" w:cs="Georgia"/>
           <w:sz w:val="22"/>
           <w:szCs w:val="22"/>
           <w:rtl w:val="0"/>
@@ -3486,6 +3757,7 @@
       </w:r>
       <w:r>
         <w:rPr>
+          <w:rFonts w:ascii="Georgia" w:hAnsi="Georgia" w:eastAsia="Georgia" w:cs="Georgia"/>
           <w:rtl w:val="0"/>
         </w:rPr>
       </w:r>
@@ -3498,7 +3770,7 @@
       </w:pPr>
       <w:r>
         <w:rPr>
-          <w:rFonts w:ascii="Times New Roman" w:hAnsi="Times New Roman"/>
+          <w:rFonts w:ascii="Georgia" w:hAnsi="Georgia" w:eastAsia="Georgia" w:cs="Georgia"/>
           <w:sz w:val="22"/>
           <w:rtl w:val="0"/>
         </w:rPr>
@@ -3514,7 +3786,7 @@
       </w:pPr>
       <w:r>
         <w:rPr>
-          <w:rFonts w:ascii="Times New Roman" w:hAnsi="Times New Roman"/>
+          <w:rFonts w:ascii="Georgia" w:hAnsi="Georgia" w:eastAsia="Georgia" w:cs="Georgia"/>
           <w:sz w:val="22"/>
           <w:szCs w:val="22"/>
           <w:rtl w:val="0"/>
@@ -3523,6 +3795,7 @@
       </w:r>
       <w:r>
         <w:rPr>
+          <w:rFonts w:ascii="Georgia" w:hAnsi="Georgia" w:eastAsia="Georgia" w:cs="Georgia"/>
           <w:i w:val="1"/>
           <w:iCs w:val="1"/>
           <w:sz w:val="22"/>
@@ -3532,13 +3805,15 @@
       </w:r>
       <w:r>
         <w:rPr>
-          <w:sz w:val="22"/>
-          <w:szCs w:val="22"/>
-          <w:rtl w:val="0"/>
-        </w:rPr>
-      </w:r>
-      <w:r>
-        <w:rPr>
+          <w:rFonts w:ascii="Georgia" w:hAnsi="Georgia" w:eastAsia="Georgia" w:cs="Georgia"/>
+          <w:sz w:val="22"/>
+          <w:szCs w:val="22"/>
+          <w:rtl w:val="0"/>
+        </w:rPr>
+      </w:r>
+      <w:r>
+        <w:rPr>
+          <w:rFonts w:ascii="Georgia" w:hAnsi="Georgia" w:eastAsia="Georgia" w:cs="Georgia"/>
           <w:rtl w:val="0"/>
         </w:rPr>
       </w:r>
@@ -3551,7 +3826,7 @@
       </w:pPr>
       <w:r>
         <w:rPr>
-          <w:rFonts w:ascii="Times New Roman" w:hAnsi="Times New Roman"/>
+          <w:rFonts w:ascii="Georgia" w:hAnsi="Georgia" w:eastAsia="Georgia" w:cs="Georgia"/>
           <w:sz w:val="22"/>
           <w:rtl w:val="0"/>
         </w:rPr>
@@ -3567,7 +3842,7 @@
       </w:pPr>
       <w:r>
         <w:rPr>
-          <w:rFonts w:ascii="Times New Roman" w:hAnsi="Times New Roman"/>
+          <w:rFonts w:ascii="Georgia" w:hAnsi="Georgia" w:eastAsia="Georgia" w:cs="Georgia"/>
           <w:sz w:val="22"/>
           <w:szCs w:val="22"/>
           <w:rtl w:val="0"/>
@@ -3576,6 +3851,7 @@
       </w:r>
       <w:r>
         <w:rPr>
+          <w:rFonts w:ascii="Georgia" w:hAnsi="Georgia" w:eastAsia="Georgia" w:cs="Georgia"/>
           <w:i w:val="1"/>
           <w:iCs w:val="1"/>
           <w:sz w:val="22"/>
@@ -3585,13 +3861,15 @@
       </w:r>
       <w:r>
         <w:rPr>
-          <w:sz w:val="22"/>
-          <w:szCs w:val="22"/>
-          <w:rtl w:val="0"/>
-        </w:rPr>
-      </w:r>
-      <w:r>
-        <w:rPr>
+          <w:rFonts w:ascii="Georgia" w:hAnsi="Georgia" w:eastAsia="Georgia" w:cs="Georgia"/>
+          <w:sz w:val="22"/>
+          <w:szCs w:val="22"/>
+          <w:rtl w:val="0"/>
+        </w:rPr>
+      </w:r>
+      <w:r>
+        <w:rPr>
+          <w:rFonts w:ascii="Georgia" w:hAnsi="Georgia" w:eastAsia="Georgia" w:cs="Georgia"/>
           <w:rtl w:val="0"/>
         </w:rPr>
       </w:r>
@@ -3604,7 +3882,7 @@
       </w:pPr>
       <w:r>
         <w:rPr>
-          <w:rFonts w:ascii="Times New Roman" w:hAnsi="Times New Roman"/>
+          <w:rFonts w:ascii="Georgia" w:hAnsi="Georgia" w:eastAsia="Georgia" w:cs="Georgia"/>
           <w:sz w:val="22"/>
           <w:rtl w:val="0"/>
         </w:rPr>
@@ -3620,7 +3898,7 @@
       </w:pPr>
       <w:r>
         <w:rPr>
-          <w:rFonts w:ascii="Times New Roman" w:hAnsi="Times New Roman"/>
+          <w:rFonts w:ascii="Georgia" w:hAnsi="Georgia" w:eastAsia="Georgia" w:cs="Georgia"/>
           <w:sz w:val="22"/>
           <w:szCs w:val="22"/>
           <w:rtl w:val="0"/>
@@ -3629,6 +3907,7 @@
       </w:r>
       <w:r>
         <w:rPr>
+          <w:rFonts w:ascii="Georgia" w:hAnsi="Georgia" w:eastAsia="Georgia" w:cs="Georgia"/>
           <w:i w:val="1"/>
           <w:iCs w:val="1"/>
           <w:sz w:val="22"/>
@@ -3638,13 +3917,15 @@
       </w:r>
       <w:r>
         <w:rPr>
-          <w:sz w:val="22"/>
-          <w:szCs w:val="22"/>
-          <w:rtl w:val="0"/>
-        </w:rPr>
-      </w:r>
-      <w:r>
-        <w:rPr>
+          <w:rFonts w:ascii="Georgia" w:hAnsi="Georgia" w:eastAsia="Georgia" w:cs="Georgia"/>
+          <w:sz w:val="22"/>
+          <w:szCs w:val="22"/>
+          <w:rtl w:val="0"/>
+        </w:rPr>
+      </w:r>
+      <w:r>
+        <w:rPr>
+          <w:rFonts w:ascii="Georgia" w:hAnsi="Georgia" w:eastAsia="Georgia" w:cs="Georgia"/>
           <w:rtl w:val="0"/>
         </w:rPr>
       </w:r>
@@ -3658,7 +3939,7 @@
       </w:pPr>
       <w:r>
         <w:rPr>
-          <w:rFonts w:ascii="Times New Roman" w:hAnsi="Times New Roman"/>
+          <w:rFonts w:ascii="Georgia" w:hAnsi="Georgia" w:eastAsia="Georgia" w:cs="Georgia"/>
           <w:sz w:val="22"/>
           <w:rtl w:val="0"/>
         </w:rPr>
@@ -3674,7 +3955,7 @@
       </w:pPr>
       <w:r>
         <w:rPr>
-          <w:rFonts w:ascii="Times New Roman" w:hAnsi="Times New Roman"/>
+          <w:rFonts w:ascii="Georgia" w:hAnsi="Georgia" w:eastAsia="Georgia" w:cs="Georgia"/>
           <w:sz w:val="22"/>
           <w:rtl w:val="0"/>
         </w:rPr>
@@ -3689,14 +3970,15 @@
       </w:pPr>
       <w:r>
         <w:rPr>
-          <w:rFonts w:ascii="Times New Roman" w:hAnsi="Times New Roman"/>
-          <w:sz w:val="22"/>
-          <w:szCs w:val="22"/>
-          <w:rtl w:val="0"/>
-        </w:rPr>
-      </w:r>
-      <w:r>
-        <w:rPr>
+          <w:rFonts w:ascii="Georgia" w:hAnsi="Georgia" w:eastAsia="Georgia" w:cs="Georgia"/>
+          <w:sz w:val="22"/>
+          <w:szCs w:val="22"/>
+          <w:rtl w:val="0"/>
+        </w:rPr>
+      </w:r>
+      <w:r>
+        <w:rPr>
+          <w:rFonts w:ascii="Georgia" w:hAnsi="Georgia" w:eastAsia="Georgia" w:cs="Georgia"/>
           <w:rtl w:val="0"/>
         </w:rPr>
       </w:r>
@@ -3710,14 +3992,15 @@
       </w:pPr>
       <w:r>
         <w:rPr>
-          <w:rFonts w:ascii="Times New Roman" w:hAnsi="Times New Roman"/>
-          <w:sz w:val="22"/>
-          <w:szCs w:val="22"/>
-          <w:rtl w:val="0"/>
-        </w:rPr>
-      </w:r>
-      <w:r>
-        <w:rPr>
+          <w:rFonts w:ascii="Georgia" w:hAnsi="Georgia" w:eastAsia="Georgia" w:cs="Georgia"/>
+          <w:sz w:val="22"/>
+          <w:szCs w:val="22"/>
+          <w:rtl w:val="0"/>
+        </w:rPr>
+      </w:r>
+      <w:r>
+        <w:rPr>
+          <w:rFonts w:ascii="Georgia" w:hAnsi="Georgia" w:eastAsia="Georgia" w:cs="Georgia"/>
           <w:rtl w:val="0"/>
         </w:rPr>
       </w:r>
@@ -3731,54 +4014,55 @@
       </w:pPr>
       <w:r>
         <w:rPr>
-          <w:rFonts w:ascii="Times New Roman" w:hAnsi="Times New Roman"/>
-          <w:sz w:val="22"/>
-          <w:szCs w:val="22"/>
-          <w:rtl w:val="0"/>
-        </w:rPr>
-      </w:r>
-      <w:r>
-        <w:rPr>
-          <w:rtl w:val="0"/>
-        </w:rPr>
-      </w:r>
-    </w:p>
-    <w:p>
-      <w:r>
-        <w:rPr>
-          <w:rFonts w:ascii="Times New Roman" w:hAnsi="Times New Roman"/>
-          <w:sz w:val="22"/>
-        </w:rPr>
-      </w:r>
-    </w:p>
-    <w:p>
-      <w:r>
-        <w:rPr>
-          <w:rFonts w:ascii="Times New Roman" w:hAnsi="Times New Roman"/>
-          <w:sz w:val="22"/>
-        </w:rPr>
-      </w:r>
-    </w:p>
-    <w:p>
-      <w:r>
-        <w:rPr>
-          <w:rFonts w:ascii="Times New Roman" w:hAnsi="Times New Roman"/>
-          <w:sz w:val="22"/>
-        </w:rPr>
-      </w:r>
-    </w:p>
-    <w:p>
-      <w:r>
-        <w:rPr>
-          <w:rFonts w:ascii="Times New Roman" w:hAnsi="Times New Roman"/>
-          <w:sz w:val="22"/>
-        </w:rPr>
-      </w:r>
-    </w:p>
-    <w:p>
-      <w:r>
-        <w:rPr>
-          <w:rFonts w:ascii="Times New Roman" w:hAnsi="Times New Roman"/>
+          <w:rFonts w:ascii="Georgia" w:hAnsi="Georgia" w:eastAsia="Georgia" w:cs="Georgia"/>
+          <w:sz w:val="22"/>
+          <w:szCs w:val="22"/>
+          <w:rtl w:val="0"/>
+        </w:rPr>
+      </w:r>
+      <w:r>
+        <w:rPr>
+          <w:rFonts w:ascii="Georgia" w:hAnsi="Georgia" w:eastAsia="Georgia" w:cs="Georgia"/>
+          <w:rtl w:val="0"/>
+        </w:rPr>
+      </w:r>
+    </w:p>
+    <w:p>
+      <w:r>
+        <w:rPr>
+          <w:rFonts w:ascii="Georgia" w:hAnsi="Georgia" w:eastAsia="Georgia" w:cs="Georgia"/>
+          <w:sz w:val="22"/>
+        </w:rPr>
+      </w:r>
+    </w:p>
+    <w:p>
+      <w:r>
+        <w:rPr>
+          <w:rFonts w:ascii="Georgia" w:hAnsi="Georgia" w:eastAsia="Georgia" w:cs="Georgia"/>
+          <w:sz w:val="22"/>
+        </w:rPr>
+      </w:r>
+    </w:p>
+    <w:p>
+      <w:r>
+        <w:rPr>
+          <w:rFonts w:ascii="Georgia" w:hAnsi="Georgia" w:eastAsia="Georgia" w:cs="Georgia"/>
+          <w:sz w:val="22"/>
+        </w:rPr>
+      </w:r>
+    </w:p>
+    <w:p>
+      <w:r>
+        <w:rPr>
+          <w:rFonts w:ascii="Georgia" w:hAnsi="Georgia" w:eastAsia="Georgia" w:cs="Georgia"/>
+          <w:sz w:val="22"/>
+        </w:rPr>
+      </w:r>
+    </w:p>
+    <w:p>
+      <w:r>
+        <w:rPr>
+          <w:rFonts w:ascii="Georgia" w:hAnsi="Georgia" w:eastAsia="Georgia" w:cs="Georgia"/>
           <w:sz w:val="22"/>
         </w:rPr>
       </w:r>
@@ -3792,6 +4076,7 @@
       </w:pPr>
       <w:r>
         <w:rPr>
+          <w:rFonts w:ascii="Georgia" w:hAnsi="Georgia" w:eastAsia="Georgia" w:cs="Georgia"/>
           <w:b w:val="1"/>
           <w:bCs w:val="1"/>
           <w:sz w:val="28"/>
@@ -3802,6 +4087,7 @@
       </w:r>
       <w:r>
         <w:rPr>
+          <w:rFonts w:ascii="Georgia" w:hAnsi="Georgia" w:eastAsia="Georgia" w:cs="Georgia"/>
           <w:rtl w:val="0"/>
         </w:rPr>
       </w:r>
@@ -3815,6 +4101,7 @@
       </w:pPr>
       <w:r>
         <w:rPr>
+          <w:rFonts w:ascii="Georgia" w:hAnsi="Georgia" w:eastAsia="Georgia" w:cs="Georgia"/>
           <w:b w:val="1"/>
           <w:bCs w:val="1"/>
           <w:sz w:val="24"/>
@@ -3825,6 +4112,7 @@
       </w:r>
       <w:r>
         <w:rPr>
+          <w:rFonts w:ascii="Georgia" w:hAnsi="Georgia" w:eastAsia="Georgia" w:cs="Georgia"/>
           <w:rtl w:val="0"/>
         </w:rPr>
       </w:r>
@@ -3837,6 +4125,7 @@
       </w:pPr>
       <w:r>
         <w:rPr>
+          <w:rFonts w:ascii="Georgia" w:hAnsi="Georgia" w:eastAsia="Georgia" w:cs="Georgia"/>
           <w:b/>
           <w:i w:val="0"/>
           <w:iCs w:val="1"/>
@@ -3848,6 +4137,7 @@
       </w:r>
       <w:r>
         <w:rPr>
+          <w:rFonts w:ascii="Georgia" w:hAnsi="Georgia" w:eastAsia="Georgia" w:cs="Georgia"/>
           <w:b/>
           <w:i w:val="0"/>
           <w:sz w:val="22"/>
@@ -3863,6 +4153,7 @@
       </w:pPr>
       <w:r>
         <w:rPr>
+          <w:rFonts w:ascii="Georgia" w:hAnsi="Georgia" w:eastAsia="Georgia" w:cs="Georgia"/>
           <w:b w:val="0"/>
           <w:bCs w:val="1"/>
           <w:i w:val="0"/>
@@ -3874,6 +4165,7 @@
       </w:r>
       <w:r>
         <w:rPr>
+          <w:rFonts w:ascii="Georgia" w:hAnsi="Georgia" w:eastAsia="Georgia" w:cs="Georgia"/>
           <w:b w:val="0"/>
           <w:i w:val="0"/>
           <w:sz w:val="22"/>
@@ -3933,6 +4225,7 @@
             </w:pPr>
             <w:r>
               <w:rPr>
+                <w:rFonts w:ascii="Georgia" w:hAnsi="Georgia" w:eastAsia="Georgia" w:cs="Georgia"/>
                 <w:b w:val="1"/>
                 <w:bCs w:val="1"/>
                 <w:color w:val="ffffff"/>
@@ -3944,6 +4237,7 @@
             </w:r>
             <w:r>
               <w:rPr>
+                <w:rFonts w:ascii="Georgia" w:hAnsi="Georgia" w:eastAsia="Georgia" w:cs="Georgia"/>
                 <w:rtl w:val="0"/>
               </w:rPr>
             </w:r>
@@ -3976,6 +4270,7 @@
             </w:pPr>
             <w:r>
               <w:rPr>
+                <w:rFonts w:ascii="Georgia" w:hAnsi="Georgia" w:eastAsia="Georgia" w:cs="Georgia"/>
                 <w:b w:val="1"/>
                 <w:bCs w:val="1"/>
                 <w:color w:val="ffffff"/>
@@ -3987,6 +4282,7 @@
             </w:r>
             <w:r>
               <w:rPr>
+                <w:rFonts w:ascii="Georgia" w:hAnsi="Georgia" w:eastAsia="Georgia" w:cs="Georgia"/>
                 <w:rtl w:val="0"/>
               </w:rPr>
             </w:r>
@@ -4019,6 +4315,7 @@
             </w:pPr>
             <w:r>
               <w:rPr>
+                <w:rFonts w:ascii="Georgia" w:hAnsi="Georgia" w:eastAsia="Georgia" w:cs="Georgia"/>
                 <w:b w:val="1"/>
                 <w:bCs w:val="1"/>
                 <w:color w:val="ffffff"/>
@@ -4030,6 +4327,7 @@
             </w:r>
             <w:r>
               <w:rPr>
+                <w:rFonts w:ascii="Georgia" w:hAnsi="Georgia" w:eastAsia="Georgia" w:cs="Georgia"/>
                 <w:rtl w:val="0"/>
               </w:rPr>
             </w:r>
@@ -4062,6 +4360,7 @@
             </w:pPr>
             <w:r>
               <w:rPr>
+                <w:rFonts w:ascii="Georgia" w:hAnsi="Georgia" w:eastAsia="Georgia" w:cs="Georgia"/>
                 <w:sz w:val="18"/>
                 <w:szCs w:val="18"/>
                 <w:rtl w:val="0"/>
@@ -4090,6 +4389,7 @@
             </w:pPr>
             <w:r>
               <w:rPr>
+                <w:rFonts w:ascii="Georgia" w:hAnsi="Georgia" w:eastAsia="Georgia" w:cs="Georgia"/>
                 <w:sz w:val="18"/>
                 <w:szCs w:val="18"/>
                 <w:rtl w:val="0"/>
@@ -4118,6 +4418,7 @@
             </w:pPr>
             <w:r>
               <w:rPr>
+                <w:rFonts w:ascii="Georgia" w:hAnsi="Georgia" w:eastAsia="Georgia" w:cs="Georgia"/>
                 <w:sz w:val="18"/>
                 <w:szCs w:val="18"/>
                 <w:rtl w:val="0"/>
@@ -4159,6 +4460,7 @@
             </w:pPr>
             <w:r>
               <w:rPr>
+                <w:rFonts w:ascii="Georgia" w:hAnsi="Georgia" w:eastAsia="Georgia" w:cs="Georgia"/>
                 <w:sz w:val="18"/>
                 <w:szCs w:val="18"/>
                 <w:rtl w:val="0"/>
@@ -4193,6 +4495,7 @@
             </w:pPr>
             <w:r>
               <w:rPr>
+                <w:rFonts w:ascii="Georgia" w:hAnsi="Georgia" w:eastAsia="Georgia" w:cs="Georgia"/>
                 <w:sz w:val="18"/>
                 <w:szCs w:val="18"/>
                 <w:rtl w:val="0"/>
@@ -4227,6 +4530,7 @@
             </w:pPr>
             <w:r>
               <w:rPr>
+                <w:rFonts w:ascii="Georgia" w:hAnsi="Georgia" w:eastAsia="Georgia" w:cs="Georgia"/>
                 <w:sz w:val="18"/>
                 <w:szCs w:val="18"/>
                 <w:rtl w:val="0"/>
@@ -4247,18 +4551,20 @@
       </w:pPr>
       <w:r>
         <w:rPr>
-          <w:rtl w:val="0"/>
-        </w:rPr>
-      </w:r>
-    </w:p>
-    <w:p>
-      <w:pPr>
-        <w:spacing w:line="480" w:lineRule="auto"/>
-        <w:jc w:val="both"/>
-        <w:rPr/>
-      </w:pPr>
-      <w:r>
-        <w:rPr>
+          <w:rFonts w:ascii="Georgia" w:hAnsi="Georgia" w:eastAsia="Georgia" w:cs="Georgia"/>
+          <w:rtl w:val="0"/>
+        </w:rPr>
+      </w:r>
+    </w:p>
+    <w:p>
+      <w:pPr>
+        <w:spacing w:line="480" w:lineRule="auto"/>
+        <w:jc w:val="both"/>
+        <w:rPr/>
+      </w:pPr>
+      <w:r>
+        <w:rPr>
+          <w:rFonts w:ascii="Georgia" w:hAnsi="Georgia" w:eastAsia="Georgia" w:cs="Georgia"/>
           <w:rtl w:val="0"/>
         </w:rPr>
         <w:t xml:space="preserve">Decision procedure (two-stage Identify and Sort). The markers in Table A1 are illustrative signals, not an exhaustive inventory. Coding proceeds in two stages. Stage 1 — Identify. For each caption, mark hope construction and empowerment language as present or absent on the basis of the illustrative signals. Stage 2 — Sort. If only hope construction is present, code HOPE. If only empowerment language is present, code EMPOWERMENT. If neither is present, code blended or indeterminate. If both are present, adjudicate dominance: which orientation occupies the main clause(s) or the final prominent position, and which speech act carries the main force of the text — "Things can or will get better" (HOPE) or "You can or should act" (EMPOWERMENT). The orientation that wins both checks, or clearly wins one while the other is only peripheral, becomes the dominant code. If the checks disagree or neither orientation is clearly stronger, code as blended or indeterminate. Blended cases are logged separately and excluded from the main HOPE versus EMPOWERMENT distribution.</w:t>
@@ -4271,6 +4577,7 @@
       </w:pPr>
       <w:r>
         <w:rPr>
+          <w:rFonts w:ascii="Georgia" w:hAnsi="Georgia" w:eastAsia="Georgia" w:cs="Georgia"/>
           <w:rtl w:val="0"/>
         </w:rPr>
       </w:r>
@@ -4285,6 +4592,7 @@
       </w:pPr>
       <w:r>
         <w:rPr>
+          <w:rFonts w:ascii="Georgia" w:hAnsi="Georgia" w:eastAsia="Georgia" w:cs="Georgia"/>
           <w:b w:val="1"/>
           <w:bCs w:val="1"/>
           <w:sz w:val="24"/>
@@ -4295,6 +4603,7 @@
       </w:r>
       <w:r>
         <w:rPr>
+          <w:rFonts w:ascii="Georgia" w:hAnsi="Georgia" w:eastAsia="Georgia" w:cs="Georgia"/>
           <w:rtl w:val="0"/>
         </w:rPr>
       </w:r>
@@ -4307,6 +4616,7 @@
       </w:pPr>
       <w:r>
         <w:rPr>
+          <w:rFonts w:ascii="Georgia" w:hAnsi="Georgia" w:eastAsia="Georgia" w:cs="Georgia"/>
           <w:b/>
           <w:i w:val="0"/>
           <w:iCs w:val="1"/>
@@ -4318,6 +4628,7 @@
       </w:r>
       <w:r>
         <w:rPr>
+          <w:rFonts w:ascii="Georgia" w:hAnsi="Georgia" w:eastAsia="Georgia" w:cs="Georgia"/>
           <w:b/>
           <w:i w:val="0"/>
           <w:sz w:val="22"/>
@@ -4333,6 +4644,7 @@
       </w:pPr>
       <w:r>
         <w:rPr>
+          <w:rFonts w:ascii="Georgia" w:hAnsi="Georgia" w:eastAsia="Georgia" w:cs="Georgia"/>
           <w:b w:val="0"/>
           <w:bCs w:val="1"/>
           <w:i w:val="0"/>
@@ -4344,6 +4656,7 @@
       </w:r>
       <w:r>
         <w:rPr>
+          <w:rFonts w:ascii="Georgia" w:hAnsi="Georgia" w:eastAsia="Georgia" w:cs="Georgia"/>
           <w:b w:val="0"/>
           <w:i w:val="0"/>
           <w:sz w:val="22"/>
@@ -4403,6 +4716,7 @@
             </w:pPr>
             <w:r>
               <w:rPr>
+                <w:rFonts w:ascii="Georgia" w:hAnsi="Georgia" w:eastAsia="Georgia" w:cs="Georgia"/>
                 <w:b w:val="1"/>
                 <w:bCs w:val="1"/>
                 <w:color w:val="ffffff"/>
@@ -4414,6 +4728,7 @@
             </w:r>
             <w:r>
               <w:rPr>
+                <w:rFonts w:ascii="Georgia" w:hAnsi="Georgia" w:eastAsia="Georgia" w:cs="Georgia"/>
                 <w:rtl w:val="0"/>
               </w:rPr>
             </w:r>
@@ -4446,6 +4761,7 @@
             </w:pPr>
             <w:r>
               <w:rPr>
+                <w:rFonts w:ascii="Georgia" w:hAnsi="Georgia" w:eastAsia="Georgia" w:cs="Georgia"/>
                 <w:b w:val="1"/>
                 <w:bCs w:val="1"/>
                 <w:color w:val="ffffff"/>
@@ -4457,6 +4773,7 @@
             </w:r>
             <w:r>
               <w:rPr>
+                <w:rFonts w:ascii="Georgia" w:hAnsi="Georgia" w:eastAsia="Georgia" w:cs="Georgia"/>
                 <w:rtl w:val="0"/>
               </w:rPr>
             </w:r>
@@ -4489,6 +4806,7 @@
             </w:pPr>
             <w:r>
               <w:rPr>
+                <w:rFonts w:ascii="Georgia" w:hAnsi="Georgia" w:eastAsia="Georgia" w:cs="Georgia"/>
                 <w:b w:val="1"/>
                 <w:bCs w:val="1"/>
                 <w:color w:val="ffffff"/>
@@ -4500,6 +4818,7 @@
             </w:r>
             <w:r>
               <w:rPr>
+                <w:rFonts w:ascii="Georgia" w:hAnsi="Georgia" w:eastAsia="Georgia" w:cs="Georgia"/>
                 <w:rtl w:val="0"/>
               </w:rPr>
             </w:r>
@@ -4532,6 +4851,7 @@
             </w:pPr>
             <w:r>
               <w:rPr>
+                <w:rFonts w:ascii="Georgia" w:hAnsi="Georgia" w:eastAsia="Georgia" w:cs="Georgia"/>
                 <w:sz w:val="18"/>
                 <w:szCs w:val="18"/>
                 <w:rtl w:val="0"/>
@@ -4561,6 +4881,7 @@
             </w:pPr>
             <w:r>
               <w:rPr>
+                <w:rFonts w:ascii="Georgia" w:hAnsi="Georgia" w:eastAsia="Georgia" w:cs="Georgia"/>
                 <w:sz w:val="18"/>
                 <w:szCs w:val="18"/>
                 <w:rtl w:val="0"/>
@@ -4590,6 +4911,7 @@
             </w:pPr>
             <w:r>
               <w:rPr>
+                <w:rFonts w:ascii="Georgia" w:hAnsi="Georgia" w:eastAsia="Georgia" w:cs="Georgia"/>
                 <w:sz w:val="18"/>
                 <w:szCs w:val="18"/>
                 <w:rtl w:val="0"/>
@@ -4631,6 +4953,7 @@
             </w:pPr>
             <w:r>
               <w:rPr>
+                <w:rFonts w:ascii="Georgia" w:hAnsi="Georgia" w:eastAsia="Georgia" w:cs="Georgia"/>
                 <w:sz w:val="18"/>
                 <w:szCs w:val="18"/>
                 <w:rtl w:val="0"/>
@@ -4665,6 +4988,7 @@
             </w:pPr>
             <w:r>
               <w:rPr>
+                <w:rFonts w:ascii="Georgia" w:hAnsi="Georgia" w:eastAsia="Georgia" w:cs="Georgia"/>
                 <w:sz w:val="18"/>
                 <w:szCs w:val="18"/>
                 <w:rtl w:val="0"/>
@@ -4700,6 +5024,7 @@
             </w:pPr>
             <w:r>
               <w:rPr>
+                <w:rFonts w:ascii="Georgia" w:hAnsi="Georgia" w:eastAsia="Georgia" w:cs="Georgia"/>
                 <w:sz w:val="18"/>
                 <w:szCs w:val="18"/>
                 <w:rtl w:val="0"/>
@@ -4717,17 +5042,19 @@
       </w:pPr>
       <w:r>
         <w:rPr>
-          <w:rtl w:val="0"/>
-        </w:rPr>
-      </w:r>
-    </w:p>
-    <w:p>
-      <w:pPr>
-        <w:spacing w:line="480" w:lineRule="auto"/>
-        <w:rPr/>
-      </w:pPr>
-      <w:r>
-        <w:rPr>
+          <w:rFonts w:ascii="Georgia" w:hAnsi="Georgia" w:eastAsia="Georgia" w:cs="Georgia"/>
+          <w:rtl w:val="0"/>
+        </w:rPr>
+      </w:r>
+    </w:p>
+    <w:p>
+      <w:pPr>
+        <w:spacing w:line="480" w:lineRule="auto"/>
+        <w:rPr/>
+      </w:pPr>
+      <w:r>
+        <w:rPr>
+          <w:rFonts w:ascii="Georgia" w:hAnsi="Georgia" w:eastAsia="Georgia" w:cs="Georgia"/>
           <w:i w:val="1"/>
           <w:iCs w:val="1"/>
           <w:rtl w:val="0"/>
@@ -4736,17 +5063,19 @@
       </w:r>
       <w:r>
         <w:rPr>
-          <w:rtl w:val="0"/>
-        </w:rPr>
-      </w:r>
-    </w:p>
-    <w:p>
-      <w:pPr>
-        <w:spacing w:line="480" w:lineRule="auto"/>
-        <w:rPr/>
-      </w:pPr>
-      <w:r>
-        <w:rPr>
+          <w:rFonts w:ascii="Georgia" w:hAnsi="Georgia" w:eastAsia="Georgia" w:cs="Georgia"/>
+          <w:rtl w:val="0"/>
+        </w:rPr>
+      </w:r>
+    </w:p>
+    <w:p>
+      <w:pPr>
+        <w:spacing w:line="480" w:lineRule="auto"/>
+        <w:rPr/>
+      </w:pPr>
+      <w:r>
+        <w:rPr>
+          <w:rFonts w:ascii="Georgia" w:hAnsi="Georgia" w:eastAsia="Georgia" w:cs="Georgia"/>
           <w:rtl w:val="0"/>
         </w:rPr>
       </w:r>
@@ -4835,6 +5164,9 @@
   </w:style>
   <w:style w:type="paragraph" w:styleId="Normal" w:default="1">
     <w:name w:val="normal"/>
+    <w:rPr>
+      <w:rFonts w:ascii="Georgia" w:hAnsi="Georgia" w:eastAsia="Georgia" w:cs="Georgia"/>
+    </w:rPr>
   </w:style>
   <w:style w:type="paragraph" w:styleId="Heading1">
     <w:name w:val="heading 1"/>

</xml_diff>

<commit_message>
Consistency pass: fix bold spills, em-dashes, prose semicolons
- Definition of Terms: bold term only, not full entry
- Process steps 2–3: label bold only, uniform with other steps
- Remove body em-dashes; split prose semicolons into sentences
- Font remains Georgia throughout
</commit_message>
<xml_diff>
--- a/thesis/Thesis_Instagram_MH_v11.docx
+++ b/thesis/Thesis_Instagram_MH_v11.docx
@@ -2098,17 +2098,9 @@
       <w:r>
         <w:rPr>
           <w:rFonts w:ascii="Georgia" w:hAnsi="Georgia" w:eastAsia="Georgia" w:cs="Georgia"/>
-          <w:sz w:val="22"/>
-          <w:szCs w:val="22"/>
-          <w:rtl w:val="0"/>
-        </w:rPr>
-        <w:t xml:space="preserve">Chang’s (2009) online support typology serves as the secondary framework for comment analysis. The typology categorizes supportive computer-mediated communication into four types: informational, emotional, esteem, and network support. This study adapts the typology for the Instagram advocacy context by collapsing emotional and esteem support into a single “supportive lexicon” category, operationalized through empathy markers, validation language, encouragement phrases, and second-person affirmation, and operationalizing network support as “personal narrative framing,” coded through first-person disclosure, temporal sequencing of personal experience, and connective expressions such as this resonates or I’ve been there. Informational support is excluded as it is markedly less prevalent in advocacy page comment sections. Each comment is assigned one dominant code — SUPPORTIVE LEXICON or PERSONAL NARRATIVE — using the same function-driven decision logic applied to captions (see Appendix B).</w:t>
-      </w:r>
-      <w:r>
-        <w:rPr>
-          <w:rFonts w:ascii="Georgia" w:hAnsi="Georgia" w:eastAsia="Georgia" w:cs="Georgia"/>
-          <w:rtl w:val="0"/>
-        </w:rPr>
+          <w:b w:val="0"/>
+        </w:rPr>
+        <w:t>Chang’s (2009) online support typology serves as the secondary framework for comment analysis. The typology categorizes supportive computer-mediated communication into four types: informational, emotional, esteem, and network support. This study adapts the typology for the Instagram advocacy context by collapsing emotional and esteem support into a single “supportive lexicon” category, operationalized through empathy markers, validation language, encouragement phrases, and second-person affirmation, and operationalizing network support as “personal narrative framing,” coded through first-person disclosure, temporal sequencing of personal experience, and connective expressions such as this resonates or I’ve been there. Informational support is excluded as it is markedly less prevalent in advocacy page comment sections. Each comment is assigned one dominant code. SUPPORTIVE LEXICON or PERSONAL NARRATIVE. using the same function-driven decision logic applied to captions (see Appendix B).</w:t>
       </w:r>
     </w:p>
     <w:p>
@@ -2484,17 +2476,9 @@
       <w:r>
         <w:rPr>
           <w:rFonts w:ascii="Georgia" w:hAnsi="Georgia" w:eastAsia="Georgia" w:cs="Georgia"/>
-          <w:sz w:val="22"/>
-          <w:szCs w:val="22"/>
-          <w:rtl w:val="0"/>
-        </w:rPr>
-        <w:t xml:space="preserve">As a sole-researcher study, inter-rater reliability testing is not feasible. Analytical consistency is maintained through explicit decision rules documented in Appendix A and B, a coded audit trail, and ongoing adviser consultation. The binary coding scheme necessarily compresses the complexity of real language use; captions and comments with blended or ambiguous discursive functions are adjudicated by dominant communicative intent and logged separately. Chang’s (2009) typology was originally developed for a Taiwanese text-based psychosis peer support forum, and its adaptation to the Instagram advocacy context involves substantial platform-specific differences in interactional norms and audience composition that are acknowledged throughout the analysis. The study is descriptive in scope: it identifies linguistic patterns and co-occurrence frequencies without performing statistical testing or establishing causal relationships between caption type and comment response.</w:t>
-      </w:r>
-      <w:r>
-        <w:rPr>
-          <w:rFonts w:ascii="Georgia" w:hAnsi="Georgia" w:eastAsia="Georgia" w:cs="Georgia"/>
-          <w:rtl w:val="0"/>
-        </w:rPr>
+          <w:b w:val="0"/>
+        </w:rPr>
+        <w:t>As a sole-researcher study, inter-rater reliability testing is not feasible. Analytical consistency is maintained through explicit decision rules documented in Appendix A and B, a coded audit trail, and ongoing adviser consultation. The binary coding scheme necessarily compresses the complexity of real language use. Captions and comments with blended or ambiguous discursive functions are adjudicated by dominant communicative intent and logged separately. Chang’s (2009) typology was originally developed for a Taiwanese text-based psychosis peer support forum, and its adaptation to the Instagram advocacy context involves substantial platform-specific differences in interactional norms and audience composition that are acknowledged throughout the analysis. The study is descriptive in scope: it identifies linguistic patterns and co-occurrence frequencies without performing statistical testing or establishing causal relationships between caption type and comment response.</w:t>
       </w:r>
     </w:p>
     <w:p>
@@ -2615,27 +2599,16 @@
       <w:r>
         <w:rPr>
           <w:rFonts w:ascii="Georgia" w:hAnsi="Georgia" w:eastAsia="Georgia" w:cs="Georgia"/>
-          <w:b w:val="1"/>
-          <w:bCs w:val="1"/>
-          <w:sz w:val="22"/>
-          <w:szCs w:val="22"/>
-          <w:rtl w:val="0"/>
-        </w:rPr>
-        <w:t>Contemporary Corpus. A purposive sample of Instagram posts published from September 2024 through December 2025, with preference for 2025, analyzed as a single dataset of contemporary mental health advocacy discourse on the platform. Years are not compared.</w:t>
-      </w:r>
-      <w:r>
-        <w:rPr>
-          <w:rFonts w:ascii="Georgia" w:hAnsi="Georgia" w:eastAsia="Georgia" w:cs="Georgia"/>
-          <w:sz w:val="22"/>
-          <w:szCs w:val="22"/>
-          <w:rtl w:val="0"/>
-        </w:rPr>
-      </w:r>
-      <w:r>
-        <w:rPr>
-          <w:rFonts w:ascii="Georgia" w:hAnsi="Georgia" w:eastAsia="Georgia" w:cs="Georgia"/>
-          <w:rtl w:val="0"/>
-        </w:rPr>
+          <w:b/>
+        </w:rPr>
+        <w:t xml:space="preserve">Contemporary Corpus. </w:t>
+      </w:r>
+      <w:r>
+        <w:rPr>
+          <w:rFonts w:ascii="Georgia" w:hAnsi="Georgia" w:eastAsia="Georgia" w:cs="Georgia"/>
+          <w:b w:val="0"/>
+        </w:rPr>
+        <w:t>A purposive sample of Instagram posts published from September 2024 through December 2025, with preference for 2025, analyzed as a single dataset of contemporary mental health advocacy discourse on the platform. Years are not compared.</w:t>
       </w:r>
     </w:p>
     <w:p>
@@ -2660,27 +2633,16 @@
       <w:r>
         <w:rPr>
           <w:rFonts w:ascii="Georgia" w:hAnsi="Georgia" w:eastAsia="Georgia" w:cs="Georgia"/>
-          <w:b w:val="1"/>
-          <w:bCs w:val="1"/>
-          <w:sz w:val="22"/>
-          <w:szCs w:val="22"/>
-          <w:rtl w:val="0"/>
-        </w:rPr>
-        <w:t>Eligible Comment. A comment written directly under the post, not a reply to another comment, that meets the study's eligibility filter: English language, enough continuous text for linguistic analysis (at least ten words or one full clause), and not limited to pure emoji, single-word reactions, tags, or links. For each post, two eligible comments are selected. When both kinds of response appear, one that offers encouragement or validation without a personal story and one that shares a personal experience related to the caption are taken. When only one kind appears, the two clearest eligible comments of that kind are taken.</w:t>
-      </w:r>
-      <w:r>
-        <w:rPr>
-          <w:rFonts w:ascii="Georgia" w:hAnsi="Georgia" w:eastAsia="Georgia" w:cs="Georgia"/>
-          <w:sz w:val="22"/>
-          <w:szCs w:val="22"/>
-          <w:rtl w:val="0"/>
-        </w:rPr>
-      </w:r>
-      <w:r>
-        <w:rPr>
-          <w:rFonts w:ascii="Georgia" w:hAnsi="Georgia" w:eastAsia="Georgia" w:cs="Georgia"/>
-          <w:rtl w:val="0"/>
-        </w:rPr>
+          <w:b/>
+        </w:rPr>
+        <w:t xml:space="preserve">Eligible Comment. </w:t>
+      </w:r>
+      <w:r>
+        <w:rPr>
+          <w:rFonts w:ascii="Georgia" w:hAnsi="Georgia" w:eastAsia="Georgia" w:cs="Georgia"/>
+          <w:b w:val="0"/>
+        </w:rPr>
+        <w:t>A comment written directly under the post, not a reply to another comment, that meets the study's eligibility filter: English language, enough continuous text for linguistic analysis (at least ten words or one full clause), and not limited to pure emoji, single-word reactions, tags, or links. For each post, two eligible comments are selected. When both kinds of response appear, one that offers encouragement or validation without a personal story and one that shares a personal experience related to the caption are taken. When only one kind appears, the two clearest eligible comments of that kind are taken.</w:t>
       </w:r>
     </w:p>
     <w:p>
@@ -2705,27 +2667,16 @@
       <w:r>
         <w:rPr>
           <w:rFonts w:ascii="Georgia" w:hAnsi="Georgia" w:eastAsia="Georgia" w:cs="Georgia"/>
-          <w:b w:val="1"/>
-          <w:bCs w:val="1"/>
-          <w:sz w:val="22"/>
-          <w:szCs w:val="22"/>
-          <w:rtl w:val="0"/>
-        </w:rPr>
-        <w:t>Empowerment Language. A discursive orientation in which the caption's primary work is to position the reader as an agent who can act, decide, or set the terms of their own mental-health practice. The language treats the reader as capable of taking concrete steps or claiming autonomy in the present. Operationally, a caption is coded EMPOWERMENT when its dominant function answers the core test "You can or should act." Illustrative signals include imperative directives (seek, set, prioritize, take), agency-affirming phrases (you can decide, trust yourself), self-care and boundary vocabulary (boundaries, rest, check in), and autonomy markers (at your own pace, when ready). These signals are illustrative, not exhaustive. Novel phrasings that perform the same discursive work are coded under the same orientation.</w:t>
-      </w:r>
-      <w:r>
-        <w:rPr>
-          <w:rFonts w:ascii="Georgia" w:hAnsi="Georgia" w:eastAsia="Georgia" w:cs="Georgia"/>
-          <w:sz w:val="22"/>
-          <w:szCs w:val="22"/>
-          <w:rtl w:val="0"/>
-        </w:rPr>
-      </w:r>
-      <w:r>
-        <w:rPr>
-          <w:rFonts w:ascii="Georgia" w:hAnsi="Georgia" w:eastAsia="Georgia" w:cs="Georgia"/>
-          <w:rtl w:val="0"/>
-        </w:rPr>
+          <w:b/>
+        </w:rPr>
+        <w:t xml:space="preserve">Empowerment Language. </w:t>
+      </w:r>
+      <w:r>
+        <w:rPr>
+          <w:rFonts w:ascii="Georgia" w:hAnsi="Georgia" w:eastAsia="Georgia" w:cs="Georgia"/>
+          <w:b w:val="0"/>
+        </w:rPr>
+        <w:t>A discursive orientation in which the caption's primary work is to position the reader as an agent who can act, decide, or set the terms of their own mental-health practice. The language treats the reader as capable of taking concrete steps or claiming autonomy in the present. Operationally, a caption is coded EMPOWERMENT when its dominant function answers the core test "You can or should act." Illustrative signals include imperative directives (seek, set, prioritize, take), agency-affirming phrases (you can decide, trust yourself), self-care and boundary vocabulary (boundaries, rest, check in), and autonomy markers (at your own pace, when ready). These signals are illustrative, not exhaustive. Novel phrasings that perform the same discursive work are coded under the same orientation.</w:t>
       </w:r>
     </w:p>
     <w:p>
@@ -2750,27 +2701,16 @@
       <w:r>
         <w:rPr>
           <w:rFonts w:ascii="Georgia" w:hAnsi="Georgia" w:eastAsia="Georgia" w:cs="Georgia"/>
-          <w:b w:val="1"/>
-          <w:bCs w:val="1"/>
-          <w:sz w:val="22"/>
-          <w:szCs w:val="22"/>
-          <w:rtl w:val="0"/>
-        </w:rPr>
-        <w:t>Function-Driven Coding. A qualitative analytical approach that categorizes linguistic features based on their discursive purpose in context, not mechanical keyword matching. Caption coding uses a two-stage Identify-and-Sort procedure (see Appendix A). Stage 1 records whether each orientation is present or absent. Stage 2 assigns the dominant code. When both orientations are present, dominance is adjudicated by main-clause or final position and by speech-act force. Cases that remain unclear are coded as blended or indeterminate and reported separately.</w:t>
-      </w:r>
-      <w:r>
-        <w:rPr>
-          <w:rFonts w:ascii="Georgia" w:hAnsi="Georgia" w:eastAsia="Georgia" w:cs="Georgia"/>
-          <w:sz w:val="22"/>
-          <w:szCs w:val="22"/>
-          <w:rtl w:val="0"/>
-        </w:rPr>
-      </w:r>
-      <w:r>
-        <w:rPr>
-          <w:rFonts w:ascii="Georgia" w:hAnsi="Georgia" w:eastAsia="Georgia" w:cs="Georgia"/>
-          <w:rtl w:val="0"/>
-        </w:rPr>
+          <w:b/>
+        </w:rPr>
+        <w:t xml:space="preserve">Function-Driven Coding. </w:t>
+      </w:r>
+      <w:r>
+        <w:rPr>
+          <w:rFonts w:ascii="Georgia" w:hAnsi="Georgia" w:eastAsia="Georgia" w:cs="Georgia"/>
+          <w:b w:val="0"/>
+        </w:rPr>
+        <w:t>A qualitative analytical approach that categorizes linguistic features based on their discursive purpose in context, not mechanical keyword matching. Caption coding uses a two-stage Identify-and-Sort procedure (see Appendix A). Stage 1 records whether each orientation is present or absent. Stage 2 assigns the dominant code. When both orientations are present, dominance is adjudicated by main-clause or final position and by speech-act force. Cases that remain unclear are coded as blended or indeterminate and reported separately.</w:t>
       </w:r>
     </w:p>
     <w:p>
@@ -2795,27 +2735,16 @@
       <w:r>
         <w:rPr>
           <w:rFonts w:ascii="Georgia" w:hAnsi="Georgia" w:eastAsia="Georgia" w:cs="Georgia"/>
-          <w:b w:val="1"/>
-          <w:bCs w:val="1"/>
-          <w:sz w:val="22"/>
-          <w:szCs w:val="22"/>
-          <w:rtl w:val="0"/>
-        </w:rPr>
-        <w:t>Hope Construction. A discursive orientation in which the caption's primary work is to project a positive future possibility or recovery trajectory in relation to mental health. The language treats present difficulty as temporary or traversable and points the reader toward a better state that is still ahead. Operationally, a caption is coded HOPE when its dominant function answers the core test "Things can or will get better." Illustrative signals include forward-looking modality (can, will, may, could), temporal markers of progression (soon, eventually, step by step), recovery-oriented nouns (healing, growth, recovery), and conditionals that project positive outcomes. These signals are illustrative, not exhaustive. Novel phrasings that perform the same discursive work are coded under the same orientation.</w:t>
-      </w:r>
-      <w:r>
-        <w:rPr>
-          <w:rFonts w:ascii="Georgia" w:hAnsi="Georgia" w:eastAsia="Georgia" w:cs="Georgia"/>
-          <w:sz w:val="22"/>
-          <w:szCs w:val="22"/>
-          <w:rtl w:val="0"/>
-        </w:rPr>
-      </w:r>
-      <w:r>
-        <w:rPr>
-          <w:rFonts w:ascii="Georgia" w:hAnsi="Georgia" w:eastAsia="Georgia" w:cs="Georgia"/>
-          <w:rtl w:val="0"/>
-        </w:rPr>
+          <w:b/>
+        </w:rPr>
+        <w:t xml:space="preserve">Hope Construction. </w:t>
+      </w:r>
+      <w:r>
+        <w:rPr>
+          <w:rFonts w:ascii="Georgia" w:hAnsi="Georgia" w:eastAsia="Georgia" w:cs="Georgia"/>
+          <w:b w:val="0"/>
+        </w:rPr>
+        <w:t>A discursive orientation in which the caption's primary work is to project a positive future possibility or recovery trajectory in relation to mental health. The language treats present difficulty as temporary or traversable and points the reader toward a better state that is still ahead. Operationally, a caption is coded HOPE when its dominant function answers the core test "Things can or will get better." Illustrative signals include forward-looking modality (can, will, may, could), temporal markers of progression (soon, eventually, step by step), recovery-oriented nouns (healing, growth, recovery), and conditionals that project positive outcomes. These signals are illustrative, not exhaustive. Novel phrasings that perform the same discursive work are coded under the same orientation.</w:t>
       </w:r>
     </w:p>
     <w:p>
@@ -2840,27 +2769,16 @@
       <w:r>
         <w:rPr>
           <w:rFonts w:ascii="Georgia" w:hAnsi="Georgia" w:eastAsia="Georgia" w:cs="Georgia"/>
-          <w:b w:val="1"/>
-          <w:bCs w:val="1"/>
-          <w:sz w:val="22"/>
-          <w:szCs w:val="22"/>
-          <w:rtl w:val="0"/>
-        </w:rPr>
-        <w:t>Personal Narrative Framing. Comment language that shares a first-person mental health experience connected to the caption theme. Corresponds to Chang's (2009) network support. Operationally coded through first-person markers, temporal sequencing, emotional disclosure, and reflective connective structures (e.g., *this resonates, I've been there*).</w:t>
-      </w:r>
-      <w:r>
-        <w:rPr>
-          <w:rFonts w:ascii="Georgia" w:hAnsi="Georgia" w:eastAsia="Georgia" w:cs="Georgia"/>
-          <w:sz w:val="22"/>
-          <w:szCs w:val="22"/>
-          <w:rtl w:val="0"/>
-        </w:rPr>
-      </w:r>
-      <w:r>
-        <w:rPr>
-          <w:rFonts w:ascii="Georgia" w:hAnsi="Georgia" w:eastAsia="Georgia" w:cs="Georgia"/>
-          <w:rtl w:val="0"/>
-        </w:rPr>
+          <w:b/>
+        </w:rPr>
+        <w:t xml:space="preserve">Personal Narrative Framing. </w:t>
+      </w:r>
+      <w:r>
+        <w:rPr>
+          <w:rFonts w:ascii="Georgia" w:hAnsi="Georgia" w:eastAsia="Georgia" w:cs="Georgia"/>
+          <w:b w:val="0"/>
+        </w:rPr>
+        <w:t>Comment language that shares a first-person mental health experience connected to the caption theme. Corresponds to Chang's (2009) network support. Operationally coded through first-person markers, temporal sequencing, emotional disclosure, and reflective connective structures (e.g., *this resonates, I've been there*).</w:t>
       </w:r>
     </w:p>
     <w:p>
@@ -2885,27 +2803,16 @@
       <w:r>
         <w:rPr>
           <w:rFonts w:ascii="Georgia" w:hAnsi="Georgia" w:eastAsia="Georgia" w:cs="Georgia"/>
-          <w:b w:val="1"/>
-          <w:bCs w:val="1"/>
-          <w:sz w:val="22"/>
-          <w:szCs w:val="22"/>
-          <w:rtl w:val="0"/>
-        </w:rPr>
-        <w:t>Supportive Lexicon. Comment language that offers encouragement, validation, empathy, or positive evaluation without sharing personal experience. Combines Chang's (2009) categories of emotional support and esteem support. Operationally coded through second-person affirmation, empathy markers, solidarity phrases, and positive evaluation language.</w:t>
-      </w:r>
-      <w:r>
-        <w:rPr>
-          <w:rFonts w:ascii="Georgia" w:hAnsi="Georgia" w:eastAsia="Georgia" w:cs="Georgia"/>
-          <w:sz w:val="22"/>
-          <w:szCs w:val="22"/>
-          <w:rtl w:val="0"/>
-        </w:rPr>
-      </w:r>
-      <w:r>
-        <w:rPr>
-          <w:rFonts w:ascii="Georgia" w:hAnsi="Georgia" w:eastAsia="Georgia" w:cs="Georgia"/>
-          <w:rtl w:val="0"/>
-        </w:rPr>
+          <w:b/>
+        </w:rPr>
+        <w:t xml:space="preserve">Supportive Lexicon. </w:t>
+      </w:r>
+      <w:r>
+        <w:rPr>
+          <w:rFonts w:ascii="Georgia" w:hAnsi="Georgia" w:eastAsia="Georgia" w:cs="Georgia"/>
+          <w:b w:val="0"/>
+        </w:rPr>
+        <w:t>Comment language that offers encouragement, validation, empathy, or positive evaluation without sharing personal experience. Combines Chang's (2009) categories of emotional support and esteem support. Operationally coded through second-person affirmation, empathy markers, solidarity phrases, and positive evaluation language.</w:t>
       </w:r>
     </w:p>
     <w:p>
@@ -3080,17 +2987,9 @@
       <w:r>
         <w:rPr>
           <w:rFonts w:ascii="Georgia" w:hAnsi="Georgia" w:eastAsia="Georgia" w:cs="Georgia"/>
-          <w:sz w:val="22"/>
-          <w:szCs w:val="22"/>
-          <w:rtl w:val="0"/>
-        </w:rPr>
-        <w:t xml:space="preserve">This study employs a qualitative discourse analysis design guided by Positive Discourse Analysis (Martin, 2004). Qualitative design is appropriate because the goal is to interpret linguistic patterns, identify discursive strategies, and describe how meaning is constructed in naturalistic digital texts. A corpus of 30 captions provides sufficient depth for pattern identification and proportional description while remaining feasible for a solo undergraduate researcher. In discourse analysis, corpus size is determined by the depth of analysis rather than statistical representativeness; studies applying SFL-based coding to comparable short-form digital corpora have worked within similar ranges (Macgilchrist, 2007; Koteyko &amp; Atanasova, 2018). The design prioritizes analytical rigor, transparent coding protocols, and clearly bounded scope over volume or statistical generalization.</w:t>
-      </w:r>
-      <w:r>
-        <w:rPr>
-          <w:rFonts w:ascii="Georgia" w:hAnsi="Georgia" w:eastAsia="Georgia" w:cs="Georgia"/>
-          <w:rtl w:val="0"/>
-        </w:rPr>
+          <w:b w:val="0"/>
+        </w:rPr>
+        <w:t>This study employs a qualitative discourse analysis design guided by Positive Discourse Analysis (Martin, 2004). Qualitative design is appropriate because the goal is to interpret linguistic patterns, identify discursive strategies, and describe how meaning is constructed in naturalistic digital texts. A corpus of 30 captions provides sufficient depth for pattern identification and proportional description while remaining feasible for a solo undergraduate researcher. In discourse analysis, corpus size is determined by the depth of analysis rather than statistical representativeness. Studies applying SFL-based coding to comparable short-form digital corpora have worked within similar ranges (Macgilchrist, 2007; Koteyko &amp; Atanasova, 2018). The design prioritizes analytical rigor, transparent coding protocols, and clearly bounded scope over volume or statistical generalization.</w:t>
       </w:r>
     </w:p>
     <w:p>
@@ -3163,28 +3062,16 @@
       <w:r>
         <w:rPr>
           <w:rFonts w:ascii="Georgia" w:hAnsi="Georgia" w:eastAsia="Georgia" w:cs="Georgia"/>
-          <w:b w:val="1"/>
-          <w:bCs w:val="1"/>
-          <w:sz w:val="22"/>
-          <w:szCs w:val="22"/>
-          <w:rtl w:val="0"/>
+          <w:b/>
         </w:rPr>
         <w:t xml:space="preserve">1. Corpus Screening. </w:t>
       </w:r>
       <w:r>
         <w:rPr>
           <w:rFonts w:ascii="Georgia" w:hAnsi="Georgia" w:eastAsia="Georgia" w:cs="Georgia"/>
-          <w:sz w:val="22"/>
-          <w:szCs w:val="22"/>
-          <w:rtl w:val="0"/>
-        </w:rPr>
-        <w:t xml:space="preserve">Candidate public mental health advocacy pages are identified through Instagram search, relevant hashtags (for example #mentalhealthawareness, #mentalhealthadvocacy, #mentalhealthmatters), and related account suggestions. Eligible pages must meet all of the following criteria: (a) the account is publicly accessible, (b) the biography or page description clearly identifies mental health advocacy as the primary purpose, (c) the majority of posts address mental health awareness, coping, recovery, or peer support rather than general wellness, fitness, or lifestyle content, (d) the account is not primarily commercial, and (e) content is in English. Pages that only occasionally post mental health content within broader lifestyle or fitness feeds are excluded. Approximately five to six pages are retained. A screening log records pages considered, pages retained, and pages dropped. Within each retained page, posts are screened in chronological order from the top of the feed. Eligible posts are those published from September 2024 through December 2025 that meet the post criteria: English language, content that clearly addresses mental health awareness, support, coping, recovery, or advocacy, fully visible caption text, and engagement of at least 100 likes and 20 visible comments. Preference is given to 2025 posts. Posts from September to December 2024 are taken only when a page does not yield enough eligible 2025 captions. Each page contributes between five and eight eligible posts. Screening proceeds page by page until the corpus ceiling of 30 captions is reached or the candidate list is exhausted. Preference is given to posts that appear under relevant mental health hashtags, but hashtag use is not a hard requirement.</w:t>
-      </w:r>
-      <w:r>
-        <w:rPr>
-          <w:rFonts w:ascii="Georgia" w:hAnsi="Georgia" w:eastAsia="Georgia" w:cs="Georgia"/>
-          <w:rtl w:val="0"/>
-        </w:rPr>
+          <w:b w:val="0"/>
+        </w:rPr>
+        <w:t>Candidate public mental health advocacy pages are identified through Instagram search, relevant hashtags (for example #mentalhealthawareness, #mentalhealthadvocacy, #mentalhealthmatters), and related account suggestions. Eligible pages must meet all of the following criteria: (a) the account is publicly accessible, (b) the biography or page description clearly identifies mental health advocacy as the primary purpose, (c) the majority of posts address mental health awareness, coping, recovery, or peer support rather than general wellness, fitness, or lifestyle content, (d) the account is not primarily commercial, and (e) content is in English. Pages that only occasionally post mental health content within broader lifestyle or fitness feeds are excluded. Approximately five to six pages are retained. A screening log records pages considered, pages retained, and pages dropped. Within each retained page, posts are screened in chronological order from the top of the feed. Eligible posts are those published from September 2024 through December 2025 that meet the post criteria: English language, content that clearly addresses mental health awareness, support, coping, recovery, or advocacy, fully visible caption text, and engagement of at least 100 likes and 20 visible comments. Preference is given to 2025 posts. Posts from September to December 2024 are taken only when a page does not yield enough eligible 2025 captions. Each page contributes between five and eight eligible posts. Screening proceeds page by page until the corpus ceiling of 30 captions is reached or the candidate list is exhausted. Preference is given to posts that appear under relevant mental health hashtags, but hashtag use is not a hard requirement.</w:t>
       </w:r>
     </w:p>
     <w:p>
@@ -3197,27 +3084,16 @@
       <w:r>
         <w:rPr>
           <w:rFonts w:ascii="Georgia" w:hAnsi="Georgia" w:eastAsia="Georgia" w:cs="Georgia"/>
-          <w:b w:val="1"/>
-          <w:bCs w:val="1"/>
-          <w:sz w:val="22"/>
-          <w:szCs w:val="22"/>
-          <w:rtl w:val="0"/>
-        </w:rPr>
-        <w:t>2. Ethical Compliance. Only publicly visible text is extracted. Page names are anonymized. Usernames and identifying personal details in comments are redacted. The study adheres to standard academic ethics for public digital text analysis and undergoes formal institutional review if required by the department.</w:t>
-      </w:r>
-      <w:r>
-        <w:rPr>
-          <w:rFonts w:ascii="Georgia" w:hAnsi="Georgia" w:eastAsia="Georgia" w:cs="Georgia"/>
-          <w:sz w:val="22"/>
-          <w:szCs w:val="22"/>
-          <w:rtl w:val="0"/>
-        </w:rPr>
-      </w:r>
-      <w:r>
-        <w:rPr>
-          <w:rFonts w:ascii="Georgia" w:hAnsi="Georgia" w:eastAsia="Georgia" w:cs="Georgia"/>
-          <w:rtl w:val="0"/>
-        </w:rPr>
+          <w:b/>
+        </w:rPr>
+        <w:t xml:space="preserve">2. Ethical Compliance. </w:t>
+      </w:r>
+      <w:r>
+        <w:rPr>
+          <w:rFonts w:ascii="Georgia" w:hAnsi="Georgia" w:eastAsia="Georgia" w:cs="Georgia"/>
+          <w:b w:val="0"/>
+        </w:rPr>
+        <w:t>Only publicly visible text is extracted. Page names are anonymized. Usernames and identifying personal details in comments are redacted. The study adheres to standard academic ethics for public digital text analysis and undergoes formal institutional review if required by the department.</w:t>
       </w:r>
     </w:p>
     <w:p>
@@ -3230,37 +3106,16 @@
       <w:r>
         <w:rPr>
           <w:rFonts w:ascii="Georgia" w:hAnsi="Georgia" w:eastAsia="Georgia" w:cs="Georgia"/>
-          <w:sz w:val="22"/>
-          <w:szCs w:val="22"/>
-          <w:rtl w:val="0"/>
-        </w:rPr>
-        <w:t xml:space="preserve">3. </w:t>
-      </w:r>
-      <w:r>
-        <w:rPr>
-          <w:rFonts w:ascii="Georgia" w:hAnsi="Georgia" w:eastAsia="Georgia" w:cs="Georgia"/>
-          <w:b w:val="1"/>
-          <w:bCs w:val="1"/>
-          <w:sz w:val="22"/>
-          <w:szCs w:val="22"/>
-          <w:rtl w:val="0"/>
-        </w:rPr>
-        <w:t xml:space="preserve">Caption Coding.</w:t>
-      </w:r>
-      <w:r>
-        <w:rPr>
-          <w:rFonts w:ascii="Georgia" w:hAnsi="Georgia" w:eastAsia="Georgia" w:cs="Georgia"/>
-          <w:sz w:val="22"/>
-          <w:szCs w:val="22"/>
-          <w:rtl w:val="0"/>
-        </w:rPr>
-        <w:t xml:space="preserve"> Each caption is read holistically. Coding follows the two-stage Identify-and-Sort procedure in Appendix A. Stage 1 marks hope construction and empowerment language as present or absent from illustrative signals. Stage 2 assigns HOPE if only hope is present, EMPOWERMENT if only empowerment is present, and blended or indeterminate if neither is present. When both are present, dominance is decided by main-clause or final position and by speech-act force. Feature tallies are retained for distributional description.</w:t>
-      </w:r>
-      <w:r>
-        <w:rPr>
-          <w:rFonts w:ascii="Georgia" w:hAnsi="Georgia" w:eastAsia="Georgia" w:cs="Georgia"/>
-          <w:rtl w:val="0"/>
-        </w:rPr>
+          <w:b/>
+        </w:rPr>
+        <w:t xml:space="preserve">3. Caption Coding. </w:t>
+      </w:r>
+      <w:r>
+        <w:rPr>
+          <w:rFonts w:ascii="Georgia" w:hAnsi="Georgia" w:eastAsia="Georgia" w:cs="Georgia"/>
+          <w:b w:val="0"/>
+        </w:rPr>
+        <w:t>Each caption is read holistically. Coding follows the two-stage Identify-and-Sort procedure in Appendix A. Stage 1 marks hope construction and empowerment language as present or absent from illustrative signals. Stage 2 assigns HOPE if only hope is present, EMPOWERMENT if only empowerment is present, and blended or indeterminate if neither is present. When both are present, dominance is decided by main-clause or final position and by speech-act force. Feature tallies are retained for distributional description.</w:t>
       </w:r>
     </w:p>
     <w:p>
@@ -3273,28 +3128,16 @@
       <w:r>
         <w:rPr>
           <w:rFonts w:ascii="Georgia" w:hAnsi="Georgia" w:eastAsia="Georgia" w:cs="Georgia"/>
-          <w:b w:val="1"/>
-          <w:bCs w:val="1"/>
-          <w:sz w:val="22"/>
-          <w:szCs w:val="22"/>
-          <w:rtl w:val="0"/>
+          <w:b/>
         </w:rPr>
         <w:t xml:space="preserve">4. Comment Extraction and Coding. </w:t>
       </w:r>
       <w:r>
         <w:rPr>
           <w:rFonts w:ascii="Georgia" w:hAnsi="Georgia" w:eastAsia="Georgia" w:cs="Georgia"/>
-          <w:sz w:val="22"/>
-          <w:szCs w:val="22"/>
-          <w:rtl w:val="0"/>
-        </w:rPr>
-        <w:t xml:space="preserve">For each retained post, comments written directly under the caption are screened for eligibility. A comment is eligible only if it is written in English, contains enough continuous text for linguistic analysis (at least ten words or one full clause), and is not limited to pure emoji, single-word reactions, tags, or links. Replies nested under other comments are excluded. From the eligible comments, two are selected. When both kinds of response appear, one that offers encouragement, validation, or empathy without sharing a personal story and one that shares a first-person experience related to the caption are taken. When only one kind appears, the two clearest eligible comments of that kind are taken. When fewer than two eligible comments exist, the post is excluded from the final corpus or recorded as a partial case under a rule fixed before coding begins. Total visible comment count is logged per post. Each selected comment is then coded as SUPPORTIVE LEXICON or PERSONAL NARRATIVE by dominant communicative purpose using Appendix B. Unclassifiable rates are reported. If they exceed 20 percent of the sample, coding markers are refined with adviser consultation. Items that still cannot be assigned a dominant function are placed in a third descriptive category (blended/indeterminate) and reported separately.</w:t>
-      </w:r>
-      <w:r>
-        <w:rPr>
-          <w:rFonts w:ascii="Georgia" w:hAnsi="Georgia" w:eastAsia="Georgia" w:cs="Georgia"/>
-          <w:rtl w:val="0"/>
-        </w:rPr>
+          <w:b w:val="0"/>
+        </w:rPr>
+        <w:t>For each retained post, comments written directly under the caption are screened for eligibility. A comment is eligible only if it is written in English, contains enough continuous text for linguistic analysis (at least ten words or one full clause), and is not limited to pure emoji, single-word reactions, tags, or links. Replies nested under other comments are excluded. From the eligible comments, two are selected. When both kinds of response appear, one that offers encouragement, validation, or empathy without sharing a personal story and one that shares a first-person experience related to the caption are taken. When only one kind appears, the two clearest eligible comments of that kind are taken. When fewer than two eligible comments exist, the post is excluded from the final corpus or recorded as a partial case under a rule fixed before coding begins. Total visible comment count is logged per post. Each selected comment is then coded as SUPPORTIVE LEXICON or PERSONAL NARRATIVE by dominant communicative purpose using Appendix B. Unclassifiable rates are reported. If they exceed 20 percent of the sample, coding markers are refined with adviser consultation. Items that still cannot be assigned a dominant function are placed in a third descriptive category (blended/indeterminate) and reported separately.</w:t>
       </w:r>
     </w:p>
     <w:p>
@@ -3319,28 +3162,16 @@
       <w:r>
         <w:rPr>
           <w:rFonts w:ascii="Georgia" w:hAnsi="Georgia" w:eastAsia="Georgia" w:cs="Georgia"/>
-          <w:b w:val="1"/>
-          <w:bCs w:val="1"/>
-          <w:sz w:val="22"/>
-          <w:szCs w:val="22"/>
-          <w:rtl w:val="0"/>
+          <w:b/>
         </w:rPr>
         <w:t xml:space="preserve">5. Integration and Analysis. </w:t>
       </w:r>
       <w:r>
         <w:rPr>
           <w:rFonts w:ascii="Georgia" w:hAnsi="Georgia" w:eastAsia="Georgia" w:cs="Georgia"/>
-          <w:sz w:val="22"/>
-          <w:szCs w:val="22"/>
-          <w:rtl w:val="0"/>
-        </w:rPr>
-        <w:t xml:space="preserve">All coded data is pooled across three analytical tasks: (a) Caption strategy distribution — the proportion of HOPE vs. EMPOWERMENT across the 30-caption corpus is described, with dominant feature types tallied per category; (b) Comment linguistic features — the dominant response types (SUPPORTIVE LEXICON vs. PERSONAL NARRATIVE) and their characteristic linguistic markers across all 60 comment units are described independently; and (c) Cross-level synthesis — patterns at the intersection of caption type and comment response type are described to characterize how positive mental health meanings are collectively constructed. The analysis is strictly descriptive: it identifies linguistic patterns and feature frequencies without making temporal, causal, or generalizable claims.</w:t>
-      </w:r>
-      <w:r>
-        <w:rPr>
-          <w:rFonts w:ascii="Georgia" w:hAnsi="Georgia" w:eastAsia="Georgia" w:cs="Georgia"/>
-          <w:rtl w:val="0"/>
-        </w:rPr>
+          <w:b w:val="0"/>
+        </w:rPr>
+        <w:t>All coded data is pooled across three analytical tasks: (a) Caption strategy distribution. The proportion of HOPE vs. EMPOWERMENT across the 30-caption corpus is described, with dominant feature types tallied per category. (b) Comment linguistic features. The dominant response types (SUPPORTIVE LEXICON vs. PERSONAL NARRATIVE) and their characteristic linguistic markers across all 60 comment units are described independently. (c) Cross-level synthesis. Patterns at the intersection of caption type and comment response type are described to characterize how positive mental health meanings are collectively constructed. The analysis is strictly descriptive: it identifies linguistic patterns and feature frequencies without making temporal, causal, or generalizable claims.</w:t>
       </w:r>
     </w:p>
     <w:p>
@@ -4565,9 +4396,8 @@
       <w:r>
         <w:rPr>
           <w:rFonts w:ascii="Georgia" w:hAnsi="Georgia" w:eastAsia="Georgia" w:cs="Georgia"/>
-          <w:rtl w:val="0"/>
-        </w:rPr>
-        <w:t xml:space="preserve">Decision procedure (two-stage Identify and Sort). The markers in Table A1 are illustrative signals, not an exhaustive inventory. Coding proceeds in two stages. Stage 1 — Identify. For each caption, mark hope construction and empowerment language as present or absent on the basis of the illustrative signals. Stage 2 — Sort. If only hope construction is present, code HOPE. If only empowerment language is present, code EMPOWERMENT. If neither is present, code blended or indeterminate. If both are present, adjudicate dominance: which orientation occupies the main clause(s) or the final prominent position, and which speech act carries the main force of the text — "Things can or will get better" (HOPE) or "You can or should act" (EMPOWERMENT). The orientation that wins both checks, or clearly wins one while the other is only peripheral, becomes the dominant code. If the checks disagree or neither orientation is clearly stronger, code as blended or indeterminate. Blended cases are logged separately and excluded from the main HOPE versus EMPOWERMENT distribution.</w:t>
+        </w:rPr>
+        <w:t>Decision procedure (two-stage Identify and Sort). The markers in Table A1 are illustrative signals, not an exhaustive inventory. Coding proceeds in two stages. Stage 1 (Identify). For each caption, mark hope construction and empowerment language as present or absent on the basis of the illustrative signals. Stage 2 (Sort). If only hope construction is present, code HOPE. If only empowerment language is present, code EMPOWERMENT. If neither is present, code blended or indeterminate. If both are present, adjudicate dominance: which orientation occupies the main clause(s) or the final prominent position, and which speech act carries the main force of the text. "Things can or will get better" (HOPE) or "You can or should act" (EMPOWERMENT). The orientation that wins both checks, or clearly wins one while the other is only peripheral, becomes the dominant code. If the checks disagree or neither orientation is clearly stronger, code as blended or indeterminate. Blended cases are logged separately and excluded from the main HOPE versus EMPOWERMENT distribution.</w:t>
       </w:r>
     </w:p>
     <w:p>

</xml_diff>

<commit_message>
Uniform spacing and font sizes per BAELS hierarchy
- Major headers: Georgia 14 bold, 3-space before/after
- Minor headers: Georgia 12, 1-space before (0 after major), 0 after
- Body: Georgia 11; table cells: Georgia 9
- Title page spacing left unchanged
</commit_message>
<xml_diff>
--- a/thesis/Thesis_Instagram_MH_v11.docx
+++ b/thesis/Thesis_Instagram_MH_v11.docx
@@ -422,15 +422,16 @@
     </w:p>
     <w:p>
       <w:pPr>
-        <w:spacing w:after="480" w:before="480" w:line="480" w:lineRule="auto"/>
+        <w:spacing w:after="720" w:before="720" w:line="480" w:lineRule="auto"/>
         <w:jc w:val="center"/>
         <w:rPr/>
       </w:pPr>
       <w:r>
         <w:rPr>
           <w:rFonts w:ascii="Georgia" w:hAnsi="Georgia" w:eastAsia="Georgia" w:cs="Georgia"/>
-          <w:b w:val="1"/>
+          <w:b/>
           <w:bCs w:val="1"/>
+          <w:i w:val="0"/>
           <w:sz w:val="28"/>
           <w:szCs w:val="28"/>
           <w:rtl w:val="0"/>
@@ -447,7 +448,7 @@
     <w:p>
       <w:pPr>
         <w:keepNext w:val="1"/>
-        <w:spacing w:after="480" w:before="480" w:line="480" w:lineRule="auto"/>
+        <w:spacing w:after="0" w:before="0" w:line="480" w:lineRule="auto"/>
         <w:jc w:val="left"/>
         <w:rPr>
           <w:b w:val="1"/>
@@ -466,31 +467,104 @@
     <w:p>
       <w:pPr>
         <w:keepNext w:val="1"/>
-        <w:spacing w:after="480" w:before="480" w:line="480" w:lineRule="auto"/>
+        <w:spacing w:after="720" w:before="720" w:line="480" w:lineRule="auto"/>
         <w:jc w:val="left"/>
         <w:rPr/>
       </w:pPr>
       <w:r>
         <w:rPr>
           <w:rFonts w:ascii="Georgia" w:hAnsi="Georgia" w:eastAsia="Georgia" w:cs="Georgia"/>
-          <w:b w:val="1"/>
+          <w:b/>
           <w:bCs w:val="1"/>
+          <w:i w:val="0"/>
+          <w:sz w:val="28"/>
+          <w:szCs w:val="24"/>
+          <w:rtl w:val="0"/>
+        </w:rPr>
+        <w:t xml:space="preserve">BACKGROUND OF THE STUDY</w:t>
+      </w:r>
+      <w:r>
+        <w:rPr>
+          <w:rFonts w:ascii="Georgia" w:hAnsi="Georgia" w:eastAsia="Georgia" w:cs="Georgia"/>
+          <w:rtl w:val="0"/>
+        </w:rPr>
+      </w:r>
+    </w:p>
+    <w:p>
+      <w:pPr>
+        <w:spacing w:line="480" w:lineRule="auto" w:before="0" w:after="0"/>
+        <w:ind w:firstLine="720"/>
+        <w:jc w:val="both"/>
+        <w:rPr/>
+      </w:pPr>
+      <w:r>
+        <w:rPr>
+          <w:rFonts w:ascii="Georgia" w:hAnsi="Georgia" w:eastAsia="Georgia" w:cs="Georgia"/>
+          <w:sz w:val="22"/>
+          <w:szCs w:val="22"/>
+          <w:rtl w:val="0"/>
+        </w:rPr>
+        <w:t xml:space="preserve">Struggle is often easy to name, but hope is harder to construct in words without sounding false. On Instagram, dedicated mental health advocacy pages produce high-volume, high-engagement content that consistently uses positive linguistic framing. Wu and Hong (2022) analysed more than 7,000 #mentalhealth posts and found that most captions and comments carried positive sentiment. Posts with human faces also drew more likes, comments, and positive replies. Koinig (2022) surveyed active Instagram users and reported that motivational quotes and influencer posts received the strongest favourable evaluations. Naslund et al. (2016) observed that people with mental illness increasingly turn to social media for peer support. They find greater social connectedness and more chances to challenge stigma. These captions work as short discursive units. Lexical choices, modality, and directive structures combine to produce specific social meanings. Related work on Twitter has shown how advocacy actors position audiences and build collective support through language and multimodal resources (Koteyko &amp; Atanasova, 2018). Even so, the specific lexical and grammatical mechanisms through which short Instagram captions construct hope and empowerment remain underexamined in applied linguistics and discourse analysis.</w:t>
+      </w:r>
+      <w:r>
+        <w:rPr>
+          <w:rFonts w:ascii="Georgia" w:hAnsi="Georgia" w:eastAsia="Georgia" w:cs="Georgia"/>
+          <w:rtl w:val="0"/>
+        </w:rPr>
+      </w:r>
+    </w:p>
+    <w:p>
+      <w:pPr>
+        <w:spacing w:line="480" w:lineRule="auto" w:before="0" w:after="0"/>
+        <w:ind w:firstLine="720"/>
+        <w:jc w:val="both"/>
+        <w:rPr/>
+      </w:pPr>
+      <w:r>
+        <w:rPr>
+          <w:rFonts w:ascii="Georgia" w:hAnsi="Georgia" w:eastAsia="Georgia" w:cs="Georgia"/>
+          <w:sz w:val="22"/>
+          <w:szCs w:val="22"/>
+          <w:rtl w:val="0"/>
+        </w:rPr>
+        <w:t xml:space="preserve">This study addresses that gap. It examines how mental health captions on Instagram use lexical and grammatical choices to construct two discursive orientations, hope construction and empowerment language. It also identifies the linguistic features that characterise public comment responses to those captions. Taken together, the two levels of analysis describe how positive mental health discourse is collectively constructed in digital advocacy spaces. The analysis is grounded in Positive Discourse Analysis (Martin, 2004) and draws on an adapted version of Chang’s (2009) online support typology. The study does not assume that positive framing is inherently beneficial. It treats positivity as a discursive construction to be described and interrogated on its own terms.</w:t>
+      </w:r>
+      <w:r>
+        <w:rPr>
+          <w:rFonts w:ascii="Georgia" w:hAnsi="Georgia" w:eastAsia="Georgia" w:cs="Georgia"/>
+          <w:rtl w:val="0"/>
+        </w:rPr>
+      </w:r>
+    </w:p>
+    <w:p>
+      <w:pPr>
+        <w:keepNext w:val="1"/>
+        <w:spacing w:after="0" w:before="240" w:line="480" w:lineRule="auto"/>
+        <w:jc w:val="left"/>
+        <w:rPr/>
+      </w:pPr>
+      <w:r>
+        <w:rPr>
+          <w:rFonts w:ascii="Georgia" w:hAnsi="Georgia" w:eastAsia="Georgia" w:cs="Georgia"/>
+          <w:b w:val="0"/>
+          <w:i/>
+          <w:iCs w:val="1"/>
           <w:sz w:val="24"/>
           <w:szCs w:val="24"/>
           <w:rtl w:val="0"/>
         </w:rPr>
-        <w:t xml:space="preserve">BACKGROUND OF THE STUDY</w:t>
-      </w:r>
-      <w:r>
-        <w:rPr>
-          <w:rFonts w:ascii="Georgia" w:hAnsi="Georgia" w:eastAsia="Georgia" w:cs="Georgia"/>
-          <w:rtl w:val="0"/>
-        </w:rPr>
-      </w:r>
-    </w:p>
-    <w:p>
-      <w:pPr>
-        <w:spacing w:line="480" w:lineRule="auto"/>
+        <w:t xml:space="preserve">Positive Discourse Analysis as a Theoretical Framework</w:t>
+      </w:r>
+      <w:r>
+        <w:rPr>
+          <w:rFonts w:ascii="Georgia" w:hAnsi="Georgia" w:eastAsia="Georgia" w:cs="Georgia"/>
+          <w:rtl w:val="0"/>
+        </w:rPr>
+      </w:r>
+    </w:p>
+    <w:p>
+      <w:pPr>
+        <w:spacing w:line="480" w:lineRule="auto" w:before="0" w:after="0"/>
         <w:ind w:firstLine="720"/>
         <w:jc w:val="both"/>
         <w:rPr/>
@@ -502,18 +576,18 @@
           <w:szCs w:val="22"/>
           <w:rtl w:val="0"/>
         </w:rPr>
-        <w:t xml:space="preserve">Struggle is often easy to name, but hope is harder to construct in words without sounding false. On Instagram, dedicated mental health advocacy pages produce high-volume, high-engagement content that consistently uses positive linguistic framing. Wu and Hong (2022) analysed more than 7,000 #mentalhealth posts and found that most captions and comments carried positive sentiment. Posts with human faces also drew more likes, comments, and positive replies. Koinig (2022) surveyed active Instagram users and reported that motivational quotes and influencer posts received the strongest favourable evaluations. Naslund et al. (2016) observed that people with mental illness increasingly turn to social media for peer support. They find greater social connectedness and more chances to challenge stigma. These captions work as short discursive units. Lexical choices, modality, and directive structures combine to produce specific social meanings. Related work on Twitter has shown how advocacy actors position audiences and build collective support through language and multimodal resources (Koteyko &amp; Atanasova, 2018). Even so, the specific lexical and grammatical mechanisms through which short Instagram captions construct hope and empowerment remain underexamined in applied linguistics and discourse analysis.</w:t>
-      </w:r>
-      <w:r>
-        <w:rPr>
-          <w:rFonts w:ascii="Georgia" w:hAnsi="Georgia" w:eastAsia="Georgia" w:cs="Georgia"/>
-          <w:rtl w:val="0"/>
-        </w:rPr>
-      </w:r>
-    </w:p>
-    <w:p>
-      <w:pPr>
-        <w:spacing w:line="480" w:lineRule="auto"/>
+        <w:t xml:space="preserve">This study is grounded in Positive Discourse Analysis (PDA), a framework developed by Martin (2004) within Systemic Functional Linguistics. Critical discourse analysis often focuses on language in the service of power. Martin offers a complementary orientation. He examines discourses that work to make the world better. Solidarity and change, in his account, are built through concrete linguistic resources. These include genre renovation, evaluative language under the appraisal framework, and narrative. His central illustrations include the Bringing Them Home report on the Stolen Generations. There, new genres and evaluative choices reposition Indigenous and non-Indigenous relations rather than only expose injustice. PDA is not a soft alternative to critique. It is an analytical commitment to describing how constructive social meanings are realised in text.</w:t>
+      </w:r>
+      <w:r>
+        <w:rPr>
+          <w:rFonts w:ascii="Georgia" w:hAnsi="Georgia" w:eastAsia="Georgia" w:cs="Georgia"/>
+          <w:rtl w:val="0"/>
+        </w:rPr>
+      </w:r>
+    </w:p>
+    <w:p>
+      <w:pPr>
+        <w:spacing w:line="480" w:lineRule="auto" w:before="0" w:after="0"/>
         <w:ind w:firstLine="720"/>
         <w:jc w:val="both"/>
         <w:rPr/>
@@ -525,7 +599,168 @@
           <w:szCs w:val="22"/>
           <w:rtl w:val="0"/>
         </w:rPr>
-        <w:t xml:space="preserve">This study addresses that gap. It examines how mental health captions on Instagram use lexical and grammatical choices to construct two discursive orientations, hope construction and empowerment language. It also identifies the linguistic features that characterise public comment responses to those captions. Taken together, the two levels of analysis describe how positive mental health discourse is collectively constructed in digital advocacy spaces. The analysis is grounded in Positive Discourse Analysis (Martin, 2004) and draws on an adapted version of Chang’s (2009) online support typology. The study does not assume that positive framing is inherently beneficial. It treats positivity as a discursive construction to be described and interrogated on its own terms.</w:t>
+        <w:t xml:space="preserve">Later work has tested and refined that commitment. Macgilchrist (2007) takes up Martin’s call by examining how marginal discourses enter mainstream news. She analyses coverage of the Russian-Chechen conflict and related cases. She identifies five counter-discursive strategies. These are logical inversion, parody, complexification, partial reframing, and radical reframing. Only certain reframings survive editorial selection. Radical reframing, which redefines the terms of the issue rather than merely contradicting the dominant frame, proves the most effective at shifting what can be said. The study matters for mental health advocacy because it shows that positive discourse is not automatically published or heard. It has to negotiate institutional filters.</w:t>
+      </w:r>
+      <w:r>
+        <w:rPr>
+          <w:rFonts w:ascii="Georgia" w:hAnsi="Georgia" w:eastAsia="Georgia" w:cs="Georgia"/>
+          <w:rtl w:val="0"/>
+        </w:rPr>
+      </w:r>
+    </w:p>
+    <w:p>
+      <w:pPr>
+        <w:spacing w:line="480" w:lineRule="auto" w:before="0" w:after="0"/>
+        <w:ind w:firstLine="720"/>
+        <w:jc w:val="both"/>
+        <w:rPr/>
+      </w:pPr>
+      <w:r>
+        <w:rPr>
+          <w:rFonts w:ascii="Georgia" w:hAnsi="Georgia" w:eastAsia="Georgia" w:cs="Georgia"/>
+          <w:sz w:val="22"/>
+          <w:szCs w:val="22"/>
+          <w:rtl w:val="0"/>
+        </w:rPr>
+        <w:t xml:space="preserve">Bartlett (2012) pushes the framework further. In Hybrid Voices and Collaborative Change he argues that early PDA risked becoming an oppositional mirror of critical discourse analysis. It could celebrate minority voices without enough attention to context. Drawing on an extended case of intercultural development discourse, Bartlett models power as potentially collaborative as well as coercive. He treats positive discourse as hybrid. Speakers draw on multiple voices and local constraints when they attempt change. For the present study, that means hope and empowerment language on Instagram cannot be coded as inherently progressive. They must be described in relation to platform norms, advocacy goals, and audience response.</w:t>
+      </w:r>
+      <w:r>
+        <w:rPr>
+          <w:rFonts w:ascii="Georgia" w:hAnsi="Georgia" w:eastAsia="Georgia" w:cs="Georgia"/>
+          <w:rtl w:val="0"/>
+        </w:rPr>
+      </w:r>
+    </w:p>
+    <w:p>
+      <w:pPr>
+        <w:spacing w:line="480" w:lineRule="auto" w:before="0" w:after="0"/>
+        <w:ind w:firstLine="720"/>
+        <w:jc w:val="both"/>
+        <w:rPr/>
+      </w:pPr>
+      <w:r>
+        <w:rPr>
+          <w:rFonts w:ascii="Georgia" w:hAnsi="Georgia" w:eastAsia="Georgia" w:cs="Georgia"/>
+          <w:sz w:val="22"/>
+          <w:szCs w:val="22"/>
+          <w:rtl w:val="0"/>
+        </w:rPr>
+        <w:t xml:space="preserve">For this study, PDA supplies a structured way to identify how mental health captions encode optimism and agency. Optimism appears as hope construction. Agency appears as empowerment language. Both are tracked through specific grammatical and lexical patterns. Martin’s emphasis on modality, inclusive pronouns, and action-oriented processes, Macgilchrist’s attention to reframing, and Bartlett’s insistence on hybrid, context-bound meaning-making justify treating short Instagram captions as sites where positive social meanings are actively built. The framework prioritises discursive function over isolated keywords. That focus fits a platform where meaning is constructed in limited space and under strong norms of visibility and engagement.</w:t>
+      </w:r>
+      <w:r>
+        <w:rPr>
+          <w:rFonts w:ascii="Georgia" w:hAnsi="Georgia" w:eastAsia="Georgia" w:cs="Georgia"/>
+          <w:rtl w:val="0"/>
+        </w:rPr>
+      </w:r>
+    </w:p>
+    <w:p>
+      <w:pPr>
+        <w:spacing w:line="480" w:lineRule="auto" w:before="0" w:after="0"/>
+        <w:ind w:firstLine="720"/>
+        <w:jc w:val="both"/>
+        <w:rPr/>
+      </w:pPr>
+      <w:r>
+        <w:rPr>
+          <w:rFonts w:ascii="Georgia" w:hAnsi="Georgia" w:eastAsia="Georgia" w:cs="Georgia"/>
+          <w:sz w:val="22"/>
+          <w:szCs w:val="22"/>
+          <w:rtl w:val="0"/>
+        </w:rPr>
+        <w:t xml:space="preserve">This study does not adopt PDA uncritically. An exclusive focus on positive discourse can naturalise particular framings. It can leave unexamined whose positivity is centred and whose experience is sidelined. Bartesaghi and Castor (2008), working within social constructionism as practical theory, stress that communication research must keep materiality, agency, and critical application in view. Otherwise constructionist accounts risk treating discourse as free-floating and politically neutral. Macgilchrist (2007) and Bartlett (2012) raise the same caution from inside PDA itself. Positive discourse is selective. Analysis that only praises it can reproduce the exclusions it claims to overcome.</w:t>
+      </w:r>
+      <w:r>
+        <w:rPr>
+          <w:rFonts w:ascii="Georgia" w:hAnsi="Georgia" w:eastAsia="Georgia" w:cs="Georgia"/>
+          <w:rtl w:val="0"/>
+        </w:rPr>
+      </w:r>
+    </w:p>
+    <w:p>
+      <w:pPr>
+        <w:spacing w:line="480" w:lineRule="auto" w:before="0" w:after="0"/>
+        <w:ind w:firstLine="720"/>
+        <w:jc w:val="both"/>
+        <w:rPr/>
+      </w:pPr>
+      <w:r>
+        <w:rPr>
+          <w:rFonts w:ascii="Georgia" w:hAnsi="Georgia" w:eastAsia="Georgia" w:cs="Georgia"/>
+          <w:sz w:val="22"/>
+          <w:szCs w:val="22"/>
+          <w:rtl w:val="0"/>
+        </w:rPr>
+        <w:t xml:space="preserve">On social media that risk is concrete. Lecompte-Van Poucke (2022) analyses posts and comments on two public Facebook pages that advocate for endometriosis awareness. She combines systemic functional linguistics, pragma-dialectics, and critical theory. She shows that both organisational posts and user replies often deploy forced positive discourse. This includes cliché uplift, neoliberal positive thinking, and argumentatively weak reassurance. The effect is a less inclusive space. Distress is met with formulas that are hard to refute yet offer little genuine alignment with the speaker’s situation. Wong, Wan, and Lew (2025) examine toxic positivity more broadly on social media through focus groups and experiment. They find that audiences recognise toxic positivity through two message features, overgeneralisation and commanding language, and through two psychological processes, ignoring negativity and perceived poster privilege. Under those conditions, intended emotional contagion fails. Positivity backfires. Naslund et al. (2016), reviewing peer-to-peer support online, note that such spaces can increase connectedness and challenge stigma. They can also circulate selective recovery narratives that do not represent the full range of lived experience.</w:t>
+      </w:r>
+      <w:r>
+        <w:rPr>
+          <w:rFonts w:ascii="Georgia" w:hAnsi="Georgia" w:eastAsia="Georgia" w:cs="Georgia"/>
+          <w:rtl w:val="0"/>
+        </w:rPr>
+      </w:r>
+    </w:p>
+    <w:p>
+      <w:pPr>
+        <w:spacing w:line="480" w:lineRule="auto" w:before="0" w:after="0"/>
+        <w:ind w:firstLine="720"/>
+        <w:jc w:val="both"/>
+        <w:rPr/>
+      </w:pPr>
+      <w:r>
+        <w:rPr>
+          <w:rFonts w:ascii="Georgia" w:hAnsi="Georgia" w:eastAsia="Georgia" w:cs="Georgia"/>
+          <w:sz w:val="22"/>
+          <w:szCs w:val="22"/>
+          <w:rtl w:val="0"/>
+        </w:rPr>
+        <w:t xml:space="preserve">Taken together, these studies justify an instrumental use of PDA in the present project. The framework is used to describe how hope and empowerment are linguistically constructed in Instagram captions. Positivity itself is treated as a selective discourse practice rather than an assumed good.</w:t>
+      </w:r>
+      <w:r>
+        <w:rPr>
+          <w:rFonts w:ascii="Georgia" w:hAnsi="Georgia" w:eastAsia="Georgia" w:cs="Georgia"/>
+          <w:rtl w:val="0"/>
+        </w:rPr>
+      </w:r>
+    </w:p>
+    <w:p>
+      <w:pPr>
+        <w:spacing w:line="480" w:lineRule="auto" w:before="0" w:after="0"/>
+        <w:ind w:firstLine="720"/>
+        <w:jc w:val="both"/>
+        <w:rPr/>
+      </w:pPr>
+      <w:r>
+        <w:rPr>
+          <w:rFonts w:ascii="Georgia" w:hAnsi="Georgia" w:eastAsia="Georgia" w:cs="Georgia"/>
+          <w:sz w:val="22"/>
+          <w:szCs w:val="22"/>
+          <w:rtl w:val="0"/>
+        </w:rPr>
+        <w:t xml:space="preserve">To analyse how audiences respond linguistically to these caption strategies, the study pairs PDA with an adapted version of Chang’s (2009) online support typology. Chang examined communication in a Taiwanese psychosis peer-support board using a network approach. She identified four primary support types. These are informational, emotional, esteem, and network support. She also showed that support exchanges were sparse and unevenly distributed. A minority of participants occupied central positions. Many ties remained uniplex rather than multiplex. The typology therefore captures not only what is said but how support circulates among participants.</w:t>
+      </w:r>
+      <w:r>
+        <w:rPr>
+          <w:rFonts w:ascii="Georgia" w:hAnsi="Georgia" w:eastAsia="Georgia" w:cs="Georgia"/>
+          <w:rtl w:val="0"/>
+        </w:rPr>
+      </w:r>
+    </w:p>
+    <w:p>
+      <w:pPr>
+        <w:spacing w:line="480" w:lineRule="auto" w:before="0" w:after="0"/>
+        <w:ind w:firstLine="720"/>
+        <w:jc w:val="both"/>
+        <w:rPr/>
+      </w:pPr>
+      <w:r>
+        <w:rPr>
+          <w:rFonts w:ascii="Georgia" w:hAnsi="Georgia" w:eastAsia="Georgia" w:cs="Georgia"/>
+          <w:sz w:val="22"/>
+          <w:szCs w:val="22"/>
+          <w:rtl w:val="0"/>
+        </w:rPr>
+        <w:t xml:space="preserve">The present study adapts that typology to public Instagram advocacy comments. Emotional and esteem support are collapsed into a single supportive lexicon category. This reflects the short, affective replies typical of the platform. Network support is operationalised as personal narrative framing, where commenters offer their own experience as alignment rather than advice. Informational support is set aside as a primary coding category because it is less prevalent under advocacy-page norms. Pairing PDA with this adapted typology allows the analysis to move from caption production to comment reception. It asks whether particular hope and empowerment strategies co-occur with particular response types.</w:t>
       </w:r>
       <w:r>
         <w:rPr>
@@ -537,263 +772,205 @@
     <w:p>
       <w:pPr>
         <w:keepNext w:val="1"/>
-        <w:spacing w:after="480" w:before="480" w:line="480" w:lineRule="auto"/>
+        <w:spacing w:after="0" w:before="240" w:line="480" w:lineRule="auto"/>
         <w:jc w:val="left"/>
         <w:rPr/>
       </w:pPr>
       <w:r>
         <w:rPr>
           <w:rFonts w:ascii="Georgia" w:hAnsi="Georgia" w:eastAsia="Georgia" w:cs="Georgia"/>
+          <w:b w:val="0"/>
+          <w:i/>
+          <w:iCs w:val="1"/>
+          <w:sz w:val="24"/>
+          <w:szCs w:val="24"/>
+          <w:rtl w:val="0"/>
+        </w:rPr>
+        <w:t xml:space="preserve">Mental Health Discourse on Instagram: Patterns of Positivity and Engagement</w:t>
+      </w:r>
+      <w:r>
+        <w:rPr>
+          <w:rFonts w:ascii="Georgia" w:hAnsi="Georgia" w:eastAsia="Georgia" w:cs="Georgia"/>
+          <w:rtl w:val="0"/>
+        </w:rPr>
+      </w:r>
+    </w:p>
+    <w:p>
+      <w:pPr>
+        <w:spacing w:line="480" w:lineRule="auto" w:before="0" w:after="0"/>
+        <w:ind w:firstLine="720"/>
+        <w:jc w:val="both"/>
+        <w:rPr/>
+      </w:pPr>
+      <w:r>
+        <w:rPr>
+          <w:rFonts w:ascii="Georgia" w:hAnsi="Georgia" w:eastAsia="Georgia" w:cs="Georgia"/>
+          <w:sz w:val="22"/>
+          <w:szCs w:val="22"/>
+          <w:rtl w:val="0"/>
+        </w:rPr>
+        <w:t xml:space="preserve">Empirical research on digital mental health discourse confirms that Instagram content is predominantly positive in orientation and is designed to elicit supportive interaction. Wu and Hong (2022) scraped all public Instagram posts tagged #mentalhealth on World Mental Health Day and analysed 7,078 posts with a mixed method of automated sentiment classification and quantitative content analysis. The sample contained more positive sentiment in both captions and comments than negative sentiment. Images with human faces drew more likes, more comments, and more positive comments than images without faces. In the subset of 1,472 posts that showed faces, emotional contagion from post to comment appeared only when image sentiment and caption sentiment were congruent. When the two modes shared the same emotional tone, readers were more likely to leave positive comments. That finding makes caption-comment alignment an empirically observable phenomenon and supports treating captions as linguistic units that shape subsequent response.</w:t>
+      </w:r>
+      <w:r>
+        <w:rPr>
+          <w:rFonts w:ascii="Georgia" w:hAnsi="Georgia" w:eastAsia="Georgia" w:cs="Georgia"/>
+          <w:rtl w:val="0"/>
+        </w:rPr>
+      </w:r>
+    </w:p>
+    <w:p>
+      <w:pPr>
+        <w:spacing w:line="480" w:lineRule="auto" w:before="0" w:after="0"/>
+        <w:ind w:firstLine="720"/>
+        <w:jc w:val="both"/>
+        <w:rPr/>
+      </w:pPr>
+      <w:r>
+        <w:rPr>
+          <w:rFonts w:ascii="Georgia" w:hAnsi="Georgia" w:eastAsia="Georgia" w:cs="Georgia"/>
+          <w:sz w:val="22"/>
+          <w:szCs w:val="22"/>
+          <w:rtl w:val="0"/>
+        </w:rPr>
+        <w:t xml:space="preserve">Koinig (2022) tested how different content formats used by mental health influencers are evaluated by users. A cross-sectional survey of 532 Austrian Instagram users aged 16 to 34 compared motivational quotes, comics, and influencer posts. Motivational quotes received the most favourable evaluations (M = 4.23), followed closely by influencer posts (M = 4.12). Comics scored lower (M = 3.72). Respondents preferred content that boosted esteem or carried a human touch. The study therefore links positive framing not only to platform norms but to audience preference for forms that invite encouragement and relatability.</w:t>
+      </w:r>
+      <w:r>
+        <w:rPr>
+          <w:rFonts w:ascii="Georgia" w:hAnsi="Georgia" w:eastAsia="Georgia" w:cs="Georgia"/>
+          <w:rtl w:val="0"/>
+        </w:rPr>
+      </w:r>
+    </w:p>
+    <w:p>
+      <w:pPr>
+        <w:spacing w:line="480" w:lineRule="auto" w:before="0" w:after="0"/>
+        <w:ind w:firstLine="720"/>
+        <w:jc w:val="both"/>
+        <w:rPr/>
+      </w:pPr>
+      <w:r>
+        <w:rPr>
+          <w:rFonts w:ascii="Georgia" w:hAnsi="Georgia" w:eastAsia="Georgia" w:cs="Georgia"/>
+          <w:sz w:val="22"/>
+          <w:szCs w:val="22"/>
+          <w:rtl w:val="0"/>
+        </w:rPr>
+        <w:t xml:space="preserve">Discourse-analytic work on related platforms has examined how advocacy language positions audiences. Koteyko and Atanasova (2018) analysed tweets tagged #WhatYouDontSee during Depression Awareness Week. They show that users and organisations deploy metadata and images for interactional positioning. Audiences are cast as jury, confidantes, or fellow sufferers. Those positions allow users to bear witness, validate experience, and invite judgement. The study highlights the interactional function of digital illness narratives rather than treating posts as isolated sentiment scores.</w:t>
+      </w:r>
+      <w:r>
+        <w:rPr>
+          <w:rFonts w:ascii="Georgia" w:hAnsi="Georgia" w:eastAsia="Georgia" w:cs="Georgia"/>
+          <w:rtl w:val="0"/>
+        </w:rPr>
+      </w:r>
+    </w:p>
+    <w:p>
+      <w:pPr>
+        <w:spacing w:line="480" w:lineRule="auto" w:before="0" w:after="0"/>
+        <w:ind w:firstLine="720"/>
+        <w:jc w:val="both"/>
+        <w:rPr/>
+      </w:pPr>
+      <w:r>
+        <w:rPr>
+          <w:rFonts w:ascii="Georgia" w:hAnsi="Georgia" w:eastAsia="Georgia" w:cs="Georgia"/>
+          <w:sz w:val="22"/>
+          <w:szCs w:val="22"/>
+          <w:rtl w:val="0"/>
+        </w:rPr>
+        <w:t xml:space="preserve">More recent Instagram-focused work extends that picture. Beelen and Karsay (2024) ran a pre-registered experiment with 479 young adults. They manipulated hopeful mental health messages versus control posts and high versus low endorsement cues on Instagram-style stimuli. They measured effects on hope, life satisfaction, stigma, willingness to disclose, and willingness to support. The analysis found no significant main or interaction effects in the predicted direction. Hopeful content alone did not reliably shift those outcomes under the conditions tested. Natrio and Yensasnidar (2025) applied Appraisal Theory and critical discourse analysis to 26 English Instagram captions tagged with health and lifestyle hashtags. Captions constructed a “healthy self” through affect, judgement, and appreciation. They emphasised emotional recovery, discipline, self-acceptance, and personal empowerment, while still carrying neoliberal values of individual responsibility and bodily control. Anake et al. (2024) used social semiotics on two mental health Instagram accounts. They show how representation, colour, and framing work with language to advocate awareness and support and to shape empathetic understanding.</w:t>
+      </w:r>
+      <w:r>
+        <w:rPr>
+          <w:rFonts w:ascii="Georgia" w:hAnsi="Georgia" w:eastAsia="Georgia" w:cs="Georgia"/>
+          <w:rtl w:val="0"/>
+        </w:rPr>
+      </w:r>
+    </w:p>
+    <w:p>
+      <w:pPr>
+        <w:spacing w:line="480" w:lineRule="auto" w:before="0" w:after="0"/>
+        <w:ind w:firstLine="720"/>
+        <w:jc w:val="both"/>
+        <w:rPr/>
+      </w:pPr>
+      <w:r>
+        <w:rPr>
+          <w:rFonts w:ascii="Georgia" w:hAnsi="Georgia" w:eastAsia="Georgia" w:cs="Georgia"/>
+          <w:sz w:val="22"/>
+          <w:szCs w:val="22"/>
+          <w:rtl w:val="0"/>
+        </w:rPr>
+        <w:t xml:space="preserve">Together these studies establish that Instagram and related platforms intentionally use positive framing and that audiences respond to format, congruence, and positioning. They stop short of categorising the specific lexical and grammatical strategies of hope and empowerment through a Positive Discourse Analysis lens, or of mapping how comment language structurally aligns with caption strategies. That is the gap this study addresses.</w:t>
+      </w:r>
+      <w:r>
+        <w:rPr>
+          <w:rFonts w:ascii="Georgia" w:hAnsi="Georgia" w:eastAsia="Georgia" w:cs="Georgia"/>
+          <w:rtl w:val="0"/>
+        </w:rPr>
+      </w:r>
+    </w:p>
+    <w:p>
+      <w:pPr>
+        <w:spacing w:line="480" w:lineRule="auto" w:before="0" w:after="0"/>
+        <w:ind w:firstLine="720"/>
+        <w:jc w:val="both"/>
+        <w:rPr>
+          <w:sz w:val="22"/>
+          <w:szCs w:val="22"/>
+        </w:rPr>
+      </w:pPr>
+      <w:r>
+        <w:rPr>
+          <w:rFonts w:ascii="Georgia" w:hAnsi="Georgia" w:eastAsia="Georgia" w:cs="Georgia"/>
+          <w:sz w:val="22"/>
+          <w:szCs w:val="22"/>
+          <w:rtl w:val="0"/>
+        </w:rPr>
+        <w:t xml:space="preserve">Instagram’s interface itself shapes how captions are written. Only the first roughly 125 characters, or about three lines, appear in the feed before the reader must tap “more” (Lindgren &amp; Johansson, 2023). Writers therefore tend to place a strong opening line, develop value or emotion in the body, and close with a call to action or reflective prompt. This conventional shape is a platform affordance rather than a formal rule. The present study does not test marketing formulas. It examines the lexical and grammatical resources through which hope and empowerment are constructed inside that constrained caption space.</w:t>
+      </w:r>
+    </w:p>
+    <w:p>
+      <w:pPr>
+        <w:spacing w:line="480" w:lineRule="auto" w:before="0" w:after="0"/>
+        <w:ind w:firstLine="720"/>
+        <w:jc w:val="both"/>
+        <w:rPr/>
+      </w:pPr>
+      <w:r>
+        <w:rPr>
+          <w:rFonts w:ascii="Georgia" w:hAnsi="Georgia" w:eastAsia="Georgia" w:cs="Georgia"/>
+          <w:rtl w:val="0"/>
+        </w:rPr>
+      </w:r>
+    </w:p>
+    <w:p>
+      <w:pPr>
+        <w:spacing w:line="480" w:lineRule="auto" w:before="240" w:after="0"/>
+        <w:jc w:val="left"/>
+        <w:rPr>
           <w:i w:val="1"/>
           <w:iCs w:val="1"/>
           <w:sz w:val="24"/>
           <w:szCs w:val="24"/>
-          <w:rtl w:val="0"/>
-        </w:rPr>
-        <w:t xml:space="preserve">Positive Discourse Analysis as a Theoretical Framework</w:t>
-      </w:r>
-      <w:r>
-        <w:rPr>
-          <w:rFonts w:ascii="Georgia" w:hAnsi="Georgia" w:eastAsia="Georgia" w:cs="Georgia"/>
-          <w:rtl w:val="0"/>
-        </w:rPr>
-      </w:r>
-    </w:p>
-    <w:p>
-      <w:pPr>
-        <w:spacing w:line="480" w:lineRule="auto"/>
-        <w:ind w:firstLine="720"/>
-        <w:jc w:val="both"/>
-        <w:rPr/>
-      </w:pPr>
-      <w:r>
-        <w:rPr>
-          <w:rFonts w:ascii="Georgia" w:hAnsi="Georgia" w:eastAsia="Georgia" w:cs="Georgia"/>
-          <w:sz w:val="22"/>
-          <w:szCs w:val="22"/>
-          <w:rtl w:val="0"/>
-        </w:rPr>
-        <w:t xml:space="preserve">This study is grounded in Positive Discourse Analysis (PDA), a framework developed by Martin (2004) within Systemic Functional Linguistics. Critical discourse analysis often focuses on language in the service of power. Martin offers a complementary orientation. He examines discourses that work to make the world better. Solidarity and change, in his account, are built through concrete linguistic resources. These include genre renovation, evaluative language under the appraisal framework, and narrative. His central illustrations include the Bringing Them Home report on the Stolen Generations. There, new genres and evaluative choices reposition Indigenous and non-Indigenous relations rather than only expose injustice. PDA is not a soft alternative to critique. It is an analytical commitment to describing how constructive social meanings are realised in text.</w:t>
-      </w:r>
-      <w:r>
-        <w:rPr>
-          <w:rFonts w:ascii="Georgia" w:hAnsi="Georgia" w:eastAsia="Georgia" w:cs="Georgia"/>
-          <w:rtl w:val="0"/>
-        </w:rPr>
-      </w:r>
-    </w:p>
-    <w:p>
-      <w:pPr>
-        <w:spacing w:line="480" w:lineRule="auto"/>
-        <w:ind w:firstLine="720"/>
-        <w:jc w:val="both"/>
-        <w:rPr/>
-      </w:pPr>
-      <w:r>
-        <w:rPr>
-          <w:rFonts w:ascii="Georgia" w:hAnsi="Georgia" w:eastAsia="Georgia" w:cs="Georgia"/>
-          <w:sz w:val="22"/>
-          <w:szCs w:val="22"/>
-          <w:rtl w:val="0"/>
-        </w:rPr>
-        <w:t xml:space="preserve">Later work has tested and refined that commitment. Macgilchrist (2007) takes up Martin’s call by examining how marginal discourses enter mainstream news. She analyses coverage of the Russian-Chechen conflict and related cases. She identifies five counter-discursive strategies. These are logical inversion, parody, complexification, partial reframing, and radical reframing. Only certain reframings survive editorial selection. Radical reframing, which redefines the terms of the issue rather than merely contradicting the dominant frame, proves the most effective at shifting what can be said. The study matters for mental health advocacy because it shows that positive discourse is not automatically published or heard. It has to negotiate institutional filters.</w:t>
-      </w:r>
-      <w:r>
-        <w:rPr>
-          <w:rFonts w:ascii="Georgia" w:hAnsi="Georgia" w:eastAsia="Georgia" w:cs="Georgia"/>
-          <w:rtl w:val="0"/>
-        </w:rPr>
-      </w:r>
-    </w:p>
-    <w:p>
-      <w:pPr>
-        <w:spacing w:line="480" w:lineRule="auto"/>
-        <w:ind w:firstLine="720"/>
-        <w:jc w:val="both"/>
-        <w:rPr/>
-      </w:pPr>
-      <w:r>
-        <w:rPr>
-          <w:rFonts w:ascii="Georgia" w:hAnsi="Georgia" w:eastAsia="Georgia" w:cs="Georgia"/>
-          <w:sz w:val="22"/>
-          <w:szCs w:val="22"/>
-          <w:rtl w:val="0"/>
-        </w:rPr>
-        <w:t xml:space="preserve">Bartlett (2012) pushes the framework further. In Hybrid Voices and Collaborative Change he argues that early PDA risked becoming an oppositional mirror of critical discourse analysis. It could celebrate minority voices without enough attention to context. Drawing on an extended case of intercultural development discourse, Bartlett models power as potentially collaborative as well as coercive. He treats positive discourse as hybrid. Speakers draw on multiple voices and local constraints when they attempt change. For the present study, that means hope and empowerment language on Instagram cannot be coded as inherently progressive. They must be described in relation to platform norms, advocacy goals, and audience response.</w:t>
-      </w:r>
-      <w:r>
-        <w:rPr>
-          <w:rFonts w:ascii="Georgia" w:hAnsi="Georgia" w:eastAsia="Georgia" w:cs="Georgia"/>
-          <w:rtl w:val="0"/>
-        </w:rPr>
-      </w:r>
-    </w:p>
-    <w:p>
-      <w:pPr>
-        <w:spacing w:line="480" w:lineRule="auto"/>
-        <w:ind w:firstLine="720"/>
-        <w:jc w:val="both"/>
-        <w:rPr/>
-      </w:pPr>
-      <w:r>
-        <w:rPr>
-          <w:rFonts w:ascii="Georgia" w:hAnsi="Georgia" w:eastAsia="Georgia" w:cs="Georgia"/>
-          <w:sz w:val="22"/>
-          <w:szCs w:val="22"/>
-          <w:rtl w:val="0"/>
-        </w:rPr>
-        <w:t xml:space="preserve">For this study, PDA supplies a structured way to identify how mental health captions encode optimism and agency. Optimism appears as hope construction. Agency appears as empowerment language. Both are tracked through specific grammatical and lexical patterns. Martin’s emphasis on modality, inclusive pronouns, and action-oriented processes, Macgilchrist’s attention to reframing, and Bartlett’s insistence on hybrid, context-bound meaning-making justify treating short Instagram captions as sites where positive social meanings are actively built. The framework prioritises discursive function over isolated keywords. That focus fits a platform where meaning is constructed in limited space and under strong norms of visibility and engagement.</w:t>
-      </w:r>
-      <w:r>
-        <w:rPr>
-          <w:rFonts w:ascii="Georgia" w:hAnsi="Georgia" w:eastAsia="Georgia" w:cs="Georgia"/>
-          <w:rtl w:val="0"/>
-        </w:rPr>
-      </w:r>
-    </w:p>
-    <w:p>
-      <w:pPr>
-        <w:spacing w:line="480" w:lineRule="auto"/>
-        <w:ind w:firstLine="720"/>
-        <w:jc w:val="both"/>
-        <w:rPr/>
-      </w:pPr>
-      <w:r>
-        <w:rPr>
-          <w:rFonts w:ascii="Georgia" w:hAnsi="Georgia" w:eastAsia="Georgia" w:cs="Georgia"/>
-          <w:sz w:val="22"/>
-          <w:szCs w:val="22"/>
-          <w:rtl w:val="0"/>
-        </w:rPr>
-        <w:t xml:space="preserve">This study does not adopt PDA uncritically. An exclusive focus on positive discourse can naturalise particular framings. It can leave unexamined whose positivity is centred and whose experience is sidelined. Bartesaghi and Castor (2008), working within social constructionism as practical theory, stress that communication research must keep materiality, agency, and critical application in view. Otherwise constructionist accounts risk treating discourse as free-floating and politically neutral. Macgilchrist (2007) and Bartlett (2012) raise the same caution from inside PDA itself. Positive discourse is selective. Analysis that only praises it can reproduce the exclusions it claims to overcome.</w:t>
-      </w:r>
-      <w:r>
-        <w:rPr>
-          <w:rFonts w:ascii="Georgia" w:hAnsi="Georgia" w:eastAsia="Georgia" w:cs="Georgia"/>
-          <w:rtl w:val="0"/>
-        </w:rPr>
-      </w:r>
-    </w:p>
-    <w:p>
-      <w:pPr>
-        <w:spacing w:line="480" w:lineRule="auto"/>
-        <w:ind w:firstLine="720"/>
-        <w:jc w:val="both"/>
-        <w:rPr/>
-      </w:pPr>
-      <w:r>
-        <w:rPr>
-          <w:rFonts w:ascii="Georgia" w:hAnsi="Georgia" w:eastAsia="Georgia" w:cs="Georgia"/>
-          <w:sz w:val="22"/>
-          <w:szCs w:val="22"/>
-          <w:rtl w:val="0"/>
-        </w:rPr>
-        <w:t xml:space="preserve">On social media that risk is concrete. Lecompte-Van Poucke (2022) analyses posts and comments on two public Facebook pages that advocate for endometriosis awareness. She combines systemic functional linguistics, pragma-dialectics, and critical theory. She shows that both organisational posts and user replies often deploy forced positive discourse. This includes cliché uplift, neoliberal positive thinking, and argumentatively weak reassurance. The effect is a less inclusive space. Distress is met with formulas that are hard to refute yet offer little genuine alignment with the speaker’s situation. Wong, Wan, and Lew (2025) examine toxic positivity more broadly on social media through focus groups and experiment. They find that audiences recognise toxic positivity through two message features, overgeneralisation and commanding language, and through two psychological processes, ignoring negativity and perceived poster privilege. Under those conditions, intended emotional contagion fails. Positivity backfires. Naslund et al. (2016), reviewing peer-to-peer support online, note that such spaces can increase connectedness and challenge stigma. They can also circulate selective recovery narratives that do not represent the full range of lived experience.</w:t>
-      </w:r>
-      <w:r>
-        <w:rPr>
-          <w:rFonts w:ascii="Georgia" w:hAnsi="Georgia" w:eastAsia="Georgia" w:cs="Georgia"/>
-          <w:rtl w:val="0"/>
-        </w:rPr>
-      </w:r>
-    </w:p>
-    <w:p>
-      <w:pPr>
-        <w:spacing w:line="480" w:lineRule="auto"/>
-        <w:ind w:firstLine="720"/>
-        <w:jc w:val="both"/>
-        <w:rPr/>
-      </w:pPr>
-      <w:r>
-        <w:rPr>
-          <w:rFonts w:ascii="Georgia" w:hAnsi="Georgia" w:eastAsia="Georgia" w:cs="Georgia"/>
-          <w:sz w:val="22"/>
-          <w:szCs w:val="22"/>
-          <w:rtl w:val="0"/>
-        </w:rPr>
-        <w:t xml:space="preserve">Taken together, these studies justify an instrumental use of PDA in the present project. The framework is used to describe how hope and empowerment are linguistically constructed in Instagram captions. Positivity itself is treated as a selective discourse practice rather than an assumed good.</w:t>
-      </w:r>
-      <w:r>
-        <w:rPr>
-          <w:rFonts w:ascii="Georgia" w:hAnsi="Georgia" w:eastAsia="Georgia" w:cs="Georgia"/>
-          <w:rtl w:val="0"/>
-        </w:rPr>
-      </w:r>
-    </w:p>
-    <w:p>
-      <w:pPr>
-        <w:spacing w:line="480" w:lineRule="auto"/>
-        <w:ind w:firstLine="720"/>
-        <w:jc w:val="both"/>
-        <w:rPr/>
-      </w:pPr>
-      <w:r>
-        <w:rPr>
-          <w:rFonts w:ascii="Georgia" w:hAnsi="Georgia" w:eastAsia="Georgia" w:cs="Georgia"/>
-          <w:sz w:val="22"/>
-          <w:szCs w:val="22"/>
-          <w:rtl w:val="0"/>
-        </w:rPr>
-        <w:t xml:space="preserve">To analyse how audiences respond linguistically to these caption strategies, the study pairs PDA with an adapted version of Chang’s (2009) online support typology. Chang examined communication in a Taiwanese psychosis peer-support board using a network approach. She identified four primary support types. These are informational, emotional, esteem, and network support. She also showed that support exchanges were sparse and unevenly distributed. A minority of participants occupied central positions. Many ties remained uniplex rather than multiplex. The typology therefore captures not only what is said but how support circulates among participants.</w:t>
-      </w:r>
-      <w:r>
-        <w:rPr>
-          <w:rFonts w:ascii="Georgia" w:hAnsi="Georgia" w:eastAsia="Georgia" w:cs="Georgia"/>
-          <w:rtl w:val="0"/>
-        </w:rPr>
-      </w:r>
-    </w:p>
-    <w:p>
-      <w:pPr>
-        <w:spacing w:line="480" w:lineRule="auto"/>
-        <w:ind w:firstLine="720"/>
-        <w:jc w:val="both"/>
-        <w:rPr/>
-      </w:pPr>
-      <w:r>
-        <w:rPr>
-          <w:rFonts w:ascii="Georgia" w:hAnsi="Georgia" w:eastAsia="Georgia" w:cs="Georgia"/>
-          <w:sz w:val="22"/>
-          <w:szCs w:val="22"/>
-          <w:rtl w:val="0"/>
-        </w:rPr>
-        <w:t xml:space="preserve">The present study adapts that typology to public Instagram advocacy comments. Emotional and esteem support are collapsed into a single supportive lexicon category. This reflects the short, affective replies typical of the platform. Network support is operationalised as personal narrative framing, where commenters offer their own experience as alignment rather than advice. Informational support is set aside as a primary coding category because it is less prevalent under advocacy-page norms. Pairing PDA with this adapted typology allows the analysis to move from caption production to comment reception. It asks whether particular hope and empowerment strategies co-occur with particular response types.</w:t>
-      </w:r>
-      <w:r>
-        <w:rPr>
-          <w:rFonts w:ascii="Georgia" w:hAnsi="Georgia" w:eastAsia="Georgia" w:cs="Georgia"/>
-          <w:rtl w:val="0"/>
-        </w:rPr>
-      </w:r>
-    </w:p>
-    <w:p>
-      <w:pPr>
-        <w:keepNext w:val="1"/>
-        <w:spacing w:after="480" w:before="480" w:line="480" w:lineRule="auto"/>
-        <w:jc w:val="left"/>
-        <w:rPr/>
-      </w:pPr>
-      <w:r>
-        <w:rPr>
-          <w:rFonts w:ascii="Georgia" w:hAnsi="Georgia" w:eastAsia="Georgia" w:cs="Georgia"/>
-          <w:i w:val="1"/>
+        </w:rPr>
+      </w:pPr>
+      <w:r>
+        <w:rPr>
+          <w:rFonts w:ascii="Georgia" w:hAnsi="Georgia" w:eastAsia="Georgia" w:cs="Georgia"/>
+          <w:b w:val="0"/>
+          <w:i/>
           <w:iCs w:val="1"/>
           <w:sz w:val="24"/>
           <w:szCs w:val="24"/>
           <w:rtl w:val="0"/>
         </w:rPr>
-        <w:t xml:space="preserve">Mental Health Discourse on Instagram: Patterns of Positivity and Engagement</w:t>
-      </w:r>
-      <w:r>
-        <w:rPr>
-          <w:rFonts w:ascii="Georgia" w:hAnsi="Georgia" w:eastAsia="Georgia" w:cs="Georgia"/>
-          <w:rtl w:val="0"/>
-        </w:rPr>
-      </w:r>
-    </w:p>
-    <w:p>
-      <w:pPr>
-        <w:spacing w:line="480" w:lineRule="auto"/>
+        <w:t xml:space="preserve">Hope as a Distinct Construct in Digital Mental Health Discourse</w:t>
+      </w:r>
+    </w:p>
+    <w:p>
+      <w:pPr>
+        <w:spacing w:line="480" w:lineRule="auto" w:before="0" w:after="0"/>
         <w:ind w:firstLine="720"/>
         <w:jc w:val="both"/>
         <w:rPr/>
@@ -801,22 +978,13 @@
       <w:r>
         <w:rPr>
           <w:rFonts w:ascii="Georgia" w:hAnsi="Georgia" w:eastAsia="Georgia" w:cs="Georgia"/>
-          <w:sz w:val="22"/>
-          <w:szCs w:val="22"/>
-          <w:rtl w:val="0"/>
-        </w:rPr>
-        <w:t xml:space="preserve">Empirical research on digital mental health discourse confirms that Instagram content is predominantly positive in orientation and is designed to elicit supportive interaction. Wu and Hong (2022) scraped all public Instagram posts tagged #mentalhealth on World Mental Health Day and analysed 7,078 posts with a mixed method of automated sentiment classification and quantitative content analysis. The sample contained more positive sentiment in both captions and comments than negative sentiment. Images with human faces drew more likes, more comments, and more positive comments than images without faces. In the subset of 1,472 posts that showed faces, emotional contagion from post to comment appeared only when image sentiment and caption sentiment were congruent. When the two modes shared the same emotional tone, readers were more likely to leave positive comments. That finding makes caption-comment alignment an empirically observable phenomenon and supports treating captions as linguistic units that shape subsequent response.</w:t>
-      </w:r>
-      <w:r>
-        <w:rPr>
-          <w:rFonts w:ascii="Georgia" w:hAnsi="Georgia" w:eastAsia="Georgia" w:cs="Georgia"/>
-          <w:rtl w:val="0"/>
-        </w:rPr>
-      </w:r>
-    </w:p>
-    <w:p>
-      <w:pPr>
-        <w:spacing w:line="480" w:lineRule="auto"/>
+          <w:rtl w:val="0"/>
+        </w:rPr>
+      </w:r>
+    </w:p>
+    <w:p>
+      <w:pPr>
+        <w:spacing w:line="480" w:lineRule="auto" w:before="0" w:after="0"/>
         <w:ind w:firstLine="720"/>
         <w:jc w:val="both"/>
         <w:rPr/>
@@ -828,18 +996,18 @@
           <w:szCs w:val="22"/>
           <w:rtl w:val="0"/>
         </w:rPr>
-        <w:t xml:space="preserve">Koinig (2022) tested how different content formats used by mental health influencers are evaluated by users. A cross-sectional survey of 532 Austrian Instagram users aged 16 to 34 compared motivational quotes, comics, and influencer posts. Motivational quotes received the most favourable evaluations (M = 4.23), followed closely by influencer posts (M = 4.12). Comics scored lower (M = 3.72). Respondents preferred content that boosted esteem or carried a human touch. The study therefore links positive framing not only to platform norms but to audience preference for forms that invite encouragement and relatability.</w:t>
-      </w:r>
-      <w:r>
-        <w:rPr>
-          <w:rFonts w:ascii="Georgia" w:hAnsi="Georgia" w:eastAsia="Georgia" w:cs="Georgia"/>
-          <w:rtl w:val="0"/>
-        </w:rPr>
-      </w:r>
-    </w:p>
-    <w:p>
-      <w:pPr>
-        <w:spacing w:line="480" w:lineRule="auto"/>
+        <w:t xml:space="preserve">Hope appears frequently in mental health content on Instagram, yet it is often treated as one instance of general positivity rather than as a distinct discursive construct. McCosker and Gerrard (2021) examined hashtag practices around #depressed on Instagram and developed a hashtag practice approach that moves beyond single-tag sampling. Their method incorporates adjacent posts, collocated hashtags, and the interplay of visual content, captions, and profile management. The analysis shows that only a minority of posts tagged with #depressed explicitly convey the embodied experience of depression. Many posts instead rely on aesthetic and memetic practices, careful modulation of visibility, and recovery-oriented framing. Users often code their posts in ways that negotiate identification with depression while still signalling struggle or recovery. This work establishes that hopeful and recovery-oriented forms of engagement are present on the platform, but they sit inside a wider and more heterogeneous set of practices than earlier research assumed.</w:t>
+      </w:r>
+      <w:r>
+        <w:rPr>
+          <w:rFonts w:ascii="Georgia" w:hAnsi="Georgia" w:eastAsia="Georgia" w:cs="Georgia"/>
+          <w:rtl w:val="0"/>
+        </w:rPr>
+      </w:r>
+    </w:p>
+    <w:p>
+      <w:pPr>
+        <w:spacing w:line="480" w:lineRule="auto" w:before="0" w:after="0"/>
         <w:ind w:firstLine="720"/>
         <w:jc w:val="both"/>
         <w:rPr/>
@@ -851,18 +1019,18 @@
           <w:szCs w:val="22"/>
           <w:rtl w:val="0"/>
         </w:rPr>
-        <w:t xml:space="preserve">Discourse-analytic work on related platforms has examined how advocacy language positions audiences. Koteyko and Atanasova (2018) analysed tweets tagged #WhatYouDontSee during Depression Awareness Week. They show that users and organisations deploy metadata and images for interactional positioning. Audiences are cast as jury, confidantes, or fellow sufferers. Those positions allow users to bear witness, validate experience, and invite judgement. The study highlights the interactional function of digital illness narratives rather than treating posts as isolated sentiment scores.</w:t>
-      </w:r>
-      <w:r>
-        <w:rPr>
-          <w:rFonts w:ascii="Georgia" w:hAnsi="Georgia" w:eastAsia="Georgia" w:cs="Georgia"/>
-          <w:rtl w:val="0"/>
-        </w:rPr>
-      </w:r>
-    </w:p>
-    <w:p>
-      <w:pPr>
-        <w:spacing w:line="480" w:lineRule="auto"/>
+        <w:t xml:space="preserve">Lindgren and Johansson (2023) analyzed 600 Instagram posts that used mental health related hashtags and examined how support practices relate to the platform’s perceptible affordances. They found that 61 percent of the posts were recovery oriented. These posts typically presented casual snapshots of individual progress and aligned with broader discourses of positive thinking and individual responsibility. Motivational picture quotes formed a notable negotiated use. They appeared in about 10 percent of the coded images and functioned as standardized messages of hope and fighting spirit. Comments on such posts often shifted from person-centred praise toward a shared sense of struggle and encouragement. The study shows that Instagram privileges recovery-oriented visual narratives, yet users also adapt the platform’s features to circulate collective messages of hope. Hope in this material is not only a private feeling. It is publicly performed through recurring visual and textual forms that invite affiliation.</w:t>
+      </w:r>
+      <w:r>
+        <w:rPr>
+          <w:rFonts w:ascii="Georgia" w:hAnsi="Georgia" w:eastAsia="Georgia" w:cs="Georgia"/>
+          <w:rtl w:val="0"/>
+        </w:rPr>
+      </w:r>
+    </w:p>
+    <w:p>
+      <w:pPr>
+        <w:spacing w:line="480" w:lineRule="auto" w:before="0" w:after="0"/>
         <w:ind w:firstLine="720"/>
         <w:jc w:val="both"/>
         <w:rPr/>
@@ -874,18 +1042,18 @@
           <w:szCs w:val="22"/>
           <w:rtl w:val="0"/>
         </w:rPr>
-        <w:t xml:space="preserve">More recent Instagram-focused work extends that picture. Beelen and Karsay (2024) ran a pre-registered experiment with 479 young adults. They manipulated hopeful mental health messages versus control posts and high versus low endorsement cues on Instagram-style stimuli. They measured effects on hope, life satisfaction, stigma, willingness to disclose, and willingness to support. The analysis found no significant main or interaction effects in the predicted direction. Hopeful content alone did not reliably shift those outcomes under the conditions tested. Natrio and Yensasnidar (2025) applied Appraisal Theory and critical discourse analysis to 26 English Instagram captions tagged with health and lifestyle hashtags. Captions constructed a “healthy self” through affect, judgement, and appreciation. They emphasised emotional recovery, discipline, self-acceptance, and personal empowerment, while still carrying neoliberal values of individual responsibility and bodily control. Anake et al. (2024) used social semiotics on two mental health Instagram accounts. They show how representation, colour, and framing work with language to advocate awareness and support and to shape empathetic understanding.</w:t>
-      </w:r>
-      <w:r>
-        <w:rPr>
-          <w:rFonts w:ascii="Georgia" w:hAnsi="Georgia" w:eastAsia="Georgia" w:cs="Georgia"/>
-          <w:rtl w:val="0"/>
-        </w:rPr>
-      </w:r>
-    </w:p>
-    <w:p>
-      <w:pPr>
-        <w:spacing w:line="480" w:lineRule="auto"/>
+        <w:t xml:space="preserve">Beelen and Karsay (2024) tested whether hopeful mental health posts on Instagram actually raise hope and related outcomes. They conducted a 2 by 2 between-subjects experiment with 479 young adults and manipulated message type (hope message versus control) and endorsement level (high versus low likes). Drawing on appraisal theory and spillover effects, they expected hope messages to increase subsequent hope and life satisfaction, reduce stigma, and raise willingness to disclose and to offer support. The pre-registered analysis found no significant main or interaction effects in the predicted direction. Exposure to hopeful Instagram posts did not reliably produce the anticipated gains. The finding is important for the present study. Hope content is common on the platform, and recovery-oriented forms are frequent, yet the linguistic and multimodal strategies that construct hope still require close analysis. Audience effects cannot be assumed from the presence of hopeful framing alone.</w:t>
+      </w:r>
+      <w:r>
+        <w:rPr>
+          <w:rFonts w:ascii="Georgia" w:hAnsi="Georgia" w:eastAsia="Georgia" w:cs="Georgia"/>
+          <w:rtl w:val="0"/>
+        </w:rPr>
+      </w:r>
+    </w:p>
+    <w:p>
+      <w:pPr>
+        <w:spacing w:line="480" w:lineRule="auto" w:before="0" w:after="0"/>
         <w:ind w:firstLine="720"/>
         <w:jc w:val="both"/>
         <w:rPr/>
@@ -897,75 +1065,218 @@
           <w:szCs w:val="22"/>
           <w:rtl w:val="0"/>
         </w:rPr>
-        <w:t xml:space="preserve">Together these studies establish that Instagram and related platforms intentionally use positive framing and that audiences respond to format, congruence, and positioning. They stop short of categorising the specific lexical and grammatical strategies of hope and empowerment through a Positive Discourse Analysis lens, or of mapping how comment language structurally aligns with caption strategies. That is the gap this study addresses.</w:t>
-      </w:r>
-      <w:r>
-        <w:rPr>
-          <w:rFonts w:ascii="Georgia" w:hAnsi="Georgia" w:eastAsia="Georgia" w:cs="Georgia"/>
-          <w:rtl w:val="0"/>
-        </w:rPr>
-      </w:r>
-    </w:p>
-    <w:p>
-      <w:pPr>
-        <w:spacing w:line="480" w:lineRule="auto"/>
+        <w:t xml:space="preserve">Taken together, these studies move the discussion beyond general positivity. They show that hope and recovery language circulate widely on Instagram, that users actively shape how such messages appear, and that the effects of hopeful posts on audiences are not automatic. What remains under-examined is the specific lexical and grammatical work through which short advocacy captions construct hope and empowerment as discursive orientations. That gap motivates the present study’s focus on caption strategies and on the linguistic features of public comment responses.</w:t>
+      </w:r>
+      <w:r>
+        <w:rPr>
+          <w:rFonts w:ascii="Georgia" w:hAnsi="Georgia" w:eastAsia="Georgia" w:cs="Georgia"/>
+          <w:rtl w:val="0"/>
+        </w:rPr>
+      </w:r>
+    </w:p>
+    <w:p>
+      <w:pPr>
+        <w:spacing w:line="480" w:lineRule="auto" w:before="0" w:after="0"/>
         <w:ind w:firstLine="720"/>
         <w:jc w:val="both"/>
-        <w:rPr>
-          <w:sz w:val="22"/>
-          <w:szCs w:val="22"/>
-        </w:rPr>
-      </w:pPr>
-      <w:r>
-        <w:rPr>
-          <w:rFonts w:ascii="Georgia" w:hAnsi="Georgia" w:eastAsia="Georgia" w:cs="Georgia"/>
-          <w:sz w:val="22"/>
-          <w:szCs w:val="22"/>
-          <w:rtl w:val="0"/>
-        </w:rPr>
-        <w:t xml:space="preserve">Instagram’s interface itself shapes how captions are written. Only the first roughly 125 characters, or about three lines, appear in the feed before the reader must tap “more” (Lindgren &amp; Johansson, 2023). Writers therefore tend to place a strong opening line, develop value or emotion in the body, and close with a call to action or reflective prompt. This conventional shape is a platform affordance rather than a formal rule. The present study does not test marketing formulas. It examines the lexical and grammatical resources through which hope and empowerment are constructed inside that constrained caption space.</w:t>
-      </w:r>
-    </w:p>
-    <w:p>
-      <w:pPr>
-        <w:spacing w:line="480" w:lineRule="auto"/>
-        <w:ind w:firstLine="720"/>
-        <w:jc w:val="both"/>
-        <w:rPr/>
-      </w:pPr>
-      <w:r>
-        <w:rPr>
-          <w:rFonts w:ascii="Georgia" w:hAnsi="Georgia" w:eastAsia="Georgia" w:cs="Georgia"/>
-          <w:rtl w:val="0"/>
-        </w:rPr>
-      </w:r>
-    </w:p>
-    <w:p>
-      <w:pPr>
-        <w:spacing w:line="480" w:lineRule="auto"/>
+        <w:rPr/>
+      </w:pPr>
+      <w:r>
+        <w:rPr>
+          <w:rFonts w:ascii="Georgia" w:hAnsi="Georgia" w:eastAsia="Georgia" w:cs="Georgia"/>
+          <w:sz w:val="22"/>
+          <w:szCs w:val="22"/>
+          <w:rtl w:val="0"/>
+        </w:rPr>
+        <w:t xml:space="preserve">Empowerment is the second discursive orientation named in this study, yet it has received less direct attention in Instagram mental health research than hope. In health and advocacy discourse, empowerment is typically linked to agency, voice, and the capacity to act on one’s own behalf. Positive Discourse Analysis treats such agency as a central concern. It asks how language positions readers as capable actors rather than as passive recipients of care (Martin, 2004; Macgilchrist, 2007). On social media, empowerment often appears through second-person address, directive structures, and invitations to share, seek help, or reframe experience. These features are visible in recovery-oriented and advocacy captions, but few studies isolate empowerment as a lexical and grammatical construct in the same way that recent work has begun to isolate hope. The present study therefore examines hope construction and empowerment language as paired orientations within the same caption corpus.</w:t>
+      </w:r>
+      <w:r>
+        <w:rPr>
+          <w:rFonts w:ascii="Georgia" w:hAnsi="Georgia" w:eastAsia="Georgia" w:cs="Georgia"/>
+          <w:rtl w:val="0"/>
+        </w:rPr>
+      </w:r>
+    </w:p>
+    <w:p>
+      <w:pPr>
+        <w:keepNext w:val="1"/>
+        <w:spacing w:after="0" w:before="240" w:line="480" w:lineRule="auto"/>
         <w:jc w:val="left"/>
-        <w:rPr>
-          <w:i w:val="1"/>
+        <w:rPr/>
+      </w:pPr>
+      <w:r>
+        <w:rPr>
+          <w:rFonts w:ascii="Georgia" w:hAnsi="Georgia" w:eastAsia="Georgia" w:cs="Georgia"/>
+          <w:b w:val="0"/>
+          <w:i/>
           <w:iCs w:val="1"/>
           <w:sz w:val="24"/>
           <w:szCs w:val="24"/>
-        </w:rPr>
-      </w:pPr>
-      <w:r>
-        <w:rPr>
-          <w:rFonts w:ascii="Georgia" w:hAnsi="Georgia" w:eastAsia="Georgia" w:cs="Georgia"/>
-          <w:i w:val="1"/>
+          <w:rtl w:val="0"/>
+        </w:rPr>
+        <w:t xml:space="preserve">Comment Response Patterns in Digital Support Spaces</w:t>
+      </w:r>
+      <w:r>
+        <w:rPr>
+          <w:rFonts w:ascii="Georgia" w:hAnsi="Georgia" w:eastAsia="Georgia" w:cs="Georgia"/>
+          <w:rtl w:val="0"/>
+        </w:rPr>
+      </w:r>
+    </w:p>
+    <w:p>
+      <w:pPr>
+        <w:spacing w:line="480" w:lineRule="auto" w:before="0" w:after="0"/>
+        <w:ind w:firstLine="720"/>
+        <w:jc w:val="both"/>
+        <w:rPr/>
+      </w:pPr>
+      <w:r>
+        <w:rPr>
+          <w:rFonts w:ascii="Georgia" w:hAnsi="Georgia" w:eastAsia="Georgia" w:cs="Georgia"/>
+          <w:i w:val="0"/>
+          <w:iCs w:val="0"/>
+          <w:sz w:val="22"/>
+          <w:szCs w:val="22"/>
+          <w:rtl w:val="0"/>
+        </w:rPr>
+        <w:t xml:space="preserve">Audience responses to mental health content follow recognizable linguistic patterns. Chang (2009) examined the full sequences of supportive interactions in the PTT psychosis support group in Taiwan over a two-and-a-half-year period. Using a network approach, she mapped how four support types moved through the community: informational support, emotional support, esteem support, and network support. In that specific board the most exchanged types were information and network links. The overall network was sparse and highly centralized, with most exchanges occurring at the dyadic or triadic level. The finding matters because it shows that support type frequency is not universal. It varies with the platform, the illness community, and the structure of interaction.</w:t>
+      </w:r>
+      <w:r>
+        <w:rPr>
+          <w:rFonts w:ascii="Georgia" w:hAnsi="Georgia" w:eastAsia="Georgia" w:cs="Georgia"/>
+          <w:rtl w:val="0"/>
+        </w:rPr>
+      </w:r>
+    </w:p>
+    <w:p>
+      <w:pPr>
+        <w:spacing w:line="480" w:lineRule="auto" w:before="0" w:after="0"/>
+        <w:ind w:firstLine="720"/>
+        <w:jc w:val="both"/>
+        <w:rPr/>
+      </w:pPr>
+      <w:r>
+        <w:rPr>
+          <w:rFonts w:ascii="Georgia" w:hAnsi="Georgia" w:eastAsia="Georgia" w:cs="Georgia"/>
+          <w:i w:val="0"/>
+          <w:iCs w:val="0"/>
+          <w:sz w:val="22"/>
+          <w:szCs w:val="22"/>
+          <w:rtl w:val="0"/>
+        </w:rPr>
+        <w:t xml:space="preserve">Later large-scale work on public mental health forums paints a different picture of what dominates. Kim et al. (2023) collected supporting comments and their target posts from 55 Reddit mental health communities. They trained a deep-learning model to score each comment for informational support and emotional support. The results show that supporters tend to give emotional support more often than informational support. The atmosphere of those communities is also emotional. Heavily supportive users, those with high out-degree in the social supporting network, were more likely to offer informational support with diverse content. Users who attracted large volumes of support tended to post multiple similar requests over time. The study therefore separates the typical emotional climate of peer replies from the more informational style of a smaller set of highly active supporters.</w:t>
+      </w:r>
+      <w:r>
+        <w:rPr>
+          <w:rFonts w:ascii="Georgia" w:hAnsi="Georgia" w:eastAsia="Georgia" w:cs="Georgia"/>
+          <w:rtl w:val="0"/>
+        </w:rPr>
+      </w:r>
+    </w:p>
+    <w:p>
+      <w:pPr>
+        <w:spacing w:line="480" w:lineRule="auto" w:before="0" w:after="0"/>
+        <w:ind w:firstLine="720"/>
+        <w:jc w:val="both"/>
+        <w:rPr/>
+      </w:pPr>
+      <w:r>
+        <w:rPr>
+          <w:rFonts w:ascii="Georgia" w:hAnsi="Georgia" w:eastAsia="Georgia" w:cs="Georgia"/>
+          <w:i w:val="0"/>
+          <w:iCs w:val="0"/>
+          <w:sz w:val="22"/>
+          <w:szCs w:val="22"/>
+          <w:rtl w:val="0"/>
+        </w:rPr>
+        <w:t xml:space="preserve">Myrick et al. (2015) addressed the problem of classifying support in open, character-limited social media. They proposed a typology that crosses support type (informational or emotional) with direction (expression or reception) and applied it to two years of tweets under the hashtag #stupidcancer. The analysis shows that even short public messages still carry clear support functions. Information giving and link providing appear as expression of informational support. Encouragement, empathy, and religious statements appear as expression of emotional support. Giving thanks functions as reception of emotional support. The typology is useful here because Instagram comments share the same constraints of brevity and public visibility that Twitter posts faced in that study.</w:t>
+      </w:r>
+      <w:r>
+        <w:rPr>
+          <w:rFonts w:ascii="Georgia" w:hAnsi="Georgia" w:eastAsia="Georgia" w:cs="Georgia"/>
+          <w:rtl w:val="0"/>
+        </w:rPr>
+      </w:r>
+    </w:p>
+    <w:p>
+      <w:pPr>
+        <w:spacing w:line="480" w:lineRule="auto" w:before="0" w:after="0"/>
+        <w:ind w:firstLine="720"/>
+        <w:jc w:val="both"/>
+        <w:rPr/>
+      </w:pPr>
+      <w:r>
+        <w:rPr>
+          <w:rFonts w:ascii="Georgia" w:hAnsi="Georgia" w:eastAsia="Georgia" w:cs="Georgia"/>
+          <w:i w:val="0"/>
+          <w:iCs w:val="0"/>
+          <w:sz w:val="22"/>
+          <w:szCs w:val="22"/>
+          <w:rtl w:val="0"/>
+        </w:rPr>
+        <w:t xml:space="preserve">Wang (2025) analyzed 150 top-ranked posts from Weibo’s Depression Super Topic under the same three-type framework of emotional, informational, and instrumental support. Support-seeking posts far outnumbered support-providing posts. Emotional support requests accounted for the large majority of seeking behavior. Instrumental support provision was entirely absent. The pattern aligns with cultural observations that Chinese users often seek empathy and validation rather than concrete advice or material help in quasi-public depression spaces. Taken together, these studies show that emotional and network-oriented replies are common across platforms, yet the exact balance of support types shifts with community norms, platform affordances, and cultural context.</w:t>
+      </w:r>
+      <w:r>
+        <w:rPr>
+          <w:rFonts w:ascii="Georgia" w:hAnsi="Georgia" w:eastAsia="Georgia" w:cs="Georgia"/>
+          <w:rtl w:val="0"/>
+        </w:rPr>
+      </w:r>
+    </w:p>
+    <w:p>
+      <w:pPr>
+        <w:spacing w:line="480" w:lineRule="auto" w:before="0" w:after="0"/>
+        <w:ind w:firstLine="720"/>
+        <w:jc w:val="both"/>
+        <w:rPr/>
+      </w:pPr>
+      <w:r>
+        <w:rPr>
+          <w:rFonts w:ascii="Georgia" w:hAnsi="Georgia" w:eastAsia="Georgia" w:cs="Georgia"/>
+          <w:i w:val="0"/>
+          <w:iCs w:val="0"/>
+          <w:sz w:val="22"/>
+          <w:szCs w:val="22"/>
+          <w:rtl w:val="0"/>
+        </w:rPr>
+        <w:t xml:space="preserve">Most existing analyses still treat comments mainly as sentiment scores or engagement metrics rather than as structured linguistic responses. Naslund et al. (2016) review the broader evidence that people with serious mental illness turn to social media for peer connection. They report gains in social connectedness, group belonging, and the sharing of coping strategies, alongside the potential to challenge stigma and offer hope. The review remains a perspective piece rather than a linguistic analysis of comment form. This study addresses the resulting gap by applying a focused adaptation of Chang’s (2009) typology to Instagram advocacy comments. Emotional and esteem support are collapsed into a single “supportive lexicon” category. Network support is operationalized as “personal narrative framing.” Informational support is excluded from the primary analysis because it appears markedly less often in the comment sections of public advocacy pages. The adaptation fits the short, public, and algorithmically ranked nature of Instagram comments. Identifying the linguistic features of these comment responses is central to the second research question. It extends existing digital discourse work by treating comment sections as linguistically structured texts rather than mere engagement data. The third research question then draws on both caption and comment findings to describe the collective discursive construction of positive mental health meanings in Instagram advocacy spaces.</w:t>
+      </w:r>
+      <w:r>
+        <w:rPr>
+          <w:rFonts w:ascii="Georgia" w:hAnsi="Georgia" w:eastAsia="Georgia" w:cs="Georgia"/>
+          <w:rtl w:val="0"/>
+        </w:rPr>
+      </w:r>
+    </w:p>
+    <w:p>
+      <w:pPr>
+        <w:keepNext w:val="1"/>
+        <w:spacing w:after="0" w:before="240" w:line="480" w:lineRule="auto"/>
+        <w:jc w:val="left"/>
+        <w:rPr/>
+      </w:pPr>
+      <w:r>
+        <w:rPr>
+          <w:rFonts w:ascii="Georgia" w:hAnsi="Georgia" w:eastAsia="Georgia" w:cs="Georgia"/>
+          <w:b w:val="0"/>
+          <w:i/>
           <w:iCs w:val="1"/>
           <w:sz w:val="24"/>
           <w:szCs w:val="24"/>
           <w:rtl w:val="0"/>
         </w:rPr>
-        <w:t xml:space="preserve">Hope as a Distinct Construct in Digital Mental Health Discourse</w:t>
-      </w:r>
-    </w:p>
-    <w:p>
-      <w:pPr>
-        <w:spacing w:line="480" w:lineRule="auto"/>
+        <w:t xml:space="preserve">Research Gap and Rationale</w:t>
+      </w:r>
+      <w:r>
+        <w:rPr>
+          <w:rFonts w:ascii="Georgia" w:hAnsi="Georgia" w:eastAsia="Georgia" w:cs="Georgia"/>
+          <w:rtl w:val="0"/>
+        </w:rPr>
+      </w:r>
+    </w:p>
+    <w:p>
+      <w:pPr>
+        <w:spacing w:line="480" w:lineRule="auto" w:before="0" w:after="0"/>
         <w:ind w:firstLine="720"/>
         <w:jc w:val="both"/>
         <w:rPr/>
@@ -973,13 +1284,22 @@
       <w:r>
         <w:rPr>
           <w:rFonts w:ascii="Georgia" w:hAnsi="Georgia" w:eastAsia="Georgia" w:cs="Georgia"/>
-          <w:rtl w:val="0"/>
-        </w:rPr>
-      </w:r>
-    </w:p>
-    <w:p>
-      <w:pPr>
-        <w:spacing w:line="480" w:lineRule="auto"/>
+          <w:sz w:val="22"/>
+          <w:szCs w:val="22"/>
+          <w:rtl w:val="0"/>
+        </w:rPr>
+        <w:t xml:space="preserve">The literature reviewed above establishes several clear findings. Mental health content on Instagram is predominantly positive in tone and draws high engagement when it uses motivational framing and recovery-oriented visuals (Wu &amp; Hong, 2022; Koinig, 2022; Lindgren &amp; Johansson, 2023). Hope appears as a recurring theme in recovery-oriented posts and in experimental tests of hopeful messages, yet exposure alone does not reliably increase hope or reduce stigma (Beelen &amp; Karsay, 2024; McCosker &amp; Gerrard, 2021). Audience comments in digital support spaces follow recognizable patterns of informational and emotional support, personal narrative, and, less often, network-oriented replies (Chang, 2009; Kim et al., 2023; Myrick et al., 2015; Wang, 2025). Positive Discourse Analysis supplies a theoretical frame for studying how language constructs optimism and agency rather than only documenting deficit (Martin, 2004; Macgilchrist, 2007).</w:t>
+      </w:r>
+      <w:r>
+        <w:rPr>
+          <w:rFonts w:ascii="Georgia" w:hAnsi="Georgia" w:eastAsia="Georgia" w:cs="Georgia"/>
+          <w:rtl w:val="0"/>
+        </w:rPr>
+      </w:r>
+    </w:p>
+    <w:p>
+      <w:pPr>
+        <w:spacing w:line="480" w:lineRule="auto" w:before="0" w:after="0"/>
         <w:ind w:firstLine="720"/>
         <w:jc w:val="both"/>
         <w:rPr/>
@@ -991,18 +1311,18 @@
           <w:szCs w:val="22"/>
           <w:rtl w:val="0"/>
         </w:rPr>
-        <w:t xml:space="preserve">Hope appears frequently in mental health content on Instagram, yet it is often treated as one instance of general positivity rather than as a distinct discursive construct. McCosker and Gerrard (2021) examined hashtag practices around #depressed on Instagram and developed a hashtag practice approach that moves beyond single-tag sampling. Their method incorporates adjacent posts, collocated hashtags, and the interplay of visual content, captions, and profile management. The analysis shows that only a minority of posts tagged with #depressed explicitly convey the embodied experience of depression. Many posts instead rely on aesthetic and memetic practices, careful modulation of visibility, and recovery-oriented framing. Users often code their posts in ways that negotiate identification with depression while still signalling struggle or recovery. This work establishes that hopeful and recovery-oriented forms of engagement are present on the platform, but they sit inside a wider and more heterogeneous set of practices than earlier research assumed.</w:t>
-      </w:r>
-      <w:r>
-        <w:rPr>
-          <w:rFonts w:ascii="Georgia" w:hAnsi="Georgia" w:eastAsia="Georgia" w:cs="Georgia"/>
-          <w:rtl w:val="0"/>
-        </w:rPr>
-      </w:r>
-    </w:p>
-    <w:p>
-      <w:pPr>
-        <w:spacing w:line="480" w:lineRule="auto"/>
+        <w:t xml:space="preserve">Despite these advances, three linked gaps remain. First, few studies apply a discourse-analytic lens to the specific lexical and grammatical strategies through which short Instagram advocacy captions construct hope and empowerment as discursive orientations. Existing work tends to code content for sentiment, theme, or recovery orientation. It does not systematically track modality, directive structures, person reference, or other grammatical resources that build future-oriented possibility and agentive stance. Second, comment language is still rarely examined as structured response to those caption strategies. Most analyses treat comments as engagement metrics or broad support types rather than as linguistic alignments with the hope and empowerment work of the original post. Third, platform-specific discourse analysis of mental health advocacy on Instagram remains thinner than parallel work on Twitter and peer-support forums, even though Instagram is a primary site for visual and caption-based advocacy among young audiences.</w:t>
+      </w:r>
+      <w:r>
+        <w:rPr>
+          <w:rFonts w:ascii="Georgia" w:hAnsi="Georgia" w:eastAsia="Georgia" w:cs="Georgia"/>
+          <w:rtl w:val="0"/>
+        </w:rPr>
+      </w:r>
+    </w:p>
+    <w:p>
+      <w:pPr>
+        <w:spacing w:line="480" w:lineRule="auto" w:before="0" w:after="0"/>
         <w:ind w:firstLine="720"/>
         <w:jc w:val="both"/>
         <w:rPr/>
@@ -1014,18 +1334,18 @@
           <w:szCs w:val="22"/>
           <w:rtl w:val="0"/>
         </w:rPr>
-        <w:t xml:space="preserve">Lindgren and Johansson (2023) analyzed 600 Instagram posts that used mental health related hashtags and examined how support practices relate to the platform’s perceptible affordances. They found that 61 percent of the posts were recovery oriented. These posts typically presented casual snapshots of individual progress and aligned with broader discourses of positive thinking and individual responsibility. Motivational picture quotes formed a notable negotiated use. They appeared in about 10 percent of the coded images and functioned as standardized messages of hope and fighting spirit. Comments on such posts often shifted from person-centred praise toward a shared sense of struggle and encouragement. The study shows that Instagram privileges recovery-oriented visual narratives, yet users also adapt the platform’s features to circulate collective messages of hope. Hope in this material is not only a private feeling. It is publicly performed through recurring visual and textual forms that invite affiliation.</w:t>
-      </w:r>
-      <w:r>
-        <w:rPr>
-          <w:rFonts w:ascii="Georgia" w:hAnsi="Georgia" w:eastAsia="Georgia" w:cs="Georgia"/>
-          <w:rtl w:val="0"/>
-        </w:rPr>
-      </w:r>
-    </w:p>
-    <w:p>
-      <w:pPr>
-        <w:spacing w:line="480" w:lineRule="auto"/>
+        <w:t xml:space="preserve">Koteyko and Atanasova (2018) demonstrate the value of discourse-analytic approaches for mental health advocacy on social media. Their focus on Twitter positioning and multimodal interaction, however, differs from this study’s concern with hope and empowerment construction inside Instagram captions and with the linguistic features of public comment responses. Naslund et al. (2016) document the growth of peer support on social media but do not analyze the grammar of advocacy captions. The present study addresses the gap by pairing Positive Discourse Analysis with an adapted support typology. It examines both caption strategies and comment patterns within a contemporary corpus of public Instagram mental health advocacy posts published from September 2024 through December 2025, with preference for 2025.</w:t>
+      </w:r>
+      <w:r>
+        <w:rPr>
+          <w:rFonts w:ascii="Georgia" w:hAnsi="Georgia" w:eastAsia="Georgia" w:cs="Georgia"/>
+          <w:rtl w:val="0"/>
+        </w:rPr>
+      </w:r>
+    </w:p>
+    <w:p>
+      <w:pPr>
+        <w:spacing w:line="480" w:lineRule="auto" w:before="0" w:after="0"/>
         <w:ind w:firstLine="720"/>
         <w:jc w:val="both"/>
         <w:rPr/>
@@ -1037,461 +1357,151 @@
           <w:szCs w:val="22"/>
           <w:rtl w:val="0"/>
         </w:rPr>
-        <w:t xml:space="preserve">Beelen and Karsay (2024) tested whether hopeful mental health posts on Instagram actually raise hope and related outcomes. They conducted a 2 by 2 between-subjects experiment with 479 young adults and manipulated message type (hope message versus control) and endorsement level (high versus low likes). Drawing on appraisal theory and spillover effects, they expected hope messages to increase subsequent hope and life satisfaction, reduce stigma, and raise willingness to disclose and to offer support. The pre-registered analysis found no significant main or interaction effects in the predicted direction. Exposure to hopeful Instagram posts did not reliably produce the anticipated gains. The finding is important for the present study. Hope content is common on the platform, and recovery-oriented forms are frequent, yet the linguistic and multimodal strategies that construct hope still require close analysis. Audience effects cannot be assumed from the presence of hopeful framing alone.</w:t>
-      </w:r>
-      <w:r>
-        <w:rPr>
-          <w:rFonts w:ascii="Georgia" w:hAnsi="Georgia" w:eastAsia="Georgia" w:cs="Georgia"/>
-          <w:rtl w:val="0"/>
-        </w:rPr>
-      </w:r>
-    </w:p>
-    <w:p>
-      <w:pPr>
-        <w:spacing w:line="480" w:lineRule="auto"/>
+        <w:t xml:space="preserve">Eligible posts are those published from September 2024 through December 2025. Preference is given to 2025 posts. Posts from September to December 2024 are included only when a page does not supply enough eligible 2025 captions to meet the per-page range. The window is chosen to capture contemporary Instagram mental health advocacy discourse and to match the practical reach of chronological scrolling on active pages. Years are not compared. This design keeps analytical depth feasible for undergraduate qualitative research while situating the corpus in a recent period when mental health talk on Instagram is both visible and conventionalized.</w:t>
+      </w:r>
+      <w:r>
+        <w:rPr>
+          <w:rFonts w:ascii="Georgia" w:hAnsi="Georgia" w:eastAsia="Georgia" w:cs="Georgia"/>
+          <w:rtl w:val="0"/>
+        </w:rPr>
+      </w:r>
+    </w:p>
+    <w:p>
+      <w:pPr>
+        <w:keepNext w:val="1"/>
+        <w:spacing w:after="720" w:before="720" w:line="480" w:lineRule="auto"/>
+        <w:jc w:val="left"/>
+        <w:rPr/>
+      </w:pPr>
+      <w:r>
+        <w:rPr>
+          <w:rFonts w:ascii="Georgia" w:hAnsi="Georgia" w:eastAsia="Georgia" w:cs="Georgia"/>
+          <w:b/>
+          <w:bCs w:val="1"/>
+          <w:i w:val="0"/>
+          <w:sz w:val="28"/>
+          <w:szCs w:val="24"/>
+          <w:rtl w:val="0"/>
+        </w:rPr>
+        <w:t xml:space="preserve">STATEMENT OF THE PROBLEM</w:t>
+      </w:r>
+      <w:r>
+        <w:rPr>
+          <w:rFonts w:ascii="Georgia" w:hAnsi="Georgia" w:eastAsia="Georgia" w:cs="Georgia"/>
+          <w:rtl w:val="0"/>
+        </w:rPr>
+      </w:r>
+    </w:p>
+    <w:p>
+      <w:pPr>
+        <w:spacing w:line="480" w:lineRule="auto" w:before="0" w:after="0"/>
         <w:ind w:firstLine="720"/>
         <w:jc w:val="both"/>
-        <w:rPr/>
-      </w:pPr>
-      <w:r>
-        <w:rPr>
-          <w:rFonts w:ascii="Georgia" w:hAnsi="Georgia" w:eastAsia="Georgia" w:cs="Georgia"/>
-          <w:sz w:val="22"/>
-          <w:szCs w:val="22"/>
-          <w:rtl w:val="0"/>
-        </w:rPr>
-        <w:t xml:space="preserve">Taken together, these studies move the discussion beyond general positivity. They show that hope and recovery language circulate widely on Instagram, that users actively shape how such messages appear, and that the effects of hopeful posts on audiences are not automatic. What remains under-examined is the specific lexical and grammatical work through which short advocacy captions construct hope and empowerment as discursive orientations. That gap motivates the present study’s focus on caption strategies and on the linguistic features of public comment responses.</w:t>
-      </w:r>
-      <w:r>
-        <w:rPr>
-          <w:rFonts w:ascii="Georgia" w:hAnsi="Georgia" w:eastAsia="Georgia" w:cs="Georgia"/>
-          <w:rtl w:val="0"/>
-        </w:rPr>
-      </w:r>
-    </w:p>
-    <w:p>
-      <w:pPr>
-        <w:spacing w:line="480" w:lineRule="auto"/>
-        <w:ind w:firstLine="720"/>
-        <w:jc w:val="both"/>
-        <w:rPr/>
-      </w:pPr>
-      <w:r>
-        <w:rPr>
-          <w:rFonts w:ascii="Georgia" w:hAnsi="Georgia" w:eastAsia="Georgia" w:cs="Georgia"/>
-          <w:sz w:val="22"/>
-          <w:szCs w:val="22"/>
-          <w:rtl w:val="0"/>
-        </w:rPr>
-        <w:t xml:space="preserve">Empowerment is the second discursive orientation named in this study, yet it has received less direct attention in Instagram mental health research than hope. In health and advocacy discourse, empowerment is typically linked to agency, voice, and the capacity to act on one’s own behalf. Positive Discourse Analysis treats such agency as a central concern. It asks how language positions readers as capable actors rather than as passive recipients of care (Martin, 2004; Macgilchrist, 2007). On social media, empowerment often appears through second-person address, directive structures, and invitations to share, seek help, or reframe experience. These features are visible in recovery-oriented and advocacy captions, but few studies isolate empowerment as a lexical and grammatical construct in the same way that recent work has begun to isolate hope. The present study therefore examines hope construction and empowerment language as paired orientations within the same caption corpus.</w:t>
-      </w:r>
-      <w:r>
-        <w:rPr>
-          <w:rFonts w:ascii="Georgia" w:hAnsi="Georgia" w:eastAsia="Georgia" w:cs="Georgia"/>
-          <w:rtl w:val="0"/>
-        </w:rPr>
-      </w:r>
-    </w:p>
-    <w:p>
-      <w:pPr>
-        <w:keepNext w:val="1"/>
-        <w:spacing w:after="480" w:before="480" w:line="480" w:lineRule="auto"/>
-        <w:jc w:val="left"/>
-        <w:rPr/>
-      </w:pPr>
-      <w:r>
-        <w:rPr>
-          <w:rFonts w:ascii="Georgia" w:hAnsi="Georgia" w:eastAsia="Georgia" w:cs="Georgia"/>
-          <w:i w:val="1"/>
-          <w:iCs w:val="1"/>
-          <w:sz w:val="24"/>
-          <w:szCs w:val="24"/>
-          <w:rtl w:val="0"/>
-        </w:rPr>
-        <w:t xml:space="preserve">Comment Response Patterns in Digital Support Spaces</w:t>
-      </w:r>
-      <w:r>
-        <w:rPr>
-          <w:rFonts w:ascii="Georgia" w:hAnsi="Georgia" w:eastAsia="Georgia" w:cs="Georgia"/>
-          <w:rtl w:val="0"/>
-        </w:rPr>
-      </w:r>
-    </w:p>
-    <w:p>
-      <w:pPr>
-        <w:spacing w:line="480" w:lineRule="auto"/>
-        <w:ind w:firstLine="720"/>
-        <w:jc w:val="both"/>
-        <w:rPr/>
-      </w:pPr>
-      <w:r>
-        <w:rPr>
-          <w:rFonts w:ascii="Georgia" w:hAnsi="Georgia" w:eastAsia="Georgia" w:cs="Georgia"/>
-          <w:i w:val="0"/>
-          <w:iCs w:val="0"/>
-          <w:sz w:val="22"/>
-          <w:szCs w:val="22"/>
-          <w:rtl w:val="0"/>
-        </w:rPr>
-        <w:t xml:space="preserve">Audience responses to mental health content follow recognizable linguistic patterns. Chang (2009) examined the full sequences of supportive interactions in the PTT psychosis support group in Taiwan over a two-and-a-half-year period. Using a network approach, she mapped how four support types moved through the community: informational support, emotional support, esteem support, and network support. In that specific board the most exchanged types were information and network links. The overall network was sparse and highly centralized, with most exchanges occurring at the dyadic or triadic level. The finding matters because it shows that support type frequency is not universal. It varies with the platform, the illness community, and the structure of interaction.</w:t>
-      </w:r>
-      <w:r>
-        <w:rPr>
-          <w:rFonts w:ascii="Georgia" w:hAnsi="Georgia" w:eastAsia="Georgia" w:cs="Georgia"/>
-          <w:rtl w:val="0"/>
-        </w:rPr>
-      </w:r>
-    </w:p>
-    <w:p>
-      <w:pPr>
-        <w:spacing w:line="480" w:lineRule="auto"/>
-        <w:ind w:firstLine="720"/>
-        <w:jc w:val="both"/>
-        <w:rPr/>
-      </w:pPr>
-      <w:r>
-        <w:rPr>
-          <w:rFonts w:ascii="Georgia" w:hAnsi="Georgia" w:eastAsia="Georgia" w:cs="Georgia"/>
-          <w:i w:val="0"/>
-          <w:iCs w:val="0"/>
-          <w:sz w:val="22"/>
-          <w:szCs w:val="22"/>
-          <w:rtl w:val="0"/>
-        </w:rPr>
-        <w:t xml:space="preserve">Later large-scale work on public mental health forums paints a different picture of what dominates. Kim et al. (2023) collected supporting comments and their target posts from 55 Reddit mental health communities. They trained a deep-learning model to score each comment for informational support and emotional support. The results show that supporters tend to give emotional support more often than informational support. The atmosphere of those communities is also emotional. Heavily supportive users, those with high out-degree in the social supporting network, were more likely to offer informational support with diverse content. Users who attracted large volumes of support tended to post multiple similar requests over time. The study therefore separates the typical emotional climate of peer replies from the more informational style of a smaller set of highly active supporters.</w:t>
-      </w:r>
-      <w:r>
-        <w:rPr>
-          <w:rFonts w:ascii="Georgia" w:hAnsi="Georgia" w:eastAsia="Georgia" w:cs="Georgia"/>
-          <w:rtl w:val="0"/>
-        </w:rPr>
-      </w:r>
-    </w:p>
-    <w:p>
-      <w:pPr>
-        <w:spacing w:line="480" w:lineRule="auto"/>
-        <w:ind w:firstLine="720"/>
-        <w:jc w:val="both"/>
-        <w:rPr/>
-      </w:pPr>
-      <w:r>
-        <w:rPr>
-          <w:rFonts w:ascii="Georgia" w:hAnsi="Georgia" w:eastAsia="Georgia" w:cs="Georgia"/>
-          <w:i w:val="0"/>
-          <w:iCs w:val="0"/>
-          <w:sz w:val="22"/>
-          <w:szCs w:val="22"/>
-          <w:rtl w:val="0"/>
-        </w:rPr>
-        <w:t xml:space="preserve">Myrick et al. (2015) addressed the problem of classifying support in open, character-limited social media. They proposed a typology that crosses support type (informational or emotional) with direction (expression or reception) and applied it to two years of tweets under the hashtag #stupidcancer. The analysis shows that even short public messages still carry clear support functions. Information giving and link providing appear as expression of informational support. Encouragement, empathy, and religious statements appear as expression of emotional support. Giving thanks functions as reception of emotional support. The typology is useful here because Instagram comments share the same constraints of brevity and public visibility that Twitter posts faced in that study.</w:t>
-      </w:r>
-      <w:r>
-        <w:rPr>
-          <w:rFonts w:ascii="Georgia" w:hAnsi="Georgia" w:eastAsia="Georgia" w:cs="Georgia"/>
-          <w:rtl w:val="0"/>
-        </w:rPr>
-      </w:r>
-    </w:p>
-    <w:p>
-      <w:pPr>
-        <w:spacing w:line="480" w:lineRule="auto"/>
-        <w:ind w:firstLine="720"/>
-        <w:jc w:val="both"/>
-        <w:rPr/>
-      </w:pPr>
-      <w:r>
-        <w:rPr>
-          <w:rFonts w:ascii="Georgia" w:hAnsi="Georgia" w:eastAsia="Georgia" w:cs="Georgia"/>
-          <w:i w:val="0"/>
-          <w:iCs w:val="0"/>
-          <w:sz w:val="22"/>
-          <w:szCs w:val="22"/>
-          <w:rtl w:val="0"/>
-        </w:rPr>
-        <w:t xml:space="preserve">Wang (2025) analyzed 150 top-ranked posts from Weibo’s Depression Super Topic under the same three-type framework of emotional, informational, and instrumental support. Support-seeking posts far outnumbered support-providing posts. Emotional support requests accounted for the large majority of seeking behavior. Instrumental support provision was entirely absent. The pattern aligns with cultural observations that Chinese users often seek empathy and validation rather than concrete advice or material help in quasi-public depression spaces. Taken together, these studies show that emotional and network-oriented replies are common across platforms, yet the exact balance of support types shifts with community norms, platform affordances, and cultural context.</w:t>
-      </w:r>
-      <w:r>
-        <w:rPr>
-          <w:rFonts w:ascii="Georgia" w:hAnsi="Georgia" w:eastAsia="Georgia" w:cs="Georgia"/>
-          <w:rtl w:val="0"/>
-        </w:rPr>
-      </w:r>
-    </w:p>
-    <w:p>
-      <w:pPr>
-        <w:spacing w:line="480" w:lineRule="auto"/>
-        <w:ind w:firstLine="720"/>
-        <w:jc w:val="both"/>
-        <w:rPr/>
-      </w:pPr>
-      <w:r>
-        <w:rPr>
-          <w:rFonts w:ascii="Georgia" w:hAnsi="Georgia" w:eastAsia="Georgia" w:cs="Georgia"/>
-          <w:i w:val="0"/>
-          <w:iCs w:val="0"/>
-          <w:sz w:val="22"/>
-          <w:szCs w:val="22"/>
-          <w:rtl w:val="0"/>
-        </w:rPr>
-        <w:t xml:space="preserve">Most existing analyses still treat comments mainly as sentiment scores or engagement metrics rather than as structured linguistic responses. Naslund et al. (2016) review the broader evidence that people with serious mental illness turn to social media for peer connection. They report gains in social connectedness, group belonging, and the sharing of coping strategies, alongside the potential to challenge stigma and offer hope. The review remains a perspective piece rather than a linguistic analysis of comment form. This study addresses the resulting gap by applying a focused adaptation of Chang’s (2009) typology to Instagram advocacy comments. Emotional and esteem support are collapsed into a single “supportive lexicon” category. Network support is operationalized as “personal narrative framing.” Informational support is excluded from the primary analysis because it appears markedly less often in the comment sections of public advocacy pages. The adaptation fits the short, public, and algorithmically ranked nature of Instagram comments. Identifying the linguistic features of these comment responses is central to the second research question. It extends existing digital discourse work by treating comment sections as linguistically structured texts rather than mere engagement data. The third research question then draws on both caption and comment findings to describe the collective discursive construction of positive mental health meanings in Instagram advocacy spaces.</w:t>
-      </w:r>
-      <w:r>
-        <w:rPr>
-          <w:rFonts w:ascii="Georgia" w:hAnsi="Georgia" w:eastAsia="Georgia" w:cs="Georgia"/>
-          <w:rtl w:val="0"/>
-        </w:rPr>
-      </w:r>
-    </w:p>
-    <w:p>
-      <w:pPr>
-        <w:keepNext w:val="1"/>
-        <w:spacing w:after="480" w:before="480" w:line="480" w:lineRule="auto"/>
-        <w:jc w:val="left"/>
-        <w:rPr/>
-      </w:pPr>
-      <w:r>
-        <w:rPr>
-          <w:rFonts w:ascii="Georgia" w:hAnsi="Georgia" w:eastAsia="Georgia" w:cs="Georgia"/>
-          <w:i w:val="1"/>
-          <w:iCs w:val="1"/>
-          <w:sz w:val="24"/>
-          <w:szCs w:val="24"/>
-          <w:rtl w:val="0"/>
-        </w:rPr>
-        <w:t xml:space="preserve">Research Gap and Rationale</w:t>
-      </w:r>
-      <w:r>
-        <w:rPr>
-          <w:rFonts w:ascii="Georgia" w:hAnsi="Georgia" w:eastAsia="Georgia" w:cs="Georgia"/>
-          <w:rtl w:val="0"/>
-        </w:rPr>
-      </w:r>
-    </w:p>
-    <w:p>
-      <w:pPr>
-        <w:spacing w:line="480" w:lineRule="auto"/>
-        <w:ind w:firstLine="720"/>
-        <w:jc w:val="both"/>
-        <w:rPr/>
-      </w:pPr>
-      <w:r>
-        <w:rPr>
-          <w:rFonts w:ascii="Georgia" w:hAnsi="Georgia" w:eastAsia="Georgia" w:cs="Georgia"/>
-          <w:sz w:val="22"/>
-          <w:szCs w:val="22"/>
-          <w:rtl w:val="0"/>
-        </w:rPr>
-        <w:t xml:space="preserve">The literature reviewed above establishes several clear findings. Mental health content on Instagram is predominantly positive in tone and draws high engagement when it uses motivational framing and recovery-oriented visuals (Wu &amp; Hong, 2022; Koinig, 2022; Lindgren &amp; Johansson, 2023). Hope appears as a recurring theme in recovery-oriented posts and in experimental tests of hopeful messages, yet exposure alone does not reliably increase hope or reduce stigma (Beelen &amp; Karsay, 2024; McCosker &amp; Gerrard, 2021). Audience comments in digital support spaces follow recognizable patterns of informational and emotional support, personal narrative, and, less often, network-oriented replies (Chang, 2009; Kim et al., 2023; Myrick et al., 2015; Wang, 2025). Positive Discourse Analysis supplies a theoretical frame for studying how language constructs optimism and agency rather than only documenting deficit (Martin, 2004; Macgilchrist, 2007).</w:t>
-      </w:r>
-      <w:r>
-        <w:rPr>
-          <w:rFonts w:ascii="Georgia" w:hAnsi="Georgia" w:eastAsia="Georgia" w:cs="Georgia"/>
-          <w:rtl w:val="0"/>
-        </w:rPr>
-      </w:r>
-    </w:p>
-    <w:p>
-      <w:pPr>
-        <w:spacing w:line="480" w:lineRule="auto"/>
-        <w:ind w:firstLine="720"/>
-        <w:jc w:val="both"/>
-        <w:rPr/>
-      </w:pPr>
-      <w:r>
-        <w:rPr>
-          <w:rFonts w:ascii="Georgia" w:hAnsi="Georgia" w:eastAsia="Georgia" w:cs="Georgia"/>
-          <w:sz w:val="22"/>
-          <w:szCs w:val="22"/>
-          <w:rtl w:val="0"/>
-        </w:rPr>
-        <w:t xml:space="preserve">Despite these advances, three linked gaps remain. First, few studies apply a discourse-analytic lens to the specific lexical and grammatical strategies through which short Instagram advocacy captions construct hope and empowerment as discursive orientations. Existing work tends to code content for sentiment, theme, or recovery orientation. It does not systematically track modality, directive structures, person reference, or other grammatical resources that build future-oriented possibility and agentive stance. Second, comment language is still rarely examined as structured response to those caption strategies. Most analyses treat comments as engagement metrics or broad support types rather than as linguistic alignments with the hope and empowerment work of the original post. Third, platform-specific discourse analysis of mental health advocacy on Instagram remains thinner than parallel work on Twitter and peer-support forums, even though Instagram is a primary site for visual and caption-based advocacy among young audiences.</w:t>
-      </w:r>
-      <w:r>
-        <w:rPr>
-          <w:rFonts w:ascii="Georgia" w:hAnsi="Georgia" w:eastAsia="Georgia" w:cs="Georgia"/>
-          <w:rtl w:val="0"/>
-        </w:rPr>
-      </w:r>
-    </w:p>
-    <w:p>
-      <w:pPr>
-        <w:spacing w:line="480" w:lineRule="auto"/>
-        <w:ind w:firstLine="720"/>
-        <w:jc w:val="both"/>
-        <w:rPr/>
-      </w:pPr>
-      <w:r>
-        <w:rPr>
-          <w:rFonts w:ascii="Georgia" w:hAnsi="Georgia" w:eastAsia="Georgia" w:cs="Georgia"/>
-          <w:sz w:val="22"/>
-          <w:szCs w:val="22"/>
-          <w:rtl w:val="0"/>
-        </w:rPr>
-        <w:t xml:space="preserve">Koteyko and Atanasova (2018) demonstrate the value of discourse-analytic approaches for mental health advocacy on social media. Their focus on Twitter positioning and multimodal interaction, however, differs from this study’s concern with hope and empowerment construction inside Instagram captions and with the linguistic features of public comment responses. Naslund et al. (2016) document the growth of peer support on social media but do not analyze the grammar of advocacy captions. The present study addresses the gap by pairing Positive Discourse Analysis with an adapted support typology. It examines both caption strategies and comment patterns within a contemporary corpus of public Instagram mental health advocacy posts published from September 2024 through December 2025, with preference for 2025.</w:t>
-      </w:r>
-      <w:r>
-        <w:rPr>
-          <w:rFonts w:ascii="Georgia" w:hAnsi="Georgia" w:eastAsia="Georgia" w:cs="Georgia"/>
-          <w:rtl w:val="0"/>
-        </w:rPr>
-      </w:r>
-    </w:p>
-    <w:p>
-      <w:pPr>
-        <w:spacing w:line="480" w:lineRule="auto"/>
-        <w:ind w:firstLine="720"/>
-        <w:jc w:val="both"/>
-        <w:rPr/>
-      </w:pPr>
-      <w:r>
-        <w:rPr>
-          <w:rFonts w:ascii="Georgia" w:hAnsi="Georgia" w:eastAsia="Georgia" w:cs="Georgia"/>
-          <w:sz w:val="22"/>
-          <w:szCs w:val="22"/>
-          <w:rtl w:val="0"/>
-        </w:rPr>
-        <w:t xml:space="preserve">Eligible posts are those published from September 2024 through December 2025. Preference is given to 2025 posts. Posts from September to December 2024 are included only when a page does not supply enough eligible 2025 captions to meet the per-page range. The window is chosen to capture contemporary Instagram mental health advocacy discourse and to match the practical reach of chronological scrolling on active pages. Years are not compared. This design keeps analytical depth feasible for undergraduate qualitative research while situating the corpus in a recent period when mental health talk on Instagram is both visible and conventionalized.</w:t>
-      </w:r>
-      <w:r>
-        <w:rPr>
-          <w:rFonts w:ascii="Georgia" w:hAnsi="Georgia" w:eastAsia="Georgia" w:cs="Georgia"/>
-          <w:rtl w:val="0"/>
-        </w:rPr>
-      </w:r>
-    </w:p>
-    <w:p>
-      <w:pPr>
-        <w:keepNext w:val="1"/>
-        <w:spacing w:after="480" w:before="480" w:line="480" w:lineRule="auto"/>
-        <w:jc w:val="left"/>
-        <w:rPr/>
-      </w:pPr>
-      <w:r>
-        <w:rPr>
-          <w:rFonts w:ascii="Georgia" w:hAnsi="Georgia" w:eastAsia="Georgia" w:cs="Georgia"/>
+        <w:rPr>
           <w:b w:val="1"/>
           <w:bCs w:val="1"/>
-          <w:sz w:val="24"/>
+          <w:sz w:val="22"/>
+          <w:szCs w:val="22"/>
+        </w:rPr>
+      </w:pPr>
+      <w:r>
+        <w:rPr>
+          <w:rFonts w:ascii="Georgia" w:hAnsi="Georgia" w:eastAsia="Georgia" w:cs="Georgia"/>
+          <w:sz w:val="22"/>
+          <w:rtl w:val="0"/>
+        </w:rPr>
+        <w:t xml:space="preserve">This study examines how mental health advocacy pages on Instagram employ lexical and grammatical strategies to construct hope and empowerment in captions, and how public comments respond to those strategies. Specifically, it aims to answer the following questions:</w:t>
+      </w:r>
+      <w:r>
+        <w:rPr>
+          <w:rFonts w:ascii="Georgia" w:hAnsi="Georgia" w:eastAsia="Georgia" w:cs="Georgia"/>
+          <w:rtl w:val="0"/>
+        </w:rPr>
+      </w:r>
+    </w:p>
+    <w:p>
+      <w:pPr>
+        <w:spacing w:line="480" w:lineRule="auto" w:before="0" w:after="0"/>
+        <w:jc w:val="both"/>
+        <w:rPr/>
+      </w:pPr>
+      <w:r>
+        <w:rPr>
+          <w:rFonts w:ascii="Georgia" w:hAnsi="Georgia" w:eastAsia="Georgia" w:cs="Georgia"/>
+          <w:sz w:val="22"/>
+          <w:szCs w:val="22"/>
+          <w:rtl w:val="0"/>
+        </w:rPr>
+        <w:t xml:space="preserve">1. What are the lexical and grammatical features on Instagram captions construct hope and empowerment?</w:t>
+      </w:r>
+      <w:r>
+        <w:rPr>
+          <w:rFonts w:ascii="Georgia" w:hAnsi="Georgia" w:eastAsia="Georgia" w:cs="Georgia"/>
+          <w:rtl w:val="0"/>
+        </w:rPr>
+      </w:r>
+    </w:p>
+    <w:p>
+      <w:pPr>
+        <w:spacing w:line="480" w:lineRule="auto" w:before="0" w:after="0"/>
+        <w:jc w:val="both"/>
+        <w:rPr/>
+      </w:pPr>
+      <w:r>
+        <w:rPr>
+          <w:rFonts w:ascii="Georgia" w:hAnsi="Georgia" w:eastAsia="Georgia" w:cs="Georgia"/>
+          <w:sz w:val="22"/>
+          <w:szCs w:val="22"/>
+          <w:rtl w:val="0"/>
+        </w:rPr>
+        <w:t xml:space="preserve">2. What linguistic features characterize public comment responses to hope- and empowerment-oriented captions in Instagram mental health advocacy posts?</w:t>
+      </w:r>
+      <w:r>
+        <w:rPr>
+          <w:rFonts w:ascii="Georgia" w:hAnsi="Georgia" w:eastAsia="Georgia" w:cs="Georgia"/>
+          <w:rtl w:val="0"/>
+        </w:rPr>
+      </w:r>
+    </w:p>
+    <w:p>
+      <w:pPr>
+        <w:spacing w:line="480" w:lineRule="auto" w:before="0" w:after="0"/>
+        <w:jc w:val="both"/>
+        <w:rPr/>
+      </w:pPr>
+      <w:r>
+        <w:rPr>
+          <w:rFonts w:ascii="Georgia" w:hAnsi="Georgia" w:eastAsia="Georgia" w:cs="Georgia"/>
+          <w:sz w:val="22"/>
+          <w:szCs w:val="22"/>
+          <w:rtl w:val="0"/>
+        </w:rPr>
+        <w:t xml:space="preserve">3. What do the identified caption and comment patterns, taken together, reveal about how positive mental health meanings are discursively constructed in Instagram advocacy spaces?</w:t>
+      </w:r>
+      <w:r>
+        <w:rPr>
+          <w:rFonts w:ascii="Georgia" w:hAnsi="Georgia" w:eastAsia="Georgia" w:cs="Georgia"/>
+          <w:rtl w:val="0"/>
+        </w:rPr>
+      </w:r>
+    </w:p>
+    <w:p>
+      <w:pPr>
+        <w:keepNext w:val="1"/>
+        <w:spacing w:after="720" w:before="720" w:line="480" w:lineRule="auto"/>
+        <w:jc w:val="left"/>
+        <w:rPr/>
+      </w:pPr>
+      <w:r>
+        <w:rPr>
+          <w:rFonts w:ascii="Georgia" w:hAnsi="Georgia" w:eastAsia="Georgia" w:cs="Georgia"/>
+          <w:b/>
+          <w:bCs w:val="1"/>
+          <w:i w:val="0"/>
+          <w:sz w:val="28"/>
           <w:szCs w:val="24"/>
           <w:rtl w:val="0"/>
         </w:rPr>
-        <w:t xml:space="preserve">STATEMENT OF THE PROBLEM</w:t>
-      </w:r>
-      <w:r>
-        <w:rPr>
-          <w:rFonts w:ascii="Georgia" w:hAnsi="Georgia" w:eastAsia="Georgia" w:cs="Georgia"/>
-          <w:rtl w:val="0"/>
-        </w:rPr>
-      </w:r>
-    </w:p>
-    <w:p>
-      <w:pPr>
-        <w:spacing w:line="480" w:lineRule="auto"/>
-        <w:ind w:firstLine="720"/>
-        <w:jc w:val="both"/>
-        <w:rPr>
-          <w:b w:val="1"/>
-          <w:bCs w:val="1"/>
-          <w:sz w:val="22"/>
-          <w:szCs w:val="22"/>
-        </w:rPr>
-      </w:pPr>
-      <w:r>
-        <w:rPr>
-          <w:rFonts w:ascii="Georgia" w:hAnsi="Georgia" w:eastAsia="Georgia" w:cs="Georgia"/>
-          <w:rtl w:val="0"/>
-        </w:rPr>
-        <w:t xml:space="preserve">This study examines how mental health advocacy pages on Instagram employ lexical and grammatical strategies to construct hope and empowerment in captions, and how public comments respond to those strategies. Specifically, it aims to answer the following questions:</w:t>
-      </w:r>
-      <w:r>
-        <w:rPr>
-          <w:rFonts w:ascii="Georgia" w:hAnsi="Georgia" w:eastAsia="Georgia" w:cs="Georgia"/>
-          <w:rtl w:val="0"/>
-        </w:rPr>
-      </w:r>
-    </w:p>
-    <w:p>
-      <w:pPr>
-        <w:spacing w:line="480" w:lineRule="auto"/>
-        <w:jc w:val="both"/>
-        <w:rPr/>
-      </w:pPr>
-      <w:r>
-        <w:rPr>
-          <w:rFonts w:ascii="Georgia" w:hAnsi="Georgia" w:eastAsia="Georgia" w:cs="Georgia"/>
-          <w:sz w:val="22"/>
-          <w:szCs w:val="22"/>
-          <w:rtl w:val="0"/>
-        </w:rPr>
-        <w:t xml:space="preserve">1. What are the lexical and grammatical features on Instagram captions construct hope and empowerment?</w:t>
-      </w:r>
-      <w:r>
-        <w:rPr>
-          <w:rFonts w:ascii="Georgia" w:hAnsi="Georgia" w:eastAsia="Georgia" w:cs="Georgia"/>
-          <w:rtl w:val="0"/>
-        </w:rPr>
-      </w:r>
-    </w:p>
-    <w:p>
-      <w:pPr>
-        <w:spacing w:line="480" w:lineRule="auto"/>
-        <w:jc w:val="both"/>
-        <w:rPr/>
-      </w:pPr>
-      <w:r>
-        <w:rPr>
-          <w:rFonts w:ascii="Georgia" w:hAnsi="Georgia" w:eastAsia="Georgia" w:cs="Georgia"/>
-          <w:sz w:val="22"/>
-          <w:szCs w:val="22"/>
-          <w:rtl w:val="0"/>
-        </w:rPr>
-        <w:t xml:space="preserve">2. What linguistic features characterize public comment responses to hope- and empowerment-oriented captions in Instagram mental health advocacy posts?</w:t>
-      </w:r>
-      <w:r>
-        <w:rPr>
-          <w:rFonts w:ascii="Georgia" w:hAnsi="Georgia" w:eastAsia="Georgia" w:cs="Georgia"/>
-          <w:rtl w:val="0"/>
-        </w:rPr>
-      </w:r>
-    </w:p>
-    <w:p>
-      <w:pPr>
-        <w:spacing w:line="480" w:lineRule="auto"/>
-        <w:jc w:val="both"/>
-        <w:rPr/>
-      </w:pPr>
-      <w:r>
-        <w:rPr>
-          <w:rFonts w:ascii="Georgia" w:hAnsi="Georgia" w:eastAsia="Georgia" w:cs="Georgia"/>
-          <w:sz w:val="22"/>
-          <w:szCs w:val="22"/>
-          <w:rtl w:val="0"/>
-        </w:rPr>
-        <w:t xml:space="preserve">3. What do the identified caption and comment patterns, taken together, reveal about how positive mental health meanings are discursively constructed in Instagram advocacy spaces?</w:t>
-      </w:r>
-      <w:r>
-        <w:rPr>
-          <w:rFonts w:ascii="Georgia" w:hAnsi="Georgia" w:eastAsia="Georgia" w:cs="Georgia"/>
-          <w:rtl w:val="0"/>
-        </w:rPr>
-      </w:r>
-    </w:p>
-    <w:p>
-      <w:pPr>
-        <w:keepNext w:val="1"/>
-        <w:spacing w:after="480" w:before="480" w:line="480" w:lineRule="auto"/>
-        <w:jc w:val="left"/>
-        <w:rPr/>
-      </w:pPr>
-      <w:r>
-        <w:rPr>
-          <w:rFonts w:ascii="Georgia" w:hAnsi="Georgia" w:eastAsia="Georgia" w:cs="Georgia"/>
-          <w:b w:val="1"/>
-          <w:bCs w:val="1"/>
-          <w:sz w:val="24"/>
-          <w:szCs w:val="24"/>
-          <w:rtl w:val="0"/>
-        </w:rPr>
         <w:t xml:space="preserve">RESEARCH FRAMEWORK</w:t>
       </w:r>
       <w:r>
@@ -1503,7 +1513,7 @@
     </w:p>
     <w:p>
       <w:pPr>
-        <w:spacing w:line="480" w:lineRule="auto"/>
+        <w:spacing w:line="480" w:lineRule="auto" w:before="0" w:after="0"/>
         <w:ind w:firstLine="720"/>
         <w:jc w:val="both"/>
         <w:rPr/>
@@ -1558,8 +1568,9 @@
       <w:r>
         <w:rPr>
           <w:rFonts w:ascii="Georgia" w:hAnsi="Georgia" w:eastAsia="Georgia" w:cs="Georgia"/>
-          <w:b w:val="1"/>
+          <w:b/>
           <w:bCs w:val="1"/>
+          <w:i w:val="0"/>
           <w:sz w:val="22"/>
           <w:szCs w:val="22"/>
           <w:rtl w:val="0"/>
@@ -1582,6 +1593,8 @@
       <w:r>
         <w:rPr>
           <w:rFonts w:ascii="Georgia" w:hAnsi="Georgia" w:eastAsia="Georgia" w:cs="Georgia"/>
+          <w:b w:val="0"/>
+          <w:i w:val="0"/>
           <w:sz w:val="22"/>
           <w:szCs w:val="22"/>
           <w:rtl w:val="0"/>
@@ -1641,6 +1654,7 @@
             <w:r>
               <w:rPr>
                 <w:rFonts w:ascii="Georgia" w:hAnsi="Georgia" w:eastAsia="Georgia" w:cs="Georgia"/>
+                <w:sz w:val="18"/>
                 <w:rtl w:val="0"/>
               </w:rPr>
             </w:r>
@@ -1667,7 +1681,7 @@
             <w:r>
               <w:rPr>
                 <w:rFonts w:ascii="Georgia" w:hAnsi="Georgia" w:eastAsia="Georgia" w:cs="Georgia"/>
-                <w:b w:val="1"/>
+                <w:b/>
                 <w:bCs w:val="1"/>
                 <w:sz w:val="18"/>
                 <w:szCs w:val="18"/>
@@ -1678,6 +1692,7 @@
             <w:r>
               <w:rPr>
                 <w:rFonts w:ascii="Georgia" w:hAnsi="Georgia" w:eastAsia="Georgia" w:cs="Georgia"/>
+                <w:sz w:val="18"/>
                 <w:rtl w:val="0"/>
               </w:rPr>
             </w:r>
@@ -1704,7 +1719,7 @@
             <w:r>
               <w:rPr>
                 <w:rFonts w:ascii="Georgia" w:hAnsi="Georgia" w:eastAsia="Georgia" w:cs="Georgia"/>
-                <w:b w:val="1"/>
+                <w:b/>
                 <w:bCs w:val="1"/>
                 <w:sz w:val="18"/>
                 <w:szCs w:val="18"/>
@@ -1715,6 +1730,7 @@
             <w:r>
               <w:rPr>
                 <w:rFonts w:ascii="Georgia" w:hAnsi="Georgia" w:eastAsia="Georgia" w:cs="Georgia"/>
+                <w:sz w:val="18"/>
                 <w:rtl w:val="0"/>
               </w:rPr>
             </w:r>
@@ -1739,7 +1755,7 @@
             <w:r>
               <w:rPr>
                 <w:rFonts w:ascii="Georgia" w:hAnsi="Georgia" w:eastAsia="Georgia" w:cs="Georgia"/>
-                <w:b w:val="1"/>
+                <w:b/>
                 <w:bCs w:val="1"/>
                 <w:sz w:val="18"/>
                 <w:szCs w:val="18"/>
@@ -1750,6 +1766,7 @@
             <w:r>
               <w:rPr>
                 <w:rFonts w:ascii="Georgia" w:hAnsi="Georgia" w:eastAsia="Georgia" w:cs="Georgia"/>
+                <w:sz w:val="18"/>
                 <w:rtl w:val="0"/>
               </w:rPr>
             </w:r>
@@ -1816,7 +1833,7 @@
             <w:r>
               <w:rPr>
                 <w:rFonts w:ascii="Georgia" w:hAnsi="Georgia" w:eastAsia="Georgia" w:cs="Georgia"/>
-                <w:b w:val="1"/>
+                <w:b/>
                 <w:bCs w:val="1"/>
                 <w:sz w:val="18"/>
                 <w:szCs w:val="18"/>
@@ -1827,6 +1844,7 @@
             <w:r>
               <w:rPr>
                 <w:rFonts w:ascii="Georgia" w:hAnsi="Georgia" w:eastAsia="Georgia" w:cs="Georgia"/>
+                <w:sz w:val="18"/>
                 <w:rtl w:val="0"/>
               </w:rPr>
             </w:r>
@@ -1893,7 +1911,7 @@
             <w:r>
               <w:rPr>
                 <w:rFonts w:ascii="Georgia" w:hAnsi="Georgia" w:eastAsia="Georgia" w:cs="Georgia"/>
-                <w:b w:val="1"/>
+                <w:b/>
                 <w:bCs w:val="1"/>
                 <w:sz w:val="18"/>
                 <w:szCs w:val="18"/>
@@ -1904,6 +1922,7 @@
             <w:r>
               <w:rPr>
                 <w:rFonts w:ascii="Georgia" w:hAnsi="Georgia" w:eastAsia="Georgia" w:cs="Georgia"/>
+                <w:sz w:val="18"/>
                 <w:rtl w:val="0"/>
               </w:rPr>
             </w:r>
@@ -1977,7 +1996,7 @@
             <w:r>
               <w:rPr>
                 <w:rFonts w:ascii="Georgia" w:hAnsi="Georgia" w:eastAsia="Georgia" w:cs="Georgia"/>
-                <w:b w:val="1"/>
+                <w:b/>
                 <w:bCs w:val="1"/>
                 <w:sz w:val="18"/>
                 <w:szCs w:val="18"/>
@@ -1988,6 +2007,7 @@
             <w:r>
               <w:rPr>
                 <w:rFonts w:ascii="Georgia" w:hAnsi="Georgia" w:eastAsia="Georgia" w:cs="Georgia"/>
+                <w:sz w:val="18"/>
                 <w:rtl w:val="0"/>
               </w:rPr>
             </w:r>
@@ -2099,13 +2119,14 @@
         <w:rPr>
           <w:rFonts w:ascii="Georgia" w:hAnsi="Georgia" w:eastAsia="Georgia" w:cs="Georgia"/>
           <w:b w:val="0"/>
+          <w:sz w:val="22"/>
         </w:rPr>
         <w:t>Chang’s (2009) online support typology serves as the secondary framework for comment analysis. The typology categorizes supportive computer-mediated communication into four types: informational, emotional, esteem, and network support. This study adapts the typology for the Instagram advocacy context by collapsing emotional and esteem support into a single “supportive lexicon” category, operationalized through empathy markers, validation language, encouragement phrases, and second-person affirmation, and operationalizing network support as “personal narrative framing,” coded through first-person disclosure, temporal sequencing of personal experience, and connective expressions such as this resonates or I’ve been there. Informational support is excluded as it is markedly less prevalent in advocacy page comment sections. Each comment is assigned one dominant code. SUPPORTIVE LEXICON or PERSONAL NARRATIVE. using the same function-driven decision logic applied to captions (see Appendix B).</w:t>
       </w:r>
     </w:p>
     <w:p>
       <w:pPr>
-        <w:spacing w:line="480" w:lineRule="auto"/>
+        <w:spacing w:line="480" w:lineRule="auto" w:before="0" w:after="0"/>
         <w:ind w:firstLine="720"/>
         <w:jc w:val="both"/>
         <w:rPr/>
@@ -2129,16 +2150,17 @@
     <w:p>
       <w:pPr>
         <w:keepNext w:val="1"/>
-        <w:spacing w:after="480" w:before="480" w:line="480" w:lineRule="auto"/>
+        <w:spacing w:after="720" w:before="720" w:line="480" w:lineRule="auto"/>
         <w:jc w:val="left"/>
         <w:rPr/>
       </w:pPr>
       <w:r>
         <w:rPr>
           <w:rFonts w:ascii="Georgia" w:hAnsi="Georgia" w:eastAsia="Georgia" w:cs="Georgia"/>
-          <w:b w:val="1"/>
+          <w:b/>
           <w:bCs w:val="1"/>
-          <w:sz w:val="24"/>
+          <w:i w:val="0"/>
+          <w:sz w:val="28"/>
           <w:szCs w:val="24"/>
           <w:rtl w:val="0"/>
         </w:rPr>
@@ -2153,7 +2175,7 @@
     </w:p>
     <w:p>
       <w:pPr>
-        <w:spacing w:line="480" w:lineRule="auto"/>
+        <w:spacing w:line="480" w:lineRule="auto" w:before="0" w:after="0"/>
         <w:ind w:firstLine="720"/>
         <w:jc w:val="both"/>
         <w:rPr/>
@@ -2176,7 +2198,7 @@
     </w:p>
     <w:p>
       <w:pPr>
-        <w:spacing w:line="480" w:lineRule="auto"/>
+        <w:spacing w:line="480" w:lineRule="auto" w:before="0" w:after="0"/>
         <w:ind w:left="0" w:firstLine="0"/>
         <w:jc w:val="both"/>
         <w:rPr/>
@@ -2184,7 +2206,7 @@
       <w:r>
         <w:rPr>
           <w:rFonts w:ascii="Georgia" w:hAnsi="Georgia" w:eastAsia="Georgia" w:cs="Georgia"/>
-          <w:b w:val="1"/>
+          <w:b/>
           <w:bCs w:val="1"/>
           <w:sz w:val="22"/>
           <w:szCs w:val="22"/>
@@ -2210,7 +2232,7 @@
     </w:p>
     <w:p>
       <w:pPr>
-        <w:spacing w:line="480" w:lineRule="auto"/>
+        <w:spacing w:line="480" w:lineRule="auto" w:before="0" w:after="0"/>
         <w:ind w:left="0" w:firstLine="0"/>
         <w:jc w:val="both"/>
         <w:rPr/>
@@ -2218,7 +2240,7 @@
       <w:r>
         <w:rPr>
           <w:rFonts w:ascii="Georgia" w:hAnsi="Georgia" w:eastAsia="Georgia" w:cs="Georgia"/>
-          <w:b w:val="1"/>
+          <w:b/>
           <w:bCs w:val="1"/>
           <w:sz w:val="22"/>
           <w:szCs w:val="22"/>
@@ -2244,7 +2266,7 @@
     </w:p>
     <w:p>
       <w:pPr>
-        <w:spacing w:line="480" w:lineRule="auto"/>
+        <w:spacing w:line="480" w:lineRule="auto" w:before="0" w:after="0"/>
         <w:ind w:left="0" w:firstLine="0"/>
         <w:jc w:val="both"/>
         <w:rPr/>
@@ -2252,7 +2274,7 @@
       <w:r>
         <w:rPr>
           <w:rFonts w:ascii="Georgia" w:hAnsi="Georgia" w:eastAsia="Georgia" w:cs="Georgia"/>
-          <w:b w:val="1"/>
+          <w:b/>
           <w:bCs w:val="1"/>
           <w:sz w:val="22"/>
           <w:szCs w:val="22"/>
@@ -2278,7 +2300,7 @@
     </w:p>
     <w:p>
       <w:pPr>
-        <w:spacing w:line="480" w:lineRule="auto"/>
+        <w:spacing w:line="480" w:lineRule="auto" w:before="0" w:after="0"/>
         <w:ind w:left="0" w:firstLine="0"/>
         <w:jc w:val="both"/>
         <w:rPr/>
@@ -2286,7 +2308,7 @@
       <w:r>
         <w:rPr>
           <w:rFonts w:ascii="Georgia" w:hAnsi="Georgia" w:eastAsia="Georgia" w:cs="Georgia"/>
-          <w:b w:val="1"/>
+          <w:b/>
           <w:bCs w:val="1"/>
           <w:sz w:val="22"/>
           <w:szCs w:val="22"/>
@@ -2312,7 +2334,7 @@
     </w:p>
     <w:p>
       <w:pPr>
-        <w:spacing w:line="480" w:lineRule="auto"/>
+        <w:spacing w:line="480" w:lineRule="auto" w:before="0" w:after="0"/>
         <w:ind w:firstLine="720"/>
         <w:jc w:val="both"/>
         <w:rPr/>
@@ -2336,16 +2358,17 @@
     <w:p>
       <w:pPr>
         <w:keepNext w:val="1"/>
-        <w:spacing w:after="480" w:before="480" w:line="480" w:lineRule="auto"/>
+        <w:spacing w:after="720" w:before="720" w:line="480" w:lineRule="auto"/>
         <w:jc w:val="left"/>
         <w:rPr/>
       </w:pPr>
       <w:r>
         <w:rPr>
           <w:rFonts w:ascii="Georgia" w:hAnsi="Georgia" w:eastAsia="Georgia" w:cs="Georgia"/>
-          <w:b w:val="1"/>
+          <w:b/>
           <w:bCs w:val="1"/>
-          <w:sz w:val="24"/>
+          <w:i w:val="0"/>
+          <w:sz w:val="28"/>
           <w:szCs w:val="24"/>
           <w:rtl w:val="0"/>
         </w:rPr>
@@ -2361,14 +2384,15 @@
     <w:p>
       <w:pPr>
         <w:keepNext w:val="1"/>
-        <w:spacing w:after="480" w:before="480" w:line="480" w:lineRule="auto"/>
+        <w:spacing w:after="0" w:before="0" w:line="480" w:lineRule="auto"/>
         <w:jc w:val="left"/>
         <w:rPr/>
       </w:pPr>
       <w:r>
         <w:rPr>
           <w:rFonts w:ascii="Georgia" w:hAnsi="Georgia" w:eastAsia="Georgia" w:cs="Georgia"/>
-          <w:i w:val="1"/>
+          <w:b w:val="0"/>
+          <w:i/>
           <w:iCs w:val="1"/>
           <w:sz w:val="24"/>
           <w:szCs w:val="24"/>
@@ -2385,7 +2409,7 @@
     </w:p>
     <w:p>
       <w:pPr>
-        <w:spacing w:line="480" w:lineRule="auto"/>
+        <w:spacing w:line="480" w:lineRule="auto" w:before="0" w:after="0"/>
         <w:ind w:firstLine="720"/>
         <w:jc w:val="both"/>
         <w:rPr/>
@@ -2408,7 +2432,7 @@
     </w:p>
     <w:p>
       <w:pPr>
-        <w:spacing w:line="480" w:lineRule="auto"/>
+        <w:spacing w:line="480" w:lineRule="auto" w:before="0" w:after="0"/>
         <w:rPr/>
       </w:pPr>
       <w:r>
@@ -2421,14 +2445,15 @@
     <w:p>
       <w:pPr>
         <w:keepNext w:val="1"/>
-        <w:spacing w:after="480" w:before="480" w:line="480" w:lineRule="auto"/>
+        <w:spacing w:after="0" w:before="240" w:line="480" w:lineRule="auto"/>
         <w:jc w:val="left"/>
         <w:rPr/>
       </w:pPr>
       <w:r>
         <w:rPr>
           <w:rFonts w:ascii="Georgia" w:hAnsi="Georgia" w:eastAsia="Georgia" w:cs="Georgia"/>
-          <w:i w:val="1"/>
+          <w:b w:val="0"/>
+          <w:i/>
           <w:iCs w:val="1"/>
           <w:sz w:val="24"/>
           <w:szCs w:val="24"/>
@@ -2445,7 +2470,7 @@
     </w:p>
     <w:p>
       <w:pPr>
-        <w:spacing w:line="480" w:lineRule="auto"/>
+        <w:spacing w:line="480" w:lineRule="auto" w:before="0" w:after="0"/>
         <w:ind w:firstLine="720"/>
         <w:jc w:val="both"/>
         <w:rPr/>
@@ -2468,7 +2493,7 @@
     </w:p>
     <w:p>
       <w:pPr>
-        <w:spacing w:line="480" w:lineRule="auto"/>
+        <w:spacing w:line="480" w:lineRule="auto" w:before="0" w:after="0"/>
         <w:ind w:firstLine="720"/>
         <w:jc w:val="both"/>
         <w:rPr/>
@@ -2477,6 +2502,7 @@
         <w:rPr>
           <w:rFonts w:ascii="Georgia" w:hAnsi="Georgia" w:eastAsia="Georgia" w:cs="Georgia"/>
           <w:b w:val="0"/>
+          <w:sz w:val="22"/>
         </w:rPr>
         <w:t>As a sole-researcher study, inter-rater reliability testing is not feasible. Analytical consistency is maintained through explicit decision rules documented in Appendix A and B, a coded audit trail, and ongoing adviser consultation. The binary coding scheme necessarily compresses the complexity of real language use. Captions and comments with blended or ambiguous discursive functions are adjudicated by dominant communicative intent and logged separately. Chang’s (2009) typology was originally developed for a Taiwanese text-based psychosis peer support forum, and its adaptation to the Instagram advocacy context involves substantial platform-specific differences in interactional norms and audience composition that are acknowledged throughout the analysis. The study is descriptive in scope: it identifies linguistic patterns and co-occurrence frequencies without performing statistical testing or establishing causal relationships between caption type and comment response.</w:t>
       </w:r>
@@ -2484,14 +2510,15 @@
     <w:p>
       <w:pPr>
         <w:keepNext w:val="1"/>
-        <w:spacing w:after="480" w:before="480" w:line="480" w:lineRule="auto"/>
+        <w:spacing w:after="0" w:before="240" w:line="480" w:lineRule="auto"/>
         <w:jc w:val="left"/>
         <w:rPr/>
       </w:pPr>
       <w:r>
         <w:rPr>
           <w:rFonts w:ascii="Georgia" w:hAnsi="Georgia" w:eastAsia="Georgia" w:cs="Georgia"/>
-          <w:i w:val="1"/>
+          <w:b w:val="0"/>
+          <w:i/>
           <w:iCs w:val="1"/>
           <w:sz w:val="24"/>
           <w:szCs w:val="24"/>
@@ -2508,7 +2535,7 @@
     </w:p>
     <w:p>
       <w:pPr>
-        <w:spacing w:line="480" w:lineRule="auto"/>
+        <w:spacing w:line="480" w:lineRule="auto" w:before="0" w:after="0"/>
         <w:ind w:firstLine="720"/>
         <w:jc w:val="both"/>
         <w:rPr/>
@@ -2532,16 +2559,17 @@
     <w:p>
       <w:pPr>
         <w:keepNext w:val="1"/>
-        <w:spacing w:after="480" w:before="480" w:line="480" w:lineRule="auto"/>
+        <w:spacing w:after="720" w:before="720" w:line="480" w:lineRule="auto"/>
         <w:jc w:val="left"/>
         <w:rPr/>
       </w:pPr>
       <w:r>
         <w:rPr>
           <w:rFonts w:ascii="Georgia" w:hAnsi="Georgia" w:eastAsia="Georgia" w:cs="Georgia"/>
-          <w:b w:val="1"/>
+          <w:b/>
           <w:bCs w:val="1"/>
-          <w:sz w:val="24"/>
+          <w:i w:val="0"/>
+          <w:sz w:val="28"/>
           <w:szCs w:val="24"/>
           <w:rtl w:val="0"/>
         </w:rPr>
@@ -2556,7 +2584,7 @@
     </w:p>
     <w:p>
       <w:pPr>
-        <w:spacing w:line="480" w:lineRule="auto"/>
+        <w:spacing w:line="480" w:lineRule="auto" w:before="0" w:after="0"/>
         <w:ind w:left="0" w:firstLine="0"/>
         <w:jc w:val="both"/>
         <w:rPr/>
@@ -2579,19 +2607,19 @@
     </w:p>
     <w:p>
       <w:pPr>
-        <w:spacing w:line="480" w:lineRule="auto"/>
-        <w:rPr/>
-      </w:pPr>
-      <w:r>
-        <w:rPr>
-          <w:rFonts w:ascii="Georgia" w:hAnsi="Georgia" w:eastAsia="Georgia" w:cs="Georgia"/>
-          <w:rtl w:val="0"/>
-        </w:rPr>
-      </w:r>
-    </w:p>
-    <w:p>
-      <w:pPr>
-        <w:spacing w:line="480" w:lineRule="auto"/>
+        <w:spacing w:line="480" w:lineRule="auto" w:before="0" w:after="0"/>
+        <w:rPr/>
+      </w:pPr>
+      <w:r>
+        <w:rPr>
+          <w:rFonts w:ascii="Georgia" w:hAnsi="Georgia" w:eastAsia="Georgia" w:cs="Georgia"/>
+          <w:rtl w:val="0"/>
+        </w:rPr>
+      </w:r>
+    </w:p>
+    <w:p>
+      <w:pPr>
+        <w:spacing w:line="480" w:lineRule="auto" w:before="0" w:after="0"/>
         <w:ind w:left="0" w:firstLine="0"/>
         <w:jc w:val="both"/>
         <w:rPr/>
@@ -2600,6 +2628,7 @@
         <w:rPr>
           <w:rFonts w:ascii="Georgia" w:hAnsi="Georgia" w:eastAsia="Georgia" w:cs="Georgia"/>
           <w:b/>
+          <w:sz w:val="22"/>
         </w:rPr>
         <w:t xml:space="preserve">Contemporary Corpus. </w:t>
       </w:r>
@@ -2607,25 +2636,26 @@
         <w:rPr>
           <w:rFonts w:ascii="Georgia" w:hAnsi="Georgia" w:eastAsia="Georgia" w:cs="Georgia"/>
           <w:b w:val="0"/>
+          <w:sz w:val="22"/>
         </w:rPr>
         <w:t>A purposive sample of Instagram posts published from September 2024 through December 2025, with preference for 2025, analyzed as a single dataset of contemporary mental health advocacy discourse on the platform. Years are not compared.</w:t>
       </w:r>
     </w:p>
     <w:p>
       <w:pPr>
-        <w:spacing w:line="480" w:lineRule="auto"/>
-        <w:rPr/>
-      </w:pPr>
-      <w:r>
-        <w:rPr>
-          <w:rFonts w:ascii="Georgia" w:hAnsi="Georgia" w:eastAsia="Georgia" w:cs="Georgia"/>
-          <w:rtl w:val="0"/>
-        </w:rPr>
-      </w:r>
-    </w:p>
-    <w:p>
-      <w:pPr>
-        <w:spacing w:line="480" w:lineRule="auto"/>
+        <w:spacing w:line="480" w:lineRule="auto" w:before="0" w:after="0"/>
+        <w:rPr/>
+      </w:pPr>
+      <w:r>
+        <w:rPr>
+          <w:rFonts w:ascii="Georgia" w:hAnsi="Georgia" w:eastAsia="Georgia" w:cs="Georgia"/>
+          <w:rtl w:val="0"/>
+        </w:rPr>
+      </w:r>
+    </w:p>
+    <w:p>
+      <w:pPr>
+        <w:spacing w:line="480" w:lineRule="auto" w:before="0" w:after="0"/>
         <w:ind w:left="0" w:firstLine="0"/>
         <w:jc w:val="both"/>
         <w:rPr/>
@@ -2634,6 +2664,7 @@
         <w:rPr>
           <w:rFonts w:ascii="Georgia" w:hAnsi="Georgia" w:eastAsia="Georgia" w:cs="Georgia"/>
           <w:b/>
+          <w:sz w:val="22"/>
         </w:rPr>
         <w:t xml:space="preserve">Eligible Comment. </w:t>
       </w:r>
@@ -2641,25 +2672,26 @@
         <w:rPr>
           <w:rFonts w:ascii="Georgia" w:hAnsi="Georgia" w:eastAsia="Georgia" w:cs="Georgia"/>
           <w:b w:val="0"/>
+          <w:sz w:val="22"/>
         </w:rPr>
         <w:t>A comment written directly under the post, not a reply to another comment, that meets the study's eligibility filter: English language, enough continuous text for linguistic analysis (at least ten words or one full clause), and not limited to pure emoji, single-word reactions, tags, or links. For each post, two eligible comments are selected. When both kinds of response appear, one that offers encouragement or validation without a personal story and one that shares a personal experience related to the caption are taken. When only one kind appears, the two clearest eligible comments of that kind are taken.</w:t>
       </w:r>
     </w:p>
     <w:p>
       <w:pPr>
-        <w:spacing w:line="480" w:lineRule="auto"/>
-        <w:rPr/>
-      </w:pPr>
-      <w:r>
-        <w:rPr>
-          <w:rFonts w:ascii="Georgia" w:hAnsi="Georgia" w:eastAsia="Georgia" w:cs="Georgia"/>
-          <w:rtl w:val="0"/>
-        </w:rPr>
-      </w:r>
-    </w:p>
-    <w:p>
-      <w:pPr>
-        <w:spacing w:line="480" w:lineRule="auto"/>
+        <w:spacing w:line="480" w:lineRule="auto" w:before="0" w:after="0"/>
+        <w:rPr/>
+      </w:pPr>
+      <w:r>
+        <w:rPr>
+          <w:rFonts w:ascii="Georgia" w:hAnsi="Georgia" w:eastAsia="Georgia" w:cs="Georgia"/>
+          <w:rtl w:val="0"/>
+        </w:rPr>
+      </w:r>
+    </w:p>
+    <w:p>
+      <w:pPr>
+        <w:spacing w:line="480" w:lineRule="auto" w:before="0" w:after="0"/>
         <w:ind w:left="0" w:firstLine="0"/>
         <w:jc w:val="both"/>
         <w:rPr/>
@@ -2668,6 +2700,7 @@
         <w:rPr>
           <w:rFonts w:ascii="Georgia" w:hAnsi="Georgia" w:eastAsia="Georgia" w:cs="Georgia"/>
           <w:b/>
+          <w:sz w:val="22"/>
         </w:rPr>
         <w:t xml:space="preserve">Empowerment Language. </w:t>
       </w:r>
@@ -2675,25 +2708,26 @@
         <w:rPr>
           <w:rFonts w:ascii="Georgia" w:hAnsi="Georgia" w:eastAsia="Georgia" w:cs="Georgia"/>
           <w:b w:val="0"/>
+          <w:sz w:val="22"/>
         </w:rPr>
         <w:t>A discursive orientation in which the caption's primary work is to position the reader as an agent who can act, decide, or set the terms of their own mental-health practice. The language treats the reader as capable of taking concrete steps or claiming autonomy in the present. Operationally, a caption is coded EMPOWERMENT when its dominant function answers the core test "You can or should act." Illustrative signals include imperative directives (seek, set, prioritize, take), agency-affirming phrases (you can decide, trust yourself), self-care and boundary vocabulary (boundaries, rest, check in), and autonomy markers (at your own pace, when ready). These signals are illustrative, not exhaustive. Novel phrasings that perform the same discursive work are coded under the same orientation.</w:t>
       </w:r>
     </w:p>
     <w:p>
       <w:pPr>
-        <w:spacing w:line="480" w:lineRule="auto"/>
-        <w:rPr/>
-      </w:pPr>
-      <w:r>
-        <w:rPr>
-          <w:rFonts w:ascii="Georgia" w:hAnsi="Georgia" w:eastAsia="Georgia" w:cs="Georgia"/>
-          <w:rtl w:val="0"/>
-        </w:rPr>
-      </w:r>
-    </w:p>
-    <w:p>
-      <w:pPr>
-        <w:spacing w:line="480" w:lineRule="auto"/>
+        <w:spacing w:line="480" w:lineRule="auto" w:before="0" w:after="0"/>
+        <w:rPr/>
+      </w:pPr>
+      <w:r>
+        <w:rPr>
+          <w:rFonts w:ascii="Georgia" w:hAnsi="Georgia" w:eastAsia="Georgia" w:cs="Georgia"/>
+          <w:rtl w:val="0"/>
+        </w:rPr>
+      </w:r>
+    </w:p>
+    <w:p>
+      <w:pPr>
+        <w:spacing w:line="480" w:lineRule="auto" w:before="0" w:after="0"/>
         <w:ind w:left="0" w:firstLine="0"/>
         <w:jc w:val="both"/>
         <w:rPr/>
@@ -2702,6 +2736,7 @@
         <w:rPr>
           <w:rFonts w:ascii="Georgia" w:hAnsi="Georgia" w:eastAsia="Georgia" w:cs="Georgia"/>
           <w:b/>
+          <w:sz w:val="22"/>
         </w:rPr>
         <w:t xml:space="preserve">Function-Driven Coding. </w:t>
       </w:r>
@@ -2709,25 +2744,26 @@
         <w:rPr>
           <w:rFonts w:ascii="Georgia" w:hAnsi="Georgia" w:eastAsia="Georgia" w:cs="Georgia"/>
           <w:b w:val="0"/>
+          <w:sz w:val="22"/>
         </w:rPr>
         <w:t>A qualitative analytical approach that categorizes linguistic features based on their discursive purpose in context, not mechanical keyword matching. Caption coding uses a two-stage Identify-and-Sort procedure (see Appendix A). Stage 1 records whether each orientation is present or absent. Stage 2 assigns the dominant code. When both orientations are present, dominance is adjudicated by main-clause or final position and by speech-act force. Cases that remain unclear are coded as blended or indeterminate and reported separately.</w:t>
       </w:r>
     </w:p>
     <w:p>
       <w:pPr>
-        <w:spacing w:line="480" w:lineRule="auto"/>
-        <w:rPr/>
-      </w:pPr>
-      <w:r>
-        <w:rPr>
-          <w:rFonts w:ascii="Georgia" w:hAnsi="Georgia" w:eastAsia="Georgia" w:cs="Georgia"/>
-          <w:rtl w:val="0"/>
-        </w:rPr>
-      </w:r>
-    </w:p>
-    <w:p>
-      <w:pPr>
-        <w:spacing w:line="480" w:lineRule="auto"/>
+        <w:spacing w:line="480" w:lineRule="auto" w:before="0" w:after="0"/>
+        <w:rPr/>
+      </w:pPr>
+      <w:r>
+        <w:rPr>
+          <w:rFonts w:ascii="Georgia" w:hAnsi="Georgia" w:eastAsia="Georgia" w:cs="Georgia"/>
+          <w:rtl w:val="0"/>
+        </w:rPr>
+      </w:r>
+    </w:p>
+    <w:p>
+      <w:pPr>
+        <w:spacing w:line="480" w:lineRule="auto" w:before="0" w:after="0"/>
         <w:ind w:left="0" w:firstLine="0"/>
         <w:jc w:val="both"/>
         <w:rPr/>
@@ -2736,6 +2772,7 @@
         <w:rPr>
           <w:rFonts w:ascii="Georgia" w:hAnsi="Georgia" w:eastAsia="Georgia" w:cs="Georgia"/>
           <w:b/>
+          <w:sz w:val="22"/>
         </w:rPr>
         <w:t xml:space="preserve">Hope Construction. </w:t>
       </w:r>
@@ -2743,25 +2780,26 @@
         <w:rPr>
           <w:rFonts w:ascii="Georgia" w:hAnsi="Georgia" w:eastAsia="Georgia" w:cs="Georgia"/>
           <w:b w:val="0"/>
+          <w:sz w:val="22"/>
         </w:rPr>
         <w:t>A discursive orientation in which the caption's primary work is to project a positive future possibility or recovery trajectory in relation to mental health. The language treats present difficulty as temporary or traversable and points the reader toward a better state that is still ahead. Operationally, a caption is coded HOPE when its dominant function answers the core test "Things can or will get better." Illustrative signals include forward-looking modality (can, will, may, could), temporal markers of progression (soon, eventually, step by step), recovery-oriented nouns (healing, growth, recovery), and conditionals that project positive outcomes. These signals are illustrative, not exhaustive. Novel phrasings that perform the same discursive work are coded under the same orientation.</w:t>
       </w:r>
     </w:p>
     <w:p>
       <w:pPr>
-        <w:spacing w:line="480" w:lineRule="auto"/>
-        <w:rPr/>
-      </w:pPr>
-      <w:r>
-        <w:rPr>
-          <w:rFonts w:ascii="Georgia" w:hAnsi="Georgia" w:eastAsia="Georgia" w:cs="Georgia"/>
-          <w:rtl w:val="0"/>
-        </w:rPr>
-      </w:r>
-    </w:p>
-    <w:p>
-      <w:pPr>
-        <w:spacing w:line="480" w:lineRule="auto"/>
+        <w:spacing w:line="480" w:lineRule="auto" w:before="0" w:after="0"/>
+        <w:rPr/>
+      </w:pPr>
+      <w:r>
+        <w:rPr>
+          <w:rFonts w:ascii="Georgia" w:hAnsi="Georgia" w:eastAsia="Georgia" w:cs="Georgia"/>
+          <w:rtl w:val="0"/>
+        </w:rPr>
+      </w:r>
+    </w:p>
+    <w:p>
+      <w:pPr>
+        <w:spacing w:line="480" w:lineRule="auto" w:before="0" w:after="0"/>
         <w:ind w:left="0" w:firstLine="0"/>
         <w:jc w:val="both"/>
         <w:rPr/>
@@ -2770,6 +2808,7 @@
         <w:rPr>
           <w:rFonts w:ascii="Georgia" w:hAnsi="Georgia" w:eastAsia="Georgia" w:cs="Georgia"/>
           <w:b/>
+          <w:sz w:val="22"/>
         </w:rPr>
         <w:t xml:space="preserve">Personal Narrative Framing. </w:t>
       </w:r>
@@ -2777,25 +2816,26 @@
         <w:rPr>
           <w:rFonts w:ascii="Georgia" w:hAnsi="Georgia" w:eastAsia="Georgia" w:cs="Georgia"/>
           <w:b w:val="0"/>
+          <w:sz w:val="22"/>
         </w:rPr>
         <w:t>Comment language that shares a first-person mental health experience connected to the caption theme. Corresponds to Chang's (2009) network support. Operationally coded through first-person markers, temporal sequencing, emotional disclosure, and reflective connective structures (e.g., *this resonates, I've been there*).</w:t>
       </w:r>
     </w:p>
     <w:p>
       <w:pPr>
-        <w:spacing w:line="480" w:lineRule="auto"/>
-        <w:rPr/>
-      </w:pPr>
-      <w:r>
-        <w:rPr>
-          <w:rFonts w:ascii="Georgia" w:hAnsi="Georgia" w:eastAsia="Georgia" w:cs="Georgia"/>
-          <w:rtl w:val="0"/>
-        </w:rPr>
-      </w:r>
-    </w:p>
-    <w:p>
-      <w:pPr>
-        <w:spacing w:line="480" w:lineRule="auto"/>
+        <w:spacing w:line="480" w:lineRule="auto" w:before="0" w:after="0"/>
+        <w:rPr/>
+      </w:pPr>
+      <w:r>
+        <w:rPr>
+          <w:rFonts w:ascii="Georgia" w:hAnsi="Georgia" w:eastAsia="Georgia" w:cs="Georgia"/>
+          <w:rtl w:val="0"/>
+        </w:rPr>
+      </w:r>
+    </w:p>
+    <w:p>
+      <w:pPr>
+        <w:spacing w:line="480" w:lineRule="auto" w:before="0" w:after="0"/>
         <w:ind w:left="0" w:firstLine="0"/>
         <w:jc w:val="both"/>
         <w:rPr/>
@@ -2804,6 +2844,7 @@
         <w:rPr>
           <w:rFonts w:ascii="Georgia" w:hAnsi="Georgia" w:eastAsia="Georgia" w:cs="Georgia"/>
           <w:b/>
+          <w:sz w:val="22"/>
         </w:rPr>
         <w:t xml:space="preserve">Supportive Lexicon. </w:t>
       </w:r>
@@ -2811,25 +2852,26 @@
         <w:rPr>
           <w:rFonts w:ascii="Georgia" w:hAnsi="Georgia" w:eastAsia="Georgia" w:cs="Georgia"/>
           <w:b w:val="0"/>
+          <w:sz w:val="22"/>
         </w:rPr>
         <w:t>Comment language that offers encouragement, validation, empathy, or positive evaluation without sharing personal experience. Combines Chang's (2009) categories of emotional support and esteem support. Operationally coded through second-person affirmation, empathy markers, solidarity phrases, and positive evaluation language.</w:t>
       </w:r>
     </w:p>
     <w:p>
       <w:pPr>
-        <w:spacing w:line="480" w:lineRule="auto"/>
-        <w:rPr/>
-      </w:pPr>
-      <w:r>
-        <w:rPr>
-          <w:rFonts w:ascii="Georgia" w:hAnsi="Georgia" w:eastAsia="Georgia" w:cs="Georgia"/>
-          <w:rtl w:val="0"/>
-        </w:rPr>
-      </w:r>
-    </w:p>
-    <w:p>
-      <w:pPr>
-        <w:spacing w:line="480" w:lineRule="auto"/>
+        <w:spacing w:line="480" w:lineRule="auto" w:before="0" w:after="0"/>
+        <w:rPr/>
+      </w:pPr>
+      <w:r>
+        <w:rPr>
+          <w:rFonts w:ascii="Georgia" w:hAnsi="Georgia" w:eastAsia="Georgia" w:cs="Georgia"/>
+          <w:rtl w:val="0"/>
+        </w:rPr>
+      </w:r>
+    </w:p>
+    <w:p>
+      <w:pPr>
+        <w:spacing w:line="480" w:lineRule="auto" w:before="0" w:after="0"/>
         <w:rPr/>
       </w:pPr>
       <w:r>
@@ -2847,27 +2889,28 @@
     </w:p>
     <w:p>
       <w:pPr>
-        <w:spacing w:after="0" w:before="1440" w:line="480" w:lineRule="auto"/>
-        <w:rPr/>
-      </w:pPr>
-      <w:r>
-        <w:rPr>
-          <w:rFonts w:ascii="Georgia" w:hAnsi="Georgia" w:eastAsia="Georgia" w:cs="Georgia"/>
-          <w:rtl w:val="0"/>
-        </w:rPr>
-      </w:r>
-    </w:p>
-    <w:p>
-      <w:pPr>
-        <w:spacing w:after="480" w:before="480" w:line="480" w:lineRule="auto"/>
+        <w:spacing w:after="0" w:before="0" w:line="480" w:lineRule="auto"/>
+        <w:rPr/>
+      </w:pPr>
+      <w:r>
+        <w:rPr>
+          <w:rFonts w:ascii="Georgia" w:hAnsi="Georgia" w:eastAsia="Georgia" w:cs="Georgia"/>
+          <w:rtl w:val="0"/>
+        </w:rPr>
+      </w:r>
+    </w:p>
+    <w:p>
+      <w:pPr>
+        <w:spacing w:after="720" w:before="720" w:line="480" w:lineRule="auto"/>
         <w:jc w:val="center"/>
         <w:rPr/>
       </w:pPr>
       <w:r>
         <w:rPr>
           <w:rFonts w:ascii="Georgia" w:hAnsi="Georgia" w:eastAsia="Georgia" w:cs="Georgia"/>
-          <w:b w:val="1"/>
+          <w:b/>
           <w:bCs w:val="1"/>
+          <w:i w:val="0"/>
           <w:sz w:val="28"/>
           <w:szCs w:val="28"/>
           <w:rtl w:val="0"/>
@@ -2883,7 +2926,7 @@
     </w:p>
     <w:p>
       <w:pPr>
-        <w:spacing w:line="480" w:lineRule="auto"/>
+        <w:spacing w:line="480" w:lineRule="auto" w:before="0" w:after="0"/>
         <w:ind w:firstLine="720"/>
         <w:jc w:val="both"/>
         <w:rPr/>
@@ -2907,16 +2950,17 @@
     <w:p>
       <w:pPr>
         <w:keepNext w:val="1"/>
-        <w:spacing w:after="480" w:before="480" w:line="480" w:lineRule="auto"/>
+        <w:spacing w:after="720" w:before="720" w:line="480" w:lineRule="auto"/>
         <w:jc w:val="left"/>
         <w:rPr/>
       </w:pPr>
       <w:r>
         <w:rPr>
           <w:rFonts w:ascii="Georgia" w:hAnsi="Georgia" w:eastAsia="Georgia" w:cs="Georgia"/>
-          <w:b w:val="1"/>
+          <w:b/>
           <w:bCs w:val="1"/>
-          <w:sz w:val="24"/>
+          <w:i w:val="0"/>
+          <w:sz w:val="28"/>
           <w:szCs w:val="24"/>
           <w:rtl w:val="0"/>
         </w:rPr>
@@ -2931,7 +2975,7 @@
     </w:p>
     <w:p>
       <w:pPr>
-        <w:spacing w:line="480" w:lineRule="auto"/>
+        <w:spacing w:line="480" w:lineRule="auto" w:before="0" w:after="0"/>
         <w:ind w:firstLine="720"/>
         <w:jc w:val="both"/>
         <w:rPr/>
@@ -2955,16 +2999,17 @@
     <w:p>
       <w:pPr>
         <w:keepNext w:val="1"/>
-        <w:spacing w:after="480" w:before="480" w:line="480" w:lineRule="auto"/>
+        <w:spacing w:after="720" w:before="720" w:line="480" w:lineRule="auto"/>
         <w:jc w:val="left"/>
         <w:rPr/>
       </w:pPr>
       <w:r>
         <w:rPr>
           <w:rFonts w:ascii="Georgia" w:hAnsi="Georgia" w:eastAsia="Georgia" w:cs="Georgia"/>
-          <w:b w:val="1"/>
+          <w:b/>
           <w:bCs w:val="1"/>
-          <w:sz w:val="24"/>
+          <w:i w:val="0"/>
+          <w:sz w:val="28"/>
           <w:szCs w:val="24"/>
           <w:rtl w:val="0"/>
         </w:rPr>
@@ -2979,7 +3024,7 @@
     </w:p>
     <w:p>
       <w:pPr>
-        <w:spacing w:line="480" w:lineRule="auto"/>
+        <w:spacing w:line="480" w:lineRule="auto" w:before="0" w:after="0"/>
         <w:ind w:firstLine="720"/>
         <w:jc w:val="both"/>
         <w:rPr/>
@@ -2988,6 +3033,7 @@
         <w:rPr>
           <w:rFonts w:ascii="Georgia" w:hAnsi="Georgia" w:eastAsia="Georgia" w:cs="Georgia"/>
           <w:b w:val="0"/>
+          <w:sz w:val="22"/>
         </w:rPr>
         <w:t>This study employs a qualitative discourse analysis design guided by Positive Discourse Analysis (Martin, 2004). Qualitative design is appropriate because the goal is to interpret linguistic patterns, identify discursive strategies, and describe how meaning is constructed in naturalistic digital texts. A corpus of 30 captions provides sufficient depth for pattern identification and proportional description while remaining feasible for a solo undergraduate researcher. In discourse analysis, corpus size is determined by the depth of analysis rather than statistical representativeness. Studies applying SFL-based coding to comparable short-form digital corpora have worked within similar ranges (Macgilchrist, 2007; Koteyko &amp; Atanasova, 2018). The design prioritizes analytical rigor, transparent coding protocols, and clearly bounded scope over volume or statistical generalization.</w:t>
       </w:r>
@@ -2995,16 +3041,17 @@
     <w:p>
       <w:pPr>
         <w:keepNext w:val="1"/>
-        <w:spacing w:after="480" w:before="480" w:line="480" w:lineRule="auto"/>
+        <w:spacing w:after="720" w:before="720" w:line="480" w:lineRule="auto"/>
         <w:jc w:val="left"/>
         <w:rPr/>
       </w:pPr>
       <w:r>
         <w:rPr>
           <w:rFonts w:ascii="Georgia" w:hAnsi="Georgia" w:eastAsia="Georgia" w:cs="Georgia"/>
-          <w:b w:val="1"/>
+          <w:b/>
           <w:bCs w:val="1"/>
-          <w:sz w:val="24"/>
+          <w:i w:val="0"/>
+          <w:sz w:val="28"/>
           <w:szCs w:val="24"/>
           <w:rtl w:val="0"/>
         </w:rPr>
@@ -3019,7 +3066,7 @@
     </w:p>
     <w:p>
       <w:pPr>
-        <w:spacing w:line="480" w:lineRule="auto"/>
+        <w:spacing w:line="480" w:lineRule="auto" w:before="0" w:after="0"/>
         <w:ind w:left="0" w:firstLine="0"/>
         <w:jc w:val="both"/>
         <w:rPr/>
@@ -3042,19 +3089,19 @@
     </w:p>
     <w:p>
       <w:pPr>
-        <w:spacing w:line="480" w:lineRule="auto"/>
-        <w:rPr/>
-      </w:pPr>
-      <w:r>
-        <w:rPr>
-          <w:rFonts w:ascii="Georgia" w:hAnsi="Georgia" w:eastAsia="Georgia" w:cs="Georgia"/>
-          <w:rtl w:val="0"/>
-        </w:rPr>
-      </w:r>
-    </w:p>
-    <w:p>
-      <w:pPr>
-        <w:spacing w:line="480" w:lineRule="auto"/>
+        <w:spacing w:line="480" w:lineRule="auto" w:before="0" w:after="0"/>
+        <w:rPr/>
+      </w:pPr>
+      <w:r>
+        <w:rPr>
+          <w:rFonts w:ascii="Georgia" w:hAnsi="Georgia" w:eastAsia="Georgia" w:cs="Georgia"/>
+          <w:rtl w:val="0"/>
+        </w:rPr>
+      </w:r>
+    </w:p>
+    <w:p>
+      <w:pPr>
+        <w:spacing w:line="480" w:lineRule="auto" w:before="0" w:after="0"/>
         <w:ind w:left="0" w:firstLine="0"/>
         <w:jc w:val="both"/>
         <w:rPr/>
@@ -3063,6 +3110,7 @@
         <w:rPr>
           <w:rFonts w:ascii="Georgia" w:hAnsi="Georgia" w:eastAsia="Georgia" w:cs="Georgia"/>
           <w:b/>
+          <w:sz w:val="22"/>
         </w:rPr>
         <w:t xml:space="preserve">1. Corpus Screening. </w:t>
       </w:r>
@@ -3070,13 +3118,14 @@
         <w:rPr>
           <w:rFonts w:ascii="Georgia" w:hAnsi="Georgia" w:eastAsia="Georgia" w:cs="Georgia"/>
           <w:b w:val="0"/>
+          <w:sz w:val="22"/>
         </w:rPr>
         <w:t>Candidate public mental health advocacy pages are identified through Instagram search, relevant hashtags (for example #mentalhealthawareness, #mentalhealthadvocacy, #mentalhealthmatters), and related account suggestions. Eligible pages must meet all of the following criteria: (a) the account is publicly accessible, (b) the biography or page description clearly identifies mental health advocacy as the primary purpose, (c) the majority of posts address mental health awareness, coping, recovery, or peer support rather than general wellness, fitness, or lifestyle content, (d) the account is not primarily commercial, and (e) content is in English. Pages that only occasionally post mental health content within broader lifestyle or fitness feeds are excluded. Approximately five to six pages are retained. A screening log records pages considered, pages retained, and pages dropped. Within each retained page, posts are screened in chronological order from the top of the feed. Eligible posts are those published from September 2024 through December 2025 that meet the post criteria: English language, content that clearly addresses mental health awareness, support, coping, recovery, or advocacy, fully visible caption text, and engagement of at least 100 likes and 20 visible comments. Preference is given to 2025 posts. Posts from September to December 2024 are taken only when a page does not yield enough eligible 2025 captions. Each page contributes between five and eight eligible posts. Screening proceeds page by page until the corpus ceiling of 30 captions is reached or the candidate list is exhausted. Preference is given to posts that appear under relevant mental health hashtags, but hashtag use is not a hard requirement.</w:t>
       </w:r>
     </w:p>
     <w:p>
       <w:pPr>
-        <w:spacing w:line="480" w:lineRule="auto"/>
+        <w:spacing w:line="480" w:lineRule="auto" w:before="0" w:after="0"/>
         <w:ind w:left="0" w:firstLine="0"/>
         <w:jc w:val="both"/>
         <w:rPr/>
@@ -3085,6 +3134,7 @@
         <w:rPr>
           <w:rFonts w:ascii="Georgia" w:hAnsi="Georgia" w:eastAsia="Georgia" w:cs="Georgia"/>
           <w:b/>
+          <w:sz w:val="22"/>
         </w:rPr>
         <w:t xml:space="preserve">2. Ethical Compliance. </w:t>
       </w:r>
@@ -3092,13 +3142,14 @@
         <w:rPr>
           <w:rFonts w:ascii="Georgia" w:hAnsi="Georgia" w:eastAsia="Georgia" w:cs="Georgia"/>
           <w:b w:val="0"/>
+          <w:sz w:val="22"/>
         </w:rPr>
         <w:t>Only publicly visible text is extracted. Page names are anonymized. Usernames and identifying personal details in comments are redacted. The study adheres to standard academic ethics for public digital text analysis and undergoes formal institutional review if required by the department.</w:t>
       </w:r>
     </w:p>
     <w:p>
       <w:pPr>
-        <w:spacing w:line="480" w:lineRule="auto"/>
+        <w:spacing w:line="480" w:lineRule="auto" w:before="0" w:after="0"/>
         <w:ind w:left="0" w:firstLine="0"/>
         <w:jc w:val="both"/>
         <w:rPr/>
@@ -3107,6 +3158,7 @@
         <w:rPr>
           <w:rFonts w:ascii="Georgia" w:hAnsi="Georgia" w:eastAsia="Georgia" w:cs="Georgia"/>
           <w:b/>
+          <w:sz w:val="22"/>
         </w:rPr>
         <w:t xml:space="preserve">3. Caption Coding. </w:t>
       </w:r>
@@ -3114,13 +3166,14 @@
         <w:rPr>
           <w:rFonts w:ascii="Georgia" w:hAnsi="Georgia" w:eastAsia="Georgia" w:cs="Georgia"/>
           <w:b w:val="0"/>
+          <w:sz w:val="22"/>
         </w:rPr>
         <w:t>Each caption is read holistically. Coding follows the two-stage Identify-and-Sort procedure in Appendix A. Stage 1 marks hope construction and empowerment language as present or absent from illustrative signals. Stage 2 assigns HOPE if only hope is present, EMPOWERMENT if only empowerment is present, and blended or indeterminate if neither is present. When both are present, dominance is decided by main-clause or final position and by speech-act force. Feature tallies are retained for distributional description.</w:t>
       </w:r>
     </w:p>
     <w:p>
       <w:pPr>
-        <w:spacing w:line="480" w:lineRule="auto"/>
+        <w:spacing w:line="480" w:lineRule="auto" w:before="0" w:after="0"/>
         <w:ind w:left="0" w:firstLine="0"/>
         <w:jc w:val="both"/>
         <w:rPr/>
@@ -3129,6 +3182,7 @@
         <w:rPr>
           <w:rFonts w:ascii="Georgia" w:hAnsi="Georgia" w:eastAsia="Georgia" w:cs="Georgia"/>
           <w:b/>
+          <w:sz w:val="22"/>
         </w:rPr>
         <w:t xml:space="preserve">4. Comment Extraction and Coding. </w:t>
       </w:r>
@@ -3136,25 +3190,26 @@
         <w:rPr>
           <w:rFonts w:ascii="Georgia" w:hAnsi="Georgia" w:eastAsia="Georgia" w:cs="Georgia"/>
           <w:b w:val="0"/>
+          <w:sz w:val="22"/>
         </w:rPr>
         <w:t>For each retained post, comments written directly under the caption are screened for eligibility. A comment is eligible only if it is written in English, contains enough continuous text for linguistic analysis (at least ten words or one full clause), and is not limited to pure emoji, single-word reactions, tags, or links. Replies nested under other comments are excluded. From the eligible comments, two are selected. When both kinds of response appear, one that offers encouragement, validation, or empathy without sharing a personal story and one that shares a first-person experience related to the caption are taken. When only one kind appears, the two clearest eligible comments of that kind are taken. When fewer than two eligible comments exist, the post is excluded from the final corpus or recorded as a partial case under a rule fixed before coding begins. Total visible comment count is logged per post. Each selected comment is then coded as SUPPORTIVE LEXICON or PERSONAL NARRATIVE by dominant communicative purpose using Appendix B. Unclassifiable rates are reported. If they exceed 20 percent of the sample, coding markers are refined with adviser consultation. Items that still cannot be assigned a dominant function are placed in a third descriptive category (blended/indeterminate) and reported separately.</w:t>
       </w:r>
     </w:p>
     <w:p>
       <w:pPr>
-        <w:spacing w:line="480" w:lineRule="auto"/>
-        <w:rPr/>
-      </w:pPr>
-      <w:r>
-        <w:rPr>
-          <w:rFonts w:ascii="Georgia" w:hAnsi="Georgia" w:eastAsia="Georgia" w:cs="Georgia"/>
-          <w:rtl w:val="0"/>
-        </w:rPr>
-      </w:r>
-    </w:p>
-    <w:p>
-      <w:pPr>
-        <w:spacing w:line="480" w:lineRule="auto"/>
+        <w:spacing w:line="480" w:lineRule="auto" w:before="0" w:after="0"/>
+        <w:rPr/>
+      </w:pPr>
+      <w:r>
+        <w:rPr>
+          <w:rFonts w:ascii="Georgia" w:hAnsi="Georgia" w:eastAsia="Georgia" w:cs="Georgia"/>
+          <w:rtl w:val="0"/>
+        </w:rPr>
+      </w:r>
+    </w:p>
+    <w:p>
+      <w:pPr>
+        <w:spacing w:line="480" w:lineRule="auto" w:before="0" w:after="0"/>
         <w:ind w:left="0" w:firstLine="0"/>
         <w:jc w:val="both"/>
         <w:rPr/>
@@ -3163,6 +3218,7 @@
         <w:rPr>
           <w:rFonts w:ascii="Georgia" w:hAnsi="Georgia" w:eastAsia="Georgia" w:cs="Georgia"/>
           <w:b/>
+          <w:sz w:val="22"/>
         </w:rPr>
         <w:t xml:space="preserve">5. Integration and Analysis. </w:t>
       </w:r>
@@ -3170,6 +3226,7 @@
         <w:rPr>
           <w:rFonts w:ascii="Georgia" w:hAnsi="Georgia" w:eastAsia="Georgia" w:cs="Georgia"/>
           <w:b w:val="0"/>
+          <w:sz w:val="22"/>
         </w:rPr>
         <w:t>All coded data is pooled across three analytical tasks: (a) Caption strategy distribution. The proportion of HOPE vs. EMPOWERMENT across the 30-caption corpus is described, with dominant feature types tallied per category. (b) Comment linguistic features. The dominant response types (SUPPORTIVE LEXICON vs. PERSONAL NARRATIVE) and their characteristic linguistic markers across all 60 comment units are described independently. (c) Cross-level synthesis. Patterns at the intersection of caption type and comment response type are described to characterize how positive mental health meanings are collectively constructed. The analysis is strictly descriptive: it identifies linguistic patterns and feature frequencies without making temporal, causal, or generalizable claims.</w:t>
       </w:r>
@@ -3177,16 +3234,17 @@
     <w:p>
       <w:pPr>
         <w:keepNext w:val="1"/>
-        <w:spacing w:after="480" w:before="480" w:line="480" w:lineRule="auto"/>
+        <w:spacing w:after="720" w:before="720" w:line="480" w:lineRule="auto"/>
         <w:jc w:val="left"/>
         <w:rPr/>
       </w:pPr>
       <w:r>
         <w:rPr>
           <w:rFonts w:ascii="Georgia" w:hAnsi="Georgia" w:eastAsia="Georgia" w:cs="Georgia"/>
-          <w:b w:val="1"/>
+          <w:b/>
           <w:bCs w:val="1"/>
-          <w:sz w:val="24"/>
+          <w:i w:val="0"/>
+          <w:sz w:val="28"/>
           <w:szCs w:val="24"/>
           <w:rtl w:val="0"/>
         </w:rPr>
@@ -3201,7 +3259,7 @@
     </w:p>
     <w:p>
       <w:pPr>
-        <w:spacing w:line="480" w:lineRule="auto"/>
+        <w:spacing w:line="480" w:lineRule="auto" w:before="0" w:after="0"/>
         <w:ind w:firstLine="720"/>
         <w:jc w:val="both"/>
         <w:rPr/>
@@ -3224,7 +3282,7 @@
     </w:p>
     <w:p>
       <w:pPr>
-        <w:spacing w:line="480" w:lineRule="auto"/>
+        <w:spacing w:line="480" w:lineRule="auto" w:before="0" w:after="0"/>
         <w:rPr/>
       </w:pPr>
       <w:r>
@@ -3242,27 +3300,28 @@
     </w:p>
     <w:p>
       <w:pPr>
-        <w:spacing w:after="0" w:before="1440" w:line="480" w:lineRule="auto"/>
-        <w:rPr/>
-      </w:pPr>
-      <w:r>
-        <w:rPr>
-          <w:rFonts w:ascii="Georgia" w:hAnsi="Georgia" w:eastAsia="Georgia" w:cs="Georgia"/>
-          <w:rtl w:val="0"/>
-        </w:rPr>
-      </w:r>
-    </w:p>
-    <w:p>
-      <w:pPr>
-        <w:spacing w:after="480" w:before="480" w:line="480" w:lineRule="auto"/>
+        <w:spacing w:after="0" w:before="0" w:line="480" w:lineRule="auto"/>
+        <w:rPr/>
+      </w:pPr>
+      <w:r>
+        <w:rPr>
+          <w:rFonts w:ascii="Georgia" w:hAnsi="Georgia" w:eastAsia="Georgia" w:cs="Georgia"/>
+          <w:rtl w:val="0"/>
+        </w:rPr>
+      </w:r>
+    </w:p>
+    <w:p>
+      <w:pPr>
+        <w:spacing w:after="720" w:before="720" w:line="480" w:lineRule="auto"/>
         <w:jc w:val="center"/>
         <w:rPr/>
       </w:pPr>
       <w:r>
         <w:rPr>
           <w:rFonts w:ascii="Georgia" w:hAnsi="Georgia" w:eastAsia="Georgia" w:cs="Georgia"/>
-          <w:b w:val="1"/>
+          <w:b/>
           <w:bCs w:val="1"/>
+          <w:i w:val="0"/>
           <w:sz w:val="28"/>
           <w:szCs w:val="28"/>
           <w:rtl w:val="0"/>
@@ -3779,7 +3838,7 @@
     </w:p>
     <w:p>
       <w:pPr>
-        <w:spacing w:line="480" w:lineRule="auto"/>
+        <w:spacing w:line="480" w:lineRule="auto" w:before="0" w:after="0"/>
         <w:ind w:left="720" w:hanging="720"/>
         <w:jc w:val="both"/>
         <w:rPr/>
@@ -3794,7 +3853,7 @@
     </w:p>
     <w:p>
       <w:pPr>
-        <w:spacing w:line="480" w:lineRule="auto"/>
+        <w:spacing w:line="480" w:lineRule="auto" w:before="0" w:after="0"/>
         <w:ind w:left="720" w:hanging="720"/>
         <w:jc w:val="both"/>
         <w:rPr/>
@@ -3816,7 +3875,7 @@
     </w:p>
     <w:p>
       <w:pPr>
-        <w:spacing w:line="480" w:lineRule="auto"/>
+        <w:spacing w:line="480" w:lineRule="auto" w:before="0" w:after="0"/>
         <w:ind w:left="720" w:hanging="720"/>
         <w:jc w:val="both"/>
         <w:rPr/>
@@ -3838,7 +3897,7 @@
     </w:p>
     <w:p>
       <w:pPr>
-        <w:spacing w:line="480" w:lineRule="auto"/>
+        <w:spacing w:line="480" w:lineRule="auto" w:before="0" w:after="0"/>
         <w:ind w:left="720" w:hanging="720"/>
         <w:jc w:val="both"/>
         <w:rPr/>
@@ -3859,38 +3918,53 @@
       </w:r>
     </w:p>
     <w:p>
-      <w:r>
-        <w:rPr>
-          <w:rFonts w:ascii="Georgia" w:hAnsi="Georgia" w:eastAsia="Georgia" w:cs="Georgia"/>
-          <w:sz w:val="22"/>
-        </w:rPr>
-      </w:r>
-    </w:p>
-    <w:p>
-      <w:r>
-        <w:rPr>
-          <w:rFonts w:ascii="Georgia" w:hAnsi="Georgia" w:eastAsia="Georgia" w:cs="Georgia"/>
-          <w:sz w:val="22"/>
-        </w:rPr>
-      </w:r>
-    </w:p>
-    <w:p>
-      <w:r>
-        <w:rPr>
-          <w:rFonts w:ascii="Georgia" w:hAnsi="Georgia" w:eastAsia="Georgia" w:cs="Georgia"/>
-          <w:sz w:val="22"/>
-        </w:rPr>
-      </w:r>
-    </w:p>
-    <w:p>
-      <w:r>
-        <w:rPr>
-          <w:rFonts w:ascii="Georgia" w:hAnsi="Georgia" w:eastAsia="Georgia" w:cs="Georgia"/>
-          <w:sz w:val="22"/>
-        </w:rPr>
-      </w:r>
-    </w:p>
-    <w:p>
+      <w:pPr>
+        <w:spacing w:before="0" w:after="0"/>
+      </w:pPr>
+      <w:r>
+        <w:rPr>
+          <w:rFonts w:ascii="Georgia" w:hAnsi="Georgia" w:eastAsia="Georgia" w:cs="Georgia"/>
+          <w:sz w:val="22"/>
+        </w:rPr>
+      </w:r>
+    </w:p>
+    <w:p>
+      <w:pPr>
+        <w:spacing w:before="0" w:after="0"/>
+      </w:pPr>
+      <w:r>
+        <w:rPr>
+          <w:rFonts w:ascii="Georgia" w:hAnsi="Georgia" w:eastAsia="Georgia" w:cs="Georgia"/>
+          <w:sz w:val="22"/>
+        </w:rPr>
+      </w:r>
+    </w:p>
+    <w:p>
+      <w:pPr>
+        <w:spacing w:before="0" w:after="0"/>
+      </w:pPr>
+      <w:r>
+        <w:rPr>
+          <w:rFonts w:ascii="Georgia" w:hAnsi="Georgia" w:eastAsia="Georgia" w:cs="Georgia"/>
+          <w:sz w:val="22"/>
+        </w:rPr>
+      </w:r>
+    </w:p>
+    <w:p>
+      <w:pPr>
+        <w:spacing w:before="0" w:after="0"/>
+      </w:pPr>
+      <w:r>
+        <w:rPr>
+          <w:rFonts w:ascii="Georgia" w:hAnsi="Georgia" w:eastAsia="Georgia" w:cs="Georgia"/>
+          <w:sz w:val="22"/>
+        </w:rPr>
+      </w:r>
+    </w:p>
+    <w:p>
+      <w:pPr>
+        <w:spacing w:before="0" w:after="0"/>
+      </w:pPr>
       <w:r>
         <w:rPr>
           <w:rFonts w:ascii="Georgia" w:hAnsi="Georgia" w:eastAsia="Georgia" w:cs="Georgia"/>
@@ -3901,15 +3975,16 @@
     <w:p>
       <w:pPr>
         <w:pageBreakBefore w:val="1"/>
-        <w:spacing w:after="480" w:before="480" w:line="480" w:lineRule="auto"/>
+        <w:spacing w:after="720" w:before="720" w:line="480" w:lineRule="auto"/>
         <w:jc w:val="center"/>
         <w:rPr/>
       </w:pPr>
       <w:r>
         <w:rPr>
           <w:rFonts w:ascii="Georgia" w:hAnsi="Georgia" w:eastAsia="Georgia" w:cs="Georgia"/>
-          <w:b w:val="1"/>
+          <w:b/>
           <w:bCs w:val="1"/>
+          <w:i w:val="0"/>
           <w:sz w:val="28"/>
           <w:szCs w:val="28"/>
           <w:rtl w:val="0"/>
@@ -3926,16 +4001,17 @@
     <w:p>
       <w:pPr>
         <w:keepNext w:val="1"/>
-        <w:spacing w:after="480" w:before="480" w:line="480" w:lineRule="auto"/>
+        <w:spacing w:after="720" w:before="720" w:line="480" w:lineRule="auto"/>
         <w:jc w:val="left"/>
         <w:rPr/>
       </w:pPr>
       <w:r>
         <w:rPr>
           <w:rFonts w:ascii="Georgia" w:hAnsi="Georgia" w:eastAsia="Georgia" w:cs="Georgia"/>
-          <w:b w:val="1"/>
+          <w:b/>
           <w:bCs w:val="1"/>
-          <w:sz w:val="24"/>
+          <w:i w:val="0"/>
+          <w:sz w:val="28"/>
           <w:szCs w:val="24"/>
           <w:rtl w:val="0"/>
         </w:rPr>
@@ -3950,7 +4026,7 @@
     </w:p>
     <w:p>
       <w:pPr>
-        <w:spacing w:line="480" w:lineRule="auto"/>
+        <w:spacing w:line="480" w:lineRule="auto" w:before="240" w:after="0"/>
         <w:jc w:val="center"/>
         <w:rPr/>
       </w:pPr>
@@ -4057,7 +4133,7 @@
             <w:r>
               <w:rPr>
                 <w:rFonts w:ascii="Georgia" w:hAnsi="Georgia" w:eastAsia="Georgia" w:cs="Georgia"/>
-                <w:b w:val="1"/>
+                <w:b/>
                 <w:bCs w:val="1"/>
                 <w:color w:val="ffffff"/>
                 <w:sz w:val="18"/>
@@ -4069,6 +4145,7 @@
             <w:r>
               <w:rPr>
                 <w:rFonts w:ascii="Georgia" w:hAnsi="Georgia" w:eastAsia="Georgia" w:cs="Georgia"/>
+                <w:sz w:val="18"/>
                 <w:rtl w:val="0"/>
               </w:rPr>
             </w:r>
@@ -4102,7 +4179,7 @@
             <w:r>
               <w:rPr>
                 <w:rFonts w:ascii="Georgia" w:hAnsi="Georgia" w:eastAsia="Georgia" w:cs="Georgia"/>
-                <w:b w:val="1"/>
+                <w:b/>
                 <w:bCs w:val="1"/>
                 <w:color w:val="ffffff"/>
                 <w:sz w:val="18"/>
@@ -4114,6 +4191,7 @@
             <w:r>
               <w:rPr>
                 <w:rFonts w:ascii="Georgia" w:hAnsi="Georgia" w:eastAsia="Georgia" w:cs="Georgia"/>
+                <w:sz w:val="18"/>
                 <w:rtl w:val="0"/>
               </w:rPr>
             </w:r>
@@ -4147,7 +4225,7 @@
             <w:r>
               <w:rPr>
                 <w:rFonts w:ascii="Georgia" w:hAnsi="Georgia" w:eastAsia="Georgia" w:cs="Georgia"/>
-                <w:b w:val="1"/>
+                <w:b/>
                 <w:bCs w:val="1"/>
                 <w:color w:val="ffffff"/>
                 <w:sz w:val="18"/>
@@ -4159,6 +4237,7 @@
             <w:r>
               <w:rPr>
                 <w:rFonts w:ascii="Georgia" w:hAnsi="Georgia" w:eastAsia="Georgia" w:cs="Georgia"/>
+                <w:sz w:val="18"/>
                 <w:rtl w:val="0"/>
               </w:rPr>
             </w:r>
@@ -4374,7 +4453,7 @@
     </w:tbl>
     <w:p>
       <w:pPr>
-        <w:spacing w:line="480" w:lineRule="auto"/>
+        <w:spacing w:line="480" w:lineRule="auto" w:before="0" w:after="0"/>
         <w:rPr>
           <w:sz w:val="20"/>
           <w:szCs w:val="20"/>
@@ -4389,20 +4468,21 @@
     </w:p>
     <w:p>
       <w:pPr>
-        <w:spacing w:line="480" w:lineRule="auto"/>
-        <w:jc w:val="both"/>
-        <w:rPr/>
-      </w:pPr>
-      <w:r>
-        <w:rPr>
-          <w:rFonts w:ascii="Georgia" w:hAnsi="Georgia" w:eastAsia="Georgia" w:cs="Georgia"/>
+        <w:spacing w:line="480" w:lineRule="auto" w:before="0" w:after="0"/>
+        <w:jc w:val="both"/>
+        <w:rPr/>
+      </w:pPr>
+      <w:r>
+        <w:rPr>
+          <w:rFonts w:ascii="Georgia" w:hAnsi="Georgia" w:eastAsia="Georgia" w:cs="Georgia"/>
+          <w:sz w:val="22"/>
         </w:rPr>
         <w:t>Decision procedure (two-stage Identify and Sort). The markers in Table A1 are illustrative signals, not an exhaustive inventory. Coding proceeds in two stages. Stage 1 (Identify). For each caption, mark hope construction and empowerment language as present or absent on the basis of the illustrative signals. Stage 2 (Sort). If only hope construction is present, code HOPE. If only empowerment language is present, code EMPOWERMENT. If neither is present, code blended or indeterminate. If both are present, adjudicate dominance: which orientation occupies the main clause(s) or the final prominent position, and which speech act carries the main force of the text. "Things can or will get better" (HOPE) or "You can or should act" (EMPOWERMENT). The orientation that wins both checks, or clearly wins one while the other is only peripheral, becomes the dominant code. If the checks disagree or neither orientation is clearly stronger, code as blended or indeterminate. Blended cases are logged separately and excluded from the main HOPE versus EMPOWERMENT distribution.</w:t>
       </w:r>
     </w:p>
     <w:p>
       <w:pPr>
-        <w:spacing w:line="480" w:lineRule="auto"/>
+        <w:spacing w:line="480" w:lineRule="auto" w:before="0" w:after="0"/>
         <w:rPr/>
       </w:pPr>
       <w:r>
@@ -4416,16 +4496,17 @@
       <w:pPr>
         <w:keepNext w:val="1"/>
         <w:pageBreakBefore w:val="1"/>
-        <w:spacing w:after="480" w:before="480" w:line="480" w:lineRule="auto"/>
+        <w:spacing w:after="720" w:before="720" w:line="480" w:lineRule="auto"/>
         <w:jc w:val="left"/>
         <w:rPr/>
       </w:pPr>
       <w:r>
         <w:rPr>
           <w:rFonts w:ascii="Georgia" w:hAnsi="Georgia" w:eastAsia="Georgia" w:cs="Georgia"/>
-          <w:b w:val="1"/>
+          <w:b/>
           <w:bCs w:val="1"/>
-          <w:sz w:val="24"/>
+          <w:i w:val="0"/>
+          <w:sz w:val="28"/>
           <w:szCs w:val="24"/>
           <w:rtl w:val="0"/>
         </w:rPr>
@@ -4440,7 +4521,7 @@
     </w:p>
     <w:p>
       <w:pPr>
-        <w:spacing w:line="480" w:lineRule="auto"/>
+        <w:spacing w:line="480" w:lineRule="auto" w:before="240" w:after="0"/>
         <w:jc w:val="center"/>
         <w:rPr/>
       </w:pPr>
@@ -4547,7 +4628,7 @@
             <w:r>
               <w:rPr>
                 <w:rFonts w:ascii="Georgia" w:hAnsi="Georgia" w:eastAsia="Georgia" w:cs="Georgia"/>
-                <w:b w:val="1"/>
+                <w:b/>
                 <w:bCs w:val="1"/>
                 <w:color w:val="ffffff"/>
                 <w:sz w:val="18"/>
@@ -4559,6 +4640,7 @@
             <w:r>
               <w:rPr>
                 <w:rFonts w:ascii="Georgia" w:hAnsi="Georgia" w:eastAsia="Georgia" w:cs="Georgia"/>
+                <w:sz w:val="18"/>
                 <w:rtl w:val="0"/>
               </w:rPr>
             </w:r>
@@ -4592,7 +4674,7 @@
             <w:r>
               <w:rPr>
                 <w:rFonts w:ascii="Georgia" w:hAnsi="Georgia" w:eastAsia="Georgia" w:cs="Georgia"/>
-                <w:b w:val="1"/>
+                <w:b/>
                 <w:bCs w:val="1"/>
                 <w:color w:val="ffffff"/>
                 <w:sz w:val="18"/>
@@ -4604,6 +4686,7 @@
             <w:r>
               <w:rPr>
                 <w:rFonts w:ascii="Georgia" w:hAnsi="Georgia" w:eastAsia="Georgia" w:cs="Georgia"/>
+                <w:sz w:val="18"/>
                 <w:rtl w:val="0"/>
               </w:rPr>
             </w:r>
@@ -4637,7 +4720,7 @@
             <w:r>
               <w:rPr>
                 <w:rFonts w:ascii="Georgia" w:hAnsi="Georgia" w:eastAsia="Georgia" w:cs="Georgia"/>
-                <w:b w:val="1"/>
+                <w:b/>
                 <w:bCs w:val="1"/>
                 <w:color w:val="ffffff"/>
                 <w:sz w:val="18"/>
@@ -4649,6 +4732,7 @@
             <w:r>
               <w:rPr>
                 <w:rFonts w:ascii="Georgia" w:hAnsi="Georgia" w:eastAsia="Georgia" w:cs="Georgia"/>
+                <w:sz w:val="18"/>
                 <w:rtl w:val="0"/>
               </w:rPr>
             </w:r>
@@ -4867,26 +4951,27 @@
     </w:tbl>
     <w:p>
       <w:pPr>
-        <w:spacing w:line="480" w:lineRule="auto"/>
-        <w:rPr/>
-      </w:pPr>
-      <w:r>
-        <w:rPr>
-          <w:rFonts w:ascii="Georgia" w:hAnsi="Georgia" w:eastAsia="Georgia" w:cs="Georgia"/>
-          <w:rtl w:val="0"/>
-        </w:rPr>
-      </w:r>
-    </w:p>
-    <w:p>
-      <w:pPr>
-        <w:spacing w:line="480" w:lineRule="auto"/>
-        <w:rPr/>
-      </w:pPr>
-      <w:r>
-        <w:rPr>
-          <w:rFonts w:ascii="Georgia" w:hAnsi="Georgia" w:eastAsia="Georgia" w:cs="Georgia"/>
-          <w:i w:val="1"/>
+        <w:spacing w:line="480" w:lineRule="auto" w:before="0" w:after="0"/>
+        <w:rPr/>
+      </w:pPr>
+      <w:r>
+        <w:rPr>
+          <w:rFonts w:ascii="Georgia" w:hAnsi="Georgia" w:eastAsia="Georgia" w:cs="Georgia"/>
+          <w:rtl w:val="0"/>
+        </w:rPr>
+      </w:r>
+    </w:p>
+    <w:p>
+      <w:pPr>
+        <w:spacing w:line="480" w:lineRule="auto" w:before="0" w:after="0"/>
+        <w:rPr/>
+      </w:pPr>
+      <w:r>
+        <w:rPr>
+          <w:rFonts w:ascii="Georgia" w:hAnsi="Georgia" w:eastAsia="Georgia" w:cs="Georgia"/>
+          <w:i/>
           <w:iCs w:val="1"/>
+          <w:sz w:val="22"/>
           <w:rtl w:val="0"/>
         </w:rPr>
         <w:t xml:space="preserve">Note. Adapted from Chang (2009). This study collapses emotional and esteem support into "supportive lexicon" and operationalizes network support as "personal narrative framing," excluding informational support as less prevalent in advocacy page comments.</w:t>
@@ -4900,7 +4985,7 @@
     </w:p>
     <w:p>
       <w:pPr>
-        <w:spacing w:line="480" w:lineRule="auto"/>
+        <w:spacing w:line="480" w:lineRule="auto" w:before="0" w:after="0"/>
         <w:rPr/>
       </w:pPr>
       <w:r>

</xml_diff>

<commit_message>
Double line spacing; 0 body para gaps; 1 space after tables
Title page spacing/line-spacing left unchanged.
</commit_message>
<xml_diff>
--- a/thesis/Thesis_Instagram_MH_v11.docx
+++ b/thesis/Thesis_Instagram_MH_v11.docx
@@ -1644,7 +1644,7 @@
           </w:tcPr>
           <w:p>
             <w:pPr>
-              <w:spacing w:after="40" w:before="40" w:line="480" w:lineRule="auto"/>
+              <w:spacing w:after="0" w:before="0" w:line="480" w:lineRule="auto"/>
               <w:jc w:val="center"/>
               <w:rPr>
                 <w:sz w:val="18"/>
@@ -1671,7 +1671,7 @@
           </w:tcPr>
           <w:p>
             <w:pPr>
-              <w:spacing w:after="40" w:before="40" w:line="480" w:lineRule="auto"/>
+              <w:spacing w:after="0" w:before="0" w:line="480" w:lineRule="auto"/>
               <w:jc w:val="center"/>
               <w:rPr>
                 <w:sz w:val="18"/>
@@ -1709,7 +1709,7 @@
           </w:tcPr>
           <w:p>
             <w:pPr>
-              <w:spacing w:after="40" w:before="40" w:line="480" w:lineRule="auto"/>
+              <w:spacing w:after="0" w:before="0" w:line="480" w:lineRule="auto"/>
               <w:jc w:val="center"/>
               <w:rPr>
                 <w:sz w:val="18"/>
@@ -1746,7 +1746,7 @@
           <w:tcPr/>
           <w:p>
             <w:pPr>
-              <w:spacing w:after="40" w:before="40" w:line="480" w:lineRule="auto"/>
+              <w:spacing w:after="0" w:before="0" w:line="480" w:lineRule="auto"/>
               <w:rPr>
                 <w:sz w:val="18"/>
                 <w:szCs w:val="18"/>
@@ -1776,7 +1776,7 @@
           <w:tcPr/>
           <w:p>
             <w:pPr>
-              <w:spacing w:after="40" w:before="40" w:line="480" w:lineRule="auto"/>
+              <w:spacing w:after="0" w:before="0" w:line="480" w:lineRule="auto"/>
               <w:rPr>
                 <w:sz w:val="18"/>
                 <w:szCs w:val="18"/>
@@ -1797,7 +1797,7 @@
           <w:tcPr/>
           <w:p>
             <w:pPr>
-              <w:spacing w:after="40" w:before="40" w:line="480" w:lineRule="auto"/>
+              <w:spacing w:after="0" w:before="0" w:line="480" w:lineRule="auto"/>
               <w:rPr>
                 <w:sz w:val="18"/>
                 <w:szCs w:val="18"/>
@@ -1824,7 +1824,7 @@
           <w:tcPr/>
           <w:p>
             <w:pPr>
-              <w:spacing w:after="40" w:before="40" w:line="480" w:lineRule="auto"/>
+              <w:spacing w:after="0" w:before="0" w:line="480" w:lineRule="auto"/>
               <w:rPr>
                 <w:sz w:val="18"/>
                 <w:szCs w:val="18"/>
@@ -1854,7 +1854,7 @@
           <w:tcPr/>
           <w:p>
             <w:pPr>
-              <w:spacing w:after="40" w:before="40" w:line="480" w:lineRule="auto"/>
+              <w:spacing w:after="0" w:before="0" w:line="480" w:lineRule="auto"/>
               <w:rPr>
                 <w:sz w:val="18"/>
                 <w:szCs w:val="18"/>
@@ -1875,7 +1875,7 @@
           <w:tcPr/>
           <w:p>
             <w:pPr>
-              <w:spacing w:after="40" w:before="40" w:line="480" w:lineRule="auto"/>
+              <w:spacing w:after="0" w:before="0" w:line="480" w:lineRule="auto"/>
               <w:rPr>
                 <w:sz w:val="18"/>
                 <w:szCs w:val="18"/>
@@ -1902,7 +1902,7 @@
           <w:tcPr/>
           <w:p>
             <w:pPr>
-              <w:spacing w:after="40" w:before="40" w:line="480" w:lineRule="auto"/>
+              <w:spacing w:after="0" w:before="0" w:line="480" w:lineRule="auto"/>
               <w:rPr>
                 <w:sz w:val="18"/>
                 <w:szCs w:val="18"/>
@@ -1932,7 +1932,7 @@
           <w:tcPr/>
           <w:p>
             <w:pPr>
-              <w:spacing w:after="40" w:before="40" w:line="480" w:lineRule="auto"/>
+              <w:spacing w:after="0" w:before="0" w:line="480" w:lineRule="auto"/>
               <w:rPr>
                 <w:sz w:val="18"/>
                 <w:szCs w:val="18"/>
@@ -1953,7 +1953,7 @@
           <w:tcPr/>
           <w:p>
             <w:pPr>
-              <w:spacing w:after="40" w:before="40" w:line="480" w:lineRule="auto"/>
+              <w:spacing w:after="0" w:before="0" w:line="480" w:lineRule="auto"/>
               <w:rPr>
                 <w:sz w:val="18"/>
                 <w:szCs w:val="18"/>
@@ -1987,7 +1987,7 @@
           </w:tcPr>
           <w:p>
             <w:pPr>
-              <w:spacing w:after="40" w:before="40" w:line="480" w:lineRule="auto"/>
+              <w:spacing w:after="0" w:before="0" w:line="480" w:lineRule="auto"/>
               <w:rPr>
                 <w:sz w:val="18"/>
                 <w:szCs w:val="18"/>
@@ -2024,7 +2024,7 @@
           </w:tcPr>
           <w:p>
             <w:pPr>
-              <w:spacing w:after="40" w:before="40" w:line="480" w:lineRule="auto"/>
+              <w:spacing w:after="0" w:before="0" w:line="480" w:lineRule="auto"/>
               <w:rPr>
                 <w:sz w:val="18"/>
                 <w:szCs w:val="18"/>
@@ -2052,7 +2052,7 @@
           </w:tcPr>
           <w:p>
             <w:pPr>
-              <w:spacing w:after="40" w:before="40" w:line="480" w:lineRule="auto"/>
+              <w:spacing w:after="0" w:before="0" w:line="480" w:lineRule="auto"/>
               <w:rPr>
                 <w:sz w:val="18"/>
                 <w:szCs w:val="18"/>
@@ -2073,7 +2073,7 @@
     </w:tbl>
     <w:p>
       <w:pPr>
-        <w:spacing w:after="0" w:before="0" w:line="480" w:lineRule="auto"/>
+        <w:spacing w:after="0" w:before="240" w:line="480" w:lineRule="auto"/>
         <w:ind w:firstLine="720"/>
         <w:jc w:val="both"/>
         <w:rPr/>
@@ -3919,51 +3919,51 @@
     </w:p>
     <w:p>
       <w:pPr>
-        <w:spacing w:before="0" w:after="0"/>
-      </w:pPr>
-      <w:r>
-        <w:rPr>
-          <w:rFonts w:ascii="Georgia" w:hAnsi="Georgia" w:eastAsia="Georgia" w:cs="Georgia"/>
-          <w:sz w:val="22"/>
-        </w:rPr>
-      </w:r>
-    </w:p>
-    <w:p>
-      <w:pPr>
-        <w:spacing w:before="0" w:after="0"/>
-      </w:pPr>
-      <w:r>
-        <w:rPr>
-          <w:rFonts w:ascii="Georgia" w:hAnsi="Georgia" w:eastAsia="Georgia" w:cs="Georgia"/>
-          <w:sz w:val="22"/>
-        </w:rPr>
-      </w:r>
-    </w:p>
-    <w:p>
-      <w:pPr>
-        <w:spacing w:before="0" w:after="0"/>
-      </w:pPr>
-      <w:r>
-        <w:rPr>
-          <w:rFonts w:ascii="Georgia" w:hAnsi="Georgia" w:eastAsia="Georgia" w:cs="Georgia"/>
-          <w:sz w:val="22"/>
-        </w:rPr>
-      </w:r>
-    </w:p>
-    <w:p>
-      <w:pPr>
-        <w:spacing w:before="0" w:after="0"/>
-      </w:pPr>
-      <w:r>
-        <w:rPr>
-          <w:rFonts w:ascii="Georgia" w:hAnsi="Georgia" w:eastAsia="Georgia" w:cs="Georgia"/>
-          <w:sz w:val="22"/>
-        </w:rPr>
-      </w:r>
-    </w:p>
-    <w:p>
-      <w:pPr>
-        <w:spacing w:before="0" w:after="0"/>
+        <w:spacing w:before="0" w:after="0" w:line="480" w:lineRule="auto"/>
+      </w:pPr>
+      <w:r>
+        <w:rPr>
+          <w:rFonts w:ascii="Georgia" w:hAnsi="Georgia" w:eastAsia="Georgia" w:cs="Georgia"/>
+          <w:sz w:val="22"/>
+        </w:rPr>
+      </w:r>
+    </w:p>
+    <w:p>
+      <w:pPr>
+        <w:spacing w:before="0" w:after="0" w:line="480" w:lineRule="auto"/>
+      </w:pPr>
+      <w:r>
+        <w:rPr>
+          <w:rFonts w:ascii="Georgia" w:hAnsi="Georgia" w:eastAsia="Georgia" w:cs="Georgia"/>
+          <w:sz w:val="22"/>
+        </w:rPr>
+      </w:r>
+    </w:p>
+    <w:p>
+      <w:pPr>
+        <w:spacing w:before="0" w:after="0" w:line="480" w:lineRule="auto"/>
+      </w:pPr>
+      <w:r>
+        <w:rPr>
+          <w:rFonts w:ascii="Georgia" w:hAnsi="Georgia" w:eastAsia="Georgia" w:cs="Georgia"/>
+          <w:sz w:val="22"/>
+        </w:rPr>
+      </w:r>
+    </w:p>
+    <w:p>
+      <w:pPr>
+        <w:spacing w:before="0" w:after="0" w:line="480" w:lineRule="auto"/>
+      </w:pPr>
+      <w:r>
+        <w:rPr>
+          <w:rFonts w:ascii="Georgia" w:hAnsi="Georgia" w:eastAsia="Georgia" w:cs="Georgia"/>
+          <w:sz w:val="22"/>
+        </w:rPr>
+      </w:r>
+    </w:p>
+    <w:p>
+      <w:pPr>
+        <w:spacing w:before="0" w:after="0" w:line="480" w:lineRule="auto"/>
       </w:pPr>
       <w:r>
         <w:rPr>
@@ -4291,7 +4291,7 @@
           </w:tcPr>
           <w:p>
             <w:pPr>
-              <w:spacing w:after="40" w:before="40" w:line="480" w:lineRule="auto"/>
+              <w:spacing w:after="0" w:before="0" w:line="480" w:lineRule="auto"/>
               <w:rPr>
                 <w:sz w:val="18"/>
                 <w:szCs w:val="18"/>
@@ -4320,7 +4320,7 @@
           </w:tcPr>
           <w:p>
             <w:pPr>
-              <w:spacing w:after="40" w:before="40" w:line="480" w:lineRule="auto"/>
+              <w:spacing w:after="0" w:before="0" w:line="480" w:lineRule="auto"/>
               <w:rPr>
                 <w:sz w:val="18"/>
                 <w:szCs w:val="18"/>
@@ -4397,7 +4397,7 @@
           </w:tcPr>
           <w:p>
             <w:pPr>
-              <w:spacing w:after="40" w:before="40" w:line="480" w:lineRule="auto"/>
+              <w:spacing w:after="0" w:before="0" w:line="480" w:lineRule="auto"/>
               <w:rPr>
                 <w:sz w:val="18"/>
                 <w:szCs w:val="18"/>
@@ -4432,7 +4432,7 @@
           </w:tcPr>
           <w:p>
             <w:pPr>
-              <w:spacing w:after="40" w:before="40" w:line="480" w:lineRule="auto"/>
+              <w:spacing w:after="0" w:before="0" w:line="480" w:lineRule="auto"/>
               <w:rPr>
                 <w:sz w:val="18"/>
                 <w:szCs w:val="18"/>
@@ -4453,7 +4453,7 @@
     </w:tbl>
     <w:p>
       <w:pPr>
-        <w:spacing w:line="480" w:lineRule="auto" w:before="0" w:after="0"/>
+        <w:spacing w:line="480" w:lineRule="auto" w:before="240" w:after="0"/>
         <w:rPr>
           <w:sz w:val="20"/>
           <w:szCs w:val="20"/>
@@ -4894,7 +4894,7 @@
           </w:tcPr>
           <w:p>
             <w:pPr>
-              <w:spacing w:after="40" w:before="40" w:line="480" w:lineRule="auto"/>
+              <w:spacing w:after="0" w:before="0" w:line="480" w:lineRule="auto"/>
               <w:rPr>
                 <w:sz w:val="18"/>
                 <w:szCs w:val="18"/>
@@ -4951,7 +4951,7 @@
     </w:tbl>
     <w:p>
       <w:pPr>
-        <w:spacing w:line="480" w:lineRule="auto" w:before="0" w:after="0"/>
+        <w:spacing w:line="480" w:lineRule="auto" w:before="240" w:after="0"/>
         <w:rPr/>
       </w:pPr>
       <w:r>

</xml_diff>

<commit_message>
Full formatting repass: hierarchy, double spacing, first-line indent
Title page unchanged. Major 14/3+3, minor 12/1+0, body 11 first-line
indent double-spaced, tables 9pt, 1 space after tables, Georgia throughout.
</commit_message>
<xml_diff>
--- a/thesis/Thesis_Instagram_MH_v11.docx
+++ b/thesis/Thesis_Instagram_MH_v11.docx
@@ -423,6 +423,7 @@
     <w:p>
       <w:pPr>
         <w:spacing w:after="720" w:before="720" w:line="480" w:lineRule="auto"/>
+        <w:ind w:firstLine="0" w:left="0"/>
         <w:jc w:val="center"/>
         <w:rPr/>
       </w:pPr>
@@ -449,6 +450,7 @@
       <w:pPr>
         <w:keepNext w:val="1"/>
         <w:spacing w:after="0" w:before="0" w:line="480" w:lineRule="auto"/>
+        <w:ind w:firstLine="0" w:left="0"/>
         <w:jc w:val="left"/>
         <w:rPr>
           <w:b w:val="1"/>
@@ -468,6 +470,7 @@
       <w:pPr>
         <w:keepNext w:val="1"/>
         <w:spacing w:after="720" w:before="720" w:line="480" w:lineRule="auto"/>
+        <w:ind w:firstLine="0" w:left="0"/>
         <w:jc w:val="left"/>
         <w:rPr/>
       </w:pPr>
@@ -493,7 +496,7 @@
     <w:p>
       <w:pPr>
         <w:spacing w:line="480" w:lineRule="auto" w:before="0" w:after="0"/>
-        <w:ind w:firstLine="720"/>
+        <w:ind w:left="0" w:firstLine="720"/>
         <w:jc w:val="both"/>
         <w:rPr/>
       </w:pPr>
@@ -516,7 +519,7 @@
     <w:p>
       <w:pPr>
         <w:spacing w:line="480" w:lineRule="auto" w:before="0" w:after="0"/>
-        <w:ind w:firstLine="720"/>
+        <w:ind w:left="0" w:firstLine="720"/>
         <w:jc w:val="both"/>
         <w:rPr/>
       </w:pPr>
@@ -540,6 +543,7 @@
       <w:pPr>
         <w:keepNext w:val="1"/>
         <w:spacing w:after="0" w:before="240" w:line="480" w:lineRule="auto"/>
+        <w:ind w:firstLine="0" w:left="0"/>
         <w:jc w:val="left"/>
         <w:rPr/>
       </w:pPr>
@@ -565,7 +569,7 @@
     <w:p>
       <w:pPr>
         <w:spacing w:line="480" w:lineRule="auto" w:before="0" w:after="0"/>
-        <w:ind w:firstLine="720"/>
+        <w:ind w:left="0" w:firstLine="720"/>
         <w:jc w:val="both"/>
         <w:rPr/>
       </w:pPr>
@@ -588,7 +592,7 @@
     <w:p>
       <w:pPr>
         <w:spacing w:line="480" w:lineRule="auto" w:before="0" w:after="0"/>
-        <w:ind w:firstLine="720"/>
+        <w:ind w:left="0" w:firstLine="720"/>
         <w:jc w:val="both"/>
         <w:rPr/>
       </w:pPr>
@@ -611,7 +615,7 @@
     <w:p>
       <w:pPr>
         <w:spacing w:line="480" w:lineRule="auto" w:before="0" w:after="0"/>
-        <w:ind w:firstLine="720"/>
+        <w:ind w:left="0" w:firstLine="720"/>
         <w:jc w:val="both"/>
         <w:rPr/>
       </w:pPr>
@@ -634,7 +638,7 @@
     <w:p>
       <w:pPr>
         <w:spacing w:line="480" w:lineRule="auto" w:before="0" w:after="0"/>
-        <w:ind w:firstLine="720"/>
+        <w:ind w:left="0" w:firstLine="720"/>
         <w:jc w:val="both"/>
         <w:rPr/>
       </w:pPr>
@@ -657,7 +661,7 @@
     <w:p>
       <w:pPr>
         <w:spacing w:line="480" w:lineRule="auto" w:before="0" w:after="0"/>
-        <w:ind w:firstLine="720"/>
+        <w:ind w:left="0" w:firstLine="720"/>
         <w:jc w:val="both"/>
         <w:rPr/>
       </w:pPr>
@@ -680,7 +684,7 @@
     <w:p>
       <w:pPr>
         <w:spacing w:line="480" w:lineRule="auto" w:before="0" w:after="0"/>
-        <w:ind w:firstLine="720"/>
+        <w:ind w:left="0" w:firstLine="720"/>
         <w:jc w:val="both"/>
         <w:rPr/>
       </w:pPr>
@@ -703,7 +707,7 @@
     <w:p>
       <w:pPr>
         <w:spacing w:line="480" w:lineRule="auto" w:before="0" w:after="0"/>
-        <w:ind w:firstLine="720"/>
+        <w:ind w:left="0" w:firstLine="720"/>
         <w:jc w:val="both"/>
         <w:rPr/>
       </w:pPr>
@@ -726,7 +730,7 @@
     <w:p>
       <w:pPr>
         <w:spacing w:line="480" w:lineRule="auto" w:before="0" w:after="0"/>
-        <w:ind w:firstLine="720"/>
+        <w:ind w:left="0" w:firstLine="720"/>
         <w:jc w:val="both"/>
         <w:rPr/>
       </w:pPr>
@@ -749,7 +753,7 @@
     <w:p>
       <w:pPr>
         <w:spacing w:line="480" w:lineRule="auto" w:before="0" w:after="0"/>
-        <w:ind w:firstLine="720"/>
+        <w:ind w:left="0" w:firstLine="720"/>
         <w:jc w:val="both"/>
         <w:rPr/>
       </w:pPr>
@@ -773,6 +777,7 @@
       <w:pPr>
         <w:keepNext w:val="1"/>
         <w:spacing w:after="0" w:before="240" w:line="480" w:lineRule="auto"/>
+        <w:ind w:firstLine="0" w:left="0"/>
         <w:jc w:val="left"/>
         <w:rPr/>
       </w:pPr>
@@ -798,7 +803,7 @@
     <w:p>
       <w:pPr>
         <w:spacing w:line="480" w:lineRule="auto" w:before="0" w:after="0"/>
-        <w:ind w:firstLine="720"/>
+        <w:ind w:left="0" w:firstLine="720"/>
         <w:jc w:val="both"/>
         <w:rPr/>
       </w:pPr>
@@ -821,7 +826,7 @@
     <w:p>
       <w:pPr>
         <w:spacing w:line="480" w:lineRule="auto" w:before="0" w:after="0"/>
-        <w:ind w:firstLine="720"/>
+        <w:ind w:left="0" w:firstLine="720"/>
         <w:jc w:val="both"/>
         <w:rPr/>
       </w:pPr>
@@ -844,7 +849,7 @@
     <w:p>
       <w:pPr>
         <w:spacing w:line="480" w:lineRule="auto" w:before="0" w:after="0"/>
-        <w:ind w:firstLine="720"/>
+        <w:ind w:left="0" w:firstLine="720"/>
         <w:jc w:val="both"/>
         <w:rPr/>
       </w:pPr>
@@ -867,7 +872,7 @@
     <w:p>
       <w:pPr>
         <w:spacing w:line="480" w:lineRule="auto" w:before="0" w:after="0"/>
-        <w:ind w:firstLine="720"/>
+        <w:ind w:left="0" w:firstLine="720"/>
         <w:jc w:val="both"/>
         <w:rPr/>
       </w:pPr>
@@ -890,7 +895,7 @@
     <w:p>
       <w:pPr>
         <w:spacing w:line="480" w:lineRule="auto" w:before="0" w:after="0"/>
-        <w:ind w:firstLine="720"/>
+        <w:ind w:left="0" w:firstLine="720"/>
         <w:jc w:val="both"/>
         <w:rPr/>
       </w:pPr>
@@ -913,7 +918,7 @@
     <w:p>
       <w:pPr>
         <w:spacing w:line="480" w:lineRule="auto" w:before="0" w:after="0"/>
-        <w:ind w:firstLine="720"/>
+        <w:ind w:left="0" w:firstLine="720"/>
         <w:jc w:val="both"/>
         <w:rPr>
           <w:sz w:val="22"/>
@@ -933,7 +938,7 @@
     <w:p>
       <w:pPr>
         <w:spacing w:line="480" w:lineRule="auto" w:before="0" w:after="0"/>
-        <w:ind w:firstLine="720"/>
+        <w:ind w:firstLine="0" w:left="0"/>
         <w:jc w:val="both"/>
         <w:rPr/>
       </w:pPr>
@@ -947,6 +952,7 @@
     <w:p>
       <w:pPr>
         <w:spacing w:line="480" w:lineRule="auto" w:before="240" w:after="0"/>
+        <w:ind w:firstLine="0" w:left="0"/>
         <w:jc w:val="left"/>
         <w:rPr>
           <w:i w:val="1"/>
@@ -971,21 +977,21 @@
     <w:p>
       <w:pPr>
         <w:spacing w:line="480" w:lineRule="auto" w:before="0" w:after="0"/>
-        <w:ind w:firstLine="720"/>
-        <w:jc w:val="both"/>
-        <w:rPr/>
-      </w:pPr>
-      <w:r>
-        <w:rPr>
-          <w:rFonts w:ascii="Georgia" w:hAnsi="Georgia" w:eastAsia="Georgia" w:cs="Georgia"/>
-          <w:rtl w:val="0"/>
-        </w:rPr>
-      </w:r>
-    </w:p>
-    <w:p>
-      <w:pPr>
-        <w:spacing w:line="480" w:lineRule="auto" w:before="0" w:after="0"/>
-        <w:ind w:firstLine="720"/>
+        <w:ind w:firstLine="0" w:left="0"/>
+        <w:jc w:val="both"/>
+        <w:rPr/>
+      </w:pPr>
+      <w:r>
+        <w:rPr>
+          <w:rFonts w:ascii="Georgia" w:hAnsi="Georgia" w:eastAsia="Georgia" w:cs="Georgia"/>
+          <w:rtl w:val="0"/>
+        </w:rPr>
+      </w:r>
+    </w:p>
+    <w:p>
+      <w:pPr>
+        <w:spacing w:line="480" w:lineRule="auto" w:before="0" w:after="0"/>
+        <w:ind w:left="0" w:firstLine="720"/>
         <w:jc w:val="both"/>
         <w:rPr/>
       </w:pPr>
@@ -1008,7 +1014,7 @@
     <w:p>
       <w:pPr>
         <w:spacing w:line="480" w:lineRule="auto" w:before="0" w:after="0"/>
-        <w:ind w:firstLine="720"/>
+        <w:ind w:left="0" w:firstLine="720"/>
         <w:jc w:val="both"/>
         <w:rPr/>
       </w:pPr>
@@ -1031,7 +1037,7 @@
     <w:p>
       <w:pPr>
         <w:spacing w:line="480" w:lineRule="auto" w:before="0" w:after="0"/>
-        <w:ind w:firstLine="720"/>
+        <w:ind w:left="0" w:firstLine="720"/>
         <w:jc w:val="both"/>
         <w:rPr/>
       </w:pPr>
@@ -1054,7 +1060,7 @@
     <w:p>
       <w:pPr>
         <w:spacing w:line="480" w:lineRule="auto" w:before="0" w:after="0"/>
-        <w:ind w:firstLine="720"/>
+        <w:ind w:left="0" w:firstLine="720"/>
         <w:jc w:val="both"/>
         <w:rPr/>
       </w:pPr>
@@ -1077,7 +1083,7 @@
     <w:p>
       <w:pPr>
         <w:spacing w:line="480" w:lineRule="auto" w:before="0" w:after="0"/>
-        <w:ind w:firstLine="720"/>
+        <w:ind w:left="0" w:firstLine="720"/>
         <w:jc w:val="both"/>
         <w:rPr/>
       </w:pPr>
@@ -1101,6 +1107,7 @@
       <w:pPr>
         <w:keepNext w:val="1"/>
         <w:spacing w:after="0" w:before="240" w:line="480" w:lineRule="auto"/>
+        <w:ind w:firstLine="0" w:left="0"/>
         <w:jc w:val="left"/>
         <w:rPr/>
       </w:pPr>
@@ -1126,7 +1133,7 @@
     <w:p>
       <w:pPr>
         <w:spacing w:line="480" w:lineRule="auto" w:before="0" w:after="0"/>
-        <w:ind w:firstLine="720"/>
+        <w:ind w:left="0" w:firstLine="720"/>
         <w:jc w:val="both"/>
         <w:rPr/>
       </w:pPr>
@@ -1151,7 +1158,7 @@
     <w:p>
       <w:pPr>
         <w:spacing w:line="480" w:lineRule="auto" w:before="0" w:after="0"/>
-        <w:ind w:firstLine="720"/>
+        <w:ind w:left="0" w:firstLine="720"/>
         <w:jc w:val="both"/>
         <w:rPr/>
       </w:pPr>
@@ -1176,7 +1183,7 @@
     <w:p>
       <w:pPr>
         <w:spacing w:line="480" w:lineRule="auto" w:before="0" w:after="0"/>
-        <w:ind w:firstLine="720"/>
+        <w:ind w:left="0" w:firstLine="720"/>
         <w:jc w:val="both"/>
         <w:rPr/>
       </w:pPr>
@@ -1201,7 +1208,7 @@
     <w:p>
       <w:pPr>
         <w:spacing w:line="480" w:lineRule="auto" w:before="0" w:after="0"/>
-        <w:ind w:firstLine="720"/>
+        <w:ind w:left="0" w:firstLine="720"/>
         <w:jc w:val="both"/>
         <w:rPr/>
       </w:pPr>
@@ -1226,7 +1233,7 @@
     <w:p>
       <w:pPr>
         <w:spacing w:line="480" w:lineRule="auto" w:before="0" w:after="0"/>
-        <w:ind w:firstLine="720"/>
+        <w:ind w:left="0" w:firstLine="720"/>
         <w:jc w:val="both"/>
         <w:rPr/>
       </w:pPr>
@@ -1252,6 +1259,7 @@
       <w:pPr>
         <w:keepNext w:val="1"/>
         <w:spacing w:after="0" w:before="240" w:line="480" w:lineRule="auto"/>
+        <w:ind w:firstLine="0" w:left="0"/>
         <w:jc w:val="left"/>
         <w:rPr/>
       </w:pPr>
@@ -1277,7 +1285,7 @@
     <w:p>
       <w:pPr>
         <w:spacing w:line="480" w:lineRule="auto" w:before="0" w:after="0"/>
-        <w:ind w:firstLine="720"/>
+        <w:ind w:left="0" w:firstLine="720"/>
         <w:jc w:val="both"/>
         <w:rPr/>
       </w:pPr>
@@ -1300,7 +1308,7 @@
     <w:p>
       <w:pPr>
         <w:spacing w:line="480" w:lineRule="auto" w:before="0" w:after="0"/>
-        <w:ind w:firstLine="720"/>
+        <w:ind w:left="0" w:firstLine="720"/>
         <w:jc w:val="both"/>
         <w:rPr/>
       </w:pPr>
@@ -1323,7 +1331,7 @@
     <w:p>
       <w:pPr>
         <w:spacing w:line="480" w:lineRule="auto" w:before="0" w:after="0"/>
-        <w:ind w:firstLine="720"/>
+        <w:ind w:left="0" w:firstLine="720"/>
         <w:jc w:val="both"/>
         <w:rPr/>
       </w:pPr>
@@ -1346,7 +1354,7 @@
     <w:p>
       <w:pPr>
         <w:spacing w:line="480" w:lineRule="auto" w:before="0" w:after="0"/>
-        <w:ind w:firstLine="720"/>
+        <w:ind w:left="0" w:firstLine="720"/>
         <w:jc w:val="both"/>
         <w:rPr/>
       </w:pPr>
@@ -1370,6 +1378,7 @@
       <w:pPr>
         <w:keepNext w:val="1"/>
         <w:spacing w:after="720" w:before="720" w:line="480" w:lineRule="auto"/>
+        <w:ind w:firstLine="0" w:left="0"/>
         <w:jc w:val="left"/>
         <w:rPr/>
       </w:pPr>
@@ -1395,7 +1404,7 @@
     <w:p>
       <w:pPr>
         <w:spacing w:line="480" w:lineRule="auto" w:before="0" w:after="0"/>
-        <w:ind w:firstLine="720"/>
+        <w:ind w:left="0" w:firstLine="720"/>
         <w:jc w:val="both"/>
         <w:rPr>
           <w:b w:val="1"/>
@@ -1422,6 +1431,7 @@
     <w:p>
       <w:pPr>
         <w:spacing w:line="480" w:lineRule="auto" w:before="0" w:after="0"/>
+        <w:ind w:left="0" w:firstLine="720"/>
         <w:jc w:val="both"/>
         <w:rPr/>
       </w:pPr>
@@ -1444,6 +1454,7 @@
     <w:p>
       <w:pPr>
         <w:spacing w:line="480" w:lineRule="auto" w:before="0" w:after="0"/>
+        <w:ind w:left="0" w:firstLine="720"/>
         <w:jc w:val="both"/>
         <w:rPr/>
       </w:pPr>
@@ -1466,6 +1477,7 @@
     <w:p>
       <w:pPr>
         <w:spacing w:line="480" w:lineRule="auto" w:before="0" w:after="0"/>
+        <w:ind w:left="0" w:firstLine="720"/>
         <w:jc w:val="both"/>
         <w:rPr/>
       </w:pPr>
@@ -1489,6 +1501,7 @@
       <w:pPr>
         <w:keepNext w:val="1"/>
         <w:spacing w:after="720" w:before="720" w:line="480" w:lineRule="auto"/>
+        <w:ind w:firstLine="0" w:left="0"/>
         <w:jc w:val="left"/>
         <w:rPr/>
       </w:pPr>
@@ -1514,7 +1527,7 @@
     <w:p>
       <w:pPr>
         <w:spacing w:line="480" w:lineRule="auto" w:before="0" w:after="0"/>
-        <w:ind w:firstLine="720"/>
+        <w:ind w:left="0" w:firstLine="720"/>
         <w:jc w:val="both"/>
         <w:rPr/>
       </w:pPr>
@@ -1537,7 +1550,7 @@
     <w:p>
       <w:pPr>
         <w:spacing w:after="0" w:before="0" w:line="480" w:lineRule="auto"/>
-        <w:ind w:firstLine="720"/>
+        <w:ind w:left="0" w:firstLine="720"/>
         <w:jc w:val="both"/>
         <w:rPr/>
       </w:pPr>
@@ -1562,6 +1575,7 @@
     <w:p>
       <w:pPr>
         <w:spacing w:after="0" w:before="240" w:line="480" w:lineRule="auto"/>
+        <w:ind w:firstLine="0" w:left="0"/>
         <w:jc w:val="center"/>
         <w:rPr/>
       </w:pPr>
@@ -1587,6 +1601,7 @@
     <w:p>
       <w:pPr>
         <w:spacing w:after="120" w:before="0" w:line="480" w:lineRule="auto"/>
+        <w:ind w:firstLine="0" w:left="0"/>
         <w:jc w:val="center"/>
         <w:rPr/>
       </w:pPr>
@@ -1645,6 +1660,7 @@
           <w:p>
             <w:pPr>
               <w:spacing w:after="0" w:before="0" w:line="480" w:lineRule="auto"/>
+              <w:ind w:firstLine="0"/>
               <w:jc w:val="center"/>
               <w:rPr>
                 <w:sz w:val="18"/>
@@ -1672,6 +1688,7 @@
           <w:p>
             <w:pPr>
               <w:spacing w:after="0" w:before="0" w:line="480" w:lineRule="auto"/>
+              <w:ind w:firstLine="0"/>
               <w:jc w:val="center"/>
               <w:rPr>
                 <w:sz w:val="18"/>
@@ -1710,6 +1727,7 @@
           <w:p>
             <w:pPr>
               <w:spacing w:after="0" w:before="0" w:line="480" w:lineRule="auto"/>
+              <w:ind w:firstLine="0"/>
               <w:jc w:val="center"/>
               <w:rPr>
                 <w:sz w:val="18"/>
@@ -1747,6 +1765,7 @@
           <w:p>
             <w:pPr>
               <w:spacing w:after="0" w:before="0" w:line="480" w:lineRule="auto"/>
+              <w:ind w:firstLine="0"/>
               <w:rPr>
                 <w:sz w:val="18"/>
                 <w:szCs w:val="18"/>
@@ -1777,6 +1796,7 @@
           <w:p>
             <w:pPr>
               <w:spacing w:after="0" w:before="0" w:line="480" w:lineRule="auto"/>
+              <w:ind w:firstLine="0"/>
               <w:rPr>
                 <w:sz w:val="18"/>
                 <w:szCs w:val="18"/>
@@ -1798,6 +1818,7 @@
           <w:p>
             <w:pPr>
               <w:spacing w:after="0" w:before="0" w:line="480" w:lineRule="auto"/>
+              <w:ind w:firstLine="0"/>
               <w:rPr>
                 <w:sz w:val="18"/>
                 <w:szCs w:val="18"/>
@@ -1825,6 +1846,7 @@
           <w:p>
             <w:pPr>
               <w:spacing w:after="0" w:before="0" w:line="480" w:lineRule="auto"/>
+              <w:ind w:firstLine="0"/>
               <w:rPr>
                 <w:sz w:val="18"/>
                 <w:szCs w:val="18"/>
@@ -1855,6 +1877,7 @@
           <w:p>
             <w:pPr>
               <w:spacing w:after="0" w:before="0" w:line="480" w:lineRule="auto"/>
+              <w:ind w:firstLine="0"/>
               <w:rPr>
                 <w:sz w:val="18"/>
                 <w:szCs w:val="18"/>
@@ -1876,6 +1899,7 @@
           <w:p>
             <w:pPr>
               <w:spacing w:after="0" w:before="0" w:line="480" w:lineRule="auto"/>
+              <w:ind w:firstLine="0"/>
               <w:rPr>
                 <w:sz w:val="18"/>
                 <w:szCs w:val="18"/>
@@ -1903,6 +1927,7 @@
           <w:p>
             <w:pPr>
               <w:spacing w:after="0" w:before="0" w:line="480" w:lineRule="auto"/>
+              <w:ind w:firstLine="0"/>
               <w:rPr>
                 <w:sz w:val="18"/>
                 <w:szCs w:val="18"/>
@@ -1933,6 +1958,7 @@
           <w:p>
             <w:pPr>
               <w:spacing w:after="0" w:before="0" w:line="480" w:lineRule="auto"/>
+              <w:ind w:firstLine="0"/>
               <w:rPr>
                 <w:sz w:val="18"/>
                 <w:szCs w:val="18"/>
@@ -1954,6 +1980,7 @@
           <w:p>
             <w:pPr>
               <w:spacing w:after="0" w:before="0" w:line="480" w:lineRule="auto"/>
+              <w:ind w:firstLine="0"/>
               <w:rPr>
                 <w:sz w:val="18"/>
                 <w:szCs w:val="18"/>
@@ -1988,6 +2015,7 @@
           <w:p>
             <w:pPr>
               <w:spacing w:after="0" w:before="0" w:line="480" w:lineRule="auto"/>
+              <w:ind w:firstLine="0"/>
               <w:rPr>
                 <w:sz w:val="18"/>
                 <w:szCs w:val="18"/>
@@ -2025,6 +2053,7 @@
           <w:p>
             <w:pPr>
               <w:spacing w:after="0" w:before="0" w:line="480" w:lineRule="auto"/>
+              <w:ind w:firstLine="0"/>
               <w:rPr>
                 <w:sz w:val="18"/>
                 <w:szCs w:val="18"/>
@@ -2053,6 +2082,7 @@
           <w:p>
             <w:pPr>
               <w:spacing w:after="0" w:before="0" w:line="480" w:lineRule="auto"/>
+              <w:ind w:firstLine="0"/>
               <w:rPr>
                 <w:sz w:val="18"/>
                 <w:szCs w:val="18"/>
@@ -2074,7 +2104,7 @@
     <w:p>
       <w:pPr>
         <w:spacing w:after="0" w:before="240" w:line="480" w:lineRule="auto"/>
-        <w:ind w:firstLine="720"/>
+        <w:ind w:firstLine="0" w:left="0"/>
         <w:jc w:val="both"/>
         <w:rPr/>
       </w:pPr>
@@ -2088,7 +2118,7 @@
     <w:p>
       <w:pPr>
         <w:spacing w:after="0" w:before="0" w:line="480" w:lineRule="auto"/>
-        <w:ind w:firstLine="720"/>
+        <w:ind w:left="0" w:firstLine="720"/>
         <w:jc w:val="both"/>
         <w:rPr/>
       </w:pPr>
@@ -2111,7 +2141,7 @@
     <w:p>
       <w:pPr>
         <w:spacing w:after="0" w:before="0" w:line="480" w:lineRule="auto"/>
-        <w:ind w:firstLine="720"/>
+        <w:ind w:left="0" w:firstLine="720"/>
         <w:jc w:val="both"/>
         <w:rPr/>
       </w:pPr>
@@ -2127,7 +2157,7 @@
     <w:p>
       <w:pPr>
         <w:spacing w:line="480" w:lineRule="auto" w:before="0" w:after="0"/>
-        <w:ind w:firstLine="720"/>
+        <w:ind w:left="0" w:firstLine="720"/>
         <w:jc w:val="both"/>
         <w:rPr/>
       </w:pPr>
@@ -2151,6 +2181,7 @@
       <w:pPr>
         <w:keepNext w:val="1"/>
         <w:spacing w:after="720" w:before="720" w:line="480" w:lineRule="auto"/>
+        <w:ind w:firstLine="0" w:left="0"/>
         <w:jc w:val="left"/>
         <w:rPr/>
       </w:pPr>
@@ -2176,7 +2207,7 @@
     <w:p>
       <w:pPr>
         <w:spacing w:line="480" w:lineRule="auto" w:before="0" w:after="0"/>
-        <w:ind w:firstLine="720"/>
+        <w:ind w:left="0" w:firstLine="720"/>
         <w:jc w:val="both"/>
         <w:rPr/>
       </w:pPr>
@@ -2199,7 +2230,7 @@
     <w:p>
       <w:pPr>
         <w:spacing w:line="480" w:lineRule="auto" w:before="0" w:after="0"/>
-        <w:ind w:left="0" w:firstLine="0"/>
+        <w:ind w:left="0" w:firstLine="720"/>
         <w:jc w:val="both"/>
         <w:rPr/>
       </w:pPr>
@@ -2233,7 +2264,7 @@
     <w:p>
       <w:pPr>
         <w:spacing w:line="480" w:lineRule="auto" w:before="0" w:after="0"/>
-        <w:ind w:left="0" w:firstLine="0"/>
+        <w:ind w:left="0" w:firstLine="720"/>
         <w:jc w:val="both"/>
         <w:rPr/>
       </w:pPr>
@@ -2267,7 +2298,7 @@
     <w:p>
       <w:pPr>
         <w:spacing w:line="480" w:lineRule="auto" w:before="0" w:after="0"/>
-        <w:ind w:left="0" w:firstLine="0"/>
+        <w:ind w:left="0" w:firstLine="720"/>
         <w:jc w:val="both"/>
         <w:rPr/>
       </w:pPr>
@@ -2301,7 +2332,7 @@
     <w:p>
       <w:pPr>
         <w:spacing w:line="480" w:lineRule="auto" w:before="0" w:after="0"/>
-        <w:ind w:left="0" w:firstLine="0"/>
+        <w:ind w:left="0" w:firstLine="720"/>
         <w:jc w:val="both"/>
         <w:rPr/>
       </w:pPr>
@@ -2335,7 +2366,7 @@
     <w:p>
       <w:pPr>
         <w:spacing w:line="480" w:lineRule="auto" w:before="0" w:after="0"/>
-        <w:ind w:firstLine="720"/>
+        <w:ind w:left="0" w:firstLine="720"/>
         <w:jc w:val="both"/>
         <w:rPr/>
       </w:pPr>
@@ -2359,6 +2390,7 @@
       <w:pPr>
         <w:keepNext w:val="1"/>
         <w:spacing w:after="720" w:before="720" w:line="480" w:lineRule="auto"/>
+        <w:ind w:firstLine="0" w:left="0"/>
         <w:jc w:val="left"/>
         <w:rPr/>
       </w:pPr>
@@ -2385,6 +2417,7 @@
       <w:pPr>
         <w:keepNext w:val="1"/>
         <w:spacing w:after="0" w:before="0" w:line="480" w:lineRule="auto"/>
+        <w:ind w:firstLine="0" w:left="0"/>
         <w:jc w:val="left"/>
         <w:rPr/>
       </w:pPr>
@@ -2410,7 +2443,7 @@
     <w:p>
       <w:pPr>
         <w:spacing w:line="480" w:lineRule="auto" w:before="0" w:after="0"/>
-        <w:ind w:firstLine="720"/>
+        <w:ind w:left="0" w:firstLine="720"/>
         <w:jc w:val="both"/>
         <w:rPr/>
       </w:pPr>
@@ -2433,6 +2466,7 @@
     <w:p>
       <w:pPr>
         <w:spacing w:line="480" w:lineRule="auto" w:before="0" w:after="0"/>
+        <w:ind w:firstLine="0" w:left="0"/>
         <w:rPr/>
       </w:pPr>
       <w:r>
@@ -2446,6 +2480,7 @@
       <w:pPr>
         <w:keepNext w:val="1"/>
         <w:spacing w:after="0" w:before="240" w:line="480" w:lineRule="auto"/>
+        <w:ind w:firstLine="0" w:left="0"/>
         <w:jc w:val="left"/>
         <w:rPr/>
       </w:pPr>
@@ -2471,7 +2506,7 @@
     <w:p>
       <w:pPr>
         <w:spacing w:line="480" w:lineRule="auto" w:before="0" w:after="0"/>
-        <w:ind w:firstLine="720"/>
+        <w:ind w:left="0" w:firstLine="720"/>
         <w:jc w:val="both"/>
         <w:rPr/>
       </w:pPr>
@@ -2494,7 +2529,7 @@
     <w:p>
       <w:pPr>
         <w:spacing w:line="480" w:lineRule="auto" w:before="0" w:after="0"/>
-        <w:ind w:firstLine="720"/>
+        <w:ind w:left="0" w:firstLine="720"/>
         <w:jc w:val="both"/>
         <w:rPr/>
       </w:pPr>
@@ -2511,6 +2546,7 @@
       <w:pPr>
         <w:keepNext w:val="1"/>
         <w:spacing w:after="0" w:before="240" w:line="480" w:lineRule="auto"/>
+        <w:ind w:firstLine="0" w:left="0"/>
         <w:jc w:val="left"/>
         <w:rPr/>
       </w:pPr>
@@ -2536,7 +2572,7 @@
     <w:p>
       <w:pPr>
         <w:spacing w:line="480" w:lineRule="auto" w:before="0" w:after="0"/>
-        <w:ind w:firstLine="720"/>
+        <w:ind w:left="0" w:firstLine="720"/>
         <w:jc w:val="both"/>
         <w:rPr/>
       </w:pPr>
@@ -2560,6 +2596,7 @@
       <w:pPr>
         <w:keepNext w:val="1"/>
         <w:spacing w:after="720" w:before="720" w:line="480" w:lineRule="auto"/>
+        <w:ind w:firstLine="0" w:left="0"/>
         <w:jc w:val="left"/>
         <w:rPr/>
       </w:pPr>
@@ -2585,7 +2622,7 @@
     <w:p>
       <w:pPr>
         <w:spacing w:line="480" w:lineRule="auto" w:before="0" w:after="0"/>
-        <w:ind w:left="0" w:firstLine="0"/>
+        <w:ind w:left="0" w:firstLine="720"/>
         <w:jc w:val="both"/>
         <w:rPr/>
       </w:pPr>
@@ -2608,19 +2645,20 @@
     <w:p>
       <w:pPr>
         <w:spacing w:line="480" w:lineRule="auto" w:before="0" w:after="0"/>
-        <w:rPr/>
-      </w:pPr>
-      <w:r>
-        <w:rPr>
-          <w:rFonts w:ascii="Georgia" w:hAnsi="Georgia" w:eastAsia="Georgia" w:cs="Georgia"/>
-          <w:rtl w:val="0"/>
-        </w:rPr>
-      </w:r>
-    </w:p>
-    <w:p>
-      <w:pPr>
-        <w:spacing w:line="480" w:lineRule="auto" w:before="0" w:after="0"/>
-        <w:ind w:left="0" w:firstLine="0"/>
+        <w:ind w:firstLine="0" w:left="0"/>
+        <w:rPr/>
+      </w:pPr>
+      <w:r>
+        <w:rPr>
+          <w:rFonts w:ascii="Georgia" w:hAnsi="Georgia" w:eastAsia="Georgia" w:cs="Georgia"/>
+          <w:rtl w:val="0"/>
+        </w:rPr>
+      </w:r>
+    </w:p>
+    <w:p>
+      <w:pPr>
+        <w:spacing w:line="480" w:lineRule="auto" w:before="0" w:after="0"/>
+        <w:ind w:left="0" w:firstLine="720"/>
         <w:jc w:val="both"/>
         <w:rPr/>
       </w:pPr>
@@ -2644,19 +2682,20 @@
     <w:p>
       <w:pPr>
         <w:spacing w:line="480" w:lineRule="auto" w:before="0" w:after="0"/>
-        <w:rPr/>
-      </w:pPr>
-      <w:r>
-        <w:rPr>
-          <w:rFonts w:ascii="Georgia" w:hAnsi="Georgia" w:eastAsia="Georgia" w:cs="Georgia"/>
-          <w:rtl w:val="0"/>
-        </w:rPr>
-      </w:r>
-    </w:p>
-    <w:p>
-      <w:pPr>
-        <w:spacing w:line="480" w:lineRule="auto" w:before="0" w:after="0"/>
-        <w:ind w:left="0" w:firstLine="0"/>
+        <w:ind w:firstLine="0" w:left="0"/>
+        <w:rPr/>
+      </w:pPr>
+      <w:r>
+        <w:rPr>
+          <w:rFonts w:ascii="Georgia" w:hAnsi="Georgia" w:eastAsia="Georgia" w:cs="Georgia"/>
+          <w:rtl w:val="0"/>
+        </w:rPr>
+      </w:r>
+    </w:p>
+    <w:p>
+      <w:pPr>
+        <w:spacing w:line="480" w:lineRule="auto" w:before="0" w:after="0"/>
+        <w:ind w:left="0" w:firstLine="720"/>
         <w:jc w:val="both"/>
         <w:rPr/>
       </w:pPr>
@@ -2680,19 +2719,20 @@
     <w:p>
       <w:pPr>
         <w:spacing w:line="480" w:lineRule="auto" w:before="0" w:after="0"/>
-        <w:rPr/>
-      </w:pPr>
-      <w:r>
-        <w:rPr>
-          <w:rFonts w:ascii="Georgia" w:hAnsi="Georgia" w:eastAsia="Georgia" w:cs="Georgia"/>
-          <w:rtl w:val="0"/>
-        </w:rPr>
-      </w:r>
-    </w:p>
-    <w:p>
-      <w:pPr>
-        <w:spacing w:line="480" w:lineRule="auto" w:before="0" w:after="0"/>
-        <w:ind w:left="0" w:firstLine="0"/>
+        <w:ind w:firstLine="0" w:left="0"/>
+        <w:rPr/>
+      </w:pPr>
+      <w:r>
+        <w:rPr>
+          <w:rFonts w:ascii="Georgia" w:hAnsi="Georgia" w:eastAsia="Georgia" w:cs="Georgia"/>
+          <w:rtl w:val="0"/>
+        </w:rPr>
+      </w:r>
+    </w:p>
+    <w:p>
+      <w:pPr>
+        <w:spacing w:line="480" w:lineRule="auto" w:before="0" w:after="0"/>
+        <w:ind w:left="0" w:firstLine="720"/>
         <w:jc w:val="both"/>
         <w:rPr/>
       </w:pPr>
@@ -2716,19 +2756,20 @@
     <w:p>
       <w:pPr>
         <w:spacing w:line="480" w:lineRule="auto" w:before="0" w:after="0"/>
-        <w:rPr/>
-      </w:pPr>
-      <w:r>
-        <w:rPr>
-          <w:rFonts w:ascii="Georgia" w:hAnsi="Georgia" w:eastAsia="Georgia" w:cs="Georgia"/>
-          <w:rtl w:val="0"/>
-        </w:rPr>
-      </w:r>
-    </w:p>
-    <w:p>
-      <w:pPr>
-        <w:spacing w:line="480" w:lineRule="auto" w:before="0" w:after="0"/>
-        <w:ind w:left="0" w:firstLine="0"/>
+        <w:ind w:firstLine="0" w:left="0"/>
+        <w:rPr/>
+      </w:pPr>
+      <w:r>
+        <w:rPr>
+          <w:rFonts w:ascii="Georgia" w:hAnsi="Georgia" w:eastAsia="Georgia" w:cs="Georgia"/>
+          <w:rtl w:val="0"/>
+        </w:rPr>
+      </w:r>
+    </w:p>
+    <w:p>
+      <w:pPr>
+        <w:spacing w:line="480" w:lineRule="auto" w:before="0" w:after="0"/>
+        <w:ind w:left="0" w:firstLine="720"/>
         <w:jc w:val="both"/>
         <w:rPr/>
       </w:pPr>
@@ -2752,19 +2793,20 @@
     <w:p>
       <w:pPr>
         <w:spacing w:line="480" w:lineRule="auto" w:before="0" w:after="0"/>
-        <w:rPr/>
-      </w:pPr>
-      <w:r>
-        <w:rPr>
-          <w:rFonts w:ascii="Georgia" w:hAnsi="Georgia" w:eastAsia="Georgia" w:cs="Georgia"/>
-          <w:rtl w:val="0"/>
-        </w:rPr>
-      </w:r>
-    </w:p>
-    <w:p>
-      <w:pPr>
-        <w:spacing w:line="480" w:lineRule="auto" w:before="0" w:after="0"/>
-        <w:ind w:left="0" w:firstLine="0"/>
+        <w:ind w:firstLine="0" w:left="0"/>
+        <w:rPr/>
+      </w:pPr>
+      <w:r>
+        <w:rPr>
+          <w:rFonts w:ascii="Georgia" w:hAnsi="Georgia" w:eastAsia="Georgia" w:cs="Georgia"/>
+          <w:rtl w:val="0"/>
+        </w:rPr>
+      </w:r>
+    </w:p>
+    <w:p>
+      <w:pPr>
+        <w:spacing w:line="480" w:lineRule="auto" w:before="0" w:after="0"/>
+        <w:ind w:left="0" w:firstLine="720"/>
         <w:jc w:val="both"/>
         <w:rPr/>
       </w:pPr>
@@ -2788,19 +2830,20 @@
     <w:p>
       <w:pPr>
         <w:spacing w:line="480" w:lineRule="auto" w:before="0" w:after="0"/>
-        <w:rPr/>
-      </w:pPr>
-      <w:r>
-        <w:rPr>
-          <w:rFonts w:ascii="Georgia" w:hAnsi="Georgia" w:eastAsia="Georgia" w:cs="Georgia"/>
-          <w:rtl w:val="0"/>
-        </w:rPr>
-      </w:r>
-    </w:p>
-    <w:p>
-      <w:pPr>
-        <w:spacing w:line="480" w:lineRule="auto" w:before="0" w:after="0"/>
-        <w:ind w:left="0" w:firstLine="0"/>
+        <w:ind w:firstLine="0" w:left="0"/>
+        <w:rPr/>
+      </w:pPr>
+      <w:r>
+        <w:rPr>
+          <w:rFonts w:ascii="Georgia" w:hAnsi="Georgia" w:eastAsia="Georgia" w:cs="Georgia"/>
+          <w:rtl w:val="0"/>
+        </w:rPr>
+      </w:r>
+    </w:p>
+    <w:p>
+      <w:pPr>
+        <w:spacing w:line="480" w:lineRule="auto" w:before="0" w:after="0"/>
+        <w:ind w:left="0" w:firstLine="720"/>
         <w:jc w:val="both"/>
         <w:rPr/>
       </w:pPr>
@@ -2824,19 +2867,20 @@
     <w:p>
       <w:pPr>
         <w:spacing w:line="480" w:lineRule="auto" w:before="0" w:after="0"/>
-        <w:rPr/>
-      </w:pPr>
-      <w:r>
-        <w:rPr>
-          <w:rFonts w:ascii="Georgia" w:hAnsi="Georgia" w:eastAsia="Georgia" w:cs="Georgia"/>
-          <w:rtl w:val="0"/>
-        </w:rPr>
-      </w:r>
-    </w:p>
-    <w:p>
-      <w:pPr>
-        <w:spacing w:line="480" w:lineRule="auto" w:before="0" w:after="0"/>
-        <w:ind w:left="0" w:firstLine="0"/>
+        <w:ind w:firstLine="0" w:left="0"/>
+        <w:rPr/>
+      </w:pPr>
+      <w:r>
+        <w:rPr>
+          <w:rFonts w:ascii="Georgia" w:hAnsi="Georgia" w:eastAsia="Georgia" w:cs="Georgia"/>
+          <w:rtl w:val="0"/>
+        </w:rPr>
+      </w:r>
+    </w:p>
+    <w:p>
+      <w:pPr>
+        <w:spacing w:line="480" w:lineRule="auto" w:before="0" w:after="0"/>
+        <w:ind w:left="0" w:firstLine="720"/>
         <w:jc w:val="both"/>
         <w:rPr/>
       </w:pPr>
@@ -2860,18 +2904,20 @@
     <w:p>
       <w:pPr>
         <w:spacing w:line="480" w:lineRule="auto" w:before="0" w:after="0"/>
-        <w:rPr/>
-      </w:pPr>
-      <w:r>
-        <w:rPr>
-          <w:rFonts w:ascii="Georgia" w:hAnsi="Georgia" w:eastAsia="Georgia" w:cs="Georgia"/>
-          <w:rtl w:val="0"/>
-        </w:rPr>
-      </w:r>
-    </w:p>
-    <w:p>
-      <w:pPr>
-        <w:spacing w:line="480" w:lineRule="auto" w:before="0" w:after="0"/>
+        <w:ind w:firstLine="0" w:left="0"/>
+        <w:rPr/>
+      </w:pPr>
+      <w:r>
+        <w:rPr>
+          <w:rFonts w:ascii="Georgia" w:hAnsi="Georgia" w:eastAsia="Georgia" w:cs="Georgia"/>
+          <w:rtl w:val="0"/>
+        </w:rPr>
+      </w:r>
+    </w:p>
+    <w:p>
+      <w:pPr>
+        <w:spacing w:line="480" w:lineRule="auto" w:before="0" w:after="0"/>
+        <w:ind w:firstLine="0" w:left="0"/>
         <w:rPr/>
       </w:pPr>
       <w:r>
@@ -2890,6 +2936,7 @@
     <w:p>
       <w:pPr>
         <w:spacing w:after="0" w:before="0" w:line="480" w:lineRule="auto"/>
+        <w:ind w:firstLine="0" w:left="0"/>
         <w:rPr/>
       </w:pPr>
       <w:r>
@@ -2902,6 +2949,7 @@
     <w:p>
       <w:pPr>
         <w:spacing w:after="720" w:before="720" w:line="480" w:lineRule="auto"/>
+        <w:ind w:firstLine="0" w:left="0"/>
         <w:jc w:val="center"/>
         <w:rPr/>
       </w:pPr>
@@ -2927,7 +2975,7 @@
     <w:p>
       <w:pPr>
         <w:spacing w:line="480" w:lineRule="auto" w:before="0" w:after="0"/>
-        <w:ind w:firstLine="720"/>
+        <w:ind w:left="0" w:firstLine="720"/>
         <w:jc w:val="both"/>
         <w:rPr/>
       </w:pPr>
@@ -2951,6 +2999,7 @@
       <w:pPr>
         <w:keepNext w:val="1"/>
         <w:spacing w:after="720" w:before="720" w:line="480" w:lineRule="auto"/>
+        <w:ind w:firstLine="0" w:left="0"/>
         <w:jc w:val="left"/>
         <w:rPr/>
       </w:pPr>
@@ -2976,7 +3025,7 @@
     <w:p>
       <w:pPr>
         <w:spacing w:line="480" w:lineRule="auto" w:before="0" w:after="0"/>
-        <w:ind w:firstLine="720"/>
+        <w:ind w:left="0" w:firstLine="720"/>
         <w:jc w:val="both"/>
         <w:rPr/>
       </w:pPr>
@@ -3000,6 +3049,7 @@
       <w:pPr>
         <w:keepNext w:val="1"/>
         <w:spacing w:after="720" w:before="720" w:line="480" w:lineRule="auto"/>
+        <w:ind w:firstLine="0" w:left="0"/>
         <w:jc w:val="left"/>
         <w:rPr/>
       </w:pPr>
@@ -3025,7 +3075,7 @@
     <w:p>
       <w:pPr>
         <w:spacing w:line="480" w:lineRule="auto" w:before="0" w:after="0"/>
-        <w:ind w:firstLine="720"/>
+        <w:ind w:left="0" w:firstLine="720"/>
         <w:jc w:val="both"/>
         <w:rPr/>
       </w:pPr>
@@ -3042,6 +3092,7 @@
       <w:pPr>
         <w:keepNext w:val="1"/>
         <w:spacing w:after="720" w:before="720" w:line="480" w:lineRule="auto"/>
+        <w:ind w:firstLine="0" w:left="0"/>
         <w:jc w:val="left"/>
         <w:rPr/>
       </w:pPr>
@@ -3067,7 +3118,7 @@
     <w:p>
       <w:pPr>
         <w:spacing w:line="480" w:lineRule="auto" w:before="0" w:after="0"/>
-        <w:ind w:left="0" w:firstLine="0"/>
+        <w:ind w:left="0" w:firstLine="720"/>
         <w:jc w:val="both"/>
         <w:rPr/>
       </w:pPr>
@@ -3090,19 +3141,20 @@
     <w:p>
       <w:pPr>
         <w:spacing w:line="480" w:lineRule="auto" w:before="0" w:after="0"/>
-        <w:rPr/>
-      </w:pPr>
-      <w:r>
-        <w:rPr>
-          <w:rFonts w:ascii="Georgia" w:hAnsi="Georgia" w:eastAsia="Georgia" w:cs="Georgia"/>
-          <w:rtl w:val="0"/>
-        </w:rPr>
-      </w:r>
-    </w:p>
-    <w:p>
-      <w:pPr>
-        <w:spacing w:line="480" w:lineRule="auto" w:before="0" w:after="0"/>
-        <w:ind w:left="0" w:firstLine="0"/>
+        <w:ind w:firstLine="0" w:left="0"/>
+        <w:rPr/>
+      </w:pPr>
+      <w:r>
+        <w:rPr>
+          <w:rFonts w:ascii="Georgia" w:hAnsi="Georgia" w:eastAsia="Georgia" w:cs="Georgia"/>
+          <w:rtl w:val="0"/>
+        </w:rPr>
+      </w:r>
+    </w:p>
+    <w:p>
+      <w:pPr>
+        <w:spacing w:line="480" w:lineRule="auto" w:before="0" w:after="0"/>
+        <w:ind w:left="0" w:firstLine="720"/>
         <w:jc w:val="both"/>
         <w:rPr/>
       </w:pPr>
@@ -3126,7 +3178,7 @@
     <w:p>
       <w:pPr>
         <w:spacing w:line="480" w:lineRule="auto" w:before="0" w:after="0"/>
-        <w:ind w:left="0" w:firstLine="0"/>
+        <w:ind w:left="0" w:firstLine="720"/>
         <w:jc w:val="both"/>
         <w:rPr/>
       </w:pPr>
@@ -3150,7 +3202,7 @@
     <w:p>
       <w:pPr>
         <w:spacing w:line="480" w:lineRule="auto" w:before="0" w:after="0"/>
-        <w:ind w:left="0" w:firstLine="0"/>
+        <w:ind w:left="0" w:firstLine="720"/>
         <w:jc w:val="both"/>
         <w:rPr/>
       </w:pPr>
@@ -3174,7 +3226,7 @@
     <w:p>
       <w:pPr>
         <w:spacing w:line="480" w:lineRule="auto" w:before="0" w:after="0"/>
-        <w:ind w:left="0" w:firstLine="0"/>
+        <w:ind w:left="0" w:firstLine="720"/>
         <w:jc w:val="both"/>
         <w:rPr/>
       </w:pPr>
@@ -3198,19 +3250,20 @@
     <w:p>
       <w:pPr>
         <w:spacing w:line="480" w:lineRule="auto" w:before="0" w:after="0"/>
-        <w:rPr/>
-      </w:pPr>
-      <w:r>
-        <w:rPr>
-          <w:rFonts w:ascii="Georgia" w:hAnsi="Georgia" w:eastAsia="Georgia" w:cs="Georgia"/>
-          <w:rtl w:val="0"/>
-        </w:rPr>
-      </w:r>
-    </w:p>
-    <w:p>
-      <w:pPr>
-        <w:spacing w:line="480" w:lineRule="auto" w:before="0" w:after="0"/>
-        <w:ind w:left="0" w:firstLine="0"/>
+        <w:ind w:firstLine="0" w:left="0"/>
+        <w:rPr/>
+      </w:pPr>
+      <w:r>
+        <w:rPr>
+          <w:rFonts w:ascii="Georgia" w:hAnsi="Georgia" w:eastAsia="Georgia" w:cs="Georgia"/>
+          <w:rtl w:val="0"/>
+        </w:rPr>
+      </w:r>
+    </w:p>
+    <w:p>
+      <w:pPr>
+        <w:spacing w:line="480" w:lineRule="auto" w:before="0" w:after="0"/>
+        <w:ind w:left="0" w:firstLine="720"/>
         <w:jc w:val="both"/>
         <w:rPr/>
       </w:pPr>
@@ -3235,6 +3288,7 @@
       <w:pPr>
         <w:keepNext w:val="1"/>
         <w:spacing w:after="720" w:before="720" w:line="480" w:lineRule="auto"/>
+        <w:ind w:firstLine="0" w:left="0"/>
         <w:jc w:val="left"/>
         <w:rPr/>
       </w:pPr>
@@ -3260,7 +3314,7 @@
     <w:p>
       <w:pPr>
         <w:spacing w:line="480" w:lineRule="auto" w:before="0" w:after="0"/>
-        <w:ind w:firstLine="720"/>
+        <w:ind w:left="0" w:firstLine="720"/>
         <w:jc w:val="both"/>
         <w:rPr/>
       </w:pPr>
@@ -3283,6 +3337,7 @@
     <w:p>
       <w:pPr>
         <w:spacing w:line="480" w:lineRule="auto" w:before="0" w:after="0"/>
+        <w:ind w:firstLine="0" w:left="0"/>
         <w:rPr/>
       </w:pPr>
       <w:r>
@@ -3301,6 +3356,7 @@
     <w:p>
       <w:pPr>
         <w:spacing w:after="0" w:before="0" w:line="480" w:lineRule="auto"/>
+        <w:ind w:firstLine="0" w:left="0"/>
         <w:rPr/>
       </w:pPr>
       <w:r>
@@ -3313,6 +3369,7 @@
     <w:p>
       <w:pPr>
         <w:spacing w:after="720" w:before="720" w:line="480" w:lineRule="auto"/>
+        <w:ind w:firstLine="0" w:left="0"/>
         <w:jc w:val="center"/>
         <w:rPr/>
       </w:pPr>
@@ -3345,6 +3402,8 @@
       <w:r>
         <w:rPr>
           <w:rFonts w:ascii="Georgia" w:hAnsi="Georgia" w:eastAsia="Georgia" w:cs="Georgia"/>
+          <w:b w:val="0"/>
+          <w:i w:val="0"/>
           <w:sz w:val="22"/>
           <w:rtl w:val="0"/>
         </w:rPr>
@@ -3361,6 +3420,8 @@
       <w:r>
         <w:rPr>
           <w:rFonts w:ascii="Georgia" w:hAnsi="Georgia" w:eastAsia="Georgia" w:cs="Georgia"/>
+          <w:b w:val="0"/>
+          <w:i w:val="0"/>
           <w:sz w:val="22"/>
           <w:szCs w:val="22"/>
           <w:rtl w:val="0"/>
@@ -3401,6 +3462,8 @@
       <w:r>
         <w:rPr>
           <w:rFonts w:ascii="Georgia" w:hAnsi="Georgia" w:eastAsia="Georgia" w:cs="Georgia"/>
+          <w:b w:val="0"/>
+          <w:i w:val="0"/>
           <w:sz w:val="22"/>
           <w:rtl w:val="0"/>
         </w:rPr>
@@ -3417,6 +3480,8 @@
       <w:r>
         <w:rPr>
           <w:rFonts w:ascii="Georgia" w:hAnsi="Georgia" w:eastAsia="Georgia" w:cs="Georgia"/>
+          <w:b w:val="0"/>
+          <w:i w:val="0"/>
           <w:sz w:val="22"/>
           <w:szCs w:val="22"/>
           <w:rtl w:val="0"/>
@@ -3439,6 +3504,8 @@
       <w:r>
         <w:rPr>
           <w:rFonts w:ascii="Georgia" w:hAnsi="Georgia" w:eastAsia="Georgia" w:cs="Georgia"/>
+          <w:b w:val="0"/>
+          <w:i w:val="0"/>
           <w:sz w:val="22"/>
           <w:rtl w:val="0"/>
         </w:rPr>
@@ -3455,6 +3522,8 @@
       <w:r>
         <w:rPr>
           <w:rFonts w:ascii="Georgia" w:hAnsi="Georgia" w:eastAsia="Georgia" w:cs="Georgia"/>
+          <w:b w:val="0"/>
+          <w:i w:val="0"/>
           <w:sz w:val="22"/>
           <w:szCs w:val="22"/>
           <w:rtl w:val="0"/>
@@ -3495,6 +3564,8 @@
       <w:r>
         <w:rPr>
           <w:rFonts w:ascii="Georgia" w:hAnsi="Georgia" w:eastAsia="Georgia" w:cs="Georgia"/>
+          <w:b w:val="0"/>
+          <w:i w:val="0"/>
           <w:sz w:val="22"/>
           <w:rtl w:val="0"/>
         </w:rPr>
@@ -3511,6 +3582,8 @@
       <w:r>
         <w:rPr>
           <w:rFonts w:ascii="Georgia" w:hAnsi="Georgia" w:eastAsia="Georgia" w:cs="Georgia"/>
+          <w:b w:val="0"/>
+          <w:i w:val="0"/>
           <w:sz w:val="22"/>
           <w:szCs w:val="22"/>
           <w:rtl w:val="0"/>
@@ -3551,6 +3624,8 @@
       <w:r>
         <w:rPr>
           <w:rFonts w:ascii="Georgia" w:hAnsi="Georgia" w:eastAsia="Georgia" w:cs="Georgia"/>
+          <w:b w:val="0"/>
+          <w:i w:val="0"/>
           <w:sz w:val="22"/>
           <w:rtl w:val="0"/>
         </w:rPr>
@@ -3567,6 +3642,8 @@
       <w:r>
         <w:rPr>
           <w:rFonts w:ascii="Georgia" w:hAnsi="Georgia" w:eastAsia="Georgia" w:cs="Georgia"/>
+          <w:b w:val="0"/>
+          <w:i w:val="0"/>
           <w:sz w:val="22"/>
           <w:szCs w:val="22"/>
           <w:rtl w:val="0"/>
@@ -3607,6 +3684,8 @@
       <w:r>
         <w:rPr>
           <w:rFonts w:ascii="Georgia" w:hAnsi="Georgia" w:eastAsia="Georgia" w:cs="Georgia"/>
+          <w:b w:val="0"/>
+          <w:i w:val="0"/>
           <w:sz w:val="22"/>
           <w:rtl w:val="0"/>
         </w:rPr>
@@ -3623,6 +3702,8 @@
       <w:r>
         <w:rPr>
           <w:rFonts w:ascii="Georgia" w:hAnsi="Georgia" w:eastAsia="Georgia" w:cs="Georgia"/>
+          <w:b w:val="0"/>
+          <w:i w:val="0"/>
           <w:sz w:val="22"/>
           <w:rtl w:val="0"/>
         </w:rPr>
@@ -3639,6 +3720,8 @@
       <w:r>
         <w:rPr>
           <w:rFonts w:ascii="Georgia" w:hAnsi="Georgia" w:eastAsia="Georgia" w:cs="Georgia"/>
+          <w:b w:val="0"/>
+          <w:i w:val="0"/>
           <w:sz w:val="22"/>
           <w:szCs w:val="22"/>
           <w:rtl w:val="0"/>
@@ -3661,6 +3744,8 @@
       <w:r>
         <w:rPr>
           <w:rFonts w:ascii="Georgia" w:hAnsi="Georgia" w:eastAsia="Georgia" w:cs="Georgia"/>
+          <w:b w:val="0"/>
+          <w:i w:val="0"/>
           <w:sz w:val="22"/>
           <w:rtl w:val="0"/>
         </w:rPr>
@@ -3677,6 +3762,8 @@
       <w:r>
         <w:rPr>
           <w:rFonts w:ascii="Georgia" w:hAnsi="Georgia" w:eastAsia="Georgia" w:cs="Georgia"/>
+          <w:b w:val="0"/>
+          <w:i w:val="0"/>
           <w:sz w:val="22"/>
           <w:szCs w:val="22"/>
           <w:rtl w:val="0"/>
@@ -3717,6 +3804,8 @@
       <w:r>
         <w:rPr>
           <w:rFonts w:ascii="Georgia" w:hAnsi="Georgia" w:eastAsia="Georgia" w:cs="Georgia"/>
+          <w:b w:val="0"/>
+          <w:i w:val="0"/>
           <w:sz w:val="22"/>
           <w:rtl w:val="0"/>
         </w:rPr>
@@ -3733,6 +3822,8 @@
       <w:r>
         <w:rPr>
           <w:rFonts w:ascii="Georgia" w:hAnsi="Georgia" w:eastAsia="Georgia" w:cs="Georgia"/>
+          <w:b w:val="0"/>
+          <w:i w:val="0"/>
           <w:sz w:val="22"/>
           <w:szCs w:val="22"/>
           <w:rtl w:val="0"/>
@@ -3773,6 +3864,8 @@
       <w:r>
         <w:rPr>
           <w:rFonts w:ascii="Georgia" w:hAnsi="Georgia" w:eastAsia="Georgia" w:cs="Georgia"/>
+          <w:b w:val="0"/>
+          <w:i w:val="0"/>
           <w:sz w:val="22"/>
           <w:rtl w:val="0"/>
         </w:rPr>
@@ -3789,6 +3882,8 @@
       <w:r>
         <w:rPr>
           <w:rFonts w:ascii="Georgia" w:hAnsi="Georgia" w:eastAsia="Georgia" w:cs="Georgia"/>
+          <w:b w:val="0"/>
+          <w:i w:val="0"/>
           <w:sz w:val="22"/>
           <w:szCs w:val="22"/>
           <w:rtl w:val="0"/>
@@ -3830,6 +3925,8 @@
       <w:r>
         <w:rPr>
           <w:rFonts w:ascii="Georgia" w:hAnsi="Georgia" w:eastAsia="Georgia" w:cs="Georgia"/>
+          <w:b w:val="0"/>
+          <w:i w:val="0"/>
           <w:sz w:val="22"/>
           <w:rtl w:val="0"/>
         </w:rPr>
@@ -3839,66 +3936,66 @@
     <w:p>
       <w:pPr>
         <w:spacing w:line="480" w:lineRule="auto" w:before="0" w:after="0"/>
-        <w:ind w:left="720" w:hanging="720"/>
-        <w:jc w:val="both"/>
-        <w:rPr/>
-      </w:pPr>
-      <w:r>
-        <w:rPr>
-          <w:rFonts w:ascii="Georgia" w:hAnsi="Georgia" w:eastAsia="Georgia" w:cs="Georgia"/>
-          <w:sz w:val="22"/>
-          <w:rtl w:val="0"/>
-        </w:rPr>
-      </w:r>
-    </w:p>
-    <w:p>
-      <w:pPr>
-        <w:spacing w:line="480" w:lineRule="auto" w:before="0" w:after="0"/>
-        <w:ind w:left="720" w:hanging="720"/>
-        <w:jc w:val="both"/>
-        <w:rPr/>
-      </w:pPr>
-      <w:r>
-        <w:rPr>
-          <w:rFonts w:ascii="Georgia" w:hAnsi="Georgia" w:eastAsia="Georgia" w:cs="Georgia"/>
-          <w:sz w:val="22"/>
-          <w:szCs w:val="22"/>
-          <w:rtl w:val="0"/>
-        </w:rPr>
-      </w:r>
-      <w:r>
-        <w:rPr>
-          <w:rFonts w:ascii="Georgia" w:hAnsi="Georgia" w:eastAsia="Georgia" w:cs="Georgia"/>
-          <w:rtl w:val="0"/>
-        </w:rPr>
-      </w:r>
-    </w:p>
-    <w:p>
-      <w:pPr>
-        <w:spacing w:line="480" w:lineRule="auto" w:before="0" w:after="0"/>
-        <w:ind w:left="720" w:hanging="720"/>
-        <w:jc w:val="both"/>
-        <w:rPr/>
-      </w:pPr>
-      <w:r>
-        <w:rPr>
-          <w:rFonts w:ascii="Georgia" w:hAnsi="Georgia" w:eastAsia="Georgia" w:cs="Georgia"/>
-          <w:sz w:val="22"/>
-          <w:szCs w:val="22"/>
-          <w:rtl w:val="0"/>
-        </w:rPr>
-      </w:r>
-      <w:r>
-        <w:rPr>
-          <w:rFonts w:ascii="Georgia" w:hAnsi="Georgia" w:eastAsia="Georgia" w:cs="Georgia"/>
-          <w:rtl w:val="0"/>
-        </w:rPr>
-      </w:r>
-    </w:p>
-    <w:p>
-      <w:pPr>
-        <w:spacing w:line="480" w:lineRule="auto" w:before="0" w:after="0"/>
-        <w:ind w:left="720" w:hanging="720"/>
+        <w:ind w:left="0" w:firstLine="0"/>
+        <w:jc w:val="both"/>
+        <w:rPr/>
+      </w:pPr>
+      <w:r>
+        <w:rPr>
+          <w:rFonts w:ascii="Georgia" w:hAnsi="Georgia" w:eastAsia="Georgia" w:cs="Georgia"/>
+          <w:sz w:val="22"/>
+          <w:rtl w:val="0"/>
+        </w:rPr>
+      </w:r>
+    </w:p>
+    <w:p>
+      <w:pPr>
+        <w:spacing w:line="480" w:lineRule="auto" w:before="0" w:after="0"/>
+        <w:ind w:left="0" w:firstLine="0"/>
+        <w:jc w:val="both"/>
+        <w:rPr/>
+      </w:pPr>
+      <w:r>
+        <w:rPr>
+          <w:rFonts w:ascii="Georgia" w:hAnsi="Georgia" w:eastAsia="Georgia" w:cs="Georgia"/>
+          <w:sz w:val="22"/>
+          <w:szCs w:val="22"/>
+          <w:rtl w:val="0"/>
+        </w:rPr>
+      </w:r>
+      <w:r>
+        <w:rPr>
+          <w:rFonts w:ascii="Georgia" w:hAnsi="Georgia" w:eastAsia="Georgia" w:cs="Georgia"/>
+          <w:rtl w:val="0"/>
+        </w:rPr>
+      </w:r>
+    </w:p>
+    <w:p>
+      <w:pPr>
+        <w:spacing w:line="480" w:lineRule="auto" w:before="0" w:after="0"/>
+        <w:ind w:left="0" w:firstLine="0"/>
+        <w:jc w:val="both"/>
+        <w:rPr/>
+      </w:pPr>
+      <w:r>
+        <w:rPr>
+          <w:rFonts w:ascii="Georgia" w:hAnsi="Georgia" w:eastAsia="Georgia" w:cs="Georgia"/>
+          <w:sz w:val="22"/>
+          <w:szCs w:val="22"/>
+          <w:rtl w:val="0"/>
+        </w:rPr>
+      </w:r>
+      <w:r>
+        <w:rPr>
+          <w:rFonts w:ascii="Georgia" w:hAnsi="Georgia" w:eastAsia="Georgia" w:cs="Georgia"/>
+          <w:rtl w:val="0"/>
+        </w:rPr>
+      </w:r>
+    </w:p>
+    <w:p>
+      <w:pPr>
+        <w:spacing w:line="480" w:lineRule="auto" w:before="0" w:after="0"/>
+        <w:ind w:left="0" w:firstLine="0"/>
         <w:jc w:val="both"/>
         <w:rPr/>
       </w:pPr>
@@ -3920,6 +4017,7 @@
     <w:p>
       <w:pPr>
         <w:spacing w:before="0" w:after="0" w:line="480" w:lineRule="auto"/>
+        <w:ind w:firstLine="0" w:left="0"/>
       </w:pPr>
       <w:r>
         <w:rPr>
@@ -3931,6 +4029,7 @@
     <w:p>
       <w:pPr>
         <w:spacing w:before="0" w:after="0" w:line="480" w:lineRule="auto"/>
+        <w:ind w:firstLine="0" w:left="0"/>
       </w:pPr>
       <w:r>
         <w:rPr>
@@ -3942,6 +4041,7 @@
     <w:p>
       <w:pPr>
         <w:spacing w:before="0" w:after="0" w:line="480" w:lineRule="auto"/>
+        <w:ind w:firstLine="0" w:left="0"/>
       </w:pPr>
       <w:r>
         <w:rPr>
@@ -3953,6 +4053,7 @@
     <w:p>
       <w:pPr>
         <w:spacing w:before="0" w:after="0" w:line="480" w:lineRule="auto"/>
+        <w:ind w:firstLine="0" w:left="0"/>
       </w:pPr>
       <w:r>
         <w:rPr>
@@ -3964,6 +4065,7 @@
     <w:p>
       <w:pPr>
         <w:spacing w:before="0" w:after="0" w:line="480" w:lineRule="auto"/>
+        <w:ind w:firstLine="0" w:left="0"/>
       </w:pPr>
       <w:r>
         <w:rPr>
@@ -3976,6 +4078,7 @@
       <w:pPr>
         <w:pageBreakBefore w:val="1"/>
         <w:spacing w:after="720" w:before="720" w:line="480" w:lineRule="auto"/>
+        <w:ind w:firstLine="0" w:left="0"/>
         <w:jc w:val="center"/>
         <w:rPr/>
       </w:pPr>
@@ -4002,6 +4105,7 @@
       <w:pPr>
         <w:keepNext w:val="1"/>
         <w:spacing w:after="720" w:before="720" w:line="480" w:lineRule="auto"/>
+        <w:ind w:firstLine="0" w:left="0"/>
         <w:jc w:val="left"/>
         <w:rPr/>
       </w:pPr>
@@ -4027,6 +4131,7 @@
     <w:p>
       <w:pPr>
         <w:spacing w:line="480" w:lineRule="auto" w:before="240" w:after="0"/>
+        <w:ind w:firstLine="0" w:left="0"/>
         <w:jc w:val="center"/>
         <w:rPr/>
       </w:pPr>
@@ -4055,6 +4160,7 @@
     <w:p>
       <w:pPr>
         <w:spacing w:after="120" w:before="0" w:line="480" w:lineRule="auto"/>
+        <w:ind w:firstLine="0" w:left="0"/>
         <w:jc w:val="center"/>
         <w:rPr/>
       </w:pPr>
@@ -4124,6 +4230,7 @@
           <w:p>
             <w:pPr>
               <w:spacing w:after="0" w:before="0" w:line="480" w:lineRule="auto"/>
+              <w:ind w:firstLine="0"/>
               <w:jc w:val="center"/>
               <w:rPr>
                 <w:sz w:val="18"/>
@@ -4170,6 +4277,7 @@
           <w:p>
             <w:pPr>
               <w:spacing w:after="0" w:before="0" w:line="480" w:lineRule="auto"/>
+              <w:ind w:firstLine="0"/>
               <w:jc w:val="center"/>
               <w:rPr>
                 <w:sz w:val="18"/>
@@ -4216,6 +4324,7 @@
           <w:p>
             <w:pPr>
               <w:spacing w:after="0" w:before="0" w:line="480" w:lineRule="auto"/>
+              <w:ind w:firstLine="0"/>
               <w:jc w:val="center"/>
               <w:rPr>
                 <w:sz w:val="18"/>
@@ -4262,6 +4371,7 @@
           <w:p>
             <w:pPr>
               <w:spacing w:after="0" w:before="0" w:line="480" w:lineRule="auto"/>
+              <w:ind w:firstLine="0"/>
               <w:jc w:val="left"/>
               <w:rPr>
                 <w:sz w:val="18"/>
@@ -4292,6 +4402,7 @@
           <w:p>
             <w:pPr>
               <w:spacing w:after="0" w:before="0" w:line="480" w:lineRule="auto"/>
+              <w:ind w:firstLine="0"/>
               <w:rPr>
                 <w:sz w:val="18"/>
                 <w:szCs w:val="18"/>
@@ -4321,6 +4432,7 @@
           <w:p>
             <w:pPr>
               <w:spacing w:after="0" w:before="0" w:line="480" w:lineRule="auto"/>
+              <w:ind w:firstLine="0"/>
               <w:rPr>
                 <w:sz w:val="18"/>
                 <w:szCs w:val="18"/>
@@ -4362,6 +4474,7 @@
           <w:p>
             <w:pPr>
               <w:spacing w:after="0" w:before="0" w:line="480" w:lineRule="auto"/>
+              <w:ind w:firstLine="0"/>
               <w:jc w:val="left"/>
               <w:rPr>
                 <w:sz w:val="18"/>
@@ -4398,6 +4511,7 @@
           <w:p>
             <w:pPr>
               <w:spacing w:after="0" w:before="0" w:line="480" w:lineRule="auto"/>
+              <w:ind w:firstLine="0"/>
               <w:rPr>
                 <w:sz w:val="18"/>
                 <w:szCs w:val="18"/>
@@ -4433,6 +4547,7 @@
           <w:p>
             <w:pPr>
               <w:spacing w:after="0" w:before="0" w:line="480" w:lineRule="auto"/>
+              <w:ind w:firstLine="0"/>
               <w:rPr>
                 <w:sz w:val="18"/>
                 <w:szCs w:val="18"/>
@@ -4454,6 +4569,7 @@
     <w:p>
       <w:pPr>
         <w:spacing w:line="480" w:lineRule="auto" w:before="240" w:after="0"/>
+        <w:ind w:firstLine="0" w:left="0"/>
         <w:rPr>
           <w:sz w:val="20"/>
           <w:szCs w:val="20"/>
@@ -4469,6 +4585,7 @@
     <w:p>
       <w:pPr>
         <w:spacing w:line="480" w:lineRule="auto" w:before="0" w:after="0"/>
+        <w:ind w:left="0" w:firstLine="720"/>
         <w:jc w:val="both"/>
         <w:rPr/>
       </w:pPr>
@@ -4483,6 +4600,7 @@
     <w:p>
       <w:pPr>
         <w:spacing w:line="480" w:lineRule="auto" w:before="0" w:after="0"/>
+        <w:ind w:firstLine="0" w:left="0"/>
         <w:rPr/>
       </w:pPr>
       <w:r>
@@ -4497,6 +4615,7 @@
         <w:keepNext w:val="1"/>
         <w:pageBreakBefore w:val="1"/>
         <w:spacing w:after="720" w:before="720" w:line="480" w:lineRule="auto"/>
+        <w:ind w:firstLine="0" w:left="0"/>
         <w:jc w:val="left"/>
         <w:rPr/>
       </w:pPr>
@@ -4522,6 +4641,7 @@
     <w:p>
       <w:pPr>
         <w:spacing w:line="480" w:lineRule="auto" w:before="240" w:after="0"/>
+        <w:ind w:firstLine="0" w:left="0"/>
         <w:jc w:val="center"/>
         <w:rPr/>
       </w:pPr>
@@ -4550,6 +4670,7 @@
     <w:p>
       <w:pPr>
         <w:spacing w:after="120" w:before="0" w:line="480" w:lineRule="auto"/>
+        <w:ind w:firstLine="0" w:left="0"/>
         <w:jc w:val="center"/>
         <w:rPr/>
       </w:pPr>
@@ -4619,6 +4740,7 @@
           <w:p>
             <w:pPr>
               <w:spacing w:after="0" w:before="0" w:line="480" w:lineRule="auto"/>
+              <w:ind w:firstLine="0"/>
               <w:jc w:val="center"/>
               <w:rPr>
                 <w:sz w:val="18"/>
@@ -4665,6 +4787,7 @@
           <w:p>
             <w:pPr>
               <w:spacing w:after="0" w:before="0" w:line="480" w:lineRule="auto"/>
+              <w:ind w:firstLine="0"/>
               <w:jc w:val="center"/>
               <w:rPr>
                 <w:sz w:val="18"/>
@@ -4711,6 +4834,7 @@
           <w:p>
             <w:pPr>
               <w:spacing w:after="0" w:before="0" w:line="480" w:lineRule="auto"/>
+              <w:ind w:firstLine="0"/>
               <w:jc w:val="center"/>
               <w:rPr>
                 <w:sz w:val="18"/>
@@ -4757,6 +4881,7 @@
           <w:p>
             <w:pPr>
               <w:spacing w:after="0" w:before="0" w:line="480" w:lineRule="auto"/>
+              <w:ind w:firstLine="0"/>
               <w:jc w:val="left"/>
               <w:rPr>
                 <w:sz w:val="18"/>
@@ -4787,6 +4912,7 @@
           <w:p>
             <w:pPr>
               <w:spacing w:after="0" w:before="0" w:line="480" w:lineRule="auto"/>
+              <w:ind w:firstLine="0"/>
               <w:jc w:val="left"/>
               <w:rPr>
                 <w:sz w:val="18"/>
@@ -4817,6 +4943,7 @@
           <w:p>
             <w:pPr>
               <w:spacing w:after="0" w:before="0" w:line="480" w:lineRule="auto"/>
+              <w:ind w:firstLine="0"/>
               <w:jc w:val="left"/>
               <w:rPr>
                 <w:sz w:val="18"/>
@@ -4859,6 +4986,7 @@
           <w:p>
             <w:pPr>
               <w:spacing w:after="0" w:before="0" w:line="480" w:lineRule="auto"/>
+              <w:ind w:firstLine="0"/>
               <w:jc w:val="left"/>
               <w:rPr>
                 <w:sz w:val="18"/>
@@ -4895,6 +5023,7 @@
           <w:p>
             <w:pPr>
               <w:spacing w:after="0" w:before="0" w:line="480" w:lineRule="auto"/>
+              <w:ind w:firstLine="0"/>
               <w:rPr>
                 <w:sz w:val="18"/>
                 <w:szCs w:val="18"/>
@@ -4930,6 +5059,7 @@
           <w:p>
             <w:pPr>
               <w:spacing w:after="0" w:before="0" w:line="480" w:lineRule="auto"/>
+              <w:ind w:firstLine="0"/>
               <w:jc w:val="left"/>
               <w:rPr>
                 <w:sz w:val="18"/>
@@ -4952,23 +5082,26 @@
     <w:p>
       <w:pPr>
         <w:spacing w:line="480" w:lineRule="auto" w:before="240" w:after="0"/>
-        <w:rPr/>
-      </w:pPr>
-      <w:r>
-        <w:rPr>
-          <w:rFonts w:ascii="Georgia" w:hAnsi="Georgia" w:eastAsia="Georgia" w:cs="Georgia"/>
-          <w:rtl w:val="0"/>
-        </w:rPr>
-      </w:r>
-    </w:p>
-    <w:p>
-      <w:pPr>
-        <w:spacing w:line="480" w:lineRule="auto" w:before="0" w:after="0"/>
-        <w:rPr/>
-      </w:pPr>
-      <w:r>
-        <w:rPr>
-          <w:rFonts w:ascii="Georgia" w:hAnsi="Georgia" w:eastAsia="Georgia" w:cs="Georgia"/>
+        <w:ind w:firstLine="0" w:left="0"/>
+        <w:rPr/>
+      </w:pPr>
+      <w:r>
+        <w:rPr>
+          <w:rFonts w:ascii="Georgia" w:hAnsi="Georgia" w:eastAsia="Georgia" w:cs="Georgia"/>
+          <w:rtl w:val="0"/>
+        </w:rPr>
+      </w:r>
+    </w:p>
+    <w:p>
+      <w:pPr>
+        <w:spacing w:line="480" w:lineRule="auto" w:before="0" w:after="0"/>
+        <w:ind w:firstLine="0"/>
+        <w:rPr/>
+      </w:pPr>
+      <w:r>
+        <w:rPr>
+          <w:rFonts w:ascii="Georgia" w:hAnsi="Georgia" w:eastAsia="Georgia" w:cs="Georgia"/>
+          <w:b w:val="0"/>
           <w:i/>
           <w:iCs w:val="1"/>
           <w:sz w:val="22"/>
@@ -4986,6 +5119,7 @@
     <w:p>
       <w:pPr>
         <w:spacing w:line="480" w:lineRule="auto" w:before="0" w:after="0"/>
+        <w:ind w:firstLine="0" w:left="0"/>
         <w:rPr/>
       </w:pPr>
       <w:r>

</xml_diff>

<commit_message>
Only four major headers; demote structural ALL CAPS to bold minor
Majors: Introduction, Methodology, References, Appendices.
Structural subsections (Background, SOP, Framework, etc.) and Appendix
A/B are bold minor (12pt). Themed sections remain italic minor.
</commit_message>
<xml_diff>
--- a/thesis/Thesis_Instagram_MH_v11.docx
+++ b/thesis/Thesis_Instagram_MH_v11.docx
@@ -423,7 +423,7 @@
     <w:p>
       <w:pPr>
         <w:spacing w:after="720" w:before="720" w:line="480" w:lineRule="auto"/>
-        <w:ind w:firstLine="0" w:left="0"/>
+        <w:ind w:left="0" w:firstLine="0"/>
         <w:jc w:val="center"/>
         <w:rPr/>
       </w:pPr>
@@ -450,7 +450,7 @@
       <w:pPr>
         <w:keepNext w:val="1"/>
         <w:spacing w:after="0" w:before="0" w:line="480" w:lineRule="auto"/>
-        <w:ind w:firstLine="0" w:left="0"/>
+        <w:ind w:left="0" w:firstLine="0"/>
         <w:jc w:val="left"/>
         <w:rPr>
           <w:b w:val="1"/>
@@ -469,8 +469,8 @@
     <w:p>
       <w:pPr>
         <w:keepNext w:val="1"/>
-        <w:spacing w:after="720" w:before="720" w:line="480" w:lineRule="auto"/>
-        <w:ind w:firstLine="0" w:left="0"/>
+        <w:spacing w:after="0" w:before="0" w:line="480" w:lineRule="auto"/>
+        <w:ind w:left="0" w:firstLine="0"/>
         <w:jc w:val="left"/>
         <w:rPr/>
       </w:pPr>
@@ -480,7 +480,7 @@
           <w:b/>
           <w:bCs w:val="1"/>
           <w:i w:val="0"/>
-          <w:sz w:val="28"/>
+          <w:sz w:val="24"/>
           <w:szCs w:val="24"/>
           <w:rtl w:val="0"/>
         </w:rPr>
@@ -543,7 +543,7 @@
       <w:pPr>
         <w:keepNext w:val="1"/>
         <w:spacing w:after="0" w:before="240" w:line="480" w:lineRule="auto"/>
-        <w:ind w:firstLine="0" w:left="0"/>
+        <w:ind w:left="0" w:firstLine="0"/>
         <w:jc w:val="left"/>
         <w:rPr/>
       </w:pPr>
@@ -777,7 +777,7 @@
       <w:pPr>
         <w:keepNext w:val="1"/>
         <w:spacing w:after="0" w:before="240" w:line="480" w:lineRule="auto"/>
-        <w:ind w:firstLine="0" w:left="0"/>
+        <w:ind w:left="0" w:firstLine="0"/>
         <w:jc w:val="left"/>
         <w:rPr/>
       </w:pPr>
@@ -938,7 +938,7 @@
     <w:p>
       <w:pPr>
         <w:spacing w:line="480" w:lineRule="auto" w:before="0" w:after="0"/>
-        <w:ind w:firstLine="0" w:left="0"/>
+        <w:ind w:left="0" w:firstLine="0"/>
         <w:jc w:val="both"/>
         <w:rPr/>
       </w:pPr>
@@ -952,7 +952,7 @@
     <w:p>
       <w:pPr>
         <w:spacing w:line="480" w:lineRule="auto" w:before="240" w:after="0"/>
-        <w:ind w:firstLine="0" w:left="0"/>
+        <w:ind w:left="0" w:firstLine="0"/>
         <w:jc w:val="left"/>
         <w:rPr>
           <w:i w:val="1"/>
@@ -977,7 +977,7 @@
     <w:p>
       <w:pPr>
         <w:spacing w:line="480" w:lineRule="auto" w:before="0" w:after="0"/>
-        <w:ind w:firstLine="0" w:left="0"/>
+        <w:ind w:left="0" w:firstLine="0"/>
         <w:jc w:val="both"/>
         <w:rPr/>
       </w:pPr>
@@ -1107,7 +1107,7 @@
       <w:pPr>
         <w:keepNext w:val="1"/>
         <w:spacing w:after="0" w:before="240" w:line="480" w:lineRule="auto"/>
-        <w:ind w:firstLine="0" w:left="0"/>
+        <w:ind w:left="0" w:firstLine="0"/>
         <w:jc w:val="left"/>
         <w:rPr/>
       </w:pPr>
@@ -1259,7 +1259,7 @@
       <w:pPr>
         <w:keepNext w:val="1"/>
         <w:spacing w:after="0" w:before="240" w:line="480" w:lineRule="auto"/>
-        <w:ind w:firstLine="0" w:left="0"/>
+        <w:ind w:left="0" w:firstLine="0"/>
         <w:jc w:val="left"/>
         <w:rPr/>
       </w:pPr>
@@ -1377,8 +1377,8 @@
     <w:p>
       <w:pPr>
         <w:keepNext w:val="1"/>
-        <w:spacing w:after="720" w:before="720" w:line="480" w:lineRule="auto"/>
-        <w:ind w:firstLine="0" w:left="0"/>
+        <w:spacing w:after="0" w:before="240" w:line="480" w:lineRule="auto"/>
+        <w:ind w:left="0" w:firstLine="0"/>
         <w:jc w:val="left"/>
         <w:rPr/>
       </w:pPr>
@@ -1388,7 +1388,7 @@
           <w:b/>
           <w:bCs w:val="1"/>
           <w:i w:val="0"/>
-          <w:sz w:val="28"/>
+          <w:sz w:val="24"/>
           <w:szCs w:val="24"/>
           <w:rtl w:val="0"/>
         </w:rPr>
@@ -1500,8 +1500,8 @@
     <w:p>
       <w:pPr>
         <w:keepNext w:val="1"/>
-        <w:spacing w:after="720" w:before="720" w:line="480" w:lineRule="auto"/>
-        <w:ind w:firstLine="0" w:left="0"/>
+        <w:spacing w:after="0" w:before="240" w:line="480" w:lineRule="auto"/>
+        <w:ind w:left="0" w:firstLine="0"/>
         <w:jc w:val="left"/>
         <w:rPr/>
       </w:pPr>
@@ -1511,7 +1511,7 @@
           <w:b/>
           <w:bCs w:val="1"/>
           <w:i w:val="0"/>
-          <w:sz w:val="28"/>
+          <w:sz w:val="24"/>
           <w:szCs w:val="24"/>
           <w:rtl w:val="0"/>
         </w:rPr>
@@ -1575,7 +1575,7 @@
     <w:p>
       <w:pPr>
         <w:spacing w:after="0" w:before="240" w:line="480" w:lineRule="auto"/>
-        <w:ind w:firstLine="0" w:left="0"/>
+        <w:ind w:left="0" w:firstLine="0"/>
         <w:jc w:val="center"/>
         <w:rPr/>
       </w:pPr>
@@ -1601,7 +1601,7 @@
     <w:p>
       <w:pPr>
         <w:spacing w:after="120" w:before="0" w:line="480" w:lineRule="auto"/>
-        <w:ind w:firstLine="0" w:left="0"/>
+        <w:ind w:left="0" w:firstLine="0"/>
         <w:jc w:val="center"/>
         <w:rPr/>
       </w:pPr>
@@ -2104,7 +2104,7 @@
     <w:p>
       <w:pPr>
         <w:spacing w:after="0" w:before="240" w:line="480" w:lineRule="auto"/>
-        <w:ind w:firstLine="0" w:left="0"/>
+        <w:ind w:left="0" w:firstLine="0"/>
         <w:jc w:val="both"/>
         <w:rPr/>
       </w:pPr>
@@ -2180,8 +2180,8 @@
     <w:p>
       <w:pPr>
         <w:keepNext w:val="1"/>
-        <w:spacing w:after="720" w:before="720" w:line="480" w:lineRule="auto"/>
-        <w:ind w:firstLine="0" w:left="0"/>
+        <w:spacing w:after="0" w:before="240" w:line="480" w:lineRule="auto"/>
+        <w:ind w:left="0" w:firstLine="0"/>
         <w:jc w:val="left"/>
         <w:rPr/>
       </w:pPr>
@@ -2191,7 +2191,7 @@
           <w:b/>
           <w:bCs w:val="1"/>
           <w:i w:val="0"/>
-          <w:sz w:val="28"/>
+          <w:sz w:val="24"/>
           <w:szCs w:val="24"/>
           <w:rtl w:val="0"/>
         </w:rPr>
@@ -2389,8 +2389,8 @@
     <w:p>
       <w:pPr>
         <w:keepNext w:val="1"/>
-        <w:spacing w:after="720" w:before="720" w:line="480" w:lineRule="auto"/>
-        <w:ind w:firstLine="0" w:left="0"/>
+        <w:spacing w:after="0" w:before="240" w:line="480" w:lineRule="auto"/>
+        <w:ind w:left="0" w:firstLine="0"/>
         <w:jc w:val="left"/>
         <w:rPr/>
       </w:pPr>
@@ -2400,7 +2400,7 @@
           <w:b/>
           <w:bCs w:val="1"/>
           <w:i w:val="0"/>
-          <w:sz w:val="28"/>
+          <w:sz w:val="24"/>
           <w:szCs w:val="24"/>
           <w:rtl w:val="0"/>
         </w:rPr>
@@ -2416,8 +2416,8 @@
     <w:p>
       <w:pPr>
         <w:keepNext w:val="1"/>
-        <w:spacing w:after="0" w:before="0" w:line="480" w:lineRule="auto"/>
-        <w:ind w:firstLine="0" w:left="0"/>
+        <w:spacing w:after="0" w:before="240" w:line="480" w:lineRule="auto"/>
+        <w:ind w:left="0" w:firstLine="0"/>
         <w:jc w:val="left"/>
         <w:rPr/>
       </w:pPr>
@@ -2466,7 +2466,7 @@
     <w:p>
       <w:pPr>
         <w:spacing w:line="480" w:lineRule="auto" w:before="0" w:after="0"/>
-        <w:ind w:firstLine="0" w:left="0"/>
+        <w:ind w:left="0" w:firstLine="0"/>
         <w:rPr/>
       </w:pPr>
       <w:r>
@@ -2480,7 +2480,7 @@
       <w:pPr>
         <w:keepNext w:val="1"/>
         <w:spacing w:after="0" w:before="240" w:line="480" w:lineRule="auto"/>
-        <w:ind w:firstLine="0" w:left="0"/>
+        <w:ind w:left="0" w:firstLine="0"/>
         <w:jc w:val="left"/>
         <w:rPr/>
       </w:pPr>
@@ -2546,7 +2546,7 @@
       <w:pPr>
         <w:keepNext w:val="1"/>
         <w:spacing w:after="0" w:before="240" w:line="480" w:lineRule="auto"/>
-        <w:ind w:firstLine="0" w:left="0"/>
+        <w:ind w:left="0" w:firstLine="0"/>
         <w:jc w:val="left"/>
         <w:rPr/>
       </w:pPr>
@@ -2595,8 +2595,8 @@
     <w:p>
       <w:pPr>
         <w:keepNext w:val="1"/>
-        <w:spacing w:after="720" w:before="720" w:line="480" w:lineRule="auto"/>
-        <w:ind w:firstLine="0" w:left="0"/>
+        <w:spacing w:after="0" w:before="240" w:line="480" w:lineRule="auto"/>
+        <w:ind w:left="0" w:firstLine="0"/>
         <w:jc w:val="left"/>
         <w:rPr/>
       </w:pPr>
@@ -2606,7 +2606,7 @@
           <w:b/>
           <w:bCs w:val="1"/>
           <w:i w:val="0"/>
-          <w:sz w:val="28"/>
+          <w:sz w:val="24"/>
           <w:szCs w:val="24"/>
           <w:rtl w:val="0"/>
         </w:rPr>
@@ -2645,7 +2645,7 @@
     <w:p>
       <w:pPr>
         <w:spacing w:line="480" w:lineRule="auto" w:before="0" w:after="0"/>
-        <w:ind w:firstLine="0" w:left="0"/>
+        <w:ind w:left="0" w:firstLine="0"/>
         <w:rPr/>
       </w:pPr>
       <w:r>
@@ -2682,7 +2682,7 @@
     <w:p>
       <w:pPr>
         <w:spacing w:line="480" w:lineRule="auto" w:before="0" w:after="0"/>
-        <w:ind w:firstLine="0" w:left="0"/>
+        <w:ind w:left="0" w:firstLine="0"/>
         <w:rPr/>
       </w:pPr>
       <w:r>
@@ -2719,7 +2719,7 @@
     <w:p>
       <w:pPr>
         <w:spacing w:line="480" w:lineRule="auto" w:before="0" w:after="0"/>
-        <w:ind w:firstLine="0" w:left="0"/>
+        <w:ind w:left="0" w:firstLine="0"/>
         <w:rPr/>
       </w:pPr>
       <w:r>
@@ -2756,7 +2756,7 @@
     <w:p>
       <w:pPr>
         <w:spacing w:line="480" w:lineRule="auto" w:before="0" w:after="0"/>
-        <w:ind w:firstLine="0" w:left="0"/>
+        <w:ind w:left="0" w:firstLine="0"/>
         <w:rPr/>
       </w:pPr>
       <w:r>
@@ -2793,7 +2793,7 @@
     <w:p>
       <w:pPr>
         <w:spacing w:line="480" w:lineRule="auto" w:before="0" w:after="0"/>
-        <w:ind w:firstLine="0" w:left="0"/>
+        <w:ind w:left="0" w:firstLine="0"/>
         <w:rPr/>
       </w:pPr>
       <w:r>
@@ -2830,7 +2830,7 @@
     <w:p>
       <w:pPr>
         <w:spacing w:line="480" w:lineRule="auto" w:before="0" w:after="0"/>
-        <w:ind w:firstLine="0" w:left="0"/>
+        <w:ind w:left="0" w:firstLine="0"/>
         <w:rPr/>
       </w:pPr>
       <w:r>
@@ -2867,7 +2867,7 @@
     <w:p>
       <w:pPr>
         <w:spacing w:line="480" w:lineRule="auto" w:before="0" w:after="0"/>
-        <w:ind w:firstLine="0" w:left="0"/>
+        <w:ind w:left="0" w:firstLine="0"/>
         <w:rPr/>
       </w:pPr>
       <w:r>
@@ -2904,20 +2904,20 @@
     <w:p>
       <w:pPr>
         <w:spacing w:line="480" w:lineRule="auto" w:before="0" w:after="0"/>
-        <w:ind w:firstLine="0" w:left="0"/>
-        <w:rPr/>
-      </w:pPr>
-      <w:r>
-        <w:rPr>
-          <w:rFonts w:ascii="Georgia" w:hAnsi="Georgia" w:eastAsia="Georgia" w:cs="Georgia"/>
-          <w:rtl w:val="0"/>
-        </w:rPr>
-      </w:r>
-    </w:p>
-    <w:p>
-      <w:pPr>
-        <w:spacing w:line="480" w:lineRule="auto" w:before="0" w:after="0"/>
-        <w:ind w:firstLine="0" w:left="0"/>
+        <w:ind w:left="0" w:firstLine="0"/>
+        <w:rPr/>
+      </w:pPr>
+      <w:r>
+        <w:rPr>
+          <w:rFonts w:ascii="Georgia" w:hAnsi="Georgia" w:eastAsia="Georgia" w:cs="Georgia"/>
+          <w:rtl w:val="0"/>
+        </w:rPr>
+      </w:r>
+    </w:p>
+    <w:p>
+      <w:pPr>
+        <w:spacing w:line="480" w:lineRule="auto" w:before="0" w:after="0"/>
+        <w:ind w:left="0" w:firstLine="0"/>
         <w:rPr/>
       </w:pPr>
       <w:r>
@@ -2936,7 +2936,7 @@
     <w:p>
       <w:pPr>
         <w:spacing w:after="0" w:before="0" w:line="480" w:lineRule="auto"/>
-        <w:ind w:firstLine="0" w:left="0"/>
+        <w:ind w:left="0" w:firstLine="0"/>
         <w:rPr/>
       </w:pPr>
       <w:r>
@@ -2949,7 +2949,7 @@
     <w:p>
       <w:pPr>
         <w:spacing w:after="720" w:before="720" w:line="480" w:lineRule="auto"/>
-        <w:ind w:firstLine="0" w:left="0"/>
+        <w:ind w:left="0" w:firstLine="0"/>
         <w:jc w:val="center"/>
         <w:rPr/>
       </w:pPr>
@@ -2998,8 +2998,8 @@
     <w:p>
       <w:pPr>
         <w:keepNext w:val="1"/>
-        <w:spacing w:after="720" w:before="720" w:line="480" w:lineRule="auto"/>
-        <w:ind w:firstLine="0" w:left="0"/>
+        <w:spacing w:after="0" w:before="240" w:line="480" w:lineRule="auto"/>
+        <w:ind w:left="0" w:firstLine="0"/>
         <w:jc w:val="left"/>
         <w:rPr/>
       </w:pPr>
@@ -3009,7 +3009,7 @@
           <w:b/>
           <w:bCs w:val="1"/>
           <w:i w:val="0"/>
-          <w:sz w:val="28"/>
+          <w:sz w:val="24"/>
           <w:szCs w:val="24"/>
           <w:rtl w:val="0"/>
         </w:rPr>
@@ -3048,8 +3048,8 @@
     <w:p>
       <w:pPr>
         <w:keepNext w:val="1"/>
-        <w:spacing w:after="720" w:before="720" w:line="480" w:lineRule="auto"/>
-        <w:ind w:firstLine="0" w:left="0"/>
+        <w:spacing w:after="0" w:before="240" w:line="480" w:lineRule="auto"/>
+        <w:ind w:left="0" w:firstLine="0"/>
         <w:jc w:val="left"/>
         <w:rPr/>
       </w:pPr>
@@ -3059,7 +3059,7 @@
           <w:b/>
           <w:bCs w:val="1"/>
           <w:i w:val="0"/>
-          <w:sz w:val="28"/>
+          <w:sz w:val="24"/>
           <w:szCs w:val="24"/>
           <w:rtl w:val="0"/>
         </w:rPr>
@@ -3091,8 +3091,8 @@
     <w:p>
       <w:pPr>
         <w:keepNext w:val="1"/>
-        <w:spacing w:after="720" w:before="720" w:line="480" w:lineRule="auto"/>
-        <w:ind w:firstLine="0" w:left="0"/>
+        <w:spacing w:after="0" w:before="240" w:line="480" w:lineRule="auto"/>
+        <w:ind w:left="0" w:firstLine="0"/>
         <w:jc w:val="left"/>
         <w:rPr/>
       </w:pPr>
@@ -3102,7 +3102,7 @@
           <w:b/>
           <w:bCs w:val="1"/>
           <w:i w:val="0"/>
-          <w:sz w:val="28"/>
+          <w:sz w:val="24"/>
           <w:szCs w:val="24"/>
           <w:rtl w:val="0"/>
         </w:rPr>
@@ -3141,7 +3141,7 @@
     <w:p>
       <w:pPr>
         <w:spacing w:line="480" w:lineRule="auto" w:before="0" w:after="0"/>
-        <w:ind w:firstLine="0" w:left="0"/>
+        <w:ind w:left="0" w:firstLine="0"/>
         <w:rPr/>
       </w:pPr>
       <w:r>
@@ -3250,7 +3250,7 @@
     <w:p>
       <w:pPr>
         <w:spacing w:line="480" w:lineRule="auto" w:before="0" w:after="0"/>
-        <w:ind w:firstLine="0" w:left="0"/>
+        <w:ind w:left="0" w:firstLine="0"/>
         <w:rPr/>
       </w:pPr>
       <w:r>
@@ -3287,8 +3287,8 @@
     <w:p>
       <w:pPr>
         <w:keepNext w:val="1"/>
-        <w:spacing w:after="720" w:before="720" w:line="480" w:lineRule="auto"/>
-        <w:ind w:firstLine="0" w:left="0"/>
+        <w:spacing w:after="0" w:before="240" w:line="480" w:lineRule="auto"/>
+        <w:ind w:left="0" w:firstLine="0"/>
         <w:jc w:val="left"/>
         <w:rPr/>
       </w:pPr>
@@ -3298,7 +3298,7 @@
           <w:b/>
           <w:bCs w:val="1"/>
           <w:i w:val="0"/>
-          <w:sz w:val="28"/>
+          <w:sz w:val="24"/>
           <w:szCs w:val="24"/>
           <w:rtl w:val="0"/>
         </w:rPr>
@@ -3337,7 +3337,7 @@
     <w:p>
       <w:pPr>
         <w:spacing w:line="480" w:lineRule="auto" w:before="0" w:after="0"/>
-        <w:ind w:firstLine="0" w:left="0"/>
+        <w:ind w:left="0" w:firstLine="0"/>
         <w:rPr/>
       </w:pPr>
       <w:r>
@@ -3356,7 +3356,7 @@
     <w:p>
       <w:pPr>
         <w:spacing w:after="0" w:before="0" w:line="480" w:lineRule="auto"/>
-        <w:ind w:firstLine="0" w:left="0"/>
+        <w:ind w:left="0" w:firstLine="0"/>
         <w:rPr/>
       </w:pPr>
       <w:r>
@@ -3369,7 +3369,7 @@
     <w:p>
       <w:pPr>
         <w:spacing w:after="720" w:before="720" w:line="480" w:lineRule="auto"/>
-        <w:ind w:firstLine="0" w:left="0"/>
+        <w:ind w:left="0" w:firstLine="0"/>
         <w:jc w:val="center"/>
         <w:rPr/>
       </w:pPr>
@@ -4017,7 +4017,7 @@
     <w:p>
       <w:pPr>
         <w:spacing w:before="0" w:after="0" w:line="480" w:lineRule="auto"/>
-        <w:ind w:firstLine="0" w:left="0"/>
+        <w:ind w:left="0" w:firstLine="0"/>
       </w:pPr>
       <w:r>
         <w:rPr>
@@ -4029,7 +4029,7 @@
     <w:p>
       <w:pPr>
         <w:spacing w:before="0" w:after="0" w:line="480" w:lineRule="auto"/>
-        <w:ind w:firstLine="0" w:left="0"/>
+        <w:ind w:left="0" w:firstLine="0"/>
       </w:pPr>
       <w:r>
         <w:rPr>
@@ -4041,7 +4041,7 @@
     <w:p>
       <w:pPr>
         <w:spacing w:before="0" w:after="0" w:line="480" w:lineRule="auto"/>
-        <w:ind w:firstLine="0" w:left="0"/>
+        <w:ind w:left="0" w:firstLine="0"/>
       </w:pPr>
       <w:r>
         <w:rPr>
@@ -4053,7 +4053,7 @@
     <w:p>
       <w:pPr>
         <w:spacing w:before="0" w:after="0" w:line="480" w:lineRule="auto"/>
-        <w:ind w:firstLine="0" w:left="0"/>
+        <w:ind w:left="0" w:firstLine="0"/>
       </w:pPr>
       <w:r>
         <w:rPr>
@@ -4065,7 +4065,7 @@
     <w:p>
       <w:pPr>
         <w:spacing w:before="0" w:after="0" w:line="480" w:lineRule="auto"/>
-        <w:ind w:firstLine="0" w:left="0"/>
+        <w:ind w:left="0" w:firstLine="0"/>
       </w:pPr>
       <w:r>
         <w:rPr>
@@ -4078,7 +4078,7 @@
       <w:pPr>
         <w:pageBreakBefore w:val="1"/>
         <w:spacing w:after="720" w:before="720" w:line="480" w:lineRule="auto"/>
-        <w:ind w:firstLine="0" w:left="0"/>
+        <w:ind w:left="0" w:firstLine="0"/>
         <w:jc w:val="center"/>
         <w:rPr/>
       </w:pPr>
@@ -4104,8 +4104,8 @@
     <w:p>
       <w:pPr>
         <w:keepNext w:val="1"/>
-        <w:spacing w:after="720" w:before="720" w:line="480" w:lineRule="auto"/>
-        <w:ind w:firstLine="0" w:left="0"/>
+        <w:spacing w:after="0" w:before="0" w:line="480" w:lineRule="auto"/>
+        <w:ind w:left="0" w:firstLine="0"/>
         <w:jc w:val="left"/>
         <w:rPr/>
       </w:pPr>
@@ -4115,7 +4115,7 @@
           <w:b/>
           <w:bCs w:val="1"/>
           <w:i w:val="0"/>
-          <w:sz w:val="28"/>
+          <w:sz w:val="24"/>
           <w:szCs w:val="24"/>
           <w:rtl w:val="0"/>
         </w:rPr>
@@ -4131,7 +4131,7 @@
     <w:p>
       <w:pPr>
         <w:spacing w:line="480" w:lineRule="auto" w:before="240" w:after="0"/>
-        <w:ind w:firstLine="0" w:left="0"/>
+        <w:ind w:left="0" w:firstLine="0"/>
         <w:jc w:val="center"/>
         <w:rPr/>
       </w:pPr>
@@ -4160,7 +4160,7 @@
     <w:p>
       <w:pPr>
         <w:spacing w:after="120" w:before="0" w:line="480" w:lineRule="auto"/>
-        <w:ind w:firstLine="0" w:left="0"/>
+        <w:ind w:left="0" w:firstLine="0"/>
         <w:jc w:val="center"/>
         <w:rPr/>
       </w:pPr>
@@ -4569,7 +4569,7 @@
     <w:p>
       <w:pPr>
         <w:spacing w:line="480" w:lineRule="auto" w:before="240" w:after="0"/>
-        <w:ind w:firstLine="0" w:left="0"/>
+        <w:ind w:left="0" w:firstLine="0"/>
         <w:rPr>
           <w:sz w:val="20"/>
           <w:szCs w:val="20"/>
@@ -4600,7 +4600,7 @@
     <w:p>
       <w:pPr>
         <w:spacing w:line="480" w:lineRule="auto" w:before="0" w:after="0"/>
-        <w:ind w:firstLine="0" w:left="0"/>
+        <w:ind w:left="0" w:firstLine="0"/>
         <w:rPr/>
       </w:pPr>
       <w:r>
@@ -4614,8 +4614,8 @@
       <w:pPr>
         <w:keepNext w:val="1"/>
         <w:pageBreakBefore w:val="1"/>
-        <w:spacing w:after="720" w:before="720" w:line="480" w:lineRule="auto"/>
-        <w:ind w:firstLine="0" w:left="0"/>
+        <w:spacing w:after="0" w:before="240" w:line="480" w:lineRule="auto"/>
+        <w:ind w:left="0" w:firstLine="0"/>
         <w:jc w:val="left"/>
         <w:rPr/>
       </w:pPr>
@@ -4625,7 +4625,7 @@
           <w:b/>
           <w:bCs w:val="1"/>
           <w:i w:val="0"/>
-          <w:sz w:val="28"/>
+          <w:sz w:val="24"/>
           <w:szCs w:val="24"/>
           <w:rtl w:val="0"/>
         </w:rPr>
@@ -4641,7 +4641,7 @@
     <w:p>
       <w:pPr>
         <w:spacing w:line="480" w:lineRule="auto" w:before="240" w:after="0"/>
-        <w:ind w:firstLine="0" w:left="0"/>
+        <w:ind w:left="0" w:firstLine="0"/>
         <w:jc w:val="center"/>
         <w:rPr/>
       </w:pPr>
@@ -4670,7 +4670,7 @@
     <w:p>
       <w:pPr>
         <w:spacing w:after="120" w:before="0" w:line="480" w:lineRule="auto"/>
-        <w:ind w:firstLine="0" w:left="0"/>
+        <w:ind w:left="0" w:firstLine="0"/>
         <w:jc w:val="center"/>
         <w:rPr/>
       </w:pPr>
@@ -5082,20 +5082,20 @@
     <w:p>
       <w:pPr>
         <w:spacing w:line="480" w:lineRule="auto" w:before="240" w:after="0"/>
+        <w:ind w:left="0" w:firstLine="0"/>
+        <w:rPr/>
+      </w:pPr>
+      <w:r>
+        <w:rPr>
+          <w:rFonts w:ascii="Georgia" w:hAnsi="Georgia" w:eastAsia="Georgia" w:cs="Georgia"/>
+          <w:rtl w:val="0"/>
+        </w:rPr>
+      </w:r>
+    </w:p>
+    <w:p>
+      <w:pPr>
+        <w:spacing w:line="480" w:lineRule="auto" w:before="0" w:after="0"/>
         <w:ind w:firstLine="0" w:left="0"/>
-        <w:rPr/>
-      </w:pPr>
-      <w:r>
-        <w:rPr>
-          <w:rFonts w:ascii="Georgia" w:hAnsi="Georgia" w:eastAsia="Georgia" w:cs="Georgia"/>
-          <w:rtl w:val="0"/>
-        </w:rPr>
-      </w:r>
-    </w:p>
-    <w:p>
-      <w:pPr>
-        <w:spacing w:line="480" w:lineRule="auto" w:before="0" w:after="0"/>
-        <w:ind w:firstLine="0"/>
         <w:rPr/>
       </w:pPr>
       <w:r>
@@ -5119,7 +5119,7 @@
     <w:p>
       <w:pPr>
         <w:spacing w:line="480" w:lineRule="auto" w:before="0" w:after="0"/>
-        <w:ind w:firstLine="0" w:left="0"/>
+        <w:ind w:left="0" w:firstLine="0"/>
         <w:rPr/>
       </w:pPr>
       <w:r>

</xml_diff>

<commit_message>
Blank-slate formatting reset; add thesis/FORMATTING.md
Reset all content spacing then reapply binding hierarchy. Only four
majors; structural minors bold; themed minors italic. Table captions
left-aligned 11pt; cells 9pt open-sided; body first-line indent.
</commit_message>
<xml_diff>
--- a/thesis/Thesis_Instagram_MH_v11.docx
+++ b/thesis/Thesis_Instagram_MH_v11.docx
@@ -1576,7 +1576,7 @@
       <w:pPr>
         <w:spacing w:after="0" w:before="240" w:line="480" w:lineRule="auto"/>
         <w:ind w:left="0" w:firstLine="0"/>
-        <w:jc w:val="center"/>
+        <w:jc w:val="left"/>
         <w:rPr/>
       </w:pPr>
       <w:r>
@@ -1600,9 +1600,9 @@
     </w:p>
     <w:p>
       <w:pPr>
-        <w:spacing w:after="120" w:before="0" w:line="480" w:lineRule="auto"/>
-        <w:ind w:left="0" w:firstLine="0"/>
-        <w:jc w:val="center"/>
+        <w:spacing w:after="0" w:before="0" w:line="480" w:lineRule="auto"/>
+        <w:ind w:left="0" w:firstLine="0"/>
+        <w:jc w:val="left"/>
         <w:rPr/>
       </w:pPr>
       <w:r>
@@ -4132,7 +4132,7 @@
       <w:pPr>
         <w:spacing w:line="480" w:lineRule="auto" w:before="240" w:after="0"/>
         <w:ind w:left="0" w:firstLine="0"/>
-        <w:jc w:val="center"/>
+        <w:jc w:val="left"/>
         <w:rPr/>
       </w:pPr>
       <w:r>
@@ -4159,9 +4159,9 @@
     </w:p>
     <w:p>
       <w:pPr>
-        <w:spacing w:after="120" w:before="0" w:line="480" w:lineRule="auto"/>
-        <w:ind w:left="0" w:firstLine="0"/>
-        <w:jc w:val="center"/>
+        <w:spacing w:after="0" w:before="0" w:line="480" w:lineRule="auto"/>
+        <w:ind w:left="0" w:firstLine="0"/>
+        <w:jc w:val="left"/>
         <w:rPr/>
       </w:pPr>
       <w:r>
@@ -4190,7 +4190,7 @@
       <w:tblPr>
         <w:tblStyle w:val="Table2"/>
         <w:tblW w:w="8306.0" w:type="dxa"/>
-        <w:jc w:val="left"/>
+        <w:jc w:val="center"/>
         <w:tblLayout w:type="fixed"/>
         <w:tblLook w:val="0000"/>
       </w:tblPr>
@@ -4642,7 +4642,7 @@
       <w:pPr>
         <w:spacing w:line="480" w:lineRule="auto" w:before="240" w:after="0"/>
         <w:ind w:left="0" w:firstLine="0"/>
-        <w:jc w:val="center"/>
+        <w:jc w:val="left"/>
         <w:rPr/>
       </w:pPr>
       <w:r>
@@ -4669,9 +4669,9 @@
     </w:p>
     <w:p>
       <w:pPr>
-        <w:spacing w:after="120" w:before="0" w:line="480" w:lineRule="auto"/>
-        <w:ind w:left="0" w:firstLine="0"/>
-        <w:jc w:val="center"/>
+        <w:spacing w:after="0" w:before="0" w:line="480" w:lineRule="auto"/>
+        <w:ind w:left="0" w:firstLine="0"/>
+        <w:jc w:val="left"/>
         <w:rPr/>
       </w:pPr>
       <w:r>
@@ -4700,7 +4700,7 @@
       <w:tblPr>
         <w:tblStyle w:val="Table3"/>
         <w:tblW w:w="8310.0" w:type="dxa"/>
-        <w:jc w:val="left"/>
+        <w:jc w:val="center"/>
         <w:tblLayout w:type="fixed"/>
         <w:tblLook w:val="0000"/>
       </w:tblPr>
@@ -5095,7 +5095,7 @@
     <w:p>
       <w:pPr>
         <w:spacing w:line="480" w:lineRule="auto" w:before="0" w:after="0"/>
-        <w:ind w:firstLine="0" w:left="0"/>
+        <w:ind w:left="0" w:firstLine="0"/>
         <w:rPr/>
       </w:pPr>
       <w:r>

</xml_diff>

<commit_message>
Unify themed italic section spacing; remove leftover empty spacers
</commit_message>
<xml_diff>
--- a/thesis/Thesis_Instagram_MH_v11.docx
+++ b/thesis/Thesis_Instagram_MH_v11.docx
@@ -937,20 +937,6 @@
     </w:p>
     <w:p>
       <w:pPr>
-        <w:spacing w:line="480" w:lineRule="auto" w:before="0" w:after="0"/>
-        <w:ind w:left="0" w:firstLine="0"/>
-        <w:jc w:val="both"/>
-        <w:rPr/>
-      </w:pPr>
-      <w:r>
-        <w:rPr>
-          <w:rFonts w:ascii="Georgia" w:hAnsi="Georgia" w:eastAsia="Georgia" w:cs="Georgia"/>
-          <w:rtl w:val="0"/>
-        </w:rPr>
-      </w:r>
-    </w:p>
-    <w:p>
-      <w:pPr>
         <w:spacing w:line="480" w:lineRule="auto" w:before="240" w:after="0"/>
         <w:ind w:left="0" w:firstLine="0"/>
         <w:jc w:val="left"/>
@@ -972,20 +958,6 @@
           <w:rtl w:val="0"/>
         </w:rPr>
         <w:t xml:space="preserve">Hope as a Distinct Construct in Digital Mental Health Discourse</w:t>
-      </w:r>
-    </w:p>
-    <w:p>
-      <w:pPr>
-        <w:spacing w:line="480" w:lineRule="auto" w:before="0" w:after="0"/>
-        <w:ind w:left="0" w:firstLine="0"/>
-        <w:jc w:val="both"/>
-        <w:rPr/>
-      </w:pPr>
-      <w:r>
-        <w:rPr>
-          <w:rFonts w:ascii="Georgia" w:hAnsi="Georgia" w:eastAsia="Georgia" w:cs="Georgia"/>
-          <w:rtl w:val="0"/>
-        </w:rPr>
       </w:r>
     </w:p>
     <w:p>
@@ -2456,19 +2428,6 @@
         </w:rPr>
         <w:t xml:space="preserve">This study is limited to a corpus of a maximum of 30 English-language Instagram captions drawn from approximately five to six publicly accessible mental health advocacy pages. Eligible posts are those published from September 2024 through December 2025. Preference is given to 2025 posts. Posts from September to December 2024 are included only when a page does not yield enough eligible 2025 captions. Each page contributes between five and eight eligible posts so that the limited pool of suitable English-language advocacy accounts can still support a full corpus. Posts must show at least 100 likes and 20 visible comments. Captions must be fully visible without platform truncation. For each post, two comments written directly under the caption are selected. A comment counts only if it is in English, has enough continuous text for analysis (at least ten words or one full clause), and is not limited to pure emoji, single-word reactions, tags, or links. When both kinds of response appear among those comments, one that offers encouragement or validation without a personal story and one that shares a personal experience are taken. When only one kind appears, the two clearest comments that meet the criteria are taken. Analysis is restricted to linguistic features: lexical choices, modality, pronoun use, directive structures, and discourse function. No causal or predictive relationship between caption type and comment response type is asserted.</w:t>
       </w:r>
-      <w:r>
-        <w:rPr>
-          <w:rFonts w:ascii="Georgia" w:hAnsi="Georgia" w:eastAsia="Georgia" w:cs="Georgia"/>
-          <w:rtl w:val="0"/>
-        </w:rPr>
-      </w:r>
-    </w:p>
-    <w:p>
-      <w:pPr>
-        <w:spacing w:line="480" w:lineRule="auto" w:before="0" w:after="0"/>
-        <w:ind w:left="0" w:firstLine="0"/>
-        <w:rPr/>
-      </w:pPr>
       <w:r>
         <w:rPr>
           <w:rFonts w:ascii="Georgia" w:hAnsi="Georgia" w:eastAsia="Georgia" w:cs="Georgia"/>

</xml_diff>

<commit_message>
Hide page numbers on major-header pages; majors start new page
Section breaks before Methodology/References/Appendices; different
first page with empty header. Continuous PAGE field on later pages.
</commit_message>
<xml_diff>
--- a/thesis/Thesis_Instagram_MH_v11.docx
+++ b/thesis/Thesis_Instagram_MH_v11.docx
@@ -426,6 +426,7 @@
         <w:ind w:left="0" w:firstLine="0"/>
         <w:jc w:val="center"/>
         <w:rPr/>
+        <w:pageBreakBefore/>
       </w:pPr>
       <w:r>
         <w:rPr>
@@ -2897,6 +2898,15 @@
         <w:spacing w:after="0" w:before="0" w:line="480" w:lineRule="auto"/>
         <w:ind w:left="0" w:firstLine="0"/>
         <w:rPr/>
+        <w:sectPr>
+          <w:headerReference r:id="rId8" w:type="default"/>
+          <w:headerReference w:type="first" r:id="rId9"/>
+          <w:type w:val="nextPage"/>
+          <w:pgSz w:h="16838" w:w="11906" w:orient="portrait"/>
+          <w:pgMar w:bottom="1440" w:top="1440" w:left="2160" w:right="1440" w:header="708" w:footer="708"/>
+          <w:pgNumType/>
+          <w:titlePg/>
+        </w:sectPr>
       </w:pPr>
       <w:r>
         <w:rPr>
@@ -2911,6 +2921,7 @@
         <w:ind w:left="0" w:firstLine="0"/>
         <w:jc w:val="center"/>
         <w:rPr/>
+        <w:pageBreakBefore/>
       </w:pPr>
       <w:r>
         <w:rPr>
@@ -3317,6 +3328,15 @@
         <w:spacing w:after="0" w:before="0" w:line="480" w:lineRule="auto"/>
         <w:ind w:left="0" w:firstLine="0"/>
         <w:rPr/>
+        <w:sectPr>
+          <w:headerReference r:id="rId8" w:type="default"/>
+          <w:headerReference w:type="first" r:id="rId9"/>
+          <w:type w:val="nextPage"/>
+          <w:pgSz w:h="16838" w:w="11906" w:orient="portrait"/>
+          <w:pgMar w:bottom="1440" w:top="1440" w:left="2160" w:right="1440" w:header="708" w:footer="708"/>
+          <w:pgNumType/>
+          <w:titlePg/>
+        </w:sectPr>
       </w:pPr>
       <w:r>
         <w:rPr>
@@ -3331,6 +3351,7 @@
         <w:ind w:left="0" w:firstLine="0"/>
         <w:jc w:val="center"/>
         <w:rPr/>
+        <w:pageBreakBefore/>
       </w:pPr>
       <w:r>
         <w:rPr>
@@ -4025,6 +4046,15 @@
       <w:pPr>
         <w:spacing w:before="0" w:after="0" w:line="480" w:lineRule="auto"/>
         <w:ind w:left="0" w:firstLine="0"/>
+        <w:sectPr>
+          <w:headerReference r:id="rId8" w:type="default"/>
+          <w:headerReference w:type="first" r:id="rId9"/>
+          <w:type w:val="nextPage"/>
+          <w:pgSz w:h="16838" w:w="11906" w:orient="portrait"/>
+          <w:pgMar w:bottom="1440" w:top="1440" w:left="2160" w:right="1440" w:header="708" w:footer="708"/>
+          <w:pgNumType/>
+          <w:titlePg/>
+        </w:sectPr>
       </w:pPr>
       <w:r>
         <w:rPr>
@@ -5090,10 +5120,12 @@
     </w:p>
     <w:sectPr>
       <w:headerReference r:id="rId8" w:type="default"/>
+      <w:headerReference w:type="first" r:id="rId9"/>
       <w:type w:val="nextPage"/>
       <w:pgSz w:h="16838" w:w="11906" w:orient="portrait"/>
       <w:pgMar w:bottom="1440" w:top="1440" w:left="2160" w:right="1440" w:header="708" w:footer="708"/>
       <w:pgNumType w:start="1"/>
+      <w:titlePg/>
     </w:sectPr>
   </w:body>
 </w:document>
@@ -5123,20 +5155,30 @@
     </w:pPr>
     <w:r>
       <w:rPr>
-        <w:rFonts w:ascii="Georgia" w:cs="Georgia" w:eastAsia="Georgia" w:hAnsi="Georgia"/>
+        <w:rFonts w:ascii="Georgia" w:hAnsi="Georgia" w:eastAsia="Georgia" w:cs="Georgia"/>
         <w:sz w:val="22"/>
-        <w:szCs w:val="22"/>
       </w:rPr>
       <w:fldChar w:fldCharType="begin"/>
-      <w:instrText xml:space="preserve">PAGE</w:instrText>
-      <w:fldChar w:fldCharType="separate"/>
-      <w:fldChar w:fldCharType="end"/>
     </w:r>
     <w:r>
       <w:rPr>
-        <w:rtl w:val="0"/>
+        <w:rFonts w:ascii="Georgia" w:hAnsi="Georgia" w:eastAsia="Georgia" w:cs="Georgia"/>
       </w:rPr>
+      <w:instrText xml:space="preserve"> PAGE </w:instrText>
     </w:r>
+    <w:r>
+      <w:fldChar w:fldCharType="end"/>
+    </w:r>
+  </w:p>
+</w:hdr>
+</file>
+
+<file path=word/header2.xml><?xml version="1.0" encoding="utf-8"?>
+<w:hdr xmlns:m="http://schemas.openxmlformats.org/officeDocument/2006/math" xmlns:mc="http://schemas.openxmlformats.org/markup-compatibility/2006" xmlns:mo="http://schemas.microsoft.com/office/mac/office/2008/main" xmlns:mv="urn:schemas-microsoft-com:mac:vml" xmlns:o="urn:schemas-microsoft-com:office:office" xmlns:r="http://schemas.openxmlformats.org/officeDocument/2006/relationships" xmlns:v="urn:schemas-microsoft-com:vml" xmlns:w10="urn:schemas-microsoft-com:office:word" xmlns:w14="http://schemas.microsoft.com/office/word/2010/wordml" xmlns:w="http://schemas.openxmlformats.org/wordprocessingml/2006/main" xmlns:wne="http://schemas.microsoft.com/office/word/2006/wordml" xmlns:wp14="http://schemas.microsoft.com/office/word/2010/wordprocessingDrawing" xmlns:wp="http://schemas.openxmlformats.org/drawingml/2006/wordprocessingDrawing" xmlns:wpc="http://schemas.microsoft.com/office/word/2010/wordprocessingCanvas" xmlns:wpg="http://schemas.microsoft.com/office/word/2010/wordprocessingGroup" xmlns:wpi="http://schemas.microsoft.com/office/word/2010/wordprocessingInk" xmlns:wps="http://schemas.microsoft.com/office/word/2010/wordprocessingShape" mc:Ignorable="w14 wp14">
+  <w:p>
+    <w:pPr>
+      <w:pStyle w:val="Header"/>
+    </w:pPr>
   </w:p>
 </w:hdr>
 </file>

</xml_diff>